<commit_message>
Why document: sections ordered by importance; key answers in bold, defined terms in italics
Co-Authored-By: Claude Opus 5.5 <noreply@anthropic.com>
</commit_message>
<xml_diff>
--- a/results/experiments/why/Key_findings_and_why.docx
+++ b/results/experiments/why/Key_findings_and_why.docx
@@ -63,13 +63,63 @@
         <w:t xml:space="preserve"> </w:t>
       </w:r>
       <w:r>
-        <w:t xml:space="preserve">columns its known workload uses (the build). When a later query needs a column the build skipped, it extracts that</w:t>
-      </w:r>
-      <w:r>
-        <w:t xml:space="preserve"> </w:t>
-      </w:r>
-      <w:r>
-        <w:t xml:space="preserve">column on demand, only for the documents the query can select, and keeps the result for later queries. Workload drift</w:t>
+        <w:t xml:space="preserve">columns its known workload uses (the</w:t>
+      </w:r>
+      <w:r>
+        <w:t xml:space="preserve"> </w:t>
+      </w:r>
+      <w:r>
+        <w:rPr>
+          <w:iCs/>
+          <w:i/>
+        </w:rPr>
+        <w:t xml:space="preserve">build</w:t>
+      </w:r>
+      <w:r>
+        <w:t xml:space="preserve">). When a later query needs a column the build skipped, it extracts that</w:t>
+      </w:r>
+      <w:r>
+        <w:t xml:space="preserve"> </w:t>
+      </w:r>
+      <w:r>
+        <w:t xml:space="preserve">column</w:t>
+      </w:r>
+      <w:r>
+        <w:t xml:space="preserve"> </w:t>
+      </w:r>
+      <w:r>
+        <w:rPr>
+          <w:iCs/>
+          <w:i/>
+        </w:rPr>
+        <w:t xml:space="preserve">on demand</w:t>
+      </w:r>
+      <w:r>
+        <w:t xml:space="preserve">, only for the documents the query can select, and keeps the result for later queries.</w:t>
+      </w:r>
+      <w:r>
+        <w:t xml:space="preserve"> </w:t>
+      </w:r>
+      <w:r>
+        <w:rPr>
+          <w:iCs/>
+          <w:i/>
+        </w:rPr>
+        <w:t xml:space="preserve">Workload</w:t>
+      </w:r>
+      <w:r>
+        <w:rPr>
+          <w:iCs/>
+          <w:i/>
+        </w:rPr>
+        <w:t xml:space="preserve"> </w:t>
+      </w:r>
+      <w:r>
+        <w:rPr>
+          <w:iCs/>
+          <w:i/>
+        </w:rPr>
+        <w:t xml:space="preserve">drift</w:t>
       </w:r>
       <w:r>
         <w:t xml:space="preserve"> </w:t>
@@ -101,7 +151,13 @@
         <w:pStyle w:val="BodyText"/>
       </w:pPr>
       <w:r>
-        <w:t xml:space="preserve">The sections below take the main observations from the experiments and ask why each one holds.</w:t>
+        <w:t xml:space="preserve">The sections below take the main observations from the experiments and ask why each one holds, starting with the</w:t>
+      </w:r>
+      <w:r>
+        <w:t xml:space="preserve"> </w:t>
+      </w:r>
+      <w:r>
+        <w:t xml:space="preserve">ones that matter most.</w:t>
       </w:r>
     </w:p>
     <w:bookmarkStart w:id="23" w:name="X0ff75b70ab3ad4306ac0f9420f926c1b1fe798a"/>
@@ -118,7 +174,17 @@
         <w:pStyle w:val="FirstParagraph"/>
       </w:pPr>
       <w:r>
-        <w:t xml:space="preserve">Extraction timing turns out to be irrelevant. What matters is the prompt. Drift only changes which prompt reads a</w:t>
+        <w:rPr>
+          <w:bCs/>
+          <w:b/>
+        </w:rPr>
+        <w:t xml:space="preserve">Extraction timing turns out to be irrelevant; what matters is the prompt.</w:t>
+      </w:r>
+      <w:r>
+        <w:t xml:space="preserve"> </w:t>
+      </w:r>
+      <w:r>
+        <w:t xml:space="preserve">Drift only changes which prompt reads a</w:t>
       </w:r>
       <w:r>
         <w:t xml:space="preserve"> </w:t>
@@ -136,7 +202,17 @@
         <w:t xml:space="preserve"> </w:t>
       </w:r>
       <w:r>
-        <w:t xml:space="preserve">396 of the 397 queries then scored the same as when everything was extracted up front. The remaining query differs</w:t>
+        <w:rPr>
+          <w:bCs/>
+          <w:b/>
+        </w:rPr>
+        <w:t xml:space="preserve">396 of the 397 queries then scored the same as when everything was extracted up front.</w:t>
+      </w:r>
+      <w:r>
+        <w:t xml:space="preserve"> </w:t>
+      </w:r>
+      <w:r>
+        <w:t xml:space="preserve">The remaining query differs</w:t>
       </w:r>
       <w:r>
         <w:t xml:space="preserve"> </w:t>
@@ -267,31 +343,71 @@
         <w:pStyle w:val="FirstParagraph"/>
       </w:pPr>
       <w:r>
-        <w:t xml:space="preserve">Anticipating a column costs 2.7 to 5.9 times less than extracting it on demand, and the break-even probability (the</w:t>
-      </w:r>
-      <w:r>
-        <w:t xml:space="preserve"> </w:t>
-      </w:r>
-      <w:r>
-        <w:t xml:space="preserve">chance a future query needs a column above which it is worth reading up front) ranges from 1.3% to 13%. Both follow</w:t>
-      </w:r>
-      <w:r>
-        <w:t xml:space="preserve"> </w:t>
-      </w:r>
-      <w:r>
-        <w:t xml:space="preserve">from where the tokens go. Every extraction prompt contains the whole document. Adding one column to a build prompt that</w:t>
-      </w:r>
-      <w:r>
-        <w:t xml:space="preserve"> </w:t>
-      </w:r>
-      <w:r>
-        <w:t xml:space="preserve">is sent anyway costs only the column’s description and its answer, 84 tokens at the median. Extracting the column</w:t>
-      </w:r>
-      <w:r>
-        <w:t xml:space="preserve"> </w:t>
-      </w:r>
-      <w:r>
-        <w:t xml:space="preserve">later pays for the document again, a median of 745 to 9,537 tokens depending on the corpus, plus 66 tokens of</w:t>
+        <w:t xml:space="preserve">Anticipating a column costs 2.7 to 5.9 times less than extracting it on demand, and the</w:t>
+      </w:r>
+      <w:r>
+        <w:t xml:space="preserve"> </w:t>
+      </w:r>
+      <w:r>
+        <w:rPr>
+          <w:iCs/>
+          <w:i/>
+        </w:rPr>
+        <w:t xml:space="preserve">break-even probability</w:t>
+      </w:r>
+      <w:r>
+        <w:t xml:space="preserve"> </w:t>
+      </w:r>
+      <w:r>
+        <w:t xml:space="preserve">(the</w:t>
+      </w:r>
+      <w:r>
+        <w:t xml:space="preserve"> </w:t>
+      </w:r>
+      <w:r>
+        <w:t xml:space="preserve">chance a future query needs a column above which it is worth reading up front) ranges from 1.3% to 13%.</w:t>
+      </w:r>
+      <w:r>
+        <w:t xml:space="preserve"> </w:t>
+      </w:r>
+      <w:r>
+        <w:rPr>
+          <w:bCs/>
+          <w:b/>
+        </w:rPr>
+        <w:t xml:space="preserve">Both follow</w:t>
+      </w:r>
+      <w:r>
+        <w:rPr>
+          <w:bCs/>
+          <w:b/>
+        </w:rPr>
+        <w:t xml:space="preserve"> </w:t>
+      </w:r>
+      <w:r>
+        <w:rPr>
+          <w:bCs/>
+          <w:b/>
+        </w:rPr>
+        <w:t xml:space="preserve">from where the tokens go: every extraction prompt contains the whole document.</w:t>
+      </w:r>
+      <w:r>
+        <w:t xml:space="preserve"> </w:t>
+      </w:r>
+      <w:r>
+        <w:t xml:space="preserve">Adding one column to a build prompt</w:t>
+      </w:r>
+      <w:r>
+        <w:t xml:space="preserve"> </w:t>
+      </w:r>
+      <w:r>
+        <w:t xml:space="preserve">that is sent anyway costs only the column’s description and its answer, 84 tokens at the median. Extracting the</w:t>
+      </w:r>
+      <w:r>
+        <w:t xml:space="preserve"> </w:t>
+      </w:r>
+      <w:r>
+        <w:t xml:space="preserve">column later pays for the document again, a median of 745 to 9,537 tokens depending on the corpus, plus 66 tokens of</w:t>
       </w:r>
       <w:r>
         <w:t xml:space="preserve"> </w:t>
@@ -305,13 +421,23 @@
         <w:pStyle w:val="BodyText"/>
       </w:pPr>
       <w:r>
-        <w:t xml:space="preserve">A model built only from these token counts predicts the measured break-even within about 30% on every corpus and puts</w:t>
-      </w:r>
-      <w:r>
-        <w:t xml:space="preserve"> </w:t>
-      </w:r>
-      <w:r>
-        <w:t xml:space="preserve">the corpora in the right order:</w:t>
+        <w:rPr>
+          <w:bCs/>
+          <w:b/>
+        </w:rPr>
+        <w:t xml:space="preserve">A model built only from these token counts predicts the measured break-even within about 30% on every corpus</w:t>
+      </w:r>
+      <w:r>
+        <w:t xml:space="preserve"> </w:t>
+      </w:r>
+      <w:r>
+        <w:t xml:space="preserve">and</w:t>
+      </w:r>
+      <w:r>
+        <w:t xml:space="preserve"> </w:t>
+      </w:r>
+      <w:r>
+        <w:t xml:space="preserve">puts the corpora in the right order:</w:t>
       </w:r>
     </w:p>
     <w:tbl>
@@ -746,31 +872,41 @@
         <w:t xml:space="preserve"> </w:t>
       </w:r>
       <w:r>
-        <w:t xml:space="preserve">an offline plan that knew the whole workload in advance. None was reliably better than first come, first served. The</w:t>
-      </w:r>
-      <w:r>
-        <w:t xml:space="preserve"> </w:t>
-      </w:r>
-      <w:r>
-        <w:t xml:space="preserve">main reason is that an extraction’s value mostly arrives later. Across the five corpora, 54% to 97% of the score gain</w:t>
-      </w:r>
-      <w:r>
-        <w:t xml:space="preserve"> </w:t>
-      </w:r>
-      <w:r>
-        <w:t xml:space="preserve">from an extraction goes to later queries that reuse the column, rather than to the query that triggered it (97% on</w:t>
-      </w:r>
-      <w:r>
-        <w:t xml:space="preserve"> </w:t>
-      </w:r>
-      <w:r>
-        <w:t xml:space="preserve">research papers, 54% on court judgments). Several extractions do nothing for their own query and a lot for later</w:t>
-      </w:r>
-      <w:r>
-        <w:t xml:space="preserve"> </w:t>
-      </w:r>
-      <w:r>
-        <w:t xml:space="preserve">ones. A policy deciding when a query arrives cannot see this.</w:t>
+        <w:t xml:space="preserve">an offline plan that knew the whole workload in advance. None was reliably better than first come, first served.</w:t>
+      </w:r>
+      <w:r>
+        <w:t xml:space="preserve"> </w:t>
+      </w:r>
+      <w:r>
+        <w:rPr>
+          <w:bCs/>
+          <w:b/>
+        </w:rPr>
+        <w:t xml:space="preserve">The main reason is that an extraction’s value mostly arrives later.</w:t>
+      </w:r>
+      <w:r>
+        <w:t xml:space="preserve"> </w:t>
+      </w:r>
+      <w:r>
+        <w:t xml:space="preserve">Across the five corpora, 54% to 97% of the</w:t>
+      </w:r>
+      <w:r>
+        <w:t xml:space="preserve"> </w:t>
+      </w:r>
+      <w:r>
+        <w:t xml:space="preserve">score gain from an extraction goes to later queries that reuse the column, rather than to the query that triggered it</w:t>
+      </w:r>
+      <w:r>
+        <w:t xml:space="preserve"> </w:t>
+      </w:r>
+      <w:r>
+        <w:t xml:space="preserve">(97% on research papers, 54% on court judgments). Several extractions do nothing for their own query and a lot for</w:t>
+      </w:r>
+      <w:r>
+        <w:t xml:space="preserve"> </w:t>
+      </w:r>
+      <w:r>
+        <w:t xml:space="preserve">later ones. A policy deciding when a query arrives cannot see this.</w:t>
       </w:r>
     </w:p>
     <w:p>
@@ -871,7 +1007,7 @@
         <w:t xml:space="preserve"> </w:t>
       </w:r>
       <w:r>
-        <w:t xml:space="preserve">would need to forecast which columns future queries will use. Estimating each extraction’s value on its own is not</w:t>
+        <w:t xml:space="preserve">would need to forecast which columns future queries will use; estimating each extraction’s value on its own is not</w:t>
       </w:r>
       <w:r>
         <w:t xml:space="preserve"> </w:t>
@@ -901,37 +1037,79 @@
         <w:pStyle w:val="FirstParagraph"/>
       </w:pPr>
       <w:r>
-        <w:t xml:space="preserve">Most extraction errors come from the specification rather than from reading. Given only a column name, the model often</w:t>
-      </w:r>
-      <w:r>
-        <w:t xml:space="preserve"> </w:t>
-      </w:r>
-      <w:r>
-        <w:t xml:space="preserve">does not know what to write, whether that is a count, a list of years, or a date in a particular format. It leaves the</w:t>
-      </w:r>
-      <w:r>
-        <w:t xml:space="preserve"> </w:t>
-      </w:r>
-      <w:r>
-        <w:t xml:space="preserve">cell empty or writes the value in another form. Without descriptions in the on-demand prompts, a count of FIBA World</w:t>
-      </w:r>
-      <w:r>
-        <w:t xml:space="preserve"> </w:t>
-      </w:r>
-      <w:r>
-        <w:t xml:space="preserve">Cup appearances falls from 0.86 to 0.01 correct because the model leaves it empty. An artist’s award count falls from</w:t>
-      </w:r>
-      <w:r>
-        <w:t xml:space="preserve"> </w:t>
-      </w:r>
-      <w:r>
-        <w:t xml:space="preserve">0.74 to 0.06, and birth dates from 0.38 to 0.00 because they come back in a different format. Adding the benchmark’s</w:t>
-      </w:r>
-      <w:r>
-        <w:t xml:space="preserve"> </w:t>
-      </w:r>
-      <w:r>
-        <w:t xml:space="preserve">descriptions to a single extraction pass raised its score from 0.234 to 0.560, the largest effect in the whole study.</w:t>
+        <w:rPr>
+          <w:bCs/>
+          <w:b/>
+        </w:rPr>
+        <w:t xml:space="preserve">Most extraction errors come from the specification rather than from reading.</w:t>
+      </w:r>
+      <w:r>
+        <w:t xml:space="preserve"> </w:t>
+      </w:r>
+      <w:r>
+        <w:t xml:space="preserve">Given only a column name, the model</w:t>
+      </w:r>
+      <w:r>
+        <w:t xml:space="preserve"> </w:t>
+      </w:r>
+      <w:r>
+        <w:t xml:space="preserve">often does not know what to write, whether that is a count, a list of years, or a date in a particular format. It</w:t>
+      </w:r>
+      <w:r>
+        <w:t xml:space="preserve"> </w:t>
+      </w:r>
+      <w:r>
+        <w:t xml:space="preserve">leaves the cell empty or writes the value in another form. Without descriptions in the on-demand prompts, a count of</w:t>
+      </w:r>
+      <w:r>
+        <w:t xml:space="preserve"> </w:t>
+      </w:r>
+      <w:r>
+        <w:t xml:space="preserve">FIBA World Cup appearances falls from 0.86 to 0.01 correct because the model leaves it empty. An artist’s award count</w:t>
+      </w:r>
+      <w:r>
+        <w:t xml:space="preserve"> </w:t>
+      </w:r>
+      <w:r>
+        <w:t xml:space="preserve">falls from 0.74 to 0.06, and birth dates from 0.38 to 0.00 because they come back in a different format.</w:t>
+      </w:r>
+      <w:r>
+        <w:t xml:space="preserve"> </w:t>
+      </w:r>
+      <w:r>
+        <w:rPr>
+          <w:bCs/>
+          <w:b/>
+        </w:rPr>
+        <w:t xml:space="preserve">Adding the</w:t>
+      </w:r>
+      <w:r>
+        <w:rPr>
+          <w:bCs/>
+          <w:b/>
+        </w:rPr>
+        <w:t xml:space="preserve"> </w:t>
+      </w:r>
+      <w:r>
+        <w:rPr>
+          <w:bCs/>
+          <w:b/>
+        </w:rPr>
+        <w:t xml:space="preserve">benchmark’s descriptions to a single extraction pass raised its score from 0.234 to 0.560, the largest effect in the</w:t>
+      </w:r>
+      <w:r>
+        <w:rPr>
+          <w:bCs/>
+          <w:b/>
+        </w:rPr>
+        <w:t xml:space="preserve"> </w:t>
+      </w:r>
+      <w:r>
+        <w:rPr>
+          <w:bCs/>
+          <w:b/>
+        </w:rPr>
+        <w:t xml:space="preserve">whole study.</w:t>
       </w:r>
     </w:p>
     <w:p>
@@ -1030,25 +1208,49 @@
         <w:pStyle w:val="FirstParagraph"/>
       </w:pPr>
       <w:r>
-        <w:t xml:space="preserve">When a document states a value plainly, as with a number or a yes/no answer, any reasonable prompt returns it. When</w:t>
-      </w:r>
-      <w:r>
-        <w:t xml:space="preserve"> </w:t>
-      </w:r>
-      <w:r>
-        <w:t xml:space="preserve">the document does not settle the answer, for example a disease’s causes, a party’s status, or a value it never</w:t>
-      </w:r>
-      <w:r>
-        <w:t xml:space="preserve"> </w:t>
-      </w:r>
-      <w:r>
-        <w:t xml:space="preserve">mentions, the prompt decides. It does this through how readily the model leaves a cell empty and through the example</w:t>
-      </w:r>
-      <w:r>
-        <w:t xml:space="preserve"> </w:t>
-      </w:r>
-      <w:r>
-        <w:t xml:space="preserve">values the prompt shows.</w:t>
+        <w:t xml:space="preserve">When a document states a value plainly, as with a number or a yes/no answer, any reasonable prompt returns it.</w:t>
+      </w:r>
+      <w:r>
+        <w:t xml:space="preserve"> </w:t>
+      </w:r>
+      <w:r>
+        <w:rPr>
+          <w:bCs/>
+          <w:b/>
+        </w:rPr>
+        <w:t xml:space="preserve">When</w:t>
+      </w:r>
+      <w:r>
+        <w:rPr>
+          <w:bCs/>
+          <w:b/>
+        </w:rPr>
+        <w:t xml:space="preserve"> </w:t>
+      </w:r>
+      <w:r>
+        <w:rPr>
+          <w:bCs/>
+          <w:b/>
+        </w:rPr>
+        <w:t xml:space="preserve">the document does not settle the answer, the prompt decides.</w:t>
+      </w:r>
+      <w:r>
+        <w:t xml:space="preserve"> </w:t>
+      </w:r>
+      <w:r>
+        <w:t xml:space="preserve">Examples are a disease’s causes, a party’s status, or a</w:t>
+      </w:r>
+      <w:r>
+        <w:t xml:space="preserve"> </w:t>
+      </w:r>
+      <w:r>
+        <w:t xml:space="preserve">value the document never mentions. The prompt decides through how readily the model leaves a cell empty and through</w:t>
+      </w:r>
+      <w:r>
+        <w:t xml:space="preserve"> </w:t>
+      </w:r>
+      <w:r>
+        <w:t xml:space="preserve">the example values it shows.</w:t>
       </w:r>
     </w:p>
     <w:p>
@@ -1062,25 +1264,49 @@
         <w:t xml:space="preserve"> </w:t>
       </w:r>
       <w:r>
-        <w:t xml:space="preserve">different values for the same document. Across 41 columns this disagreement is a strong predictor of error (Spearman</w:t>
-      </w:r>
-      <w:r>
-        <w:t xml:space="preserve"> </w:t>
-      </w:r>
-      <w:r>
-        <w:t xml:space="preserve">−0.76). Numbers disagree on 9% of cells, yes/no columns on 24%, free text on 47% and categories on 60%. No column with</w:t>
-      </w:r>
-      <w:r>
-        <w:t xml:space="preserve"> </w:t>
-      </w:r>
-      <w:r>
-        <w:t xml:space="preserve">more than about 55% disagreement is right more than 60% of the time. The reverse does not hold: some columns are</w:t>
-      </w:r>
-      <w:r>
-        <w:t xml:space="preserve"> </w:t>
-      </w:r>
-      <w:r>
-        <w:t xml:space="preserve">consistent and still wrong because both prompts make the same formatting error.</w:t>
+        <w:t xml:space="preserve">different values for the same document.</w:t>
+      </w:r>
+      <w:r>
+        <w:t xml:space="preserve"> </w:t>
+      </w:r>
+      <w:r>
+        <w:rPr>
+          <w:bCs/>
+          <w:b/>
+        </w:rPr>
+        <w:t xml:space="preserve">Across 41 columns this disagreement is a strong predictor of error</w:t>
+      </w:r>
+      <w:r>
+        <w:rPr>
+          <w:bCs/>
+          <w:b/>
+        </w:rPr>
+        <w:t xml:space="preserve"> </w:t>
+      </w:r>
+      <w:r>
+        <w:rPr>
+          <w:bCs/>
+          <w:b/>
+        </w:rPr>
+        <w:t xml:space="preserve">(Spearman −0.76).</w:t>
+      </w:r>
+      <w:r>
+        <w:t xml:space="preserve"> </w:t>
+      </w:r>
+      <w:r>
+        <w:t xml:space="preserve">Numbers disagree on 9% of cells, yes/no columns on 24%, free text on 47% and categories on 60%. No</w:t>
+      </w:r>
+      <w:r>
+        <w:t xml:space="preserve"> </w:t>
+      </w:r>
+      <w:r>
+        <w:t xml:space="preserve">column with more than about 55% disagreement is right more than 60% of the time. The reverse does not hold: some</w:t>
+      </w:r>
+      <w:r>
+        <w:t xml:space="preserve"> </w:t>
+      </w:r>
+      <w:r>
+        <w:t xml:space="preserve">columns are consistent and still wrong because both prompts make the same formatting error.</w:t>
       </w:r>
     </w:p>
     <w:p>
@@ -1197,7 +1423,14 @@
         <w:pStyle w:val="FirstParagraph"/>
       </w:pPr>
       <w:r>
-        <w:t xml:space="preserve">When a column does not apply to a document, the model rarely leaves it empty, especially when the schema says the</w:t>
+        <w:rPr>
+          <w:bCs/>
+          <w:b/>
+        </w:rPr>
+        <w:t xml:space="preserve">When a column does not apply to a document, the model rarely leaves it empty</w:t>
+      </w:r>
+      <w:r>
+        <w:t xml:space="preserve">, especially when the schema says the</w:t>
       </w:r>
       <w:r>
         <w:t xml:space="preserve"> </w:t>
@@ -1275,12 +1508,92 @@
       </w:r>
     </w:p>
     <w:bookmarkEnd w:id="40"/>
-    <w:bookmarkStart w:id="44" w:name="X93e79f25c615c32ee4b9e256d95d1fb3cf30497"/>
+    <w:bookmarkStart w:id="41" w:name="Xb0dd392892fe856ae8cc77ef541b39e465bb519"/>
     <w:p>
       <w:pPr>
         <w:pStyle w:val="Heading1"/>
       </w:pPr>
       <w:r>
+        <w:t xml:space="preserve">Why does a cost-based extraction planner fall short of one shared extraction pass?</w:t>
+      </w:r>
+    </w:p>
+    <w:p>
+      <w:pPr>
+        <w:pStyle w:val="FirstParagraph"/>
+      </w:pPr>
+      <w:r>
+        <w:rPr>
+          <w:bCs/>
+          <w:b/>
+        </w:rPr>
+        <w:t xml:space="preserve">The planner estimates its loss as disagreement with each query’s own extraction, which means it treats its own</w:t>
+      </w:r>
+      <w:r>
+        <w:rPr>
+          <w:bCs/>
+          <w:b/>
+        </w:rPr>
+        <w:t xml:space="preserve"> </w:t>
+      </w:r>
+      <w:r>
+        <w:rPr>
+          <w:bCs/>
+          <w:b/>
+        </w:rPr>
+        <w:t xml:space="preserve">extractions as correct.</w:t>
+      </w:r>
+      <w:r>
+        <w:t xml:space="preserve"> </w:t>
+      </w:r>
+      <w:r>
+        <w:t xml:space="preserve">It cannot tell that a shared extraction is more accurate, and once its extractions agree with</w:t>
+      </w:r>
+      <w:r>
+        <w:t xml:space="preserve"> </w:t>
+      </w:r>
+      <w:r>
+        <w:t xml:space="preserve">each other it sees nothing left to gain. It also values columns one at a time, while a missing join key makes the</w:t>
+      </w:r>
+      <w:r>
+        <w:t xml:space="preserve"> </w:t>
+      </w:r>
+      <w:r>
+        <w:t xml:space="preserve">whole query fail. On basketball players its best configuration reaches 0.42, against 0.56 for one shared pass with</w:t>
+      </w:r>
+      <w:r>
+        <w:t xml:space="preserve"> </w:t>
+      </w:r>
+      <w:r>
+        <w:t xml:space="preserve">descriptions. At the full budget it plans only 4.9M of the 10.6M available tokens because its estimated loss is</w:t>
+      </w:r>
+      <w:r>
+        <w:t xml:space="preserve"> </w:t>
+      </w:r>
+      <w:r>
+        <w:t xml:space="preserve">already 0.027 per query.</w:t>
+      </w:r>
+    </w:p>
+    <w:p>
+      <w:pPr>
+        <w:pStyle w:val="BodyText"/>
+      </w:pPr>
+      <w:r>
+        <w:t xml:space="preserve">We know the cause but have not built a planner with a different objective. Such a planner would need some estimate of</w:t>
+      </w:r>
+      <w:r>
+        <w:t xml:space="preserve"> </w:t>
+      </w:r>
+      <w:r>
+        <w:t xml:space="preserve">accuracy, for instance from a small labelled sample or from the disagreement between prompts described above.</w:t>
+      </w:r>
+    </w:p>
+    <w:bookmarkEnd w:id="41"/>
+    <w:bookmarkStart w:id="45" w:name="X93e79f25c615c32ee4b9e256d95d1fb3cf30497"/>
+    <w:p>
+      <w:pPr>
+        <w:pStyle w:val="Heading1"/>
+      </w:pPr>
+      <w:r>
         <w:t xml:space="preserve">Why does DocETL fail on queries that join tables?</w:t>
       </w:r>
     </w:p>
@@ -1295,13 +1608,37 @@
         <w:t xml:space="preserve"> </w:t>
       </w:r>
       <w:r>
-        <w:t xml:space="preserve">without joins to 0.034 with one join and 0.008 with two or more. A join only matches rows whose keys agree, and keys</w:t>
-      </w:r>
-      <w:r>
-        <w:t xml:space="preserve"> </w:t>
-      </w:r>
-      <w:r>
-        <w:t xml:space="preserve">extracted independently mostly do not. In DocETL’s per-query tables, 18% of player rows find their team and 19% of</w:t>
+        <w:t xml:space="preserve">without joins to 0.034 with one join and 0.008 with two or more.</w:t>
+      </w:r>
+      <w:r>
+        <w:t xml:space="preserve"> </w:t>
+      </w:r>
+      <w:r>
+        <w:rPr>
+          <w:bCs/>
+          <w:b/>
+        </w:rPr>
+        <w:t xml:space="preserve">A join only matches rows whose keys agree, and keys</w:t>
+      </w:r>
+      <w:r>
+        <w:rPr>
+          <w:bCs/>
+          <w:b/>
+        </w:rPr>
+        <w:t xml:space="preserve"> </w:t>
+      </w:r>
+      <w:r>
+        <w:rPr>
+          <w:bCs/>
+          <w:b/>
+        </w:rPr>
+        <w:t xml:space="preserve">extracted independently mostly do not.</w:t>
+      </w:r>
+      <w:r>
+        <w:t xml:space="preserve"> </w:t>
+      </w:r>
+      <w:r>
+        <w:t xml:space="preserve">In DocETL’s per-query tables, 18% of player rows find their team and 19% of</w:t>
       </w:r>
       <w:r>
         <w:t xml:space="preserve"> </w:t>
@@ -1331,18 +1668,18 @@
           <wp:inline>
             <wp:extent cx="5334000" cy="2311400"/>
             <wp:effectExtent b="0" l="0" r="0" t="0"/>
-            <wp:docPr descr="Figure 6. Share of rows whose join key finds a partner in the joined table." title="" id="42" name="Picture"/>
+            <wp:docPr descr="Figure 6. Share of rows whose join key finds a partner in the joined table." title="" id="43" name="Picture"/>
             <a:graphic>
               <a:graphicData uri="http://schemas.openxmlformats.org/drawingml/2006/picture">
                 <pic:pic>
                   <pic:nvPicPr>
-                    <pic:cNvPr descr="figures/w5_join_keys.png" id="43" name="Picture"/>
+                    <pic:cNvPr descr="figures/w5_join_keys.png" id="44" name="Picture"/>
                     <pic:cNvPicPr>
                       <a:picLocks noChangeArrowheads="1" noChangeAspect="1"/>
                     </pic:cNvPicPr>
                   </pic:nvPicPr>
                   <pic:blipFill>
-                    <a:blip r:embed="rId41"/>
+                    <a:blip r:embed="rId42"/>
                     <a:stretch>
                       <a:fillRect/>
                     </a:stretch>
@@ -1383,66 +1720,6 @@
       </w:pPr>
       <w:r>
         <w:t xml:space="preserve">Basketball players is the only corpus with joins, so this rests on one corpus.</w:t>
-      </w:r>
-    </w:p>
-    <w:bookmarkEnd w:id="44"/>
-    <w:bookmarkStart w:id="45" w:name="Xb0dd392892fe856ae8cc77ef541b39e465bb519"/>
-    <w:p>
-      <w:pPr>
-        <w:pStyle w:val="Heading1"/>
-      </w:pPr>
-      <w:r>
-        <w:t xml:space="preserve">Why does a cost-based extraction planner fall short of one shared extraction pass?</w:t>
-      </w:r>
-    </w:p>
-    <w:p>
-      <w:pPr>
-        <w:pStyle w:val="FirstParagraph"/>
-      </w:pPr>
-      <w:r>
-        <w:t xml:space="preserve">The planner estimates its loss as disagreement with each query’s own extraction, which means it treats its own</w:t>
-      </w:r>
-      <w:r>
-        <w:t xml:space="preserve"> </w:t>
-      </w:r>
-      <w:r>
-        <w:t xml:space="preserve">extractions as correct. It cannot tell that a shared extraction is more accurate, and once its extractions agree with</w:t>
-      </w:r>
-      <w:r>
-        <w:t xml:space="preserve"> </w:t>
-      </w:r>
-      <w:r>
-        <w:t xml:space="preserve">each other it sees nothing left to gain. It also values columns one at a time, while a missing join key makes the</w:t>
-      </w:r>
-      <w:r>
-        <w:t xml:space="preserve"> </w:t>
-      </w:r>
-      <w:r>
-        <w:t xml:space="preserve">whole query fail. On basketball players its best configuration reaches 0.42, against 0.56 for one shared pass with</w:t>
-      </w:r>
-      <w:r>
-        <w:t xml:space="preserve"> </w:t>
-      </w:r>
-      <w:r>
-        <w:t xml:space="preserve">descriptions. At the full budget it plans only 4.9M of the 10.6M available tokens because its estimated loss is</w:t>
-      </w:r>
-      <w:r>
-        <w:t xml:space="preserve"> </w:t>
-      </w:r>
-      <w:r>
-        <w:t xml:space="preserve">already 0.027 per query. We know the cause but have not built a planner with a different objective. Such a planner</w:t>
-      </w:r>
-      <w:r>
-        <w:t xml:space="preserve"> </w:t>
-      </w:r>
-      <w:r>
-        <w:t xml:space="preserve">would need some estimate of accuracy, for instance from a small labelled sample or from disagreement between prompts</w:t>
-      </w:r>
-      <w:r>
-        <w:t xml:space="preserve"> </w:t>
-      </w:r>
-      <w:r>
-        <w:t xml:space="preserve">as in the previous section.</w:t>
       </w:r>
     </w:p>
     <w:bookmarkEnd w:id="45"/>

</xml_diff>

<commit_message>
Why document: where and why queries fail (query-feature breakdown at every drift level, label collapse in GROUP BY columns, aggregate error direction), example benchmark queries appendix
Co-Authored-By: Claude Opus 5.5 <noreply@anthropic.com>
</commit_message>
<xml_diff>
--- a/results/experiments/why/Key_findings_and_why.docx
+++ b/results/experiments/why/Key_findings_and_why.docx
@@ -329,7 +329,431 @@
       </w:r>
     </w:p>
     <w:bookmarkEnd w:id="23"/>
-    <w:bookmarkStart w:id="27" w:name="X97ef73342c3aa52f2965853d00535c9d087abef"/>
+    <w:bookmarkStart w:id="33" w:name="X758a63c0541663050cb7dc5234ba2f9f81fea09"/>
+    <w:p>
+      <w:pPr>
+        <w:pStyle w:val="Heading1"/>
+      </w:pPr>
+      <w:r>
+        <w:t xml:space="preserve">Why do queries fail, and does it depend on the kind of query?</w:t>
+      </w:r>
+    </w:p>
+    <w:p>
+      <w:pPr>
+        <w:pStyle w:val="FirstParagraph"/>
+      </w:pPr>
+      <w:r>
+        <w:t xml:space="preserve">Looking at individual queries rather than averages,</w:t>
+      </w:r>
+      <w:r>
+        <w:t xml:space="preserve"> </w:t>
+      </w:r>
+      <w:r>
+        <w:rPr>
+          <w:bCs/>
+          <w:b/>
+        </w:rPr>
+        <w:t xml:space="preserve">most failures are the wrong set of groups, and almost always too</w:t>
+      </w:r>
+      <w:r>
+        <w:rPr>
+          <w:bCs/>
+          <w:b/>
+        </w:rPr>
+        <w:t xml:space="preserve"> </w:t>
+      </w:r>
+      <w:r>
+        <w:rPr>
+          <w:bCs/>
+          <w:b/>
+        </w:rPr>
+        <w:t xml:space="preserve">few groups.</w:t>
+      </w:r>
+      <w:r>
+        <w:t xml:space="preserve"> </w:t>
+      </w:r>
+      <w:r>
+        <w:t xml:space="preserve">At 100% drift, 79% of the 290 test queries return groups that differ from the gold answer, 13% return</w:t>
+      </w:r>
+      <w:r>
+        <w:t xml:space="preserve"> </w:t>
+      </w:r>
+      <w:r>
+        <w:t xml:space="preserve">the right groups with wrong values, 4% return no rows and 5% are fully right. More than half of all queries (55%)</w:t>
+      </w:r>
+      <w:r>
+        <w:t xml:space="preserve"> </w:t>
+      </w:r>
+      <w:r>
+        <w:t xml:space="preserve">return fewer groups than the gold answer.</w:t>
+      </w:r>
+    </w:p>
+    <w:p>
+      <w:pPr>
+        <w:pStyle w:val="BodyText"/>
+      </w:pPr>
+      <w:r>
+        <w:rPr>
+          <w:bCs/>
+          <w:b/>
+        </w:rPr>
+        <w:t xml:space="preserve">The groups go missing because extraction collapses labels.</w:t>
+      </w:r>
+      <w:r>
+        <w:t xml:space="preserve"> </w:t>
+      </w:r>
+      <w:r>
+        <w:t xml:space="preserve">For each GROUP BY column we compared the number of</w:t>
+      </w:r>
+      <w:r>
+        <w:t xml:space="preserve"> </w:t>
+      </w:r>
+      <w:r>
+        <w:t xml:space="preserve">distinct values in the extracted table with the number in the gold table. In 59% of these columns the extraction has</w:t>
+      </w:r>
+      <w:r>
+        <w:t xml:space="preserve"> </w:t>
+      </w:r>
+      <w:r>
+        <w:t xml:space="preserve">fewer distinct values, and in only 11% it has more. The collapse is strongest on research papers (median ratio 0.67)</w:t>
+      </w:r>
+      <w:r>
+        <w:t xml:space="preserve"> </w:t>
+      </w:r>
+      <w:r>
+        <w:t xml:space="preserve">and medical documents (0.75), and absent on basketball players and court judgments (1.0), which matches how the</w:t>
+      </w:r>
+      <w:r>
+        <w:t xml:space="preserve"> </w:t>
+      </w:r>
+      <w:r>
+        <w:t xml:space="preserve">corpora rank overall. The more groups a gold answer has, the more of them are missed: 47% of queries with one to</w:t>
+      </w:r>
+      <w:r>
+        <w:t xml:space="preserve"> </w:t>
+      </w:r>
+      <w:r>
+        <w:t xml:space="preserve">three gold groups return too few, against 81% of queries with more than thirty. A label collapses when the model writes</w:t>
+      </w:r>
+      <w:r>
+        <w:t xml:space="preserve"> </w:t>
+      </w:r>
+      <w:r>
+        <w:t xml:space="preserve">several gold categories the same way or leaves the value empty so that the row drops out of every group. We have not</w:t>
+      </w:r>
+      <w:r>
+        <w:t xml:space="preserve"> </w:t>
+      </w:r>
+      <w:r>
+        <w:t xml:space="preserve">yet separated these two cases.</w:t>
+      </w:r>
+    </w:p>
+    <w:p>
+      <w:pPr>
+        <w:pStyle w:val="CaptionedFigure"/>
+      </w:pPr>
+      <w:r>
+        <w:drawing>
+          <wp:inline>
+            <wp:extent cx="5334000" cy="1745672"/>
+            <wp:effectExtent b="0" l="0" r="0" t="0"/>
+            <wp:docPr descr="Figure 2. (a) Distinct values in the extracted GROUP BY column relative to gold. (b) Share of queries returning too few groups, by the number of groups in the gold answer." title="" id="25" name="Picture"/>
+            <a:graphic>
+              <a:graphicData uri="http://schemas.openxmlformats.org/drawingml/2006/picture">
+                <pic:pic>
+                  <pic:nvPicPr>
+                    <pic:cNvPr descr="figures/b7_label_collapse.png" id="26" name="Picture"/>
+                    <pic:cNvPicPr>
+                      <a:picLocks noChangeArrowheads="1" noChangeAspect="1"/>
+                    </pic:cNvPicPr>
+                  </pic:nvPicPr>
+                  <pic:blipFill>
+                    <a:blip r:embed="rId24"/>
+                    <a:stretch>
+                      <a:fillRect/>
+                    </a:stretch>
+                  </pic:blipFill>
+                  <pic:spPr bwMode="auto">
+                    <a:xfrm>
+                      <a:off x="0" y="0"/>
+                      <a:ext cx="5334000" cy="1745672"/>
+                    </a:xfrm>
+                    <a:prstGeom prst="rect">
+                      <a:avLst/>
+                    </a:prstGeom>
+                    <a:noFill/>
+                    <a:ln w="9525">
+                      <a:noFill/>
+                      <a:headEnd/>
+                      <a:tailEnd/>
+                    </a:ln>
+                  </pic:spPr>
+                </pic:pic>
+              </a:graphicData>
+            </a:graphic>
+          </wp:inline>
+        </w:drawing>
+      </w:r>
+    </w:p>
+    <w:p>
+      <w:pPr>
+        <w:pStyle w:val="ImageCaption"/>
+      </w:pPr>
+      <w:r>
+        <w:t xml:space="preserve">Figure 2. (a) Distinct values in the extracted GROUP BY column relative to gold. (b) Share of queries returning too</w:t>
+      </w:r>
+      <w:r>
+        <w:t xml:space="preserve"> </w:t>
+      </w:r>
+      <w:r>
+        <w:t xml:space="preserve">few groups, by the number of groups in the gold answer.</w:t>
+      </w:r>
+    </w:p>
+    <w:p>
+      <w:pPr>
+        <w:pStyle w:val="BodyText"/>
+      </w:pPr>
+      <w:r>
+        <w:t xml:space="preserve">The aggregate matters as much as the grouping. AVG queries score 0.38, SUM and MIN 0.32, COUNT 0.21 and MAX 0.17, and</w:t>
+      </w:r>
+      <w:r>
+        <w:t xml:space="preserve"> </w:t>
+      </w:r>
+      <w:r>
+        <w:rPr>
+          <w:bCs/>
+          <w:b/>
+        </w:rPr>
+        <w:t xml:space="preserve">this ordering is the same at every drift level</w:t>
+      </w:r>
+      <w:r>
+        <w:t xml:space="preserve">, so it is a property of the aggregate rather than of drift. It</w:t>
+      </w:r>
+      <w:r>
+        <w:t xml:space="preserve"> </w:t>
+      </w:r>
+      <w:r>
+        <w:t xml:space="preserve">follows from how each aggregate reacts to one wrong or missing row. We matched predicted and gold groups by their keys</w:t>
+      </w:r>
+      <w:r>
+        <w:t xml:space="preserve"> </w:t>
+      </w:r>
+      <w:r>
+        <w:t xml:space="preserve">and compared the aggregate values. Averages and sums are within 20% of gold in 54% and 63% of groups because</w:t>
+      </w:r>
+      <w:r>
+        <w:t xml:space="preserve"> </w:t>
+      </w:r>
+      <w:r>
+        <w:t xml:space="preserve">individual errors partly cancel. MIN is within 20% in 78% of groups and almost never too low (2%): extraction rarely</w:t>
+      </w:r>
+      <w:r>
+        <w:t xml:space="preserve"> </w:t>
+      </w:r>
+      <w:r>
+        <w:t xml:space="preserve">produces a value smaller than the true minimum, so a minimum only goes wrong when its row is missing. MAX is wrong in</w:t>
+      </w:r>
+      <w:r>
+        <w:t xml:space="preserve"> </w:t>
+      </w:r>
+      <w:r>
+        <w:t xml:space="preserve">both directions (21% too high, 20% too low), because one inflated value anywhere in the group becomes the maximum.</w:t>
+      </w:r>
+      <w:r>
+        <w:t xml:space="preserve"> </w:t>
+      </w:r>
+      <w:r>
+        <w:t xml:space="preserve">COUNT is within 20% in only 42% of groups, too low in 33% and too high in 25%, because every row whose label is</w:t>
+      </w:r>
+      <w:r>
+        <w:t xml:space="preserve"> </w:t>
+      </w:r>
+      <w:r>
+        <w:t xml:space="preserve">missing or merged moves a count. That is the same label collapse as above.</w:t>
+      </w:r>
+    </w:p>
+    <w:p>
+      <w:pPr>
+        <w:pStyle w:val="CaptionedFigure"/>
+      </w:pPr>
+      <w:r>
+        <w:drawing>
+          <wp:inline>
+            <wp:extent cx="5334000" cy="1891145"/>
+            <wp:effectExtent b="0" l="0" r="0" t="0"/>
+            <wp:docPr descr="Figure 3. Mean score by aggregate across drift levels, with on-demand extraction (a) and the static build (b)." title="" id="28" name="Picture"/>
+            <a:graphic>
+              <a:graphicData uri="http://schemas.openxmlformats.org/drawingml/2006/picture">
+                <pic:pic>
+                  <pic:nvPicPr>
+                    <pic:cNvPr descr="figures/b1_aggregate_drift.png" id="29" name="Picture"/>
+                    <pic:cNvPicPr>
+                      <a:picLocks noChangeArrowheads="1" noChangeAspect="1"/>
+                    </pic:cNvPicPr>
+                  </pic:nvPicPr>
+                  <pic:blipFill>
+                    <a:blip r:embed="rId27"/>
+                    <a:stretch>
+                      <a:fillRect/>
+                    </a:stretch>
+                  </pic:blipFill>
+                  <pic:spPr bwMode="auto">
+                    <a:xfrm>
+                      <a:off x="0" y="0"/>
+                      <a:ext cx="5334000" cy="1891145"/>
+                    </a:xfrm>
+                    <a:prstGeom prst="rect">
+                      <a:avLst/>
+                    </a:prstGeom>
+                    <a:noFill/>
+                    <a:ln w="9525">
+                      <a:noFill/>
+                      <a:headEnd/>
+                      <a:tailEnd/>
+                    </a:ln>
+                  </pic:spPr>
+                </pic:pic>
+              </a:graphicData>
+            </a:graphic>
+          </wp:inline>
+        </w:drawing>
+      </w:r>
+    </w:p>
+    <w:p>
+      <w:pPr>
+        <w:pStyle w:val="ImageCaption"/>
+      </w:pPr>
+      <w:r>
+        <w:t xml:space="preserve">Figure 3. Mean score by aggregate across drift levels, with on-demand extraction (a) and the static build</w:t>
+      </w:r>
+      <w:r>
+        <w:t xml:space="preserve"> </w:t>
+      </w:r>
+      <w:r>
+        <w:t xml:space="preserve">(b).</w:t>
+      </w:r>
+    </w:p>
+    <w:p>
+      <w:pPr>
+        <w:pStyle w:val="CaptionedFigure"/>
+      </w:pPr>
+      <w:r>
+        <w:drawing>
+          <wp:inline>
+            <wp:extent cx="5334000" cy="1909010"/>
+            <wp:effectExtent b="0" l="0" r="0" t="0"/>
+            <wp:docPr descr="Figure 4. Aggregate values in matched groups at 100% drift: too low, within 20% of gold, or too high." title="" id="31" name="Picture"/>
+            <a:graphic>
+              <a:graphicData uri="http://schemas.openxmlformats.org/drawingml/2006/picture">
+                <pic:pic>
+                  <pic:nvPicPr>
+                    <pic:cNvPr descr="figures/b6_aggregate_direction.png" id="32" name="Picture"/>
+                    <pic:cNvPicPr>
+                      <a:picLocks noChangeArrowheads="1" noChangeAspect="1"/>
+                    </pic:cNvPicPr>
+                  </pic:nvPicPr>
+                  <pic:blipFill>
+                    <a:blip r:embed="rId30"/>
+                    <a:stretch>
+                      <a:fillRect/>
+                    </a:stretch>
+                  </pic:blipFill>
+                  <pic:spPr bwMode="auto">
+                    <a:xfrm>
+                      <a:off x="0" y="0"/>
+                      <a:ext cx="5334000" cy="1909010"/>
+                    </a:xfrm>
+                    <a:prstGeom prst="rect">
+                      <a:avLst/>
+                    </a:prstGeom>
+                    <a:noFill/>
+                    <a:ln w="9525">
+                      <a:noFill/>
+                      <a:headEnd/>
+                      <a:tailEnd/>
+                    </a:ln>
+                  </pic:spPr>
+                </pic:pic>
+              </a:graphicData>
+            </a:graphic>
+          </wp:inline>
+        </w:drawing>
+      </w:r>
+    </w:p>
+    <w:p>
+      <w:pPr>
+        <w:pStyle w:val="ImageCaption"/>
+      </w:pPr>
+      <w:r>
+        <w:t xml:space="preserve">Figure 4. Aggregate values in matched groups at 100% drift: too low, within 20% of gold, or too</w:t>
+      </w:r>
+      <w:r>
+        <w:t xml:space="preserve"> </w:t>
+      </w:r>
+      <w:r>
+        <w:t xml:space="preserve">high.</w:t>
+      </w:r>
+    </w:p>
+    <w:p>
+      <w:pPr>
+        <w:pStyle w:val="BodyText"/>
+      </w:pPr>
+      <w:r>
+        <w:t xml:space="preserve">Filters and joins follow the same logic. Queries with no filter score lowest (0.23, against 0.29 with one filter),</w:t>
+      </w:r>
+      <w:r>
+        <w:t xml:space="preserve"> </w:t>
+      </w:r>
+      <w:r>
+        <w:t xml:space="preserve">and 113 of the 119 have wrong groups: without a filter the query groups the whole corpus, so many more groups have to</w:t>
+      </w:r>
+      <w:r>
+        <w:t xml:space="preserve"> </w:t>
+      </w:r>
+      <w:r>
+        <w:t xml:space="preserve">come out right. With three or more filters the score drops again (0.21), since each condition depends on another</w:t>
+      </w:r>
+      <w:r>
+        <w:t xml:space="preserve"> </w:t>
+      </w:r>
+      <w:r>
+        <w:t xml:space="preserve">extracted column and the errors compound. Queries with joins score higher (0.30 with one join, 0.38 with two or more),</w:t>
+      </w:r>
+      <w:r>
+        <w:t xml:space="preserve"> </w:t>
+      </w:r>
+      <w:r>
+        <w:t xml:space="preserve">but all of them are on basketball players, the easiest corpus. Within that corpus the scores are 0.37, 0.44 and 0.38</w:t>
+      </w:r>
+      <w:r>
+        <w:t xml:space="preserve"> </w:t>
+      </w:r>
+      <w:r>
+        <w:t xml:space="preserve">for zero, one and two or more joins, so joins do not hurt this system, because keys are extracted once and</w:t>
+      </w:r>
+      <w:r>
+        <w:t xml:space="preserve"> </w:t>
+      </w:r>
+      <w:r>
+        <w:t xml:space="preserve">consistently (see the DocETL section).</w:t>
+      </w:r>
+    </w:p>
+    <w:p>
+      <w:pPr>
+        <w:pStyle w:val="BodyText"/>
+      </w:pPr>
+      <w:r>
+        <w:t xml:space="preserve">These patterns are correlational and partly confounded by corpus: joins occur only on basketball players, and the</w:t>
+      </w:r>
+      <w:r>
+        <w:t xml:space="preserve"> </w:t>
+      </w:r>
+      <w:r>
+        <w:t xml:space="preserve">corpora differ in how many groups their queries have.</w:t>
+      </w:r>
+    </w:p>
+    <w:bookmarkEnd w:id="33"/>
+    <w:bookmarkStart w:id="37" w:name="X97ef73342c3aa52f2965853d00535c9d087abef"/>
     <w:p>
       <w:pPr>
         <w:pStyle w:val="Heading1"/>
@@ -779,18 +1203,18 @@
           <wp:inline>
             <wp:extent cx="5334000" cy="2085109"/>
             <wp:effectExtent b="0" l="0" r="0" t="0"/>
-            <wp:docPr descr="Figure 2. Left: composition of one extraction prompt at each corpus’s median document length. Right: predicted and measured break-even probability." title="" id="25" name="Picture"/>
+            <wp:docPr descr="Figure 5. Left: composition of one extraction prompt at each corpus’s median document length. Right: predicted and measured break-even probability." title="" id="35" name="Picture"/>
             <a:graphic>
               <a:graphicData uri="http://schemas.openxmlformats.org/drawingml/2006/picture">
                 <pic:pic>
                   <pic:nvPicPr>
-                    <pic:cNvPr descr="figures/w2_cost_mechanism.png" id="26" name="Picture"/>
+                    <pic:cNvPr descr="figures/w2_cost_mechanism.png" id="36" name="Picture"/>
                     <pic:cNvPicPr>
                       <a:picLocks noChangeArrowheads="1" noChangeAspect="1"/>
                     </pic:cNvPicPr>
                   </pic:nvPicPr>
                   <pic:blipFill>
-                    <a:blip r:embed="rId24"/>
+                    <a:blip r:embed="rId34"/>
                     <a:stretch>
                       <a:fillRect/>
                     </a:stretch>
@@ -822,7 +1246,7 @@
         <w:pStyle w:val="ImageCaption"/>
       </w:pPr>
       <w:r>
-        <w:t xml:space="preserve">Figure 2. Left: composition of one extraction prompt at each corpus’s median document length. Right: predicted and</w:t>
+        <w:t xml:space="preserve">Figure 5. Left: composition of one extraction prompt at each corpus’s median document length. Right: predicted and</w:t>
       </w:r>
       <w:r>
         <w:t xml:space="preserve"> </w:t>
@@ -851,8 +1275,8 @@
         <w:t xml:space="preserve">most.</w:t>
       </w:r>
     </w:p>
-    <w:bookmarkEnd w:id="27"/>
-    <w:bookmarkStart w:id="31" w:name="X8d33c7e4010610f0e71f57229664c1d470db2b4"/>
+    <w:bookmarkEnd w:id="37"/>
+    <w:bookmarkStart w:id="41" w:name="X8d33c7e4010610f0e71f57229664c1d470db2b4"/>
     <w:p>
       <w:pPr>
         <w:pStyle w:val="Heading1"/>
@@ -918,18 +1342,18 @@
           <wp:inline>
             <wp:extent cx="5334000" cy="2021305"/>
             <wp:effectExtent b="0" l="0" r="0" t="0"/>
-            <wp:docPr descr="Figure 3. Share of each extraction’s score gain that goes to its own query and to later queries." title="" id="29" name="Picture"/>
+            <wp:docPr descr="Figure 6. Share of each extraction’s score gain that goes to its own query and to later queries." title="" id="39" name="Picture"/>
             <a:graphic>
               <a:graphicData uri="http://schemas.openxmlformats.org/drawingml/2006/picture">
                 <pic:pic>
                   <pic:nvPicPr>
-                    <pic:cNvPr descr="figures/w3_value_timing.png" id="30" name="Picture"/>
+                    <pic:cNvPr descr="figures/w3_value_timing.png" id="40" name="Picture"/>
                     <pic:cNvPicPr>
                       <a:picLocks noChangeArrowheads="1" noChangeAspect="1"/>
                     </pic:cNvPicPr>
                   </pic:nvPicPr>
                   <pic:blipFill>
-                    <a:blip r:embed="rId28"/>
+                    <a:blip r:embed="rId38"/>
                     <a:stretch>
                       <a:fillRect/>
                     </a:stretch>
@@ -961,7 +1385,7 @@
         <w:pStyle w:val="ImageCaption"/>
       </w:pPr>
       <w:r>
-        <w:t xml:space="preserve">Figure 3. Share of each extraction’s score gain that goes to its own query and to later</w:t>
+        <w:t xml:space="preserve">Figure 6. Share of each extraction’s score gain that goes to its own query and to later</w:t>
       </w:r>
       <w:r>
         <w:t xml:space="preserve"> </w:t>
@@ -1022,8 +1446,8 @@
         <w:t xml:space="preserve">have a true upper bound for budget policies.</w:t>
       </w:r>
     </w:p>
-    <w:bookmarkEnd w:id="31"/>
-    <w:bookmarkStart w:id="35" w:name="X88548670784a613c2590b69f6231fd2908a553f"/>
+    <w:bookmarkEnd w:id="41"/>
+    <w:bookmarkStart w:id="45" w:name="X88548670784a613c2590b69f6231fd2908a553f"/>
     <w:p>
       <w:pPr>
         <w:pStyle w:val="Heading1"/>
@@ -1121,18 +1545,18 @@
           <wp:inline>
             <wp:extent cx="5334000" cy="2189747"/>
             <wp:effectExtent b="0" l="0" r="0" t="0"/>
-            <wp:docPr descr="Figure 4. Share of cells correct with and without field descriptions." title="" id="33" name="Picture"/>
+            <wp:docPr descr="Figure 7. Share of cells correct with and without field descriptions." title="" id="43" name="Picture"/>
             <a:graphic>
               <a:graphicData uri="http://schemas.openxmlformats.org/drawingml/2006/picture">
                 <pic:pic>
                   <pic:nvPicPr>
-                    <pic:cNvPr descr="figures/w6_specification.png" id="34" name="Picture"/>
+                    <pic:cNvPr descr="figures/w6_specification.png" id="44" name="Picture"/>
                     <pic:cNvPicPr>
                       <a:picLocks noChangeArrowheads="1" noChangeAspect="1"/>
                     </pic:cNvPicPr>
                   </pic:nvPicPr>
                   <pic:blipFill>
-                    <a:blip r:embed="rId32"/>
+                    <a:blip r:embed="rId42"/>
                     <a:stretch>
                       <a:fillRect/>
                     </a:stretch>
@@ -1164,7 +1588,7 @@
         <w:pStyle w:val="ImageCaption"/>
       </w:pPr>
       <w:r>
-        <w:t xml:space="preserve">Figure 4. Share of cells correct with and without field descriptions.</w:t>
+        <w:t xml:space="preserve">Figure 7. Share of cells correct with and without field descriptions.</w:t>
       </w:r>
     </w:p>
     <w:p>
@@ -1193,8 +1617,8 @@
         <w:t xml:space="preserve">causal test of rewriting ambiguous descriptions and measuring the gain.</w:t>
       </w:r>
     </w:p>
-    <w:bookmarkEnd w:id="35"/>
-    <w:bookmarkStart w:id="39" w:name="X732acf2ae867a4468d7656a751557829cb16487"/>
+    <w:bookmarkEnd w:id="45"/>
+    <w:bookmarkStart w:id="49" w:name="X732acf2ae867a4468d7656a751557829cb16487"/>
     <w:p>
       <w:pPr>
         <w:pStyle w:val="Heading1"/>
@@ -1318,18 +1742,18 @@
           <wp:inline>
             <wp:extent cx="5334000" cy="2582778"/>
             <wp:effectExtent b="0" l="0" r="0" t="0"/>
-            <wp:docPr descr="Figure 5. Disagreement between two prompts against accuracy, one point per column." title="" id="37" name="Picture"/>
+            <wp:docPr descr="Figure 8. Disagreement between two prompts against accuracy, one point per column." title="" id="47" name="Picture"/>
             <a:graphic>
               <a:graphicData uri="http://schemas.openxmlformats.org/drawingml/2006/picture">
                 <pic:pic>
                   <pic:nvPicPr>
-                    <pic:cNvPr descr="figures/w4_determinacy.png" id="38" name="Picture"/>
+                    <pic:cNvPr descr="figures/w4_determinacy.png" id="48" name="Picture"/>
                     <pic:cNvPicPr>
                       <a:picLocks noChangeArrowheads="1" noChangeAspect="1"/>
                     </pic:cNvPicPr>
                   </pic:nvPicPr>
                   <pic:blipFill>
-                    <a:blip r:embed="rId36"/>
+                    <a:blip r:embed="rId46"/>
                     <a:stretch>
                       <a:fillRect/>
                     </a:stretch>
@@ -1361,7 +1785,7 @@
         <w:pStyle w:val="ImageCaption"/>
       </w:pPr>
       <w:r>
-        <w:t xml:space="preserve">Figure 5. Disagreement between two prompts against accuracy, one point per column.</w:t>
+        <w:t xml:space="preserve">Figure 8. Disagreement between two prompts against accuracy, one point per column.</w:t>
       </w:r>
     </w:p>
     <w:p>
@@ -1408,8 +1832,8 @@
         <w:t xml:space="preserve">look, before any gold data exists.</w:t>
       </w:r>
     </w:p>
-    <w:bookmarkEnd w:id="39"/>
-    <w:bookmarkStart w:id="40" w:name="Xbd5cb092345892faad08ce8e3e52d3f9d449dcf"/>
+    <w:bookmarkEnd w:id="49"/>
+    <w:bookmarkStart w:id="50" w:name="Xbd5cb092345892faad08ce8e3e52d3f9d449dcf"/>
     <w:p>
       <w:pPr>
         <w:pStyle w:val="Heading1"/>
@@ -1507,8 +1931,8 @@
         <w:t xml:space="preserve">controlled way.</w:t>
       </w:r>
     </w:p>
-    <w:bookmarkEnd w:id="40"/>
-    <w:bookmarkStart w:id="41" w:name="Xb0dd392892fe856ae8cc77ef541b39e465bb519"/>
+    <w:bookmarkEnd w:id="50"/>
+    <w:bookmarkStart w:id="51" w:name="Xb0dd392892fe856ae8cc77ef541b39e465bb519"/>
     <w:p>
       <w:pPr>
         <w:pStyle w:val="Heading1"/>
@@ -1587,8 +2011,8 @@
         <w:t xml:space="preserve">accuracy, for instance from a small labelled sample or from the disagreement between prompts described above.</w:t>
       </w:r>
     </w:p>
-    <w:bookmarkEnd w:id="41"/>
-    <w:bookmarkStart w:id="45" w:name="X93e79f25c615c32ee4b9e256d95d1fb3cf30497"/>
+    <w:bookmarkEnd w:id="51"/>
+    <w:bookmarkStart w:id="55" w:name="X93e79f25c615c32ee4b9e256d95d1fb3cf30497"/>
     <w:p>
       <w:pPr>
         <w:pStyle w:val="Heading1"/>
@@ -1668,18 +2092,18 @@
           <wp:inline>
             <wp:extent cx="5334000" cy="2311400"/>
             <wp:effectExtent b="0" l="0" r="0" t="0"/>
-            <wp:docPr descr="Figure 6. Share of rows whose join key finds a partner in the joined table." title="" id="43" name="Picture"/>
+            <wp:docPr descr="Figure 9. Share of rows whose join key finds a partner in the joined table." title="" id="53" name="Picture"/>
             <a:graphic>
               <a:graphicData uri="http://schemas.openxmlformats.org/drawingml/2006/picture">
                 <pic:pic>
                   <pic:nvPicPr>
-                    <pic:cNvPr descr="figures/w5_join_keys.png" id="44" name="Picture"/>
+                    <pic:cNvPr descr="figures/w5_join_keys.png" id="54" name="Picture"/>
                     <pic:cNvPicPr>
                       <a:picLocks noChangeArrowheads="1" noChangeAspect="1"/>
                     </pic:cNvPicPr>
                   </pic:nvPicPr>
                   <pic:blipFill>
-                    <a:blip r:embed="rId42"/>
+                    <a:blip r:embed="rId52"/>
                     <a:stretch>
                       <a:fillRect/>
                     </a:stretch>
@@ -1711,7 +2135,7 @@
         <w:pStyle w:val="ImageCaption"/>
       </w:pPr>
       <w:r>
-        <w:t xml:space="preserve">Figure 6. Share of rows whose join key finds a partner in the joined table.</w:t>
+        <w:t xml:space="preserve">Figure 9. Share of rows whose join key finds a partner in the joined table.</w:t>
       </w:r>
     </w:p>
     <w:p>
@@ -1722,8 +2146,8 @@
         <w:t xml:space="preserve">Basketball players is the only corpus with joins, so this rests on one corpus.</w:t>
       </w:r>
     </w:p>
-    <w:bookmarkEnd w:id="45"/>
-    <w:bookmarkStart w:id="46" w:name="open-questions"/>
+    <w:bookmarkEnd w:id="55"/>
+    <w:bookmarkStart w:id="56" w:name="open-questions"/>
     <w:p>
       <w:pPr>
         <w:pStyle w:val="Heading1"/>
@@ -1764,8 +2188,8 @@
         <w:t xml:space="preserve">tested beyond five corpora and three models, or on a different split of the workload into known and later queries.</w:t>
       </w:r>
     </w:p>
-    <w:bookmarkEnd w:id="46"/>
-    <w:bookmarkStart w:id="47" w:name="methods"/>
+    <w:bookmarkEnd w:id="56"/>
+    <w:bookmarkStart w:id="57" w:name="methods"/>
     <w:p>
       <w:pPr>
         <w:pStyle w:val="Heading1"/>
@@ -1821,10 +2245,3839 @@
         <w:t xml:space="preserve"> </w:t>
       </w:r>
       <w:r>
-        <w:t xml:space="preserve">checks, for each basketball-player query with a join, how many rows’ keys appear in the joined table.</w:t>
-      </w:r>
-    </w:p>
-    <w:bookmarkEnd w:id="47"/>
+        <w:t xml:space="preserve">checks, for each basketball-player query with a join, how many rows’ keys appear in the joined table. The query</w:t>
+      </w:r>
+      <w:r>
+        <w:t xml:space="preserve"> </w:t>
+      </w:r>
+      <w:r>
+        <w:t xml:space="preserve">breakdown uses, for every test query and drift level, its structure and value scores and its predicted and gold row</w:t>
+      </w:r>
+      <w:r>
+        <w:t xml:space="preserve"> </w:t>
+      </w:r>
+      <w:r>
+        <w:t xml:space="preserve">counts; the label analysis counts distinct values per GROUP BY column in the served and gold tables, and the aggregate</w:t>
+      </w:r>
+      <w:r>
+        <w:t xml:space="preserve"> </w:t>
+      </w:r>
+      <w:r>
+        <w:t xml:space="preserve">analysis runs each query on both and compares values in groups matched by key.</w:t>
+      </w:r>
+    </w:p>
+    <w:bookmarkEnd w:id="57"/>
+    <w:bookmarkStart w:id="63" w:name="appendix-example-test-queries"/>
+    <w:p>
+      <w:pPr>
+        <w:pStyle w:val="Heading1"/>
+      </w:pPr>
+      <w:r>
+        <w:t xml:space="preserve">Appendix: example test queries</w:t>
+      </w:r>
+    </w:p>
+    <w:p>
+      <w:pPr>
+        <w:pStyle w:val="FirstParagraph"/>
+      </w:pPr>
+      <w:r>
+        <w:t xml:space="preserve">Each test query is a benchmark query with one column replaced by a column the build did not read. A few per corpus, chosen to cover the aggregates and, where the corpus has them, joins and several filter conditions.</w:t>
+      </w:r>
+    </w:p>
+    <w:bookmarkStart w:id="58" w:name="research-papers-59-test-queries"/>
+    <w:p>
+      <w:pPr>
+        <w:pStyle w:val="Heading2"/>
+      </w:pPr>
+      <w:r>
+        <w:t xml:space="preserve">Research papers (59 test queries)</w:t>
+      </w:r>
+    </w:p>
+    <w:p>
+      <w:pPr>
+        <w:pStyle w:val="SourceCode"/>
+      </w:pPr>
+      <w:r>
+        <w:rPr>
+          <w:rStyle w:val="KeywordTok"/>
+        </w:rPr>
+        <w:t xml:space="preserve">SELECT</w:t>
+      </w:r>
+      <w:r>
+        <w:rPr>
+          <w:rStyle w:val="NormalTok"/>
+        </w:rPr>
+        <w:t xml:space="preserve"> performance_on_NQ, </w:t>
+      </w:r>
+      <w:r>
+        <w:rPr>
+          <w:rStyle w:val="FunctionTok"/>
+        </w:rPr>
+        <w:t xml:space="preserve">COUNT</w:t>
+      </w:r>
+      <w:r>
+        <w:rPr>
+          <w:rStyle w:val="NormalTok"/>
+        </w:rPr>
+        <w:t xml:space="preserve">(paper_name) </w:t>
+      </w:r>
+      <w:r>
+        <w:rPr>
+          <w:rStyle w:val="KeywordTok"/>
+        </w:rPr>
+        <w:t xml:space="preserve">AS</w:t>
+      </w:r>
+      <w:r>
+        <w:rPr>
+          <w:rStyle w:val="NormalTok"/>
+        </w:rPr>
+        <w:t xml:space="preserve"> count_papers </w:t>
+      </w:r>
+      <w:r>
+        <w:rPr>
+          <w:rStyle w:val="KeywordTok"/>
+        </w:rPr>
+        <w:t xml:space="preserve">FROM</w:t>
+      </w:r>
+      <w:r>
+        <w:rPr>
+          <w:rStyle w:val="NormalTok"/>
+        </w:rPr>
+        <w:t xml:space="preserve"> cspaper </w:t>
+      </w:r>
+      <w:r>
+        <w:rPr>
+          <w:rStyle w:val="KeywordTok"/>
+        </w:rPr>
+        <w:t xml:space="preserve">WHERE</w:t>
+      </w:r>
+      <w:r>
+        <w:rPr>
+          <w:rStyle w:val="NormalTok"/>
+        </w:rPr>
+        <w:t xml:space="preserve"> uses_reranker </w:t>
+      </w:r>
+      <w:r>
+        <w:rPr>
+          <w:rStyle w:val="OperatorTok"/>
+        </w:rPr>
+        <w:t xml:space="preserve">=</w:t>
+      </w:r>
+      <w:r>
+        <w:rPr>
+          <w:rStyle w:val="NormalTok"/>
+        </w:rPr>
+        <w:t xml:space="preserve"> </w:t>
+      </w:r>
+      <w:r>
+        <w:rPr>
+          <w:rStyle w:val="StringTok"/>
+        </w:rPr>
+        <w:t xml:space="preserve">'Yes'</w:t>
+      </w:r>
+      <w:r>
+        <w:rPr>
+          <w:rStyle w:val="NormalTok"/>
+        </w:rPr>
+        <w:t xml:space="preserve"> </w:t>
+      </w:r>
+      <w:r>
+        <w:rPr>
+          <w:rStyle w:val="KeywordTok"/>
+        </w:rPr>
+        <w:t xml:space="preserve">GROUP</w:t>
+      </w:r>
+      <w:r>
+        <w:rPr>
+          <w:rStyle w:val="NormalTok"/>
+        </w:rPr>
+        <w:t xml:space="preserve"> </w:t>
+      </w:r>
+      <w:r>
+        <w:rPr>
+          <w:rStyle w:val="KeywordTok"/>
+        </w:rPr>
+        <w:t xml:space="preserve">BY</w:t>
+      </w:r>
+      <w:r>
+        <w:rPr>
+          <w:rStyle w:val="NormalTok"/>
+        </w:rPr>
+        <w:t xml:space="preserve"> performance_on_NQ</w:t>
+      </w:r>
+    </w:p>
+    <w:p>
+      <w:pPr>
+        <w:pStyle w:val="SourceCode"/>
+      </w:pPr>
+      <w:r>
+        <w:rPr>
+          <w:rStyle w:val="KeywordTok"/>
+        </w:rPr>
+        <w:t xml:space="preserve">SELECT</w:t>
+      </w:r>
+      <w:r>
+        <w:rPr>
+          <w:rStyle w:val="NormalTok"/>
+        </w:rPr>
+        <w:t xml:space="preserve"> retrieval_method, </w:t>
+      </w:r>
+      <w:r>
+        <w:rPr>
+          <w:rStyle w:val="FunctionTok"/>
+        </w:rPr>
+        <w:t xml:space="preserve">SUM</w:t>
+      </w:r>
+      <w:r>
+        <w:rPr>
+          <w:rStyle w:val="NormalTok"/>
+        </w:rPr>
+        <w:t xml:space="preserve">(baseline_amount) </w:t>
+      </w:r>
+      <w:r>
+        <w:rPr>
+          <w:rStyle w:val="KeywordTok"/>
+        </w:rPr>
+        <w:t xml:space="preserve">AS</w:t>
+      </w:r>
+      <w:r>
+        <w:rPr>
+          <w:rStyle w:val="NormalTok"/>
+        </w:rPr>
+        <w:t xml:space="preserve"> sum_baseline_amount </w:t>
+      </w:r>
+      <w:r>
+        <w:rPr>
+          <w:rStyle w:val="KeywordTok"/>
+        </w:rPr>
+        <w:t xml:space="preserve">FROM</w:t>
+      </w:r>
+      <w:r>
+        <w:rPr>
+          <w:rStyle w:val="NormalTok"/>
+        </w:rPr>
+        <w:t xml:space="preserve"> cspaper </w:t>
+      </w:r>
+      <w:r>
+        <w:rPr>
+          <w:rStyle w:val="KeywordTok"/>
+        </w:rPr>
+        <w:t xml:space="preserve">WHERE</w:t>
+      </w:r>
+      <w:r>
+        <w:rPr>
+          <w:rStyle w:val="NormalTok"/>
+        </w:rPr>
+        <w:t xml:space="preserve"> uses_reranker </w:t>
+      </w:r>
+      <w:r>
+        <w:rPr>
+          <w:rStyle w:val="OperatorTok"/>
+        </w:rPr>
+        <w:t xml:space="preserve">=</w:t>
+      </w:r>
+      <w:r>
+        <w:rPr>
+          <w:rStyle w:val="NormalTok"/>
+        </w:rPr>
+        <w:t xml:space="preserve"> </w:t>
+      </w:r>
+      <w:r>
+        <w:rPr>
+          <w:rStyle w:val="StringTok"/>
+        </w:rPr>
+        <w:t xml:space="preserve">'No'</w:t>
+      </w:r>
+      <w:r>
+        <w:rPr>
+          <w:rStyle w:val="NormalTok"/>
+        </w:rPr>
+        <w:t xml:space="preserve"> </w:t>
+      </w:r>
+      <w:r>
+        <w:rPr>
+          <w:rStyle w:val="KeywordTok"/>
+        </w:rPr>
+        <w:t xml:space="preserve">OR</w:t>
+      </w:r>
+      <w:r>
+        <w:rPr>
+          <w:rStyle w:val="NormalTok"/>
+        </w:rPr>
+        <w:t xml:space="preserve"> performance_on_hotpotqa </w:t>
+      </w:r>
+      <w:r>
+        <w:rPr>
+          <w:rStyle w:val="OperatorTok"/>
+        </w:rPr>
+        <w:t xml:space="preserve">=</w:t>
+      </w:r>
+      <w:r>
+        <w:rPr>
+          <w:rStyle w:val="NormalTok"/>
+        </w:rPr>
+        <w:t xml:space="preserve"> </w:t>
+      </w:r>
+      <w:r>
+        <w:rPr>
+          <w:rStyle w:val="StringTok"/>
+        </w:rPr>
+        <w:t xml:space="preserve">'F1: 62.2'</w:t>
+      </w:r>
+      <w:r>
+        <w:rPr>
+          <w:rStyle w:val="NormalTok"/>
+        </w:rPr>
+        <w:t xml:space="preserve"> </w:t>
+      </w:r>
+      <w:r>
+        <w:rPr>
+          <w:rStyle w:val="KeywordTok"/>
+        </w:rPr>
+        <w:t xml:space="preserve">OR</w:t>
+      </w:r>
+      <w:r>
+        <w:rPr>
+          <w:rStyle w:val="NormalTok"/>
+        </w:rPr>
+        <w:t xml:space="preserve"> baseline </w:t>
+      </w:r>
+      <w:r>
+        <w:rPr>
+          <w:rStyle w:val="OperatorTok"/>
+        </w:rPr>
+        <w:t xml:space="preserve">=</w:t>
+      </w:r>
+      <w:r>
+        <w:rPr>
+          <w:rStyle w:val="NormalTok"/>
+        </w:rPr>
+        <w:t xml:space="preserve"> </w:t>
+      </w:r>
+      <w:r>
+        <w:rPr>
+          <w:rStyle w:val="StringTok"/>
+        </w:rPr>
+        <w:t xml:space="preserve">'Traditional RAG'</w:t>
+      </w:r>
+      <w:r>
+        <w:rPr>
+          <w:rStyle w:val="NormalTok"/>
+        </w:rPr>
+        <w:t xml:space="preserve"> </w:t>
+      </w:r>
+      <w:r>
+        <w:rPr>
+          <w:rStyle w:val="KeywordTok"/>
+        </w:rPr>
+        <w:t xml:space="preserve">GROUP</w:t>
+      </w:r>
+      <w:r>
+        <w:rPr>
+          <w:rStyle w:val="NormalTok"/>
+        </w:rPr>
+        <w:t xml:space="preserve"> </w:t>
+      </w:r>
+      <w:r>
+        <w:rPr>
+          <w:rStyle w:val="KeywordTok"/>
+        </w:rPr>
+        <w:t xml:space="preserve">BY</w:t>
+      </w:r>
+      <w:r>
+        <w:rPr>
+          <w:rStyle w:val="NormalTok"/>
+        </w:rPr>
+        <w:t xml:space="preserve"> retrieval_method</w:t>
+      </w:r>
+    </w:p>
+    <w:p>
+      <w:pPr>
+        <w:pStyle w:val="SourceCode"/>
+      </w:pPr>
+      <w:r>
+        <w:rPr>
+          <w:rStyle w:val="KeywordTok"/>
+        </w:rPr>
+        <w:t xml:space="preserve">SELECT</w:t>
+      </w:r>
+      <w:r>
+        <w:rPr>
+          <w:rStyle w:val="NormalTok"/>
+        </w:rPr>
+        <w:t xml:space="preserve"> agent_framework, </w:t>
+      </w:r>
+      <w:r>
+        <w:rPr>
+          <w:rStyle w:val="FunctionTok"/>
+        </w:rPr>
+        <w:t xml:space="preserve">MAX</w:t>
+      </w:r>
+      <w:r>
+        <w:rPr>
+          <w:rStyle w:val="NormalTok"/>
+        </w:rPr>
+        <w:t xml:space="preserve">(baseline_amount) </w:t>
+      </w:r>
+      <w:r>
+        <w:rPr>
+          <w:rStyle w:val="KeywordTok"/>
+        </w:rPr>
+        <w:t xml:space="preserve">AS</w:t>
+      </w:r>
+      <w:r>
+        <w:rPr>
+          <w:rStyle w:val="NormalTok"/>
+        </w:rPr>
+        <w:t xml:space="preserve"> max_baselines </w:t>
+      </w:r>
+      <w:r>
+        <w:rPr>
+          <w:rStyle w:val="KeywordTok"/>
+        </w:rPr>
+        <w:t xml:space="preserve">FROM</w:t>
+      </w:r>
+      <w:r>
+        <w:rPr>
+          <w:rStyle w:val="NormalTok"/>
+        </w:rPr>
+        <w:t xml:space="preserve"> cspaper </w:t>
+      </w:r>
+      <w:r>
+        <w:rPr>
+          <w:rStyle w:val="KeywordTok"/>
+        </w:rPr>
+        <w:t xml:space="preserve">WHERE</w:t>
+      </w:r>
+      <w:r>
+        <w:rPr>
+          <w:rStyle w:val="NormalTok"/>
+        </w:rPr>
+        <w:t xml:space="preserve"> agent_framework </w:t>
+      </w:r>
+      <w:r>
+        <w:rPr>
+          <w:rStyle w:val="KeywordTok"/>
+        </w:rPr>
+        <w:t xml:space="preserve">IN</w:t>
+      </w:r>
+      <w:r>
+        <w:rPr>
+          <w:rStyle w:val="NormalTok"/>
+        </w:rPr>
+        <w:t xml:space="preserve"> (</w:t>
+      </w:r>
+      <w:r>
+        <w:rPr>
+          <w:rStyle w:val="StringTok"/>
+        </w:rPr>
+        <w:t xml:space="preserve">'Other'</w:t>
+      </w:r>
+      <w:r>
+        <w:rPr>
+          <w:rStyle w:val="NormalTok"/>
+        </w:rPr>
+        <w:t xml:space="preserve">, </w:t>
+      </w:r>
+      <w:r>
+        <w:rPr>
+          <w:rStyle w:val="StringTok"/>
+        </w:rPr>
+        <w:t xml:space="preserve">'Multi-Agent Collaboration'</w:t>
+      </w:r>
+      <w:r>
+        <w:rPr>
+          <w:rStyle w:val="NormalTok"/>
+        </w:rPr>
+        <w:t xml:space="preserve">) </w:t>
+      </w:r>
+      <w:r>
+        <w:rPr>
+          <w:rStyle w:val="KeywordTok"/>
+        </w:rPr>
+        <w:t xml:space="preserve">AND</w:t>
+      </w:r>
+      <w:r>
+        <w:rPr>
+          <w:rStyle w:val="NormalTok"/>
+        </w:rPr>
+        <w:t xml:space="preserve"> </w:t>
+      </w:r>
+      <w:r>
+        <w:rPr>
+          <w:rStyle w:val="KeywordTok"/>
+        </w:rPr>
+        <w:t xml:space="preserve">NOT</w:t>
+      </w:r>
+      <w:r>
+        <w:rPr>
+          <w:rStyle w:val="NormalTok"/>
+        </w:rPr>
+        <w:t xml:space="preserve"> baseline_amount </w:t>
+      </w:r>
+      <w:r>
+        <w:rPr>
+          <w:rStyle w:val="KeywordTok"/>
+        </w:rPr>
+        <w:t xml:space="preserve">IS</w:t>
+      </w:r>
+      <w:r>
+        <w:rPr>
+          <w:rStyle w:val="NormalTok"/>
+        </w:rPr>
+        <w:t xml:space="preserve"> </w:t>
+      </w:r>
+      <w:r>
+        <w:rPr>
+          <w:rStyle w:val="KeywordTok"/>
+        </w:rPr>
+        <w:t xml:space="preserve">NULL</w:t>
+      </w:r>
+      <w:r>
+        <w:rPr>
+          <w:rStyle w:val="NormalTok"/>
+        </w:rPr>
+        <w:t xml:space="preserve"> </w:t>
+      </w:r>
+      <w:r>
+        <w:rPr>
+          <w:rStyle w:val="KeywordTok"/>
+        </w:rPr>
+        <w:t xml:space="preserve">GROUP</w:t>
+      </w:r>
+      <w:r>
+        <w:rPr>
+          <w:rStyle w:val="NormalTok"/>
+        </w:rPr>
+        <w:t xml:space="preserve"> </w:t>
+      </w:r>
+      <w:r>
+        <w:rPr>
+          <w:rStyle w:val="KeywordTok"/>
+        </w:rPr>
+        <w:t xml:space="preserve">BY</w:t>
+      </w:r>
+      <w:r>
+        <w:rPr>
+          <w:rStyle w:val="NormalTok"/>
+        </w:rPr>
+        <w:t xml:space="preserve"> agent_framework</w:t>
+      </w:r>
+    </w:p>
+    <w:p>
+      <w:pPr>
+        <w:pStyle w:val="SourceCode"/>
+      </w:pPr>
+      <w:r>
+        <w:rPr>
+          <w:rStyle w:val="KeywordTok"/>
+        </w:rPr>
+        <w:t xml:space="preserve">SELECT</w:t>
+      </w:r>
+      <w:r>
+        <w:rPr>
+          <w:rStyle w:val="NormalTok"/>
+        </w:rPr>
+        <w:t xml:space="preserve"> </w:t>
+      </w:r>
+      <w:r>
+        <w:rPr>
+          <w:rStyle w:val="ControlFlowTok"/>
+        </w:rPr>
+        <w:t xml:space="preserve">CASE</w:t>
+      </w:r>
+      <w:r>
+        <w:rPr>
+          <w:rStyle w:val="NormalTok"/>
+        </w:rPr>
+        <w:t xml:space="preserve"> </w:t>
+      </w:r>
+      <w:r>
+        <w:rPr>
+          <w:rStyle w:val="ControlFlowTok"/>
+        </w:rPr>
+        <w:t xml:space="preserve">WHEN</w:t>
+      </w:r>
+      <w:r>
+        <w:rPr>
+          <w:rStyle w:val="NormalTok"/>
+        </w:rPr>
+        <w:t xml:space="preserve"> retrieval_method </w:t>
+      </w:r>
+      <w:r>
+        <w:rPr>
+          <w:rStyle w:val="KeywordTok"/>
+        </w:rPr>
+        <w:t xml:space="preserve">LIKE</w:t>
+      </w:r>
+      <w:r>
+        <w:rPr>
+          <w:rStyle w:val="NormalTok"/>
+        </w:rPr>
+        <w:t xml:space="preserve"> </w:t>
+      </w:r>
+      <w:r>
+        <w:rPr>
+          <w:rStyle w:val="StringTok"/>
+        </w:rPr>
+        <w:t xml:space="preserve">'%Hybrid%'</w:t>
+      </w:r>
+      <w:r>
+        <w:rPr>
+          <w:rStyle w:val="NormalTok"/>
+        </w:rPr>
+        <w:t xml:space="preserve"> </w:t>
+      </w:r>
+      <w:r>
+        <w:rPr>
+          <w:rStyle w:val="ControlFlowTok"/>
+        </w:rPr>
+        <w:t xml:space="preserve">THEN</w:t>
+      </w:r>
+      <w:r>
+        <w:rPr>
+          <w:rStyle w:val="NormalTok"/>
+        </w:rPr>
+        <w:t xml:space="preserve"> </w:t>
+      </w:r>
+      <w:r>
+        <w:rPr>
+          <w:rStyle w:val="StringTok"/>
+        </w:rPr>
+        <w:t xml:space="preserve">'Hybrid'</w:t>
+      </w:r>
+      <w:r>
+        <w:rPr>
+          <w:rStyle w:val="NormalTok"/>
+        </w:rPr>
+        <w:t xml:space="preserve"> </w:t>
+      </w:r>
+      <w:r>
+        <w:rPr>
+          <w:rStyle w:val="ControlFlowTok"/>
+        </w:rPr>
+        <w:t xml:space="preserve">WHEN</w:t>
+      </w:r>
+      <w:r>
+        <w:rPr>
+          <w:rStyle w:val="NormalTok"/>
+        </w:rPr>
+        <w:t xml:space="preserve"> retrieval_method </w:t>
+      </w:r>
+      <w:r>
+        <w:rPr>
+          <w:rStyle w:val="KeywordTok"/>
+        </w:rPr>
+        <w:t xml:space="preserve">LIKE</w:t>
+      </w:r>
+      <w:r>
+        <w:rPr>
+          <w:rStyle w:val="NormalTok"/>
+        </w:rPr>
+        <w:t xml:space="preserve"> </w:t>
+      </w:r>
+      <w:r>
+        <w:rPr>
+          <w:rStyle w:val="StringTok"/>
+        </w:rPr>
+        <w:t xml:space="preserve">'%Graph-based%'</w:t>
+      </w:r>
+      <w:r>
+        <w:rPr>
+          <w:rStyle w:val="NormalTok"/>
+        </w:rPr>
+        <w:t xml:space="preserve"> </w:t>
+      </w:r>
+      <w:r>
+        <w:rPr>
+          <w:rStyle w:val="ControlFlowTok"/>
+        </w:rPr>
+        <w:t xml:space="preserve">THEN</w:t>
+      </w:r>
+      <w:r>
+        <w:rPr>
+          <w:rStyle w:val="NormalTok"/>
+        </w:rPr>
+        <w:t xml:space="preserve"> </w:t>
+      </w:r>
+      <w:r>
+        <w:rPr>
+          <w:rStyle w:val="StringTok"/>
+        </w:rPr>
+        <w:t xml:space="preserve">'Graph-based'</w:t>
+      </w:r>
+      <w:r>
+        <w:rPr>
+          <w:rStyle w:val="NormalTok"/>
+        </w:rPr>
+        <w:t xml:space="preserve"> </w:t>
+      </w:r>
+      <w:r>
+        <w:rPr>
+          <w:rStyle w:val="ControlFlowTok"/>
+        </w:rPr>
+        <w:t xml:space="preserve">WHEN</w:t>
+      </w:r>
+      <w:r>
+        <w:rPr>
+          <w:rStyle w:val="NormalTok"/>
+        </w:rPr>
+        <w:t xml:space="preserve"> retrieval_method </w:t>
+      </w:r>
+      <w:r>
+        <w:rPr>
+          <w:rStyle w:val="KeywordTok"/>
+        </w:rPr>
+        <w:t xml:space="preserve">LIKE</w:t>
+      </w:r>
+      <w:r>
+        <w:rPr>
+          <w:rStyle w:val="NormalTok"/>
+        </w:rPr>
+        <w:t xml:space="preserve"> </w:t>
+      </w:r>
+      <w:r>
+        <w:rPr>
+          <w:rStyle w:val="StringTok"/>
+        </w:rPr>
+        <w:t xml:space="preserve">'%Dense%'</w:t>
+      </w:r>
+      <w:r>
+        <w:rPr>
+          <w:rStyle w:val="NormalTok"/>
+        </w:rPr>
+        <w:t xml:space="preserve"> </w:t>
+      </w:r>
+      <w:r>
+        <w:rPr>
+          <w:rStyle w:val="ControlFlowTok"/>
+        </w:rPr>
+        <w:t xml:space="preserve">THEN</w:t>
+      </w:r>
+      <w:r>
+        <w:rPr>
+          <w:rStyle w:val="NormalTok"/>
+        </w:rPr>
+        <w:t xml:space="preserve"> </w:t>
+      </w:r>
+      <w:r>
+        <w:rPr>
+          <w:rStyle w:val="StringTok"/>
+        </w:rPr>
+        <w:t xml:space="preserve">'Dense'</w:t>
+      </w:r>
+      <w:r>
+        <w:rPr>
+          <w:rStyle w:val="NormalTok"/>
+        </w:rPr>
+        <w:t xml:space="preserve"> </w:t>
+      </w:r>
+      <w:r>
+        <w:rPr>
+          <w:rStyle w:val="ControlFlowTok"/>
+        </w:rPr>
+        <w:t xml:space="preserve">WHEN</w:t>
+      </w:r>
+      <w:r>
+        <w:rPr>
+          <w:rStyle w:val="NormalTok"/>
+        </w:rPr>
+        <w:t xml:space="preserve"> retrieval_method </w:t>
+      </w:r>
+      <w:r>
+        <w:rPr>
+          <w:rStyle w:val="KeywordTok"/>
+        </w:rPr>
+        <w:t xml:space="preserve">LIKE</w:t>
+      </w:r>
+      <w:r>
+        <w:rPr>
+          <w:rStyle w:val="NormalTok"/>
+        </w:rPr>
+        <w:t xml:space="preserve"> </w:t>
+      </w:r>
+      <w:r>
+        <w:rPr>
+          <w:rStyle w:val="StringTok"/>
+        </w:rPr>
+        <w:t xml:space="preserve">'%Sparse%'</w:t>
+      </w:r>
+      <w:r>
+        <w:rPr>
+          <w:rStyle w:val="NormalTok"/>
+        </w:rPr>
+        <w:t xml:space="preserve"> </w:t>
+      </w:r>
+      <w:r>
+        <w:rPr>
+          <w:rStyle w:val="ControlFlowTok"/>
+        </w:rPr>
+        <w:t xml:space="preserve">THEN</w:t>
+      </w:r>
+      <w:r>
+        <w:rPr>
+          <w:rStyle w:val="NormalTok"/>
+        </w:rPr>
+        <w:t xml:space="preserve"> </w:t>
+      </w:r>
+      <w:r>
+        <w:rPr>
+          <w:rStyle w:val="StringTok"/>
+        </w:rPr>
+        <w:t xml:space="preserve">'Sparse'</w:t>
+      </w:r>
+      <w:r>
+        <w:rPr>
+          <w:rStyle w:val="NormalTok"/>
+        </w:rPr>
+        <w:t xml:space="preserve"> </w:t>
+      </w:r>
+      <w:r>
+        <w:rPr>
+          <w:rStyle w:val="ControlFlowTok"/>
+        </w:rPr>
+        <w:t xml:space="preserve">WHEN</w:t>
+      </w:r>
+      <w:r>
+        <w:rPr>
+          <w:rStyle w:val="NormalTok"/>
+        </w:rPr>
+        <w:t xml:space="preserve"> retrieval_method </w:t>
+      </w:r>
+      <w:r>
+        <w:rPr>
+          <w:rStyle w:val="KeywordTok"/>
+        </w:rPr>
+        <w:t xml:space="preserve">LIKE</w:t>
+      </w:r>
+      <w:r>
+        <w:rPr>
+          <w:rStyle w:val="NormalTok"/>
+        </w:rPr>
+        <w:t xml:space="preserve"> </w:t>
+      </w:r>
+      <w:r>
+        <w:rPr>
+          <w:rStyle w:val="StringTok"/>
+        </w:rPr>
+        <w:t xml:space="preserve">'%Web Search%'</w:t>
+      </w:r>
+      <w:r>
+        <w:rPr>
+          <w:rStyle w:val="NormalTok"/>
+        </w:rPr>
+        <w:t xml:space="preserve"> </w:t>
+      </w:r>
+      <w:r>
+        <w:rPr>
+          <w:rStyle w:val="ControlFlowTok"/>
+        </w:rPr>
+        <w:t xml:space="preserve">THEN</w:t>
+      </w:r>
+      <w:r>
+        <w:rPr>
+          <w:rStyle w:val="NormalTok"/>
+        </w:rPr>
+        <w:t xml:space="preserve"> </w:t>
+      </w:r>
+      <w:r>
+        <w:rPr>
+          <w:rStyle w:val="StringTok"/>
+        </w:rPr>
+        <w:t xml:space="preserve">'Web Search'</w:t>
+      </w:r>
+      <w:r>
+        <w:rPr>
+          <w:rStyle w:val="NormalTok"/>
+        </w:rPr>
+        <w:t xml:space="preserve"> </w:t>
+      </w:r>
+      <w:r>
+        <w:rPr>
+          <w:rStyle w:val="ControlFlowTok"/>
+        </w:rPr>
+        <w:t xml:space="preserve">WHEN</w:t>
+      </w:r>
+      <w:r>
+        <w:rPr>
+          <w:rStyle w:val="NormalTok"/>
+        </w:rPr>
+        <w:t xml:space="preserve"> retrieval_method </w:t>
+      </w:r>
+      <w:r>
+        <w:rPr>
+          <w:rStyle w:val="OperatorTok"/>
+        </w:rPr>
+        <w:t xml:space="preserve">&lt;&gt;</w:t>
+      </w:r>
+      <w:r>
+        <w:rPr>
+          <w:rStyle w:val="NormalTok"/>
+        </w:rPr>
+        <w:t xml:space="preserve"> </w:t>
+      </w:r>
+      <w:r>
+        <w:rPr>
+          <w:rStyle w:val="StringTok"/>
+        </w:rPr>
+        <w:t xml:space="preserve">''</w:t>
+      </w:r>
+      <w:r>
+        <w:rPr>
+          <w:rStyle w:val="NormalTok"/>
+        </w:rPr>
+        <w:t xml:space="preserve"> </w:t>
+      </w:r>
+      <w:r>
+        <w:rPr>
+          <w:rStyle w:val="ControlFlowTok"/>
+        </w:rPr>
+        <w:t xml:space="preserve">THEN</w:t>
+      </w:r>
+      <w:r>
+        <w:rPr>
+          <w:rStyle w:val="NormalTok"/>
+        </w:rPr>
+        <w:t xml:space="preserve"> </w:t>
+      </w:r>
+      <w:r>
+        <w:rPr>
+          <w:rStyle w:val="StringTok"/>
+        </w:rPr>
+        <w:t xml:space="preserve">'Other'</w:t>
+      </w:r>
+      <w:r>
+        <w:rPr>
+          <w:rStyle w:val="NormalTok"/>
+        </w:rPr>
+        <w:t xml:space="preserve"> </w:t>
+      </w:r>
+      <w:r>
+        <w:rPr>
+          <w:rStyle w:val="ControlFlowTok"/>
+        </w:rPr>
+        <w:t xml:space="preserve">END</w:t>
+      </w:r>
+      <w:r>
+        <w:rPr>
+          <w:rStyle w:val="NormalTok"/>
+        </w:rPr>
+        <w:t xml:space="preserve"> </w:t>
+      </w:r>
+      <w:r>
+        <w:rPr>
+          <w:rStyle w:val="KeywordTok"/>
+        </w:rPr>
+        <w:t xml:space="preserve">AS</w:t>
+      </w:r>
+      <w:r>
+        <w:rPr>
+          <w:rStyle w:val="NormalTok"/>
+        </w:rPr>
+        <w:t xml:space="preserve"> retrieval_family, agent_framework, </w:t>
+      </w:r>
+      <w:r>
+        <w:rPr>
+          <w:rStyle w:val="FunctionTok"/>
+        </w:rPr>
+        <w:t xml:space="preserve">COUNT</w:t>
+      </w:r>
+      <w:r>
+        <w:rPr>
+          <w:rStyle w:val="NormalTok"/>
+        </w:rPr>
+        <w:t xml:space="preserve">(</w:t>
+      </w:r>
+      <w:r>
+        <w:rPr>
+          <w:rStyle w:val="OperatorTok"/>
+        </w:rPr>
+        <w:t xml:space="preserve">*</w:t>
+      </w:r>
+      <w:r>
+        <w:rPr>
+          <w:rStyle w:val="NormalTok"/>
+        </w:rPr>
+        <w:t xml:space="preserve">) </w:t>
+      </w:r>
+      <w:r>
+        <w:rPr>
+          <w:rStyle w:val="KeywordTok"/>
+        </w:rPr>
+        <w:t xml:space="preserve">AS</w:t>
+      </w:r>
+      <w:r>
+        <w:rPr>
+          <w:rStyle w:val="NormalTok"/>
+        </w:rPr>
+        <w:t xml:space="preserve"> paper_count </w:t>
+      </w:r>
+      <w:r>
+        <w:rPr>
+          <w:rStyle w:val="KeywordTok"/>
+        </w:rPr>
+        <w:t xml:space="preserve">FROM</w:t>
+      </w:r>
+      <w:r>
+        <w:rPr>
+          <w:rStyle w:val="NormalTok"/>
+        </w:rPr>
+        <w:t xml:space="preserve"> cspaper </w:t>
+      </w:r>
+      <w:r>
+        <w:rPr>
+          <w:rStyle w:val="KeywordTok"/>
+        </w:rPr>
+        <w:t xml:space="preserve">WHERE</w:t>
+      </w:r>
+      <w:r>
+        <w:rPr>
+          <w:rStyle w:val="NormalTok"/>
+        </w:rPr>
+        <w:t xml:space="preserve"> retrieval_method </w:t>
+      </w:r>
+      <w:r>
+        <w:rPr>
+          <w:rStyle w:val="OperatorTok"/>
+        </w:rPr>
+        <w:t xml:space="preserve">&lt;&gt;</w:t>
+      </w:r>
+      <w:r>
+        <w:rPr>
+          <w:rStyle w:val="NormalTok"/>
+        </w:rPr>
+        <w:t xml:space="preserve"> </w:t>
+      </w:r>
+      <w:r>
+        <w:rPr>
+          <w:rStyle w:val="StringTok"/>
+        </w:rPr>
+        <w:t xml:space="preserve">''</w:t>
+      </w:r>
+      <w:r>
+        <w:rPr>
+          <w:rStyle w:val="NormalTok"/>
+        </w:rPr>
+        <w:t xml:space="preserve"> </w:t>
+      </w:r>
+      <w:r>
+        <w:rPr>
+          <w:rStyle w:val="KeywordTok"/>
+        </w:rPr>
+        <w:t xml:space="preserve">AND</w:t>
+      </w:r>
+      <w:r>
+        <w:rPr>
+          <w:rStyle w:val="NormalTok"/>
+        </w:rPr>
+        <w:t xml:space="preserve"> agent_framework </w:t>
+      </w:r>
+      <w:r>
+        <w:rPr>
+          <w:rStyle w:val="KeywordTok"/>
+        </w:rPr>
+        <w:t xml:space="preserve">IN</w:t>
+      </w:r>
+      <w:r>
+        <w:rPr>
+          <w:rStyle w:val="NormalTok"/>
+        </w:rPr>
+        <w:t xml:space="preserve"> (</w:t>
+      </w:r>
+      <w:r>
+        <w:rPr>
+          <w:rStyle w:val="StringTok"/>
+        </w:rPr>
+        <w:t xml:space="preserve">'Other'</w:t>
+      </w:r>
+      <w:r>
+        <w:rPr>
+          <w:rStyle w:val="NormalTok"/>
+        </w:rPr>
+        <w:t xml:space="preserve">, </w:t>
+      </w:r>
+      <w:r>
+        <w:rPr>
+          <w:rStyle w:val="StringTok"/>
+        </w:rPr>
+        <w:t xml:space="preserve">'Multi-Agent Collaboration'</w:t>
+      </w:r>
+      <w:r>
+        <w:rPr>
+          <w:rStyle w:val="NormalTok"/>
+        </w:rPr>
+        <w:t xml:space="preserve">) </w:t>
+      </w:r>
+      <w:r>
+        <w:rPr>
+          <w:rStyle w:val="KeywordTok"/>
+        </w:rPr>
+        <w:t xml:space="preserve">GROUP</w:t>
+      </w:r>
+      <w:r>
+        <w:rPr>
+          <w:rStyle w:val="NormalTok"/>
+        </w:rPr>
+        <w:t xml:space="preserve"> </w:t>
+      </w:r>
+      <w:r>
+        <w:rPr>
+          <w:rStyle w:val="KeywordTok"/>
+        </w:rPr>
+        <w:t xml:space="preserve">BY</w:t>
+      </w:r>
+      <w:r>
+        <w:rPr>
+          <w:rStyle w:val="NormalTok"/>
+        </w:rPr>
+        <w:t xml:space="preserve"> retrieval_family, agent_framework</w:t>
+      </w:r>
+    </w:p>
+    <w:bookmarkEnd w:id="58"/>
+    <w:bookmarkStart w:id="59" w:name="basketball-players-118-test-queries"/>
+    <w:p>
+      <w:pPr>
+        <w:pStyle w:val="Heading2"/>
+      </w:pPr>
+      <w:r>
+        <w:t xml:space="preserve">Basketball players (118 test queries)</w:t>
+      </w:r>
+    </w:p>
+    <w:p>
+      <w:pPr>
+        <w:pStyle w:val="SourceCode"/>
+      </w:pPr>
+      <w:r>
+        <w:rPr>
+          <w:rStyle w:val="KeywordTok"/>
+        </w:rPr>
+        <w:t xml:space="preserve">SELECT</w:t>
+      </w:r>
+      <w:r>
+        <w:rPr>
+          <w:rStyle w:val="NormalTok"/>
+        </w:rPr>
+        <w:t xml:space="preserve"> t.team_name, </w:t>
+      </w:r>
+      <w:r>
+        <w:rPr>
+          <w:rStyle w:val="FunctionTok"/>
+        </w:rPr>
+        <w:t xml:space="preserve">COUNT</w:t>
+      </w:r>
+      <w:r>
+        <w:rPr>
+          <w:rStyle w:val="NormalTok"/>
+        </w:rPr>
+        <w:t xml:space="preserve">(</w:t>
+      </w:r>
+      <w:r>
+        <w:rPr>
+          <w:rStyle w:val="OperatorTok"/>
+        </w:rPr>
+        <w:t xml:space="preserve">*</w:t>
+      </w:r>
+      <w:r>
+        <w:rPr>
+          <w:rStyle w:val="NormalTok"/>
+        </w:rPr>
+        <w:t xml:space="preserve">) </w:t>
+      </w:r>
+      <w:r>
+        <w:rPr>
+          <w:rStyle w:val="KeywordTok"/>
+        </w:rPr>
+        <w:t xml:space="preserve">AS</w:t>
+      </w:r>
+      <w:r>
+        <w:rPr>
+          <w:rStyle w:val="NormalTok"/>
+        </w:rPr>
+        <w:t xml:space="preserve"> player_count, </w:t>
+      </w:r>
+      <w:r>
+        <w:rPr>
+          <w:rStyle w:val="FunctionTok"/>
+        </w:rPr>
+        <w:t xml:space="preserve">AVG</w:t>
+      </w:r>
+      <w:r>
+        <w:rPr>
+          <w:rStyle w:val="NormalTok"/>
+        </w:rPr>
+        <w:t xml:space="preserve">(p.draft_pick) </w:t>
+      </w:r>
+      <w:r>
+        <w:rPr>
+          <w:rStyle w:val="KeywordTok"/>
+        </w:rPr>
+        <w:t xml:space="preserve">AS</w:t>
+      </w:r>
+      <w:r>
+        <w:rPr>
+          <w:rStyle w:val="NormalTok"/>
+        </w:rPr>
+        <w:t xml:space="preserve"> avg_age, </w:t>
+      </w:r>
+      <w:r>
+        <w:rPr>
+          <w:rStyle w:val="FunctionTok"/>
+        </w:rPr>
+        <w:t xml:space="preserve">SUM</w:t>
+      </w:r>
+      <w:r>
+        <w:rPr>
+          <w:rStyle w:val="NormalTok"/>
+        </w:rPr>
+        <w:t xml:space="preserve">(</w:t>
+      </w:r>
+      <w:r>
+        <w:rPr>
+          <w:rStyle w:val="ControlFlowTok"/>
+        </w:rPr>
+        <w:t xml:space="preserve">CASE</w:t>
+      </w:r>
+      <w:r>
+        <w:rPr>
+          <w:rStyle w:val="NormalTok"/>
+        </w:rPr>
+        <w:t xml:space="preserve"> </w:t>
+      </w:r>
+      <w:r>
+        <w:rPr>
+          <w:rStyle w:val="ControlFlowTok"/>
+        </w:rPr>
+        <w:t xml:space="preserve">WHEN</w:t>
+      </w:r>
+      <w:r>
+        <w:rPr>
+          <w:rStyle w:val="NormalTok"/>
+        </w:rPr>
+        <w:t xml:space="preserve"> </w:t>
+      </w:r>
+      <w:r>
+        <w:rPr>
+          <w:rStyle w:val="KeywordTok"/>
+        </w:rPr>
+        <w:t xml:space="preserve">NOT</w:t>
+      </w:r>
+      <w:r>
+        <w:rPr>
+          <w:rStyle w:val="NormalTok"/>
+        </w:rPr>
+        <w:t xml:space="preserve"> p.olympic_gold_medals </w:t>
+      </w:r>
+      <w:r>
+        <w:rPr>
+          <w:rStyle w:val="KeywordTok"/>
+        </w:rPr>
+        <w:t xml:space="preserve">IS</w:t>
+      </w:r>
+      <w:r>
+        <w:rPr>
+          <w:rStyle w:val="NormalTok"/>
+        </w:rPr>
+        <w:t xml:space="preserve"> </w:t>
+      </w:r>
+      <w:r>
+        <w:rPr>
+          <w:rStyle w:val="KeywordTok"/>
+        </w:rPr>
+        <w:t xml:space="preserve">NULL</w:t>
+      </w:r>
+      <w:r>
+        <w:rPr>
+          <w:rStyle w:val="NormalTok"/>
+        </w:rPr>
+        <w:t xml:space="preserve"> </w:t>
+      </w:r>
+      <w:r>
+        <w:rPr>
+          <w:rStyle w:val="ControlFlowTok"/>
+        </w:rPr>
+        <w:t xml:space="preserve">THEN</w:t>
+      </w:r>
+      <w:r>
+        <w:rPr>
+          <w:rStyle w:val="NormalTok"/>
+        </w:rPr>
+        <w:t xml:space="preserve"> p.olympic_gold_medals </w:t>
+      </w:r>
+      <w:r>
+        <w:rPr>
+          <w:rStyle w:val="ControlFlowTok"/>
+        </w:rPr>
+        <w:t xml:space="preserve">ELSE</w:t>
+      </w:r>
+      <w:r>
+        <w:rPr>
+          <w:rStyle w:val="NormalTok"/>
+        </w:rPr>
+        <w:t xml:space="preserve"> </w:t>
+      </w:r>
+      <w:r>
+        <w:rPr>
+          <w:rStyle w:val="DecValTok"/>
+        </w:rPr>
+        <w:t xml:space="preserve">0</w:t>
+      </w:r>
+      <w:r>
+        <w:rPr>
+          <w:rStyle w:val="NormalTok"/>
+        </w:rPr>
+        <w:t xml:space="preserve"> </w:t>
+      </w:r>
+      <w:r>
+        <w:rPr>
+          <w:rStyle w:val="ControlFlowTok"/>
+        </w:rPr>
+        <w:t xml:space="preserve">END</w:t>
+      </w:r>
+      <w:r>
+        <w:rPr>
+          <w:rStyle w:val="NormalTok"/>
+        </w:rPr>
+        <w:t xml:space="preserve">) </w:t>
+      </w:r>
+      <w:r>
+        <w:rPr>
+          <w:rStyle w:val="KeywordTok"/>
+        </w:rPr>
+        <w:t xml:space="preserve">AS</w:t>
+      </w:r>
+      <w:r>
+        <w:rPr>
+          <w:rStyle w:val="NormalTok"/>
+        </w:rPr>
+        <w:t xml:space="preserve"> total_recorded_olympic_golds </w:t>
+      </w:r>
+      <w:r>
+        <w:rPr>
+          <w:rStyle w:val="KeywordTok"/>
+        </w:rPr>
+        <w:t xml:space="preserve">FROM</w:t>
+      </w:r>
+      <w:r>
+        <w:rPr>
+          <w:rStyle w:val="NormalTok"/>
+        </w:rPr>
+        <w:t xml:space="preserve"> player </w:t>
+      </w:r>
+      <w:r>
+        <w:rPr>
+          <w:rStyle w:val="KeywordTok"/>
+        </w:rPr>
+        <w:t xml:space="preserve">AS</w:t>
+      </w:r>
+      <w:r>
+        <w:rPr>
+          <w:rStyle w:val="NormalTok"/>
+        </w:rPr>
+        <w:t xml:space="preserve"> p </w:t>
+      </w:r>
+      <w:r>
+        <w:rPr>
+          <w:rStyle w:val="KeywordTok"/>
+        </w:rPr>
+        <w:t xml:space="preserve">JOIN</w:t>
+      </w:r>
+      <w:r>
+        <w:rPr>
+          <w:rStyle w:val="NormalTok"/>
+        </w:rPr>
+        <w:t xml:space="preserve"> team </w:t>
+      </w:r>
+      <w:r>
+        <w:rPr>
+          <w:rStyle w:val="KeywordTok"/>
+        </w:rPr>
+        <w:t xml:space="preserve">AS</w:t>
+      </w:r>
+      <w:r>
+        <w:rPr>
+          <w:rStyle w:val="NormalTok"/>
+        </w:rPr>
+        <w:t xml:space="preserve"> t </w:t>
+      </w:r>
+      <w:r>
+        <w:rPr>
+          <w:rStyle w:val="KeywordTok"/>
+        </w:rPr>
+        <w:t xml:space="preserve">ON</w:t>
+      </w:r>
+      <w:r>
+        <w:rPr>
+          <w:rStyle w:val="NormalTok"/>
+        </w:rPr>
+        <w:t xml:space="preserve"> </w:t>
+      </w:r>
+      <w:r>
+        <w:rPr>
+          <w:rStyle w:val="FunctionTok"/>
+        </w:rPr>
+        <w:t xml:space="preserve">TRIM</w:t>
+      </w:r>
+      <w:r>
+        <w:rPr>
+          <w:rStyle w:val="NormalTok"/>
+        </w:rPr>
+        <w:t xml:space="preserve">(p.team) </w:t>
+      </w:r>
+      <w:r>
+        <w:rPr>
+          <w:rStyle w:val="OperatorTok"/>
+        </w:rPr>
+        <w:t xml:space="preserve">=</w:t>
+      </w:r>
+      <w:r>
+        <w:rPr>
+          <w:rStyle w:val="NormalTok"/>
+        </w:rPr>
+        <w:t xml:space="preserve"> </w:t>
+      </w:r>
+      <w:r>
+        <w:rPr>
+          <w:rStyle w:val="FunctionTok"/>
+        </w:rPr>
+        <w:t xml:space="preserve">TRIM</w:t>
+      </w:r>
+      <w:r>
+        <w:rPr>
+          <w:rStyle w:val="NormalTok"/>
+        </w:rPr>
+        <w:t xml:space="preserve">(t.team_name) </w:t>
+      </w:r>
+      <w:r>
+        <w:rPr>
+          <w:rStyle w:val="KeywordTok"/>
+        </w:rPr>
+        <w:t xml:space="preserve">GROUP</w:t>
+      </w:r>
+      <w:r>
+        <w:rPr>
+          <w:rStyle w:val="NormalTok"/>
+        </w:rPr>
+        <w:t xml:space="preserve"> </w:t>
+      </w:r>
+      <w:r>
+        <w:rPr>
+          <w:rStyle w:val="KeywordTok"/>
+        </w:rPr>
+        <w:t xml:space="preserve">BY</w:t>
+      </w:r>
+      <w:r>
+        <w:rPr>
+          <w:rStyle w:val="NormalTok"/>
+        </w:rPr>
+        <w:t xml:space="preserve"> t.team_name </w:t>
+      </w:r>
+      <w:r>
+        <w:rPr>
+          <w:rStyle w:val="KeywordTok"/>
+        </w:rPr>
+        <w:t xml:space="preserve">HAVING</w:t>
+      </w:r>
+      <w:r>
+        <w:rPr>
+          <w:rStyle w:val="NormalTok"/>
+        </w:rPr>
+        <w:t xml:space="preserve"> </w:t>
+      </w:r>
+      <w:r>
+        <w:rPr>
+          <w:rStyle w:val="FunctionTok"/>
+        </w:rPr>
+        <w:t xml:space="preserve">COUNT</w:t>
+      </w:r>
+      <w:r>
+        <w:rPr>
+          <w:rStyle w:val="NormalTok"/>
+        </w:rPr>
+        <w:t xml:space="preserve">(</w:t>
+      </w:r>
+      <w:r>
+        <w:rPr>
+          <w:rStyle w:val="OperatorTok"/>
+        </w:rPr>
+        <w:t xml:space="preserve">*</w:t>
+      </w:r>
+      <w:r>
+        <w:rPr>
+          <w:rStyle w:val="NormalTok"/>
+        </w:rPr>
+        <w:t xml:space="preserve">) </w:t>
+      </w:r>
+      <w:r>
+        <w:rPr>
+          <w:rStyle w:val="OperatorTok"/>
+        </w:rPr>
+        <w:t xml:space="preserve">&gt;=</w:t>
+      </w:r>
+      <w:r>
+        <w:rPr>
+          <w:rStyle w:val="NormalTok"/>
+        </w:rPr>
+        <w:t xml:space="preserve"> </w:t>
+      </w:r>
+      <w:r>
+        <w:rPr>
+          <w:rStyle w:val="DecValTok"/>
+        </w:rPr>
+        <w:t xml:space="preserve">2</w:t>
+      </w:r>
+    </w:p>
+    <w:p>
+      <w:pPr>
+        <w:pStyle w:val="SourceCode"/>
+      </w:pPr>
+      <w:r>
+        <w:rPr>
+          <w:rStyle w:val="KeywordTok"/>
+        </w:rPr>
+        <w:t xml:space="preserve">SELECT</w:t>
+      </w:r>
+      <w:r>
+        <w:rPr>
+          <w:rStyle w:val="NormalTok"/>
+        </w:rPr>
+        <w:t xml:space="preserve"> player.team, </w:t>
+      </w:r>
+      <w:r>
+        <w:rPr>
+          <w:rStyle w:val="FunctionTok"/>
+        </w:rPr>
+        <w:t xml:space="preserve">SUM</w:t>
+      </w:r>
+      <w:r>
+        <w:rPr>
+          <w:rStyle w:val="NormalTok"/>
+        </w:rPr>
+        <w:t xml:space="preserve">(player.nba_championships) </w:t>
+      </w:r>
+      <w:r>
+        <w:rPr>
+          <w:rStyle w:val="KeywordTok"/>
+        </w:rPr>
+        <w:t xml:space="preserve">AS</w:t>
+      </w:r>
+      <w:r>
+        <w:rPr>
+          <w:rStyle w:val="NormalTok"/>
+        </w:rPr>
+        <w:t xml:space="preserve"> sum_player_mvp_awards </w:t>
+      </w:r>
+      <w:r>
+        <w:rPr>
+          <w:rStyle w:val="KeywordTok"/>
+        </w:rPr>
+        <w:t xml:space="preserve">FROM</w:t>
+      </w:r>
+      <w:r>
+        <w:rPr>
+          <w:rStyle w:val="NormalTok"/>
+        </w:rPr>
+        <w:t xml:space="preserve"> player </w:t>
+      </w:r>
+      <w:r>
+        <w:rPr>
+          <w:rStyle w:val="KeywordTok"/>
+        </w:rPr>
+        <w:t xml:space="preserve">JOIN</w:t>
+      </w:r>
+      <w:r>
+        <w:rPr>
+          <w:rStyle w:val="NormalTok"/>
+        </w:rPr>
+        <w:t xml:space="preserve"> team </w:t>
+      </w:r>
+      <w:r>
+        <w:rPr>
+          <w:rStyle w:val="KeywordTok"/>
+        </w:rPr>
+        <w:t xml:space="preserve">ON</w:t>
+      </w:r>
+      <w:r>
+        <w:rPr>
+          <w:rStyle w:val="NormalTok"/>
+        </w:rPr>
+        <w:t xml:space="preserve"> player.team </w:t>
+      </w:r>
+      <w:r>
+        <w:rPr>
+          <w:rStyle w:val="OperatorTok"/>
+        </w:rPr>
+        <w:t xml:space="preserve">=</w:t>
+      </w:r>
+      <w:r>
+        <w:rPr>
+          <w:rStyle w:val="NormalTok"/>
+        </w:rPr>
+        <w:t xml:space="preserve"> team.team_name </w:t>
+      </w:r>
+      <w:r>
+        <w:rPr>
+          <w:rStyle w:val="KeywordTok"/>
+        </w:rPr>
+        <w:t xml:space="preserve">JOIN</w:t>
+      </w:r>
+      <w:r>
+        <w:rPr>
+          <w:rStyle w:val="NormalTok"/>
+        </w:rPr>
+        <w:t xml:space="preserve"> city </w:t>
+      </w:r>
+      <w:r>
+        <w:rPr>
+          <w:rStyle w:val="KeywordTok"/>
+        </w:rPr>
+        <w:t xml:space="preserve">ON</w:t>
+      </w:r>
+      <w:r>
+        <w:rPr>
+          <w:rStyle w:val="NormalTok"/>
+        </w:rPr>
+        <w:t xml:space="preserve"> team.location </w:t>
+      </w:r>
+      <w:r>
+        <w:rPr>
+          <w:rStyle w:val="OperatorTok"/>
+        </w:rPr>
+        <w:t xml:space="preserve">=</w:t>
+      </w:r>
+      <w:r>
+        <w:rPr>
+          <w:rStyle w:val="NormalTok"/>
+        </w:rPr>
+        <w:t xml:space="preserve"> city.city_name </w:t>
+      </w:r>
+      <w:r>
+        <w:rPr>
+          <w:rStyle w:val="KeywordTok"/>
+        </w:rPr>
+        <w:t xml:space="preserve">WHERE</w:t>
+      </w:r>
+      <w:r>
+        <w:rPr>
+          <w:rStyle w:val="NormalTok"/>
+        </w:rPr>
+        <w:t xml:space="preserve"> player.age </w:t>
+      </w:r>
+      <w:r>
+        <w:rPr>
+          <w:rStyle w:val="OperatorTok"/>
+        </w:rPr>
+        <w:t xml:space="preserve">&gt;</w:t>
+      </w:r>
+      <w:r>
+        <w:rPr>
+          <w:rStyle w:val="NormalTok"/>
+        </w:rPr>
+        <w:t xml:space="preserve"> </w:t>
+      </w:r>
+      <w:r>
+        <w:rPr>
+          <w:rStyle w:val="DecValTok"/>
+        </w:rPr>
+        <w:t xml:space="preserve">28</w:t>
+      </w:r>
+      <w:r>
+        <w:rPr>
+          <w:rStyle w:val="NormalTok"/>
+        </w:rPr>
+        <w:t xml:space="preserve"> </w:t>
+      </w:r>
+      <w:r>
+        <w:rPr>
+          <w:rStyle w:val="KeywordTok"/>
+        </w:rPr>
+        <w:t xml:space="preserve">GROUP</w:t>
+      </w:r>
+      <w:r>
+        <w:rPr>
+          <w:rStyle w:val="NormalTok"/>
+        </w:rPr>
+        <w:t xml:space="preserve"> </w:t>
+      </w:r>
+      <w:r>
+        <w:rPr>
+          <w:rStyle w:val="KeywordTok"/>
+        </w:rPr>
+        <w:t xml:space="preserve">BY</w:t>
+      </w:r>
+      <w:r>
+        <w:rPr>
+          <w:rStyle w:val="NormalTok"/>
+        </w:rPr>
+        <w:t xml:space="preserve"> player.team</w:t>
+      </w:r>
+    </w:p>
+    <w:p>
+      <w:pPr>
+        <w:pStyle w:val="SourceCode"/>
+      </w:pPr>
+      <w:r>
+        <w:rPr>
+          <w:rStyle w:val="KeywordTok"/>
+        </w:rPr>
+        <w:t xml:space="preserve">SELECT</w:t>
+      </w:r>
+      <w:r>
+        <w:rPr>
+          <w:rStyle w:val="NormalTok"/>
+        </w:rPr>
+        <w:t xml:space="preserve"> player.position, </w:t>
+      </w:r>
+      <w:r>
+        <w:rPr>
+          <w:rStyle w:val="FunctionTok"/>
+        </w:rPr>
+        <w:t xml:space="preserve">MAX</w:t>
+      </w:r>
+      <w:r>
+        <w:rPr>
+          <w:rStyle w:val="NormalTok"/>
+        </w:rPr>
+        <w:t xml:space="preserve">(player.draft_year) </w:t>
+      </w:r>
+      <w:r>
+        <w:rPr>
+          <w:rStyle w:val="KeywordTok"/>
+        </w:rPr>
+        <w:t xml:space="preserve">AS</w:t>
+      </w:r>
+      <w:r>
+        <w:rPr>
+          <w:rStyle w:val="NormalTok"/>
+        </w:rPr>
+        <w:t xml:space="preserve"> max_player_mvp_awards </w:t>
+      </w:r>
+      <w:r>
+        <w:rPr>
+          <w:rStyle w:val="KeywordTok"/>
+        </w:rPr>
+        <w:t xml:space="preserve">FROM</w:t>
+      </w:r>
+      <w:r>
+        <w:rPr>
+          <w:rStyle w:val="NormalTok"/>
+        </w:rPr>
+        <w:t xml:space="preserve"> player </w:t>
+      </w:r>
+      <w:r>
+        <w:rPr>
+          <w:rStyle w:val="KeywordTok"/>
+        </w:rPr>
+        <w:t xml:space="preserve">JOIN</w:t>
+      </w:r>
+      <w:r>
+        <w:rPr>
+          <w:rStyle w:val="NormalTok"/>
+        </w:rPr>
+        <w:t xml:space="preserve"> team </w:t>
+      </w:r>
+      <w:r>
+        <w:rPr>
+          <w:rStyle w:val="KeywordTok"/>
+        </w:rPr>
+        <w:t xml:space="preserve">ON</w:t>
+      </w:r>
+      <w:r>
+        <w:rPr>
+          <w:rStyle w:val="NormalTok"/>
+        </w:rPr>
+        <w:t xml:space="preserve"> player.team </w:t>
+      </w:r>
+      <w:r>
+        <w:rPr>
+          <w:rStyle w:val="OperatorTok"/>
+        </w:rPr>
+        <w:t xml:space="preserve">=</w:t>
+      </w:r>
+      <w:r>
+        <w:rPr>
+          <w:rStyle w:val="NormalTok"/>
+        </w:rPr>
+        <w:t xml:space="preserve"> team.team_name </w:t>
+      </w:r>
+      <w:r>
+        <w:rPr>
+          <w:rStyle w:val="KeywordTok"/>
+        </w:rPr>
+        <w:t xml:space="preserve">JOIN</w:t>
+      </w:r>
+      <w:r>
+        <w:rPr>
+          <w:rStyle w:val="NormalTok"/>
+        </w:rPr>
+        <w:t xml:space="preserve"> city </w:t>
+      </w:r>
+      <w:r>
+        <w:rPr>
+          <w:rStyle w:val="KeywordTok"/>
+        </w:rPr>
+        <w:t xml:space="preserve">ON</w:t>
+      </w:r>
+      <w:r>
+        <w:rPr>
+          <w:rStyle w:val="NormalTok"/>
+        </w:rPr>
+        <w:t xml:space="preserve"> team.location </w:t>
+      </w:r>
+      <w:r>
+        <w:rPr>
+          <w:rStyle w:val="OperatorTok"/>
+        </w:rPr>
+        <w:t xml:space="preserve">=</w:t>
+      </w:r>
+      <w:r>
+        <w:rPr>
+          <w:rStyle w:val="NormalTok"/>
+        </w:rPr>
+        <w:t xml:space="preserve"> city.city_name </w:t>
+      </w:r>
+      <w:r>
+        <w:rPr>
+          <w:rStyle w:val="KeywordTok"/>
+        </w:rPr>
+        <w:t xml:space="preserve">GROUP</w:t>
+      </w:r>
+      <w:r>
+        <w:rPr>
+          <w:rStyle w:val="NormalTok"/>
+        </w:rPr>
+        <w:t xml:space="preserve"> </w:t>
+      </w:r>
+      <w:r>
+        <w:rPr>
+          <w:rStyle w:val="KeywordTok"/>
+        </w:rPr>
+        <w:t xml:space="preserve">BY</w:t>
+      </w:r>
+      <w:r>
+        <w:rPr>
+          <w:rStyle w:val="NormalTok"/>
+        </w:rPr>
+        <w:t xml:space="preserve"> player.position</w:t>
+      </w:r>
+    </w:p>
+    <w:p>
+      <w:pPr>
+        <w:pStyle w:val="SourceCode"/>
+      </w:pPr>
+      <w:r>
+        <w:rPr>
+          <w:rStyle w:val="KeywordTok"/>
+        </w:rPr>
+        <w:t xml:space="preserve">SELECT</w:t>
+      </w:r>
+      <w:r>
+        <w:rPr>
+          <w:rStyle w:val="NormalTok"/>
+        </w:rPr>
+        <w:t xml:space="preserve"> player.team, </w:t>
+      </w:r>
+      <w:r>
+        <w:rPr>
+          <w:rStyle w:val="FunctionTok"/>
+        </w:rPr>
+        <w:t xml:space="preserve">AVG</w:t>
+      </w:r>
+      <w:r>
+        <w:rPr>
+          <w:rStyle w:val="NormalTok"/>
+        </w:rPr>
+        <w:t xml:space="preserve">(player.draft_year) </w:t>
+      </w:r>
+      <w:r>
+        <w:rPr>
+          <w:rStyle w:val="KeywordTok"/>
+        </w:rPr>
+        <w:t xml:space="preserve">AS</w:t>
+      </w:r>
+      <w:r>
+        <w:rPr>
+          <w:rStyle w:val="NormalTok"/>
+        </w:rPr>
+        <w:t xml:space="preserve"> avg_player_age </w:t>
+      </w:r>
+      <w:r>
+        <w:rPr>
+          <w:rStyle w:val="KeywordTok"/>
+        </w:rPr>
+        <w:t xml:space="preserve">FROM</w:t>
+      </w:r>
+      <w:r>
+        <w:rPr>
+          <w:rStyle w:val="NormalTok"/>
+        </w:rPr>
+        <w:t xml:space="preserve"> player </w:t>
+      </w:r>
+      <w:r>
+        <w:rPr>
+          <w:rStyle w:val="KeywordTok"/>
+        </w:rPr>
+        <w:t xml:space="preserve">JOIN</w:t>
+      </w:r>
+      <w:r>
+        <w:rPr>
+          <w:rStyle w:val="NormalTok"/>
+        </w:rPr>
+        <w:t xml:space="preserve"> team </w:t>
+      </w:r>
+      <w:r>
+        <w:rPr>
+          <w:rStyle w:val="KeywordTok"/>
+        </w:rPr>
+        <w:t xml:space="preserve">ON</w:t>
+      </w:r>
+      <w:r>
+        <w:rPr>
+          <w:rStyle w:val="NormalTok"/>
+        </w:rPr>
+        <w:t xml:space="preserve"> player.team </w:t>
+      </w:r>
+      <w:r>
+        <w:rPr>
+          <w:rStyle w:val="OperatorTok"/>
+        </w:rPr>
+        <w:t xml:space="preserve">=</w:t>
+      </w:r>
+      <w:r>
+        <w:rPr>
+          <w:rStyle w:val="NormalTok"/>
+        </w:rPr>
+        <w:t xml:space="preserve"> team.team_name </w:t>
+      </w:r>
+      <w:r>
+        <w:rPr>
+          <w:rStyle w:val="KeywordTok"/>
+        </w:rPr>
+        <w:t xml:space="preserve">JOIN</w:t>
+      </w:r>
+      <w:r>
+        <w:rPr>
+          <w:rStyle w:val="NormalTok"/>
+        </w:rPr>
+        <w:t xml:space="preserve"> city </w:t>
+      </w:r>
+      <w:r>
+        <w:rPr>
+          <w:rStyle w:val="KeywordTok"/>
+        </w:rPr>
+        <w:t xml:space="preserve">ON</w:t>
+      </w:r>
+      <w:r>
+        <w:rPr>
+          <w:rStyle w:val="NormalTok"/>
+        </w:rPr>
+        <w:t xml:space="preserve"> team.location </w:t>
+      </w:r>
+      <w:r>
+        <w:rPr>
+          <w:rStyle w:val="OperatorTok"/>
+        </w:rPr>
+        <w:t xml:space="preserve">=</w:t>
+      </w:r>
+      <w:r>
+        <w:rPr>
+          <w:rStyle w:val="NormalTok"/>
+        </w:rPr>
+        <w:t xml:space="preserve"> city.city_name </w:t>
+      </w:r>
+      <w:r>
+        <w:rPr>
+          <w:rStyle w:val="KeywordTok"/>
+        </w:rPr>
+        <w:t xml:space="preserve">WHERE</w:t>
+      </w:r>
+      <w:r>
+        <w:rPr>
+          <w:rStyle w:val="NormalTok"/>
+        </w:rPr>
+        <w:t xml:space="preserve"> (city.city_name </w:t>
+      </w:r>
+      <w:r>
+        <w:rPr>
+          <w:rStyle w:val="OperatorTok"/>
+        </w:rPr>
+        <w:t xml:space="preserve">=</w:t>
+      </w:r>
+      <w:r>
+        <w:rPr>
+          <w:rStyle w:val="NormalTok"/>
+        </w:rPr>
+        <w:t xml:space="preserve"> </w:t>
+      </w:r>
+      <w:r>
+        <w:rPr>
+          <w:rStyle w:val="StringTok"/>
+        </w:rPr>
+        <w:t xml:space="preserve">'Los Angeles'</w:t>
+      </w:r>
+      <w:r>
+        <w:rPr>
+          <w:rStyle w:val="NormalTok"/>
+        </w:rPr>
+        <w:t xml:space="preserve">) </w:t>
+      </w:r>
+      <w:r>
+        <w:rPr>
+          <w:rStyle w:val="KeywordTok"/>
+        </w:rPr>
+        <w:t xml:space="preserve">OR</w:t>
+      </w:r>
+      <w:r>
+        <w:rPr>
+          <w:rStyle w:val="NormalTok"/>
+        </w:rPr>
+        <w:t xml:space="preserve"> (player.mvp_awards </w:t>
+      </w:r>
+      <w:r>
+        <w:rPr>
+          <w:rStyle w:val="OperatorTok"/>
+        </w:rPr>
+        <w:t xml:space="preserve">&gt;=</w:t>
+      </w:r>
+      <w:r>
+        <w:rPr>
+          <w:rStyle w:val="NormalTok"/>
+        </w:rPr>
+        <w:t xml:space="preserve"> </w:t>
+      </w:r>
+      <w:r>
+        <w:rPr>
+          <w:rStyle w:val="DecValTok"/>
+        </w:rPr>
+        <w:t xml:space="preserve">1</w:t>
+      </w:r>
+      <w:r>
+        <w:rPr>
+          <w:rStyle w:val="NormalTok"/>
+        </w:rPr>
+        <w:t xml:space="preserve">) </w:t>
+      </w:r>
+      <w:r>
+        <w:rPr>
+          <w:rStyle w:val="KeywordTok"/>
+        </w:rPr>
+        <w:t xml:space="preserve">GROUP</w:t>
+      </w:r>
+      <w:r>
+        <w:rPr>
+          <w:rStyle w:val="NormalTok"/>
+        </w:rPr>
+        <w:t xml:space="preserve"> </w:t>
+      </w:r>
+      <w:r>
+        <w:rPr>
+          <w:rStyle w:val="KeywordTok"/>
+        </w:rPr>
+        <w:t xml:space="preserve">BY</w:t>
+      </w:r>
+      <w:r>
+        <w:rPr>
+          <w:rStyle w:val="NormalTok"/>
+        </w:rPr>
+        <w:t xml:space="preserve"> player.team</w:t>
+      </w:r>
+    </w:p>
+    <w:bookmarkEnd w:id="59"/>
+    <w:bookmarkStart w:id="60" w:name="artists-43-test-queries"/>
+    <w:p>
+      <w:pPr>
+        <w:pStyle w:val="Heading2"/>
+      </w:pPr>
+      <w:r>
+        <w:t xml:space="preserve">Artists (43 test queries)</w:t>
+      </w:r>
+    </w:p>
+    <w:p>
+      <w:pPr>
+        <w:pStyle w:val="SourceCode"/>
+      </w:pPr>
+      <w:r>
+        <w:rPr>
+          <w:rStyle w:val="KeywordTok"/>
+        </w:rPr>
+        <w:t xml:space="preserve">SELECT</w:t>
+      </w:r>
+      <w:r>
+        <w:rPr>
+          <w:rStyle w:val="NormalTok"/>
+        </w:rPr>
+        <w:t xml:space="preserve"> zodiac, </w:t>
+      </w:r>
+      <w:r>
+        <w:rPr>
+          <w:rStyle w:val="FunctionTok"/>
+        </w:rPr>
+        <w:t xml:space="preserve">COUNT</w:t>
+      </w:r>
+      <w:r>
+        <w:rPr>
+          <w:rStyle w:val="NormalTok"/>
+        </w:rPr>
+        <w:t xml:space="preserve">(birth_date) </w:t>
+      </w:r>
+      <w:r>
+        <w:rPr>
+          <w:rStyle w:val="KeywordTok"/>
+        </w:rPr>
+        <w:t xml:space="preserve">AS</w:t>
+      </w:r>
+      <w:r>
+        <w:rPr>
+          <w:rStyle w:val="NormalTok"/>
+        </w:rPr>
+        <w:t xml:space="preserve"> count_art_institution </w:t>
+      </w:r>
+      <w:r>
+        <w:rPr>
+          <w:rStyle w:val="KeywordTok"/>
+        </w:rPr>
+        <w:t xml:space="preserve">FROM</w:t>
+      </w:r>
+      <w:r>
+        <w:rPr>
+          <w:rStyle w:val="NormalTok"/>
+        </w:rPr>
+        <w:t xml:space="preserve"> art </w:t>
+      </w:r>
+      <w:r>
+        <w:rPr>
+          <w:rStyle w:val="KeywordTok"/>
+        </w:rPr>
+        <w:t xml:space="preserve">GROUP</w:t>
+      </w:r>
+      <w:r>
+        <w:rPr>
+          <w:rStyle w:val="NormalTok"/>
+        </w:rPr>
+        <w:t xml:space="preserve"> </w:t>
+      </w:r>
+      <w:r>
+        <w:rPr>
+          <w:rStyle w:val="KeywordTok"/>
+        </w:rPr>
+        <w:t xml:space="preserve">BY</w:t>
+      </w:r>
+      <w:r>
+        <w:rPr>
+          <w:rStyle w:val="NormalTok"/>
+        </w:rPr>
+        <w:t xml:space="preserve"> zodiac</w:t>
+      </w:r>
+    </w:p>
+    <w:p>
+      <w:pPr>
+        <w:pStyle w:val="SourceCode"/>
+      </w:pPr>
+      <w:r>
+        <w:rPr>
+          <w:rStyle w:val="KeywordTok"/>
+        </w:rPr>
+        <w:t xml:space="preserve">SELECT</w:t>
+      </w:r>
+      <w:r>
+        <w:rPr>
+          <w:rStyle w:val="NormalTok"/>
+        </w:rPr>
+        <w:t xml:space="preserve"> genre, </w:t>
+      </w:r>
+      <w:r>
+        <w:rPr>
+          <w:rStyle w:val="FunctionTok"/>
+        </w:rPr>
+        <w:t xml:space="preserve">AVG</w:t>
+      </w:r>
+      <w:r>
+        <w:rPr>
+          <w:rStyle w:val="NormalTok"/>
+        </w:rPr>
+        <w:t xml:space="preserve">(awards) </w:t>
+      </w:r>
+      <w:r>
+        <w:rPr>
+          <w:rStyle w:val="KeywordTok"/>
+        </w:rPr>
+        <w:t xml:space="preserve">AS</w:t>
+      </w:r>
+      <w:r>
+        <w:rPr>
+          <w:rStyle w:val="NormalTok"/>
+        </w:rPr>
+        <w:t xml:space="preserve"> avg_age </w:t>
+      </w:r>
+      <w:r>
+        <w:rPr>
+          <w:rStyle w:val="KeywordTok"/>
+        </w:rPr>
+        <w:t xml:space="preserve">FROM</w:t>
+      </w:r>
+      <w:r>
+        <w:rPr>
+          <w:rStyle w:val="NormalTok"/>
+        </w:rPr>
+        <w:t xml:space="preserve"> art </w:t>
+      </w:r>
+      <w:r>
+        <w:rPr>
+          <w:rStyle w:val="KeywordTok"/>
+        </w:rPr>
+        <w:t xml:space="preserve">WHERE</w:t>
+      </w:r>
+      <w:r>
+        <w:rPr>
+          <w:rStyle w:val="NormalTok"/>
+        </w:rPr>
+        <w:t xml:space="preserve"> birth_country </w:t>
+      </w:r>
+      <w:r>
+        <w:rPr>
+          <w:rStyle w:val="OperatorTok"/>
+        </w:rPr>
+        <w:t xml:space="preserve">=</w:t>
+      </w:r>
+      <w:r>
+        <w:rPr>
+          <w:rStyle w:val="NormalTok"/>
+        </w:rPr>
+        <w:t xml:space="preserve"> </w:t>
+      </w:r>
+      <w:r>
+        <w:rPr>
+          <w:rStyle w:val="StringTok"/>
+        </w:rPr>
+        <w:t xml:space="preserve">'British India'</w:t>
+      </w:r>
+      <w:r>
+        <w:rPr>
+          <w:rStyle w:val="NormalTok"/>
+        </w:rPr>
+        <w:t xml:space="preserve"> </w:t>
+      </w:r>
+      <w:r>
+        <w:rPr>
+          <w:rStyle w:val="KeywordTok"/>
+        </w:rPr>
+        <w:t xml:space="preserve">OR</w:t>
+      </w:r>
+      <w:r>
+        <w:rPr>
+          <w:rStyle w:val="NormalTok"/>
+        </w:rPr>
+        <w:t xml:space="preserve"> teaching </w:t>
+      </w:r>
+      <w:r>
+        <w:rPr>
+          <w:rStyle w:val="OperatorTok"/>
+        </w:rPr>
+        <w:t xml:space="preserve">&lt;&gt;</w:t>
+      </w:r>
+      <w:r>
+        <w:rPr>
+          <w:rStyle w:val="NormalTok"/>
+        </w:rPr>
+        <w:t xml:space="preserve"> </w:t>
+      </w:r>
+      <w:r>
+        <w:rPr>
+          <w:rStyle w:val="DecValTok"/>
+        </w:rPr>
+        <w:t xml:space="preserve">0</w:t>
+      </w:r>
+      <w:r>
+        <w:rPr>
+          <w:rStyle w:val="NormalTok"/>
+        </w:rPr>
+        <w:t xml:space="preserve"> </w:t>
+      </w:r>
+      <w:r>
+        <w:rPr>
+          <w:rStyle w:val="KeywordTok"/>
+        </w:rPr>
+        <w:t xml:space="preserve">GROUP</w:t>
+      </w:r>
+      <w:r>
+        <w:rPr>
+          <w:rStyle w:val="NormalTok"/>
+        </w:rPr>
+        <w:t xml:space="preserve"> </w:t>
+      </w:r>
+      <w:r>
+        <w:rPr>
+          <w:rStyle w:val="KeywordTok"/>
+        </w:rPr>
+        <w:t xml:space="preserve">BY</w:t>
+      </w:r>
+      <w:r>
+        <w:rPr>
+          <w:rStyle w:val="NormalTok"/>
+        </w:rPr>
+        <w:t xml:space="preserve"> genre</w:t>
+      </w:r>
+    </w:p>
+    <w:p>
+      <w:pPr>
+        <w:pStyle w:val="SourceCode"/>
+      </w:pPr>
+      <w:r>
+        <w:rPr>
+          <w:rStyle w:val="KeywordTok"/>
+        </w:rPr>
+        <w:t xml:space="preserve">SELECT</w:t>
+      </w:r>
+      <w:r>
+        <w:rPr>
+          <w:rStyle w:val="NormalTok"/>
+        </w:rPr>
+        <w:t xml:space="preserve"> nationality, </w:t>
+      </w:r>
+      <w:r>
+        <w:rPr>
+          <w:rStyle w:val="FunctionTok"/>
+        </w:rPr>
+        <w:t xml:space="preserve">MAX</w:t>
+      </w:r>
+      <w:r>
+        <w:rPr>
+          <w:rStyle w:val="NormalTok"/>
+        </w:rPr>
+        <w:t xml:space="preserve">(age) </w:t>
+      </w:r>
+      <w:r>
+        <w:rPr>
+          <w:rStyle w:val="KeywordTok"/>
+        </w:rPr>
+        <w:t xml:space="preserve">AS</w:t>
+      </w:r>
+      <w:r>
+        <w:rPr>
+          <w:rStyle w:val="NormalTok"/>
+        </w:rPr>
+        <w:t xml:space="preserve"> max_age </w:t>
+      </w:r>
+      <w:r>
+        <w:rPr>
+          <w:rStyle w:val="KeywordTok"/>
+        </w:rPr>
+        <w:t xml:space="preserve">FROM</w:t>
+      </w:r>
+      <w:r>
+        <w:rPr>
+          <w:rStyle w:val="NormalTok"/>
+        </w:rPr>
+        <w:t xml:space="preserve"> art </w:t>
+      </w:r>
+      <w:r>
+        <w:rPr>
+          <w:rStyle w:val="KeywordTok"/>
+        </w:rPr>
+        <w:t xml:space="preserve">WHERE</w:t>
+      </w:r>
+      <w:r>
+        <w:rPr>
+          <w:rStyle w:val="NormalTok"/>
+        </w:rPr>
+        <w:t xml:space="preserve"> tone </w:t>
+      </w:r>
+      <w:r>
+        <w:rPr>
+          <w:rStyle w:val="OperatorTok"/>
+        </w:rPr>
+        <w:t xml:space="preserve">=</w:t>
+      </w:r>
+      <w:r>
+        <w:rPr>
+          <w:rStyle w:val="NormalTok"/>
+        </w:rPr>
+        <w:t xml:space="preserve"> </w:t>
+      </w:r>
+      <w:r>
+        <w:rPr>
+          <w:rStyle w:val="StringTok"/>
+        </w:rPr>
+        <w:t xml:space="preserve">'Warm'</w:t>
+      </w:r>
+      <w:r>
+        <w:rPr>
+          <w:rStyle w:val="NormalTok"/>
+        </w:rPr>
+        <w:t xml:space="preserve"> </w:t>
+      </w:r>
+      <w:r>
+        <w:rPr>
+          <w:rStyle w:val="KeywordTok"/>
+        </w:rPr>
+        <w:t xml:space="preserve">GROUP</w:t>
+      </w:r>
+      <w:r>
+        <w:rPr>
+          <w:rStyle w:val="NormalTok"/>
+        </w:rPr>
+        <w:t xml:space="preserve"> </w:t>
+      </w:r>
+      <w:r>
+        <w:rPr>
+          <w:rStyle w:val="KeywordTok"/>
+        </w:rPr>
+        <w:t xml:space="preserve">BY</w:t>
+      </w:r>
+      <w:r>
+        <w:rPr>
+          <w:rStyle w:val="NormalTok"/>
+        </w:rPr>
+        <w:t xml:space="preserve"> nationality</w:t>
+      </w:r>
+    </w:p>
+    <w:p>
+      <w:pPr>
+        <w:pStyle w:val="SourceCode"/>
+      </w:pPr>
+      <w:r>
+        <w:rPr>
+          <w:rStyle w:val="KeywordTok"/>
+        </w:rPr>
+        <w:t xml:space="preserve">SELECT</w:t>
+      </w:r>
+      <w:r>
+        <w:rPr>
+          <w:rStyle w:val="NormalTok"/>
+        </w:rPr>
+        <w:t xml:space="preserve"> nationality, </w:t>
+      </w:r>
+      <w:r>
+        <w:rPr>
+          <w:rStyle w:val="FunctionTok"/>
+        </w:rPr>
+        <w:t xml:space="preserve">COUNT</w:t>
+      </w:r>
+      <w:r>
+        <w:rPr>
+          <w:rStyle w:val="NormalTok"/>
+        </w:rPr>
+        <w:t xml:space="preserve">(</w:t>
+      </w:r>
+      <w:r>
+        <w:rPr>
+          <w:rStyle w:val="OperatorTok"/>
+        </w:rPr>
+        <w:t xml:space="preserve">*</w:t>
+      </w:r>
+      <w:r>
+        <w:rPr>
+          <w:rStyle w:val="NormalTok"/>
+        </w:rPr>
+        <w:t xml:space="preserve">) </w:t>
+      </w:r>
+      <w:r>
+        <w:rPr>
+          <w:rStyle w:val="KeywordTok"/>
+        </w:rPr>
+        <w:t xml:space="preserve">AS</w:t>
+      </w:r>
+      <w:r>
+        <w:rPr>
+          <w:rStyle w:val="NormalTok"/>
+        </w:rPr>
+        <w:t xml:space="preserve"> artist_count </w:t>
+      </w:r>
+      <w:r>
+        <w:rPr>
+          <w:rStyle w:val="KeywordTok"/>
+        </w:rPr>
+        <w:t xml:space="preserve">FROM</w:t>
+      </w:r>
+      <w:r>
+        <w:rPr>
+          <w:rStyle w:val="NormalTok"/>
+        </w:rPr>
+        <w:t xml:space="preserve"> art </w:t>
+      </w:r>
+      <w:r>
+        <w:rPr>
+          <w:rStyle w:val="KeywordTok"/>
+        </w:rPr>
+        <w:t xml:space="preserve">WHERE</w:t>
+      </w:r>
+      <w:r>
+        <w:rPr>
+          <w:rStyle w:val="NormalTok"/>
+        </w:rPr>
+        <w:t xml:space="preserve"> tone </w:t>
+      </w:r>
+      <w:r>
+        <w:rPr>
+          <w:rStyle w:val="KeywordTok"/>
+        </w:rPr>
+        <w:t xml:space="preserve">IN</w:t>
+      </w:r>
+      <w:r>
+        <w:rPr>
+          <w:rStyle w:val="NormalTok"/>
+        </w:rPr>
+        <w:t xml:space="preserve"> (</w:t>
+      </w:r>
+      <w:r>
+        <w:rPr>
+          <w:rStyle w:val="StringTok"/>
+        </w:rPr>
+        <w:t xml:space="preserve">'Bright'</w:t>
+      </w:r>
+      <w:r>
+        <w:rPr>
+          <w:rStyle w:val="NormalTok"/>
+        </w:rPr>
+        <w:t xml:space="preserve">, </w:t>
+      </w:r>
+      <w:r>
+        <w:rPr>
+          <w:rStyle w:val="StringTok"/>
+        </w:rPr>
+        <w:t xml:space="preserve">'Dark'</w:t>
+      </w:r>
+      <w:r>
+        <w:rPr>
+          <w:rStyle w:val="NormalTok"/>
+        </w:rPr>
+        <w:t xml:space="preserve">) </w:t>
+      </w:r>
+      <w:r>
+        <w:rPr>
+          <w:rStyle w:val="KeywordTok"/>
+        </w:rPr>
+        <w:t xml:space="preserve">AND</w:t>
+      </w:r>
+      <w:r>
+        <w:rPr>
+          <w:rStyle w:val="NormalTok"/>
+        </w:rPr>
+        <w:t xml:space="preserve"> nationality </w:t>
+      </w:r>
+      <w:r>
+        <w:rPr>
+          <w:rStyle w:val="OperatorTok"/>
+        </w:rPr>
+        <w:t xml:space="preserve">&lt;&gt;</w:t>
+      </w:r>
+      <w:r>
+        <w:rPr>
+          <w:rStyle w:val="NormalTok"/>
+        </w:rPr>
+        <w:t xml:space="preserve"> </w:t>
+      </w:r>
+      <w:r>
+        <w:rPr>
+          <w:rStyle w:val="StringTok"/>
+        </w:rPr>
+        <w:t xml:space="preserve">''</w:t>
+      </w:r>
+      <w:r>
+        <w:rPr>
+          <w:rStyle w:val="NormalTok"/>
+        </w:rPr>
+        <w:t xml:space="preserve"> </w:t>
+      </w:r>
+      <w:r>
+        <w:rPr>
+          <w:rStyle w:val="KeywordTok"/>
+        </w:rPr>
+        <w:t xml:space="preserve">GROUP</w:t>
+      </w:r>
+      <w:r>
+        <w:rPr>
+          <w:rStyle w:val="NormalTok"/>
+        </w:rPr>
+        <w:t xml:space="preserve"> </w:t>
+      </w:r>
+      <w:r>
+        <w:rPr>
+          <w:rStyle w:val="KeywordTok"/>
+        </w:rPr>
+        <w:t xml:space="preserve">BY</w:t>
+      </w:r>
+      <w:r>
+        <w:rPr>
+          <w:rStyle w:val="NormalTok"/>
+        </w:rPr>
+        <w:t xml:space="preserve"> nationality </w:t>
+      </w:r>
+      <w:r>
+        <w:rPr>
+          <w:rStyle w:val="KeywordTok"/>
+        </w:rPr>
+        <w:t xml:space="preserve">HAVING</w:t>
+      </w:r>
+      <w:r>
+        <w:rPr>
+          <w:rStyle w:val="NormalTok"/>
+        </w:rPr>
+        <w:t xml:space="preserve"> </w:t>
+      </w:r>
+      <w:r>
+        <w:rPr>
+          <w:rStyle w:val="FunctionTok"/>
+        </w:rPr>
+        <w:t xml:space="preserve">COUNT</w:t>
+      </w:r>
+      <w:r>
+        <w:rPr>
+          <w:rStyle w:val="NormalTok"/>
+        </w:rPr>
+        <w:t xml:space="preserve">(</w:t>
+      </w:r>
+      <w:r>
+        <w:rPr>
+          <w:rStyle w:val="OperatorTok"/>
+        </w:rPr>
+        <w:t xml:space="preserve">*</w:t>
+      </w:r>
+      <w:r>
+        <w:rPr>
+          <w:rStyle w:val="NormalTok"/>
+        </w:rPr>
+        <w:t xml:space="preserve">) </w:t>
+      </w:r>
+      <w:r>
+        <w:rPr>
+          <w:rStyle w:val="OperatorTok"/>
+        </w:rPr>
+        <w:t xml:space="preserve">&gt;=</w:t>
+      </w:r>
+      <w:r>
+        <w:rPr>
+          <w:rStyle w:val="NormalTok"/>
+        </w:rPr>
+        <w:t xml:space="preserve"> </w:t>
+      </w:r>
+      <w:r>
+        <w:rPr>
+          <w:rStyle w:val="DecValTok"/>
+        </w:rPr>
+        <w:t xml:space="preserve">5</w:t>
+      </w:r>
+    </w:p>
+    <w:bookmarkEnd w:id="60"/>
+    <w:bookmarkStart w:id="61" w:name="medical-43-test-queries"/>
+    <w:p>
+      <w:pPr>
+        <w:pStyle w:val="Heading2"/>
+      </w:pPr>
+      <w:r>
+        <w:t xml:space="preserve">Medical (43 test queries)</w:t>
+      </w:r>
+    </w:p>
+    <w:p>
+      <w:pPr>
+        <w:pStyle w:val="SourceCode"/>
+      </w:pPr>
+      <w:r>
+        <w:rPr>
+          <w:rStyle w:val="KeywordTok"/>
+        </w:rPr>
+        <w:t xml:space="preserve">SELECT</w:t>
+      </w:r>
+      <w:r>
+        <w:rPr>
+          <w:rStyle w:val="NormalTok"/>
+        </w:rPr>
+        <w:t xml:space="preserve"> prescription_status, </w:t>
+      </w:r>
+      <w:r>
+        <w:rPr>
+          <w:rStyle w:val="FunctionTok"/>
+        </w:rPr>
+        <w:t xml:space="preserve">COUNT</w:t>
+      </w:r>
+      <w:r>
+        <w:rPr>
+          <w:rStyle w:val="NormalTok"/>
+        </w:rPr>
+        <w:t xml:space="preserve">(recommended_usage) </w:t>
+      </w:r>
+      <w:r>
+        <w:rPr>
+          <w:rStyle w:val="KeywordTok"/>
+        </w:rPr>
+        <w:t xml:space="preserve">AS</w:t>
+      </w:r>
+      <w:r>
+        <w:rPr>
+          <w:rStyle w:val="NormalTok"/>
+        </w:rPr>
+        <w:t xml:space="preserve"> count_side_effects </w:t>
+      </w:r>
+      <w:r>
+        <w:rPr>
+          <w:rStyle w:val="KeywordTok"/>
+        </w:rPr>
+        <w:t xml:space="preserve">FROM</w:t>
+      </w:r>
+      <w:r>
+        <w:rPr>
+          <w:rStyle w:val="NormalTok"/>
+        </w:rPr>
+        <w:t xml:space="preserve"> drug </w:t>
+      </w:r>
+      <w:r>
+        <w:rPr>
+          <w:rStyle w:val="KeywordTok"/>
+        </w:rPr>
+        <w:t xml:space="preserve">WHERE</w:t>
+      </w:r>
+      <w:r>
+        <w:rPr>
+          <w:rStyle w:val="NormalTok"/>
+        </w:rPr>
+        <w:t xml:space="preserve"> administration_route </w:t>
+      </w:r>
+      <w:r>
+        <w:rPr>
+          <w:rStyle w:val="OperatorTok"/>
+        </w:rPr>
+        <w:t xml:space="preserve">&lt;&gt;</w:t>
+      </w:r>
+      <w:r>
+        <w:rPr>
+          <w:rStyle w:val="NormalTok"/>
+        </w:rPr>
+        <w:t xml:space="preserve"> </w:t>
+      </w:r>
+      <w:r>
+        <w:rPr>
+          <w:rStyle w:val="StringTok"/>
+        </w:rPr>
+        <w:t xml:space="preserve">'inhalation'</w:t>
+      </w:r>
+      <w:r>
+        <w:rPr>
+          <w:rStyle w:val="NormalTok"/>
+        </w:rPr>
+        <w:t xml:space="preserve"> </w:t>
+      </w:r>
+      <w:r>
+        <w:rPr>
+          <w:rStyle w:val="KeywordTok"/>
+        </w:rPr>
+        <w:t xml:space="preserve">GROUP</w:t>
+      </w:r>
+      <w:r>
+        <w:rPr>
+          <w:rStyle w:val="NormalTok"/>
+        </w:rPr>
+        <w:t xml:space="preserve"> </w:t>
+      </w:r>
+      <w:r>
+        <w:rPr>
+          <w:rStyle w:val="KeywordTok"/>
+        </w:rPr>
+        <w:t xml:space="preserve">BY</w:t>
+      </w:r>
+      <w:r>
+        <w:rPr>
+          <w:rStyle w:val="NormalTok"/>
+        </w:rPr>
+        <w:t xml:space="preserve"> prescription_status</w:t>
+      </w:r>
+    </w:p>
+    <w:p>
+      <w:pPr>
+        <w:pStyle w:val="SourceCode"/>
+      </w:pPr>
+      <w:r>
+        <w:rPr>
+          <w:rStyle w:val="KeywordTok"/>
+        </w:rPr>
+        <w:t xml:space="preserve">SELECT</w:t>
+      </w:r>
+      <w:r>
+        <w:rPr>
+          <w:rStyle w:val="NormalTok"/>
+        </w:rPr>
+        <w:t xml:space="preserve"> disease.complications, </w:t>
+      </w:r>
+      <w:r>
+        <w:rPr>
+          <w:rStyle w:val="FunctionTok"/>
+        </w:rPr>
+        <w:t xml:space="preserve">COUNT</w:t>
+      </w:r>
+      <w:r>
+        <w:rPr>
+          <w:rStyle w:val="NormalTok"/>
+        </w:rPr>
+        <w:t xml:space="preserve">(disease.treatments) </w:t>
+      </w:r>
+      <w:r>
+        <w:rPr>
+          <w:rStyle w:val="KeywordTok"/>
+        </w:rPr>
+        <w:t xml:space="preserve">AS</w:t>
+      </w:r>
+      <w:r>
+        <w:rPr>
+          <w:rStyle w:val="NormalTok"/>
+        </w:rPr>
+        <w:t xml:space="preserve"> count_disease_treatments </w:t>
+      </w:r>
+      <w:r>
+        <w:rPr>
+          <w:rStyle w:val="KeywordTok"/>
+        </w:rPr>
+        <w:t xml:space="preserve">FROM</w:t>
+      </w:r>
+      <w:r>
+        <w:rPr>
+          <w:rStyle w:val="NormalTok"/>
+        </w:rPr>
+        <w:t xml:space="preserve"> drug </w:t>
+      </w:r>
+      <w:r>
+        <w:rPr>
+          <w:rStyle w:val="KeywordTok"/>
+        </w:rPr>
+        <w:t xml:space="preserve">JOIN</w:t>
+      </w:r>
+      <w:r>
+        <w:rPr>
+          <w:rStyle w:val="NormalTok"/>
+        </w:rPr>
+        <w:t xml:space="preserve"> disease </w:t>
+      </w:r>
+      <w:r>
+        <w:rPr>
+          <w:rStyle w:val="KeywordTok"/>
+        </w:rPr>
+        <w:t xml:space="preserve">ON</w:t>
+      </w:r>
+      <w:r>
+        <w:rPr>
+          <w:rStyle w:val="NormalTok"/>
+        </w:rPr>
+        <w:t xml:space="preserve"> drug.disease_name </w:t>
+      </w:r>
+      <w:r>
+        <w:rPr>
+          <w:rStyle w:val="OperatorTok"/>
+        </w:rPr>
+        <w:t xml:space="preserve">=</w:t>
+      </w:r>
+      <w:r>
+        <w:rPr>
+          <w:rStyle w:val="NormalTok"/>
+        </w:rPr>
+        <w:t xml:space="preserve"> disease.disease_name </w:t>
+      </w:r>
+      <w:r>
+        <w:rPr>
+          <w:rStyle w:val="KeywordTok"/>
+        </w:rPr>
+        <w:t xml:space="preserve">GROUP</w:t>
+      </w:r>
+      <w:r>
+        <w:rPr>
+          <w:rStyle w:val="NormalTok"/>
+        </w:rPr>
+        <w:t xml:space="preserve"> </w:t>
+      </w:r>
+      <w:r>
+        <w:rPr>
+          <w:rStyle w:val="KeywordTok"/>
+        </w:rPr>
+        <w:t xml:space="preserve">BY</w:t>
+      </w:r>
+      <w:r>
+        <w:rPr>
+          <w:rStyle w:val="NormalTok"/>
+        </w:rPr>
+        <w:t xml:space="preserve"> disease.complications</w:t>
+      </w:r>
+    </w:p>
+    <w:p>
+      <w:pPr>
+        <w:pStyle w:val="SourceCode"/>
+      </w:pPr>
+      <w:r>
+        <w:rPr>
+          <w:rStyle w:val="KeywordTok"/>
+        </w:rPr>
+        <w:t xml:space="preserve">SELECT</w:t>
+      </w:r>
+      <w:r>
+        <w:rPr>
+          <w:rStyle w:val="NormalTok"/>
+        </w:rPr>
+        <w:t xml:space="preserve"> prescription_status, </w:t>
+      </w:r>
+      <w:r>
+        <w:rPr>
+          <w:rStyle w:val="FunctionTok"/>
+        </w:rPr>
+        <w:t xml:space="preserve">COUNT</w:t>
+      </w:r>
+      <w:r>
+        <w:rPr>
+          <w:rStyle w:val="NormalTok"/>
+        </w:rPr>
+        <w:t xml:space="preserve">(mechanism_of_action) </w:t>
+      </w:r>
+      <w:r>
+        <w:rPr>
+          <w:rStyle w:val="KeywordTok"/>
+        </w:rPr>
+        <w:t xml:space="preserve">AS</w:t>
+      </w:r>
+      <w:r>
+        <w:rPr>
+          <w:rStyle w:val="NormalTok"/>
+        </w:rPr>
+        <w:t xml:space="preserve"> count_generic_name </w:t>
+      </w:r>
+      <w:r>
+        <w:rPr>
+          <w:rStyle w:val="KeywordTok"/>
+        </w:rPr>
+        <w:t xml:space="preserve">FROM</w:t>
+      </w:r>
+      <w:r>
+        <w:rPr>
+          <w:rStyle w:val="NormalTok"/>
+        </w:rPr>
+        <w:t xml:space="preserve"> drug </w:t>
+      </w:r>
+      <w:r>
+        <w:rPr>
+          <w:rStyle w:val="KeywordTok"/>
+        </w:rPr>
+        <w:t xml:space="preserve">WHERE</w:t>
+      </w:r>
+      <w:r>
+        <w:rPr>
+          <w:rStyle w:val="NormalTok"/>
+        </w:rPr>
+        <w:t xml:space="preserve"> (administration_route </w:t>
+      </w:r>
+      <w:r>
+        <w:rPr>
+          <w:rStyle w:val="OperatorTok"/>
+        </w:rPr>
+        <w:t xml:space="preserve">=</w:t>
+      </w:r>
+      <w:r>
+        <w:rPr>
+          <w:rStyle w:val="NormalTok"/>
+        </w:rPr>
+        <w:t xml:space="preserve"> </w:t>
+      </w:r>
+      <w:r>
+        <w:rPr>
+          <w:rStyle w:val="StringTok"/>
+        </w:rPr>
+        <w:t xml:space="preserve">'injection'</w:t>
+      </w:r>
+      <w:r>
+        <w:rPr>
+          <w:rStyle w:val="NormalTok"/>
+        </w:rPr>
+        <w:t xml:space="preserve">) </w:t>
+      </w:r>
+      <w:r>
+        <w:rPr>
+          <w:rStyle w:val="KeywordTok"/>
+        </w:rPr>
+        <w:t xml:space="preserve">AND</w:t>
+      </w:r>
+      <w:r>
+        <w:rPr>
+          <w:rStyle w:val="NormalTok"/>
+        </w:rPr>
+        <w:t xml:space="preserve"> (administration_route </w:t>
+      </w:r>
+      <w:r>
+        <w:rPr>
+          <w:rStyle w:val="OperatorTok"/>
+        </w:rPr>
+        <w:t xml:space="preserve">&lt;&gt;</w:t>
+      </w:r>
+      <w:r>
+        <w:rPr>
+          <w:rStyle w:val="NormalTok"/>
+        </w:rPr>
+        <w:t xml:space="preserve"> </w:t>
+      </w:r>
+      <w:r>
+        <w:rPr>
+          <w:rStyle w:val="StringTok"/>
+        </w:rPr>
+        <w:t xml:space="preserve">'subcutaneous'</w:t>
+      </w:r>
+      <w:r>
+        <w:rPr>
+          <w:rStyle w:val="NormalTok"/>
+        </w:rPr>
+        <w:t xml:space="preserve">) </w:t>
+      </w:r>
+      <w:r>
+        <w:rPr>
+          <w:rStyle w:val="KeywordTok"/>
+        </w:rPr>
+        <w:t xml:space="preserve">GROUP</w:t>
+      </w:r>
+      <w:r>
+        <w:rPr>
+          <w:rStyle w:val="NormalTok"/>
+        </w:rPr>
+        <w:t xml:space="preserve"> </w:t>
+      </w:r>
+      <w:r>
+        <w:rPr>
+          <w:rStyle w:val="KeywordTok"/>
+        </w:rPr>
+        <w:t xml:space="preserve">BY</w:t>
+      </w:r>
+      <w:r>
+        <w:rPr>
+          <w:rStyle w:val="NormalTok"/>
+        </w:rPr>
+        <w:t xml:space="preserve"> prescription_status</w:t>
+      </w:r>
+    </w:p>
+    <w:bookmarkEnd w:id="61"/>
+    <w:bookmarkStart w:id="62" w:name="court-judgments-27-test-queries"/>
+    <w:p>
+      <w:pPr>
+        <w:pStyle w:val="Heading2"/>
+      </w:pPr>
+      <w:r>
+        <w:t xml:space="preserve">Court judgments (27 test queries)</w:t>
+      </w:r>
+    </w:p>
+    <w:p>
+      <w:pPr>
+        <w:pStyle w:val="SourceCode"/>
+      </w:pPr>
+      <w:r>
+        <w:rPr>
+          <w:rStyle w:val="KeywordTok"/>
+        </w:rPr>
+        <w:t xml:space="preserve">SELECT</w:t>
+      </w:r>
+      <w:r>
+        <w:rPr>
+          <w:rStyle w:val="NormalTok"/>
+        </w:rPr>
+        <w:t xml:space="preserve"> </w:t>
+      </w:r>
+      <w:r>
+        <w:rPr>
+          <w:rStyle w:val="ControlFlowTok"/>
+        </w:rPr>
+        <w:t xml:space="preserve">CASE</w:t>
+      </w:r>
+      <w:r>
+        <w:rPr>
+          <w:rStyle w:val="NormalTok"/>
+        </w:rPr>
+        <w:t xml:space="preserve"> </w:t>
+      </w:r>
+      <w:r>
+        <w:rPr>
+          <w:rStyle w:val="ControlFlowTok"/>
+        </w:rPr>
+        <w:t xml:space="preserve">WHEN</w:t>
+      </w:r>
+      <w:r>
+        <w:rPr>
+          <w:rStyle w:val="NormalTok"/>
+        </w:rPr>
+        <w:t xml:space="preserve"> case_type </w:t>
+      </w:r>
+      <w:r>
+        <w:rPr>
+          <w:rStyle w:val="KeywordTok"/>
+        </w:rPr>
+        <w:t xml:space="preserve">IN</w:t>
+      </w:r>
+      <w:r>
+        <w:rPr>
+          <w:rStyle w:val="NormalTok"/>
+        </w:rPr>
+        <w:t xml:space="preserve"> (</w:t>
+      </w:r>
+      <w:r>
+        <w:rPr>
+          <w:rStyle w:val="StringTok"/>
+        </w:rPr>
+        <w:t xml:space="preserve">'Administrative Case'</w:t>
+      </w:r>
+      <w:r>
+        <w:rPr>
+          <w:rStyle w:val="NormalTok"/>
+        </w:rPr>
+        <w:t xml:space="preserve">, </w:t>
+      </w:r>
+      <w:r>
+        <w:rPr>
+          <w:rStyle w:val="StringTok"/>
+        </w:rPr>
+        <w:t xml:space="preserve">'Civil Case'</w:t>
+      </w:r>
+      <w:r>
+        <w:rPr>
+          <w:rStyle w:val="NormalTok"/>
+        </w:rPr>
+        <w:t xml:space="preserve">, </w:t>
+      </w:r>
+      <w:r>
+        <w:rPr>
+          <w:rStyle w:val="StringTok"/>
+        </w:rPr>
+        <w:t xml:space="preserve">'Commercial Case'</w:t>
+      </w:r>
+      <w:r>
+        <w:rPr>
+          <w:rStyle w:val="NormalTok"/>
+        </w:rPr>
+        <w:t xml:space="preserve">) </w:t>
+      </w:r>
+      <w:r>
+        <w:rPr>
+          <w:rStyle w:val="ControlFlowTok"/>
+        </w:rPr>
+        <w:t xml:space="preserve">THEN</w:t>
+      </w:r>
+      <w:r>
+        <w:rPr>
+          <w:rStyle w:val="NormalTok"/>
+        </w:rPr>
+        <w:t xml:space="preserve"> case_type </w:t>
+      </w:r>
+      <w:r>
+        <w:rPr>
+          <w:rStyle w:val="ControlFlowTok"/>
+        </w:rPr>
+        <w:t xml:space="preserve">ELSE</w:t>
+      </w:r>
+      <w:r>
+        <w:rPr>
+          <w:rStyle w:val="NormalTok"/>
+        </w:rPr>
+        <w:t xml:space="preserve"> </w:t>
+      </w:r>
+      <w:r>
+        <w:rPr>
+          <w:rStyle w:val="StringTok"/>
+        </w:rPr>
+        <w:t xml:space="preserve">'Other'</w:t>
+      </w:r>
+      <w:r>
+        <w:rPr>
+          <w:rStyle w:val="NormalTok"/>
+        </w:rPr>
+        <w:t xml:space="preserve"> </w:t>
+      </w:r>
+      <w:r>
+        <w:rPr>
+          <w:rStyle w:val="ControlFlowTok"/>
+        </w:rPr>
+        <w:t xml:space="preserve">END</w:t>
+      </w:r>
+      <w:r>
+        <w:rPr>
+          <w:rStyle w:val="NormalTok"/>
+        </w:rPr>
+        <w:t xml:space="preserve"> </w:t>
+      </w:r>
+      <w:r>
+        <w:rPr>
+          <w:rStyle w:val="KeywordTok"/>
+        </w:rPr>
+        <w:t xml:space="preserve">AS</w:t>
+      </w:r>
+      <w:r>
+        <w:rPr>
+          <w:rStyle w:val="NormalTok"/>
+        </w:rPr>
+        <w:t xml:space="preserve"> case_family, </w:t>
+      </w:r>
+      <w:r>
+        <w:rPr>
+          <w:rStyle w:val="FunctionTok"/>
+        </w:rPr>
+        <w:t xml:space="preserve">COUNT</w:t>
+      </w:r>
+      <w:r>
+        <w:rPr>
+          <w:rStyle w:val="NormalTok"/>
+        </w:rPr>
+        <w:t xml:space="preserve">(</w:t>
+      </w:r>
+      <w:r>
+        <w:rPr>
+          <w:rStyle w:val="OperatorTok"/>
+        </w:rPr>
+        <w:t xml:space="preserve">*</w:t>
+      </w:r>
+      <w:r>
+        <w:rPr>
+          <w:rStyle w:val="NormalTok"/>
+        </w:rPr>
+        <w:t xml:space="preserve">) </w:t>
+      </w:r>
+      <w:r>
+        <w:rPr>
+          <w:rStyle w:val="KeywordTok"/>
+        </w:rPr>
+        <w:t xml:space="preserve">AS</w:t>
+      </w:r>
+      <w:r>
+        <w:rPr>
+          <w:rStyle w:val="NormalTok"/>
+        </w:rPr>
+        <w:t xml:space="preserve"> case_count </w:t>
+      </w:r>
+      <w:r>
+        <w:rPr>
+          <w:rStyle w:val="KeywordTok"/>
+        </w:rPr>
+        <w:t xml:space="preserve">FROM</w:t>
+      </w:r>
+      <w:r>
+        <w:rPr>
+          <w:rStyle w:val="NormalTok"/>
+        </w:rPr>
+        <w:t xml:space="preserve"> legal </w:t>
+      </w:r>
+      <w:r>
+        <w:rPr>
+          <w:rStyle w:val="KeywordTok"/>
+        </w:rPr>
+        <w:t xml:space="preserve">WHERE</w:t>
+      </w:r>
+      <w:r>
+        <w:rPr>
+          <w:rStyle w:val="NormalTok"/>
+        </w:rPr>
+        <w:t xml:space="preserve"> fine_amount </w:t>
+      </w:r>
+      <w:r>
+        <w:rPr>
+          <w:rStyle w:val="KeywordTok"/>
+        </w:rPr>
+        <w:t xml:space="preserve">IN</w:t>
+      </w:r>
+      <w:r>
+        <w:rPr>
+          <w:rStyle w:val="NormalTok"/>
+        </w:rPr>
+        <w:t xml:space="preserve"> (</w:t>
+      </w:r>
+      <w:r>
+        <w:rPr>
+          <w:rStyle w:val="StringTok"/>
+        </w:rPr>
+        <w:t xml:space="preserve">'0'</w:t>
+      </w:r>
+      <w:r>
+        <w:rPr>
+          <w:rStyle w:val="NormalTok"/>
+        </w:rPr>
+        <w:t xml:space="preserve">, </w:t>
+      </w:r>
+      <w:r>
+        <w:rPr>
+          <w:rStyle w:val="StringTok"/>
+        </w:rPr>
+        <w:t xml:space="preserve">'5000'</w:t>
+      </w:r>
+      <w:r>
+        <w:rPr>
+          <w:rStyle w:val="NormalTok"/>
+        </w:rPr>
+        <w:t xml:space="preserve">, </w:t>
+      </w:r>
+      <w:r>
+        <w:rPr>
+          <w:rStyle w:val="StringTok"/>
+        </w:rPr>
+        <w:t xml:space="preserve">'20000'</w:t>
+      </w:r>
+      <w:r>
+        <w:rPr>
+          <w:rStyle w:val="NormalTok"/>
+        </w:rPr>
+        <w:t xml:space="preserve">) </w:t>
+      </w:r>
+      <w:r>
+        <w:rPr>
+          <w:rStyle w:val="KeywordTok"/>
+        </w:rPr>
+        <w:t xml:space="preserve">GROUP</w:t>
+      </w:r>
+      <w:r>
+        <w:rPr>
+          <w:rStyle w:val="NormalTok"/>
+        </w:rPr>
+        <w:t xml:space="preserve"> </w:t>
+      </w:r>
+      <w:r>
+        <w:rPr>
+          <w:rStyle w:val="KeywordTok"/>
+        </w:rPr>
+        <w:t xml:space="preserve">BY</w:t>
+      </w:r>
+      <w:r>
+        <w:rPr>
+          <w:rStyle w:val="NormalTok"/>
+        </w:rPr>
+        <w:t xml:space="preserve"> case_family</w:t>
+      </w:r>
+    </w:p>
+    <w:p>
+      <w:pPr>
+        <w:pStyle w:val="SourceCode"/>
+      </w:pPr>
+      <w:r>
+        <w:rPr>
+          <w:rStyle w:val="KeywordTok"/>
+        </w:rPr>
+        <w:t xml:space="preserve">SELECT</w:t>
+      </w:r>
+      <w:r>
+        <w:rPr>
+          <w:rStyle w:val="NormalTok"/>
+        </w:rPr>
+        <w:t xml:space="preserve"> </w:t>
+      </w:r>
+      <w:r>
+        <w:rPr>
+          <w:rStyle w:val="ControlFlowTok"/>
+        </w:rPr>
+        <w:t xml:space="preserve">CASE</w:t>
+      </w:r>
+      <w:r>
+        <w:rPr>
+          <w:rStyle w:val="NormalTok"/>
+        </w:rPr>
+        <w:t xml:space="preserve"> </w:t>
+      </w:r>
+      <w:r>
+        <w:rPr>
+          <w:rStyle w:val="ControlFlowTok"/>
+        </w:rPr>
+        <w:t xml:space="preserve">WHEN</w:t>
+      </w:r>
+      <w:r>
+        <w:rPr>
+          <w:rStyle w:val="NormalTok"/>
+        </w:rPr>
+        <w:t xml:space="preserve"> verdict </w:t>
+      </w:r>
+      <w:r>
+        <w:rPr>
+          <w:rStyle w:val="KeywordTok"/>
+        </w:rPr>
+        <w:t xml:space="preserve">IN</w:t>
+      </w:r>
+      <w:r>
+        <w:rPr>
+          <w:rStyle w:val="NormalTok"/>
+        </w:rPr>
+        <w:t xml:space="preserve"> (</w:t>
+      </w:r>
+      <w:r>
+        <w:rPr>
+          <w:rStyle w:val="StringTok"/>
+        </w:rPr>
+        <w:t xml:space="preserve">'Dismissed'</w:t>
+      </w:r>
+      <w:r>
+        <w:rPr>
+          <w:rStyle w:val="NormalTok"/>
+        </w:rPr>
+        <w:t xml:space="preserve">, </w:t>
+      </w:r>
+      <w:r>
+        <w:rPr>
+          <w:rStyle w:val="StringTok"/>
+        </w:rPr>
+        <w:t xml:space="preserve">'Approved'</w:t>
+      </w:r>
+      <w:r>
+        <w:rPr>
+          <w:rStyle w:val="NormalTok"/>
+        </w:rPr>
+        <w:t xml:space="preserve">, </w:t>
+      </w:r>
+      <w:r>
+        <w:rPr>
+          <w:rStyle w:val="StringTok"/>
+        </w:rPr>
+        <w:t xml:space="preserve">'Others'</w:t>
+      </w:r>
+      <w:r>
+        <w:rPr>
+          <w:rStyle w:val="NormalTok"/>
+        </w:rPr>
+        <w:t xml:space="preserve">) </w:t>
+      </w:r>
+      <w:r>
+        <w:rPr>
+          <w:rStyle w:val="ControlFlowTok"/>
+        </w:rPr>
+        <w:t xml:space="preserve">THEN</w:t>
+      </w:r>
+      <w:r>
+        <w:rPr>
+          <w:rStyle w:val="NormalTok"/>
+        </w:rPr>
+        <w:t xml:space="preserve"> verdict </w:t>
+      </w:r>
+      <w:r>
+        <w:rPr>
+          <w:rStyle w:val="ControlFlowTok"/>
+        </w:rPr>
+        <w:t xml:space="preserve">ELSE</w:t>
+      </w:r>
+      <w:r>
+        <w:rPr>
+          <w:rStyle w:val="NormalTok"/>
+        </w:rPr>
+        <w:t xml:space="preserve"> </w:t>
+      </w:r>
+      <w:r>
+        <w:rPr>
+          <w:rStyle w:val="StringTok"/>
+        </w:rPr>
+        <w:t xml:space="preserve">'Other'</w:t>
+      </w:r>
+      <w:r>
+        <w:rPr>
+          <w:rStyle w:val="NormalTok"/>
+        </w:rPr>
+        <w:t xml:space="preserve"> </w:t>
+      </w:r>
+      <w:r>
+        <w:rPr>
+          <w:rStyle w:val="ControlFlowTok"/>
+        </w:rPr>
+        <w:t xml:space="preserve">END</w:t>
+      </w:r>
+      <w:r>
+        <w:rPr>
+          <w:rStyle w:val="NormalTok"/>
+        </w:rPr>
+        <w:t xml:space="preserve"> </w:t>
+      </w:r>
+      <w:r>
+        <w:rPr>
+          <w:rStyle w:val="KeywordTok"/>
+        </w:rPr>
+        <w:t xml:space="preserve">AS</w:t>
+      </w:r>
+      <w:r>
+        <w:rPr>
+          <w:rStyle w:val="NormalTok"/>
+        </w:rPr>
+        <w:t xml:space="preserve"> verdict_family, </w:t>
+      </w:r>
+      <w:r>
+        <w:rPr>
+          <w:rStyle w:val="FunctionTok"/>
+        </w:rPr>
+        <w:t xml:space="preserve">AVG</w:t>
+      </w:r>
+      <w:r>
+        <w:rPr>
+          <w:rStyle w:val="NormalTok"/>
+        </w:rPr>
+        <w:t xml:space="preserve">(legal_basis_num) </w:t>
+      </w:r>
+      <w:r>
+        <w:rPr>
+          <w:rStyle w:val="KeywordTok"/>
+        </w:rPr>
+        <w:t xml:space="preserve">AS</w:t>
+      </w:r>
+      <w:r>
+        <w:rPr>
+          <w:rStyle w:val="NormalTok"/>
+        </w:rPr>
+        <w:t xml:space="preserve"> avg_statutes </w:t>
+      </w:r>
+      <w:r>
+        <w:rPr>
+          <w:rStyle w:val="KeywordTok"/>
+        </w:rPr>
+        <w:t xml:space="preserve">FROM</w:t>
+      </w:r>
+      <w:r>
+        <w:rPr>
+          <w:rStyle w:val="NormalTok"/>
+        </w:rPr>
+        <w:t xml:space="preserve"> legal </w:t>
+      </w:r>
+      <w:r>
+        <w:rPr>
+          <w:rStyle w:val="KeywordTok"/>
+        </w:rPr>
+        <w:t xml:space="preserve">WHERE</w:t>
+      </w:r>
+      <w:r>
+        <w:rPr>
+          <w:rStyle w:val="NormalTok"/>
+        </w:rPr>
+        <w:t xml:space="preserve"> judgment_year </w:t>
+      </w:r>
+      <w:r>
+        <w:rPr>
+          <w:rStyle w:val="OperatorTok"/>
+        </w:rPr>
+        <w:t xml:space="preserve">=</w:t>
+      </w:r>
+      <w:r>
+        <w:rPr>
+          <w:rStyle w:val="NormalTok"/>
+        </w:rPr>
+        <w:t xml:space="preserve"> </w:t>
+      </w:r>
+      <w:r>
+        <w:rPr>
+          <w:rStyle w:val="StringTok"/>
+        </w:rPr>
+        <w:t xml:space="preserve">'2009'</w:t>
+      </w:r>
+      <w:r>
+        <w:rPr>
+          <w:rStyle w:val="NormalTok"/>
+        </w:rPr>
+        <w:t xml:space="preserve"> </w:t>
+      </w:r>
+      <w:r>
+        <w:rPr>
+          <w:rStyle w:val="KeywordTok"/>
+        </w:rPr>
+        <w:t xml:space="preserve">AND</w:t>
+      </w:r>
+      <w:r>
+        <w:rPr>
+          <w:rStyle w:val="NormalTok"/>
+        </w:rPr>
+        <w:t xml:space="preserve"> case_number </w:t>
+      </w:r>
+      <w:r>
+        <w:rPr>
+          <w:rStyle w:val="OperatorTok"/>
+        </w:rPr>
+        <w:t xml:space="preserve">&gt;=</w:t>
+      </w:r>
+      <w:r>
+        <w:rPr>
+          <w:rStyle w:val="NormalTok"/>
+        </w:rPr>
+        <w:t xml:space="preserve"> </w:t>
+      </w:r>
+      <w:r>
+        <w:rPr>
+          <w:rStyle w:val="DecValTok"/>
+        </w:rPr>
+        <w:t xml:space="preserve">3</w:t>
+      </w:r>
+      <w:r>
+        <w:rPr>
+          <w:rStyle w:val="NormalTok"/>
+        </w:rPr>
+        <w:t xml:space="preserve"> </w:t>
+      </w:r>
+      <w:r>
+        <w:rPr>
+          <w:rStyle w:val="KeywordTok"/>
+        </w:rPr>
+        <w:t xml:space="preserve">GROUP</w:t>
+      </w:r>
+      <w:r>
+        <w:rPr>
+          <w:rStyle w:val="NormalTok"/>
+        </w:rPr>
+        <w:t xml:space="preserve"> </w:t>
+      </w:r>
+      <w:r>
+        <w:rPr>
+          <w:rStyle w:val="KeywordTok"/>
+        </w:rPr>
+        <w:t xml:space="preserve">BY</w:t>
+      </w:r>
+      <w:r>
+        <w:rPr>
+          <w:rStyle w:val="NormalTok"/>
+        </w:rPr>
+        <w:t xml:space="preserve"> verdict_family</w:t>
+      </w:r>
+    </w:p>
+    <w:p>
+      <w:pPr>
+        <w:pStyle w:val="SourceCode"/>
+      </w:pPr>
+      <w:r>
+        <w:rPr>
+          <w:rStyle w:val="KeywordTok"/>
+        </w:rPr>
+        <w:t xml:space="preserve">SELECT</w:t>
+      </w:r>
+      <w:r>
+        <w:rPr>
+          <w:rStyle w:val="NormalTok"/>
+        </w:rPr>
+        <w:t xml:space="preserve"> evidence, </w:t>
+      </w:r>
+      <w:r>
+        <w:rPr>
+          <w:rStyle w:val="FunctionTok"/>
+        </w:rPr>
+        <w:t xml:space="preserve">MIN</w:t>
+      </w:r>
+      <w:r>
+        <w:rPr>
+          <w:rStyle w:val="NormalTok"/>
+        </w:rPr>
+        <w:t xml:space="preserve">(judgment_year) </w:t>
+      </w:r>
+      <w:r>
+        <w:rPr>
+          <w:rStyle w:val="KeywordTok"/>
+        </w:rPr>
+        <w:t xml:space="preserve">AS</w:t>
+      </w:r>
+      <w:r>
+        <w:rPr>
+          <w:rStyle w:val="NormalTok"/>
+        </w:rPr>
+        <w:t xml:space="preserve"> min_hearing_year </w:t>
+      </w:r>
+      <w:r>
+        <w:rPr>
+          <w:rStyle w:val="KeywordTok"/>
+        </w:rPr>
+        <w:t xml:space="preserve">FROM</w:t>
+      </w:r>
+      <w:r>
+        <w:rPr>
+          <w:rStyle w:val="NormalTok"/>
+        </w:rPr>
+        <w:t xml:space="preserve"> legal </w:t>
+      </w:r>
+      <w:r>
+        <w:rPr>
+          <w:rStyle w:val="KeywordTok"/>
+        </w:rPr>
+        <w:t xml:space="preserve">GROUP</w:t>
+      </w:r>
+      <w:r>
+        <w:rPr>
+          <w:rStyle w:val="NormalTok"/>
+        </w:rPr>
+        <w:t xml:space="preserve"> </w:t>
+      </w:r>
+      <w:r>
+        <w:rPr>
+          <w:rStyle w:val="KeywordTok"/>
+        </w:rPr>
+        <w:t xml:space="preserve">BY</w:t>
+      </w:r>
+      <w:r>
+        <w:rPr>
+          <w:rStyle w:val="NormalTok"/>
+        </w:rPr>
+        <w:t xml:space="preserve"> evidence</w:t>
+      </w:r>
+    </w:p>
+    <w:p>
+      <w:pPr>
+        <w:pStyle w:val="SourceCode"/>
+      </w:pPr>
+      <w:r>
+        <w:rPr>
+          <w:rStyle w:val="KeywordTok"/>
+        </w:rPr>
+        <w:t xml:space="preserve">SELECT</w:t>
+      </w:r>
+      <w:r>
+        <w:rPr>
+          <w:rStyle w:val="NormalTok"/>
+        </w:rPr>
+        <w:t xml:space="preserve"> verdict, </w:t>
+      </w:r>
+      <w:r>
+        <w:rPr>
+          <w:rStyle w:val="FunctionTok"/>
+        </w:rPr>
+        <w:t xml:space="preserve">MIN</w:t>
+      </w:r>
+      <w:r>
+        <w:rPr>
+          <w:rStyle w:val="NormalTok"/>
+        </w:rPr>
+        <w:t xml:space="preserve">(legal_basis_num) </w:t>
+      </w:r>
+      <w:r>
+        <w:rPr>
+          <w:rStyle w:val="KeywordTok"/>
+        </w:rPr>
+        <w:t xml:space="preserve">AS</w:t>
+      </w:r>
+      <w:r>
+        <w:rPr>
+          <w:rStyle w:val="NormalTok"/>
+        </w:rPr>
+        <w:t xml:space="preserve"> min_legal_basis_num </w:t>
+      </w:r>
+      <w:r>
+        <w:rPr>
+          <w:rStyle w:val="KeywordTok"/>
+        </w:rPr>
+        <w:t xml:space="preserve">FROM</w:t>
+      </w:r>
+      <w:r>
+        <w:rPr>
+          <w:rStyle w:val="NormalTok"/>
+        </w:rPr>
+        <w:t xml:space="preserve"> legal </w:t>
+      </w:r>
+      <w:r>
+        <w:rPr>
+          <w:rStyle w:val="KeywordTok"/>
+        </w:rPr>
+        <w:t xml:space="preserve">WHERE</w:t>
+      </w:r>
+      <w:r>
+        <w:rPr>
+          <w:rStyle w:val="NormalTok"/>
+        </w:rPr>
+        <w:t xml:space="preserve"> fine_amount </w:t>
+      </w:r>
+      <w:r>
+        <w:rPr>
+          <w:rStyle w:val="OperatorTok"/>
+        </w:rPr>
+        <w:t xml:space="preserve">=</w:t>
+      </w:r>
+      <w:r>
+        <w:rPr>
+          <w:rStyle w:val="NormalTok"/>
+        </w:rPr>
+        <w:t xml:space="preserve"> </w:t>
+      </w:r>
+      <w:r>
+        <w:rPr>
+          <w:rStyle w:val="StringTok"/>
+        </w:rPr>
+        <w:t xml:space="preserve">'20000'</w:t>
+      </w:r>
+      <w:r>
+        <w:rPr>
+          <w:rStyle w:val="NormalTok"/>
+        </w:rPr>
+        <w:t xml:space="preserve"> </w:t>
+      </w:r>
+      <w:r>
+        <w:rPr>
+          <w:rStyle w:val="KeywordTok"/>
+        </w:rPr>
+        <w:t xml:space="preserve">AND</w:t>
+      </w:r>
+      <w:r>
+        <w:rPr>
+          <w:rStyle w:val="NormalTok"/>
+        </w:rPr>
+        <w:t xml:space="preserve"> defendant </w:t>
+      </w:r>
+      <w:r>
+        <w:rPr>
+          <w:rStyle w:val="OperatorTok"/>
+        </w:rPr>
+        <w:t xml:space="preserve">&lt;&gt;</w:t>
+      </w:r>
+      <w:r>
+        <w:rPr>
+          <w:rStyle w:val="NormalTok"/>
+        </w:rPr>
+        <w:t xml:space="preserve"> </w:t>
+      </w:r>
+      <w:r>
+        <w:rPr>
+          <w:rStyle w:val="StringTok"/>
+        </w:rPr>
+        <w:t xml:space="preserve">'Construction, Forestry, Mining and Energy Union'</w:t>
+      </w:r>
+      <w:r>
+        <w:rPr>
+          <w:rStyle w:val="NormalTok"/>
+        </w:rPr>
+        <w:t xml:space="preserve"> </w:t>
+      </w:r>
+      <w:r>
+        <w:rPr>
+          <w:rStyle w:val="KeywordTok"/>
+        </w:rPr>
+        <w:t xml:space="preserve">AND</w:t>
+      </w:r>
+      <w:r>
+        <w:rPr>
+          <w:rStyle w:val="NormalTok"/>
+        </w:rPr>
+        <w:t xml:space="preserve"> fine_amount </w:t>
+      </w:r>
+      <w:r>
+        <w:rPr>
+          <w:rStyle w:val="OperatorTok"/>
+        </w:rPr>
+        <w:t xml:space="preserve">&lt;&gt;</w:t>
+      </w:r>
+      <w:r>
+        <w:rPr>
+          <w:rStyle w:val="NormalTok"/>
+        </w:rPr>
+        <w:t xml:space="preserve"> </w:t>
+      </w:r>
+      <w:r>
+        <w:rPr>
+          <w:rStyle w:val="StringTok"/>
+        </w:rPr>
+        <w:t xml:space="preserve">'70000'</w:t>
+      </w:r>
+      <w:r>
+        <w:rPr>
+          <w:rStyle w:val="NormalTok"/>
+        </w:rPr>
+        <w:t xml:space="preserve"> </w:t>
+      </w:r>
+      <w:r>
+        <w:rPr>
+          <w:rStyle w:val="KeywordTok"/>
+        </w:rPr>
+        <w:t xml:space="preserve">GROUP</w:t>
+      </w:r>
+      <w:r>
+        <w:rPr>
+          <w:rStyle w:val="NormalTok"/>
+        </w:rPr>
+        <w:t xml:space="preserve"> </w:t>
+      </w:r>
+      <w:r>
+        <w:rPr>
+          <w:rStyle w:val="KeywordTok"/>
+        </w:rPr>
+        <w:t xml:space="preserve">BY</w:t>
+      </w:r>
+      <w:r>
+        <w:rPr>
+          <w:rStyle w:val="NormalTok"/>
+        </w:rPr>
+        <w:t xml:space="preserve"> verdict</w:t>
+      </w:r>
+    </w:p>
+    <w:bookmarkEnd w:id="62"/>
+    <w:bookmarkEnd w:id="63"/>
     <w:sectPr/>
   </w:body>
 </w:document>

</xml_diff>

<commit_message>
Why document restructured around transferable knowledge: property-first headings, 'what this lets you decide' per section, cross-area section; new analyses: prompt disagreement as an error check (per cell and per column) and its transfer to DocETL, need probability vs break-even, within-corpus aggregate and GROUP BY effects (COUNT's low score is a corpus effect)
Co-Authored-By: Claude Opus 5.5 <noreply@anthropic.com>
</commit_message>
<xml_diff>
--- a/results/experiments/why/Key_findings_and_why.docx
+++ b/results/experiments/why/Key_findings_and_why.docx
@@ -7,7 +7,13 @@
         <w:pStyle w:val="Title"/>
       </w:pPr>
       <w:r>
-        <w:t xml:space="preserve">Why</w:t>
+        <w:t xml:space="preserve">What</w:t>
+      </w:r>
+      <w:r>
+        <w:t xml:space="preserve"> </w:t>
+      </w:r>
+      <w:r>
+        <w:t xml:space="preserve">decides</w:t>
       </w:r>
       <w:r>
         <w:t xml:space="preserve"> </w:t>
@@ -19,37 +25,73 @@
         <w:t xml:space="preserve"> </w:t>
       </w:r>
       <w:r>
-        <w:t xml:space="preserve">system</w:t>
-      </w:r>
-      <w:r>
-        <w:t xml:space="preserve"> </w:t>
-      </w:r>
-      <w:r>
-        <w:t xml:space="preserve">behaves</w:t>
-      </w:r>
-      <w:r>
-        <w:t xml:space="preserve"> </w:t>
-      </w:r>
-      <w:r>
-        <w:t xml:space="preserve">the</w:t>
-      </w:r>
-      <w:r>
-        <w:t xml:space="preserve"> </w:t>
-      </w:r>
-      <w:r>
-        <w:t xml:space="preserve">way</w:t>
-      </w:r>
-      <w:r>
-        <w:t xml:space="preserve"> </w:t>
-      </w:r>
-      <w:r>
-        <w:t xml:space="preserve">it</w:t>
-      </w:r>
-      <w:r>
-        <w:t xml:space="preserve"> </w:t>
-      </w:r>
-      <w:r>
-        <w:t xml:space="preserve">does</w:t>
+        <w:t xml:space="preserve">accuracy</w:t>
+      </w:r>
+      <w:r>
+        <w:t xml:space="preserve"> </w:t>
+      </w:r>
+      <w:r>
+        <w:t xml:space="preserve">and</w:t>
+      </w:r>
+      <w:r>
+        <w:t xml:space="preserve"> </w:t>
+      </w:r>
+      <w:r>
+        <w:t xml:space="preserve">cost</w:t>
+      </w:r>
+      <w:r>
+        <w:t xml:space="preserve"> </w:t>
+      </w:r>
+      <w:r>
+        <w:t xml:space="preserve">of</w:t>
+      </w:r>
+      <w:r>
+        <w:t xml:space="preserve"> </w:t>
+      </w:r>
+      <w:r>
+        <w:t xml:space="preserve">a</w:t>
+      </w:r>
+      <w:r>
+        <w:t xml:space="preserve"> </w:t>
+      </w:r>
+      <w:r>
+        <w:t xml:space="preserve">database</w:t>
+      </w:r>
+      <w:r>
+        <w:t xml:space="preserve"> </w:t>
+      </w:r>
+      <w:r>
+        <w:t xml:space="preserve">built</w:t>
+      </w:r>
+      <w:r>
+        <w:t xml:space="preserve"> </w:t>
+      </w:r>
+      <w:r>
+        <w:t xml:space="preserve">by</w:t>
+      </w:r>
+      <w:r>
+        <w:t xml:space="preserve"> </w:t>
+      </w:r>
+      <w:r>
+        <w:t xml:space="preserve">an</w:t>
+      </w:r>
+      <w:r>
+        <w:t xml:space="preserve"> </w:t>
+      </w:r>
+      <w:r>
+        <w:t xml:space="preserve">LLM,</w:t>
+      </w:r>
+      <w:r>
+        <w:t xml:space="preserve"> </w:t>
+      </w:r>
+      <w:r>
+        <w:t xml:space="preserve">and</w:t>
+      </w:r>
+      <w:r>
+        <w:t xml:space="preserve"> </w:t>
+      </w:r>
+      <w:r>
+        <w:t xml:space="preserve">why</w:t>
       </w:r>
     </w:p>
     <w:p>
@@ -146,22 +188,34 @@
         <w:pStyle w:val="BodyText"/>
       </w:pPr>
       <w:r>
-        <w:t xml:space="preserve">The sections below take the main observations from the experiments and ask why each one holds, starting with the</w:t>
-      </w:r>
-      <w:r>
-        <w:t xml:space="preserve"> </w:t>
-      </w:r>
-      <w:r>
-        <w:t xml:space="preserve">ones that matter most.</w:t>
+        <w:t xml:space="preserve">Each section below asks why one property of the documents, the columns, the prompt or the workload has the effect it</w:t>
+      </w:r>
+      <w:r>
+        <w:t xml:space="preserve"> </w:t>
+      </w:r>
+      <w:r>
+        <w:t xml:space="preserve">has. It gives the evidence and the mechanism, says where the effect holds and where we have not tested it, and ends</w:t>
+      </w:r>
+      <w:r>
+        <w:t xml:space="preserve"> </w:t>
+      </w:r>
+      <w:r>
+        <w:t xml:space="preserve">with what the finding lets someone decide for their own setting. The sections run from the most to the least</w:t>
+      </w:r>
+      <w:r>
+        <w:t xml:space="preserve"> </w:t>
+      </w:r>
+      <w:r>
+        <w:t xml:space="preserve">transferable, and the last one connects the findings to other areas.</w:t>
       </w:r>
     </w:p>
     <w:p>
       <w:pPr>
         <w:pStyle w:val="Heading1"/>
       </w:pPr>
-      <w:bookmarkStart w:id="21" w:name="why-does-on-demand-extraction-match-the-accuracy-of-extracting-everything-up-front"/>
-      <w:r>
-        <w:t xml:space="preserve">Why does on-demand extraction match the accuracy of extracting everything up front?</w:t>
+      <w:bookmarkStart w:id="21" w:name="why-does-an-extracted-value-depend-on-how-the-question-is-asked-but-not-on-when"/>
+      <w:r>
+        <w:t xml:space="preserve">Why does an extracted value depend on how the question is asked, but not on when?</w:t>
       </w:r>
       <w:bookmarkEnd w:id="21"/>
     </w:p>
@@ -250,7 +304,31 @@
         <w:t xml:space="preserve"> </w:t>
       </w:r>
       <w:r>
-        <w:t xml:space="preserve">together with six other columns, the model leaves it empty for 64% of papers; asked alone, it fills it for 98%.</w:t>
+        <w:t xml:space="preserve">together with six other columns, the model leaves it empty for 64% of papers; asked alone, it fills it for 98%. So an</w:t>
+      </w:r>
+      <w:r>
+        <w:t xml:space="preserve"> </w:t>
+      </w:r>
+      <w:r>
+        <w:t xml:space="preserve">extracted value is a function of the document</w:t>
+      </w:r>
+      <w:r>
+        <w:t xml:space="preserve"> </w:t>
+      </w:r>
+      <w:r>
+        <w:rPr>
+          <w:i/>
+        </w:rPr>
+        <w:t xml:space="preserve">and of the prompt it was asked in</w:t>
+      </w:r>
+      <w:r>
+        <w:t xml:space="preserve">, including which other columns were</w:t>
+      </w:r>
+      <w:r>
+        <w:t xml:space="preserve"> </w:t>
+      </w:r>
+      <w:r>
+        <w:t xml:space="preserve">asked alongside it. In a conventional database, reading a value twice gives the same value; here it does not.</w:t>
       </w:r>
     </w:p>
     <w:p>
@@ -319,24 +397,688 @@
         <w:pStyle w:val="BodyText"/>
       </w:pPr>
       <w:r>
-        <w:t xml:space="preserve">This holds on all five corpora with the 7B model and on two with the 32B model. In practice, a system can defer extraction without losing accuracy, and the thing to</w:t>
-      </w:r>
-      <w:r>
-        <w:t xml:space="preserve"> </w:t>
-      </w:r>
-      <w:r>
-        <w:t xml:space="preserve">control is prompt design.</w:t>
+        <w:t xml:space="preserve">The timing result holds on all five corpora with the 7B model and on two with the 32B model. The size of the prompt</w:t>
+      </w:r>
+      <w:r>
+        <w:t xml:space="preserve"> </w:t>
+      </w:r>
+      <w:r>
+        <w:t xml:space="preserve">effect depends on the model: it is small for the 7B model and large for the 32B model on one corpus, and we have not</w:t>
+      </w:r>
+      <w:r>
+        <w:t xml:space="preserve"> </w:t>
+      </w:r>
+      <w:r>
+        <w:t xml:space="preserve">measured it on other model families.</w:t>
+      </w:r>
+    </w:p>
+    <w:p>
+      <w:pPr>
+        <w:pStyle w:val="BodyText"/>
+      </w:pPr>
+      <w:r>
+        <w:rPr>
+          <w:i/>
+        </w:rPr>
+        <w:t xml:space="preserve">What this lets you decide.</w:t>
+      </w:r>
+      <w:r>
+        <w:t xml:space="preserve"> </w:t>
+      </w:r>
+      <w:r>
+        <w:t xml:space="preserve">Extraction can be deferred until a query needs it without losing accuracy, so a system</w:t>
+      </w:r>
+      <w:r>
+        <w:t xml:space="preserve"> </w:t>
+      </w:r>
+      <w:r>
+        <w:t xml:space="preserve">does not have to guess the workload correctly to be accurate, only to be cheap. What has to be controlled is the</w:t>
+      </w:r>
+      <w:r>
+        <w:t xml:space="preserve"> </w:t>
+      </w:r>
+      <w:r>
+        <w:t xml:space="preserve">prompt. Values from different prompts should not be mixed in one column, a store of extracted values should record the</w:t>
+      </w:r>
+      <w:r>
+        <w:t xml:space="preserve"> </w:t>
+      </w:r>
+      <w:r>
+        <w:t xml:space="preserve">prompt each value came from, and re-extracting a column is a new measurement, not a refresh. The budget section below</w:t>
+      </w:r>
+      <w:r>
+        <w:t xml:space="preserve"> </w:t>
+      </w:r>
+      <w:r>
+        <w:t xml:space="preserve">shows what happens when this is ignored: delaying an extraction moves it into a different prompt and changes the</w:t>
+      </w:r>
+      <w:r>
+        <w:t xml:space="preserve"> </w:t>
+      </w:r>
+      <w:r>
+        <w:t xml:space="preserve">answers.</w:t>
       </w:r>
     </w:p>
     <w:p>
       <w:pPr>
         <w:pStyle w:val="Heading1"/>
       </w:pPr>
-      <w:bookmarkStart w:id="23" w:name="why-do-queries-fail-and-does-it-depend-on-the-kind-of-query"/>
-      <w:r>
-        <w:t xml:space="preserve">Why do queries fail, and does it depend on the kind of query?</w:t>
+      <w:bookmarkStart w:id="23" w:name="why-can-a-columns-accuracy-be-predicted-without-any-gold-data"/>
+      <w:r>
+        <w:t xml:space="preserve">Why can a column’s accuracy be predicted without any gold data?</w:t>
       </w:r>
       <w:bookmarkEnd w:id="23"/>
+    </w:p>
+    <w:p>
+      <w:pPr>
+        <w:pStyle w:val="FirstParagraph"/>
+      </w:pPr>
+      <w:r>
+        <w:t xml:space="preserve">When a document states a value plainly, as with a number or a yes/no answer, any reasonable prompt returns it.</w:t>
+      </w:r>
+      <w:r>
+        <w:t xml:space="preserve"> </w:t>
+      </w:r>
+      <w:r>
+        <w:rPr>
+          <w:b/>
+        </w:rPr>
+        <w:t xml:space="preserve">When</w:t>
+      </w:r>
+      <w:r>
+        <w:rPr>
+          <w:b/>
+        </w:rPr>
+        <w:t xml:space="preserve"> </w:t>
+      </w:r>
+      <w:r>
+        <w:rPr>
+          <w:b/>
+        </w:rPr>
+        <w:t xml:space="preserve">the document does not settle the answer, the prompt decides.</w:t>
+      </w:r>
+      <w:r>
+        <w:t xml:space="preserve"> </w:t>
+      </w:r>
+      <w:r>
+        <w:t xml:space="preserve">Examples are a disease’s causes, a party’s status, or a</w:t>
+      </w:r>
+      <w:r>
+        <w:t xml:space="preserve"> </w:t>
+      </w:r>
+      <w:r>
+        <w:t xml:space="preserve">value the document never mentions. The prompt decides through how readily the model leaves a cell empty and through</w:t>
+      </w:r>
+      <w:r>
+        <w:t xml:space="preserve"> </w:t>
+      </w:r>
+      <w:r>
+        <w:t xml:space="preserve">the example values it shows. It follows that two different prompts will disagree exactly where the document leaves the</w:t>
+      </w:r>
+      <w:r>
+        <w:t xml:space="preserve"> </w:t>
+      </w:r>
+      <w:r>
+        <w:t xml:space="preserve">answer open, and that is also where they are likely to be wrong.</w:t>
+      </w:r>
+    </w:p>
+    <w:p>
+      <w:pPr>
+        <w:pStyle w:val="BodyText"/>
+      </w:pPr>
+      <w:r>
+        <w:t xml:space="preserve">We measured, for each column the test queries need, how often the build’s prompt and the on-demand prompt give</w:t>
+      </w:r>
+      <w:r>
+        <w:t xml:space="preserve"> </w:t>
+      </w:r>
+      <w:r>
+        <w:t xml:space="preserve">different values for the same document.</w:t>
+      </w:r>
+      <w:r>
+        <w:t xml:space="preserve"> </w:t>
+      </w:r>
+      <w:r>
+        <w:rPr>
+          <w:b/>
+        </w:rPr>
+        <w:t xml:space="preserve">Across 41 columns this disagreement is a strong predictor of error</w:t>
+      </w:r>
+      <w:r>
+        <w:rPr>
+          <w:b/>
+        </w:rPr>
+        <w:t xml:space="preserve"> </w:t>
+      </w:r>
+      <w:r>
+        <w:rPr>
+          <w:b/>
+        </w:rPr>
+        <w:t xml:space="preserve">(Spearman −0.76).</w:t>
+      </w:r>
+      <w:r>
+        <w:t xml:space="preserve"> </w:t>
+      </w:r>
+      <w:r>
+        <w:t xml:space="preserve">Numbers disagree on 9% of cells, yes/no columns on 24%, free text on 47% and categories on 60%.</w:t>
+      </w:r>
+      <w:r>
+        <w:t xml:space="preserve"> </w:t>
+      </w:r>
+      <w:r>
+        <w:t xml:space="preserve">No column with more than about 55% disagreement is right more than 60% of the time.</w:t>
+      </w:r>
+    </w:p>
+    <w:p>
+      <w:pPr>
+        <w:pStyle w:val="CaptionedFigure"/>
+      </w:pPr>
+      <w:r>
+        <w:drawing>
+          <wp:inline>
+            <wp:extent cx="5334000" cy="2582778"/>
+            <wp:effectExtent b="0" l="0" r="0" t="0"/>
+            <wp:docPr descr="Figure 2. Disagreement between two prompts against accuracy, one point per column." title="" id="1" name="Picture"/>
+            <a:graphic>
+              <a:graphicData uri="http://schemas.openxmlformats.org/drawingml/2006/picture">
+                <pic:pic>
+                  <pic:nvPicPr>
+                    <pic:cNvPr descr="figures/w4_determinacy.png" id="0" name="Picture"/>
+                    <pic:cNvPicPr>
+                      <a:picLocks noChangeArrowheads="1" noChangeAspect="1"/>
+                    </pic:cNvPicPr>
+                  </pic:nvPicPr>
+                  <pic:blipFill>
+                    <a:blip r:embed="rId24"/>
+                    <a:stretch>
+                      <a:fillRect/>
+                    </a:stretch>
+                  </pic:blipFill>
+                  <pic:spPr bwMode="auto">
+                    <a:xfrm>
+                      <a:off x="0" y="0"/>
+                      <a:ext cx="5334000" cy="2582778"/>
+                    </a:xfrm>
+                    <a:prstGeom prst="rect">
+                      <a:avLst/>
+                    </a:prstGeom>
+                    <a:noFill/>
+                    <a:ln w="9525">
+                      <a:noFill/>
+                      <a:headEnd/>
+                      <a:tailEnd/>
+                    </a:ln>
+                  </pic:spPr>
+                </pic:pic>
+              </a:graphicData>
+            </a:graphic>
+          </wp:inline>
+        </w:drawing>
+      </w:r>
+    </w:p>
+    <w:p>
+      <w:pPr>
+        <w:pStyle w:val="ImageCaption"/>
+      </w:pPr>
+      <w:r>
+        <w:t xml:space="preserve">Figure 2. Disagreement between two prompts against accuracy, one point per column.</w:t>
+      </w:r>
+    </w:p>
+    <w:p>
+      <w:pPr>
+        <w:pStyle w:val="BodyText"/>
+      </w:pPr>
+      <w:r>
+        <w:t xml:space="preserve">The signal also works cell by cell. Where the two prompts disagree, the served value is wrong 79% of the time; where</w:t>
+      </w:r>
+      <w:r>
+        <w:t xml:space="preserve"> </w:t>
+      </w:r>
+      <w:r>
+        <w:t xml:space="preserve">they agree, 44%. The disagreeing cells are 36% of all cells and hold half of all wrong cells. Checking columns in order</w:t>
+      </w:r>
+      <w:r>
+        <w:t xml:space="preserve"> </w:t>
+      </w:r>
+      <w:r>
+        <w:t xml:space="preserve">of disagreement finds 69% of the wrong cells after checking half of all cells, close to the 72% that an order chosen</w:t>
+      </w:r>
+      <w:r>
+        <w:t xml:space="preserve"> </w:t>
+      </w:r>
+      <w:r>
+        <w:t xml:space="preserve">with hindsight finds and well above the 50% of a random order.</w:t>
+      </w:r>
+      <w:r>
+        <w:t xml:space="preserve"> </w:t>
+      </w:r>
+      <w:r>
+        <w:rPr>
+          <w:b/>
+        </w:rPr>
+        <w:t xml:space="preserve">The signal fails in one place, and the failure is</w:t>
+      </w:r>
+      <w:r>
+        <w:rPr>
+          <w:b/>
+        </w:rPr>
+        <w:t xml:space="preserve"> </w:t>
+      </w:r>
+      <w:r>
+        <w:rPr>
+          <w:b/>
+        </w:rPr>
+        <w:t xml:space="preserve">informative: on category columns, cells where the prompts agree are wrong more often (57%) than cells where they</w:t>
+      </w:r>
+      <w:r>
+        <w:rPr>
+          <w:b/>
+        </w:rPr>
+        <w:t xml:space="preserve"> </w:t>
+      </w:r>
+      <w:r>
+        <w:rPr>
+          <w:b/>
+        </w:rPr>
+        <w:t xml:space="preserve">disagree (49%).</w:t>
+      </w:r>
+      <w:r>
+        <w:t xml:space="preserve"> </w:t>
+      </w:r>
+      <w:r>
+        <w:t xml:space="preserve">Both prompts choose the same label from the same list, and when that label is coarser than the gold</w:t>
+      </w:r>
+      <w:r>
+        <w:t xml:space="preserve"> </w:t>
+      </w:r>
+      <w:r>
+        <w:t xml:space="preserve">one they are consistently wrong. Disagreement catches errors that come from an open answer, not errors that come from</w:t>
+      </w:r>
+      <w:r>
+        <w:t xml:space="preserve"> </w:t>
+      </w:r>
+      <w:r>
+        <w:t xml:space="preserve">a shared misunderstanding of what the categories mean.</w:t>
+      </w:r>
+    </w:p>
+    <w:p>
+      <w:pPr>
+        <w:pStyle w:val="BodyText"/>
+      </w:pPr>
+      <w:r>
+        <w:rPr>
+          <w:b/>
+        </w:rPr>
+        <w:t xml:space="preserve">The property belongs to the column, not to our system.</w:t>
+      </w:r>
+      <w:r>
+        <w:t xml:space="preserve"> </w:t>
+      </w:r>
+      <w:r>
+        <w:t xml:space="preserve">DocETL extracts the same columns with its own prompts, one</w:t>
+      </w:r>
+      <w:r>
+        <w:t xml:space="preserve"> </w:t>
+      </w:r>
+      <w:r>
+        <w:t xml:space="preserve">per query. Our two-prompt disagreement on a column predicts DocETL’s accuracy on that column almost as well as it</w:t>
+      </w:r>
+      <w:r>
+        <w:t xml:space="preserve"> </w:t>
+      </w:r>
+      <w:r>
+        <w:t xml:space="preserve">predicts ours (Spearman −0.73 over 40 shared columns), and DocETL’s disagreement between its own queries predicts its</w:t>
+      </w:r>
+      <w:r>
+        <w:t xml:space="preserve"> </w:t>
+      </w:r>
+      <w:r>
+        <w:t xml:space="preserve">own accuracy (−0.63 over 85 columns). Columns that are hard for one system are hard for the other (accuracy rank</w:t>
+      </w:r>
+      <w:r>
+        <w:t xml:space="preserve"> </w:t>
+      </w:r>
+      <w:r>
+        <w:t xml:space="preserve">correlation 0.64), and list-valued columns are the worst kind in both (16% correct in DocETL against 47% to 66% for</w:t>
+      </w:r>
+      <w:r>
+        <w:t xml:space="preserve"> </w:t>
+      </w:r>
+      <w:r>
+        <w:t xml:space="preserve">the other kinds).</w:t>
+      </w:r>
+    </w:p>
+    <w:p>
+      <w:pPr>
+        <w:pStyle w:val="CaptionedFigure"/>
+      </w:pPr>
+      <w:r>
+        <w:drawing>
+          <wp:inline>
+            <wp:extent cx="5334000" cy="2032000"/>
+            <wp:effectExtent b="0" l="0" r="0" t="0"/>
+            <wp:docPr descr="Figure 3. (a) Share of wrong cells where our two prompts agree or disagree, by kind of column. (b) Our two-prompt disagreement on a column against DocETL’s accuracy on the same column." title="" id="1" name="Picture"/>
+            <a:graphic>
+              <a:graphicData uri="http://schemas.openxmlformats.org/drawingml/2006/picture">
+                <pic:pic>
+                  <pic:nvPicPr>
+                    <pic:cNvPr descr="figures/w7_transfer.png" id="0" name="Picture"/>
+                    <pic:cNvPicPr>
+                      <a:picLocks noChangeArrowheads="1" noChangeAspect="1"/>
+                    </pic:cNvPicPr>
+                  </pic:nvPicPr>
+                  <pic:blipFill>
+                    <a:blip r:embed="rId25"/>
+                    <a:stretch>
+                      <a:fillRect/>
+                    </a:stretch>
+                  </pic:blipFill>
+                  <pic:spPr bwMode="auto">
+                    <a:xfrm>
+                      <a:off x="0" y="0"/>
+                      <a:ext cx="5334000" cy="2032000"/>
+                    </a:xfrm>
+                    <a:prstGeom prst="rect">
+                      <a:avLst/>
+                    </a:prstGeom>
+                    <a:noFill/>
+                    <a:ln w="9525">
+                      <a:noFill/>
+                      <a:headEnd/>
+                      <a:tailEnd/>
+                    </a:ln>
+                  </pic:spPr>
+                </pic:pic>
+              </a:graphicData>
+            </a:graphic>
+          </wp:inline>
+        </w:drawing>
+      </w:r>
+    </w:p>
+    <w:p>
+      <w:pPr>
+        <w:pStyle w:val="ImageCaption"/>
+      </w:pPr>
+      <w:r>
+        <w:t xml:space="preserve">Figure 3. (a) Share of wrong cells where our two prompts agree or disagree, by kind of column. (b) Our two-prompt</w:t>
+      </w:r>
+      <w:r>
+        <w:t xml:space="preserve"> </w:t>
+      </w:r>
+      <w:r>
+        <w:t xml:space="preserve">disagreement on a column against DocETL’s accuracy on the same column.</w:t>
+      </w:r>
+    </w:p>
+    <w:p>
+      <w:pPr>
+        <w:pStyle w:val="BodyText"/>
+      </w:pPr>
+      <w:r>
+        <w:t xml:space="preserve">The medical corpus, whose columns are mostly descriptive judgments, stands out. Its two prompts disagree on 75% of</w:t>
+      </w:r>
+      <w:r>
+        <w:t xml:space="preserve"> </w:t>
+      </w:r>
+      <w:r>
+        <w:t xml:space="preserve">cells, against 28% to 34% for papers, artists and court judgments and 10% for basketball players. Document length</w:t>
+      </w:r>
+      <w:r>
+        <w:t xml:space="preserve"> </w:t>
+      </w:r>
+      <w:r>
+        <w:t xml:space="preserve">does not explain this; on the earlier version of the medical and legal queries, prompts disagreed about as often on</w:t>
+      </w:r>
+      <w:r>
+        <w:t xml:space="preserve"> </w:t>
+      </w:r>
+      <w:r>
+        <w:t xml:space="preserve">short documents as on long ones. With five corpora we cannot separate three properties that occur together in the</w:t>
+      </w:r>
+      <w:r>
+        <w:t xml:space="preserve"> </w:t>
+      </w:r>
+      <w:r>
+        <w:t xml:space="preserve">medical corpus: descriptive columns, gold values that are often empty, and list-valued columns.</w:t>
+      </w:r>
+    </w:p>
+    <w:p>
+      <w:pPr>
+        <w:pStyle w:val="BodyText"/>
+      </w:pPr>
+      <w:r>
+        <w:rPr>
+          <w:i/>
+        </w:rPr>
+        <w:t xml:space="preserve">What this lets you decide.</w:t>
+      </w:r>
+      <w:r>
+        <w:t xml:space="preserve"> </w:t>
+      </w:r>
+      <w:r>
+        <w:t xml:space="preserve">Before any gold data exists, asking a column twice with two cheap prompts tells you which</w:t>
+      </w:r>
+      <w:r>
+        <w:t xml:space="preserve"> </w:t>
+      </w:r>
+      <w:r>
+        <w:t xml:space="preserve">columns to trust, which need a better description, and where to spend a human check or a larger model. For numbers,</w:t>
+      </w:r>
+      <w:r>
+        <w:t xml:space="preserve"> </w:t>
+      </w:r>
+      <w:r>
+        <w:t xml:space="preserve">yes/no answers, lists and free text, a disagreeing cell is a likely error. For categories, agreement is not evidence of</w:t>
+      </w:r>
+      <w:r>
+        <w:t xml:space="preserve"> </w:t>
+      </w:r>
+      <w:r>
+        <w:t xml:space="preserve">correctness, and the category definitions themselves need checking.</w:t>
+      </w:r>
+    </w:p>
+    <w:p>
+      <w:pPr>
+        <w:pStyle w:val="Heading1"/>
+      </w:pPr>
+      <w:bookmarkStart w:id="26" w:name="why-does-telling-the-model-what-a-column-means-matter-more-than-anything-else-we-changed"/>
+      <w:r>
+        <w:t xml:space="preserve">Why does telling the model what a column means matter more than anything else we changed?</w:t>
+      </w:r>
+      <w:bookmarkEnd w:id="26"/>
+    </w:p>
+    <w:p>
+      <w:pPr>
+        <w:pStyle w:val="FirstParagraph"/>
+      </w:pPr>
+      <w:r>
+        <w:rPr>
+          <w:b/>
+        </w:rPr>
+        <w:t xml:space="preserve">Most extraction errors come from the specification rather than from reading.</w:t>
+      </w:r>
+      <w:r>
+        <w:t xml:space="preserve"> </w:t>
+      </w:r>
+      <w:r>
+        <w:t xml:space="preserve">Given only a column name, the model</w:t>
+      </w:r>
+      <w:r>
+        <w:t xml:space="preserve"> </w:t>
+      </w:r>
+      <w:r>
+        <w:t xml:space="preserve">often does not know what to write, whether that is a count, a list of years, or a date in a particular format. It</w:t>
+      </w:r>
+      <w:r>
+        <w:t xml:space="preserve"> </w:t>
+      </w:r>
+      <w:r>
+        <w:t xml:space="preserve">leaves the cell empty or writes the value in another form. Without descriptions in the on-demand prompts, a count of</w:t>
+      </w:r>
+      <w:r>
+        <w:t xml:space="preserve"> </w:t>
+      </w:r>
+      <w:r>
+        <w:t xml:space="preserve">FIBA World Cup appearances falls from 0.86 to 0.01 correct because the model leaves it empty. An artist’s award count</w:t>
+      </w:r>
+      <w:r>
+        <w:t xml:space="preserve"> </w:t>
+      </w:r>
+      <w:r>
+        <w:t xml:space="preserve">falls from 0.74 to 0.06, and birth dates from 0.38 to 0.00 because they come back in a different format.</w:t>
+      </w:r>
+      <w:r>
+        <w:t xml:space="preserve"> </w:t>
+      </w:r>
+      <w:r>
+        <w:rPr>
+          <w:b/>
+        </w:rPr>
+        <w:t xml:space="preserve">Adding the</w:t>
+      </w:r>
+      <w:r>
+        <w:rPr>
+          <w:b/>
+        </w:rPr>
+        <w:t xml:space="preserve"> </w:t>
+      </w:r>
+      <w:r>
+        <w:rPr>
+          <w:b/>
+        </w:rPr>
+        <w:t xml:space="preserve">benchmark’s descriptions to a single extraction pass raised its score from 0.234 to 0.560, the largest effect in the</w:t>
+      </w:r>
+      <w:r>
+        <w:rPr>
+          <w:b/>
+        </w:rPr>
+        <w:t xml:space="preserve"> </w:t>
+      </w:r>
+      <w:r>
+        <w:rPr>
+          <w:b/>
+        </w:rPr>
+        <w:t xml:space="preserve">whole study.</w:t>
+      </w:r>
+    </w:p>
+    <w:p>
+      <w:pPr>
+        <w:pStyle w:val="CaptionedFigure"/>
+      </w:pPr>
+      <w:r>
+        <w:drawing>
+          <wp:inline>
+            <wp:extent cx="5334000" cy="2189747"/>
+            <wp:effectExtent b="0" l="0" r="0" t="0"/>
+            <wp:docPr descr="Figure 4. Share of cells correct with and without field descriptions." title="" id="1" name="Picture"/>
+            <a:graphic>
+              <a:graphicData uri="http://schemas.openxmlformats.org/drawingml/2006/picture">
+                <pic:pic>
+                  <pic:nvPicPr>
+                    <pic:cNvPr descr="figures/w6_specification.png" id="0" name="Picture"/>
+                    <pic:cNvPicPr>
+                      <a:picLocks noChangeArrowheads="1" noChangeAspect="1"/>
+                    </pic:cNvPicPr>
+                  </pic:nvPicPr>
+                  <pic:blipFill>
+                    <a:blip r:embed="rId27"/>
+                    <a:stretch>
+                      <a:fillRect/>
+                    </a:stretch>
+                  </pic:blipFill>
+                  <pic:spPr bwMode="auto">
+                    <a:xfrm>
+                      <a:off x="0" y="0"/>
+                      <a:ext cx="5334000" cy="2189747"/>
+                    </a:xfrm>
+                    <a:prstGeom prst="rect">
+                      <a:avLst/>
+                    </a:prstGeom>
+                    <a:noFill/>
+                    <a:ln w="9525">
+                      <a:noFill/>
+                      <a:headEnd/>
+                      <a:tailEnd/>
+                    </a:ln>
+                  </pic:spPr>
+                </pic:pic>
+              </a:graphicData>
+            </a:graphic>
+          </wp:inline>
+        </w:drawing>
+      </w:r>
+    </w:p>
+    <w:p>
+      <w:pPr>
+        <w:pStyle w:val="ImageCaption"/>
+      </w:pPr>
+      <w:r>
+        <w:t xml:space="preserve">Figure 4. Share of cells correct with and without field descriptions.</w:t>
+      </w:r>
+    </w:p>
+    <w:p>
+      <w:pPr>
+        <w:pStyle w:val="BodyText"/>
+      </w:pPr>
+      <w:r>
+        <w:t xml:space="preserve">The same problem shows up in values that are right in substance but wrong in form. On one artist column, values agree</w:t>
+      </w:r>
+      <w:r>
+        <w:t xml:space="preserve"> </w:t>
+      </w:r>
+      <w:r>
+        <w:t xml:space="preserve">with the gold data 92% of the time if we ignore case, punctuation and list order, but only 13% of the time exactly,</w:t>
+      </w:r>
+      <w:r>
+        <w:t xml:space="preserve"> </w:t>
+      </w:r>
+      <w:r>
+        <w:t xml:space="preserve">and a GROUP BY needs the exact form. The evidence here comes from cell-level comparisons. We have not yet run the</w:t>
+      </w:r>
+      <w:r>
+        <w:t xml:space="preserve"> </w:t>
+      </w:r>
+      <w:r>
+        <w:t xml:space="preserve">causal test of rewriting ambiguous descriptions and measuring the gain.</w:t>
+      </w:r>
+    </w:p>
+    <w:p>
+      <w:pPr>
+        <w:pStyle w:val="BodyText"/>
+      </w:pPr>
+      <w:r>
+        <w:rPr>
+          <w:i/>
+        </w:rPr>
+        <w:t xml:space="preserve">What this lets you decide.</w:t>
+      </w:r>
+      <w:r>
+        <w:t xml:space="preserve"> </w:t>
+      </w:r>
+      <w:r>
+        <w:t xml:space="preserve">Effort spent on describing each column (its unit, its format, what to write when the</w:t>
+      </w:r>
+      <w:r>
+        <w:t xml:space="preserve"> </w:t>
+      </w:r>
+      <w:r>
+        <w:t xml:space="preserve">document is silent) pays more than effort spent on scheduling or budgeting extraction. The columns that need it most</w:t>
+      </w:r>
+      <w:r>
+        <w:t xml:space="preserve"> </w:t>
+      </w:r>
+      <w:r>
+        <w:t xml:space="preserve">are the ones the previous section flags: high disagreement, or categories whose labels the model draws differently.</w:t>
+      </w:r>
+    </w:p>
+    <w:p>
+      <w:pPr>
+        <w:pStyle w:val="Heading1"/>
+      </w:pPr>
+      <w:bookmarkStart w:id="28" w:name="why-do-aggregate-queries-over-extracted-values-lose-their-groups"/>
+      <w:r>
+        <w:t xml:space="preserve">Why do aggregate queries over extracted values lose their groups?</w:t>
+      </w:r>
+      <w:bookmarkEnd w:id="28"/>
     </w:p>
     <w:p>
       <w:pPr>
@@ -441,7 +1183,7 @@
           <wp:inline>
             <wp:extent cx="5334000" cy="1745672"/>
             <wp:effectExtent b="0" l="0" r="0" t="0"/>
-            <wp:docPr descr="Figure 2. (a) Distinct values in the extracted GROUP BY column relative to gold. (b) Share of queries returning too few groups, by the number of groups in the gold answer." title="" id="1" name="Picture"/>
+            <wp:docPr descr="Figure 5. (a) Distinct values in the extracted GROUP BY column relative to gold. (b) Share of queries returning too few groups, by the number of groups in the gold answer." title="" id="1" name="Picture"/>
             <a:graphic>
               <a:graphicData uri="http://schemas.openxmlformats.org/drawingml/2006/picture">
                 <pic:pic>
@@ -452,7 +1194,7 @@
                     </pic:cNvPicPr>
                   </pic:nvPicPr>
                   <pic:blipFill>
-                    <a:blip r:embed="rId24"/>
+                    <a:blip r:embed="rId29"/>
                     <a:stretch>
                       <a:fillRect/>
                     </a:stretch>
@@ -484,7 +1226,7 @@
         <w:pStyle w:val="ImageCaption"/>
       </w:pPr>
       <w:r>
-        <w:t xml:space="preserve">Figure 2. (a) Distinct values in the extracted GROUP BY column relative to gold. (b) Share of queries returning too</w:t>
+        <w:t xml:space="preserve">Figure 5. (a) Distinct values in the extracted GROUP BY column relative to gold. (b) Share of queries returning too</w:t>
       </w:r>
       <w:r>
         <w:t xml:space="preserve"> </w:t>
@@ -686,13 +1428,7 @@
         <w:t xml:space="preserve">“</w:t>
       </w:r>
       <w:r>
-        <w:t xml:space="preserve">oral,</w:t>
-      </w:r>
-      <w:r>
-        <w:t xml:space="preserve"> </w:t>
-      </w:r>
-      <w:r>
-        <w:t xml:space="preserve">intravenous</w:t>
+        <w:t xml:space="preserve">oral, intravenous</w:t>
       </w:r>
       <w:r>
         <w:t xml:space="preserve">”</w:t>
@@ -701,25 +1437,25 @@
         <w:t xml:space="preserve"> </w:t>
       </w:r>
       <w:r>
-        <w:t xml:space="preserve">and so joins the group of that single item. This also explains the corpus differences. Medical columns</w:t>
-      </w:r>
-      <w:r>
-        <w:t xml:space="preserve"> </w:t>
-      </w:r>
-      <w:r>
-        <w:t xml:space="preserve">are mostly lists and free-text categories, and 44% of their rows get a differently spelled label and 19% none, the</w:t>
-      </w:r>
-      <w:r>
-        <w:t xml:space="preserve"> </w:t>
-      </w:r>
-      <w:r>
-        <w:t xml:space="preserve">highest of any corpus. Basketball players group mostly by short factual values such as team and position and keep 79%</w:t>
-      </w:r>
-      <w:r>
-        <w:t xml:space="preserve"> </w:t>
-      </w:r>
-      <w:r>
-        <w:t xml:space="preserve">exact.</w:t>
+        <w:t xml:space="preserve">and so joins the group of that single item. This also explains the corpus differences. Medical</w:t>
+      </w:r>
+      <w:r>
+        <w:t xml:space="preserve"> </w:t>
+      </w:r>
+      <w:r>
+        <w:t xml:space="preserve">columns are mostly lists and free-text categories, and 44% of their rows get a differently spelled label and 19% none,</w:t>
+      </w:r>
+      <w:r>
+        <w:t xml:space="preserve"> </w:t>
+      </w:r>
+      <w:r>
+        <w:t xml:space="preserve">the highest of any corpus. Basketball players group mostly by short factual values such as team and position and keep</w:t>
+      </w:r>
+      <w:r>
+        <w:t xml:space="preserve"> </w:t>
+      </w:r>
+      <w:r>
+        <w:t xml:space="preserve">79% exact.</w:t>
       </w:r>
     </w:p>
     <w:p>
@@ -731,7 +1467,7 @@
           <wp:inline>
             <wp:extent cx="5334000" cy="3031957"/>
             <wp:effectExtent b="0" l="0" r="0" t="0"/>
-            <wp:docPr descr="Figure 3. Where each gold row of a GROUP BY column ends up in the extracted table, by kind of column (a) and by corpus (b), at 100% drift." title="" id="1" name="Picture"/>
+            <wp:docPr descr="Figure 6. Where each gold row of a GROUP BY column ends up in the extracted table, by kind of column (a) and by corpus (b), at 100% drift." title="" id="1" name="Picture"/>
             <a:graphic>
               <a:graphicData uri="http://schemas.openxmlformats.org/drawingml/2006/picture">
                 <pic:pic>
@@ -742,7 +1478,7 @@
                     </pic:cNvPicPr>
                   </pic:nvPicPr>
                   <pic:blipFill>
-                    <a:blip r:embed="rId25"/>
+                    <a:blip r:embed="rId30"/>
                     <a:stretch>
                       <a:fillRect/>
                     </a:stretch>
@@ -774,7 +1510,7 @@
         <w:pStyle w:val="ImageCaption"/>
       </w:pPr>
       <w:r>
-        <w:t xml:space="preserve">Figure 3. Where each gold row of a GROUP BY column ends up in the extracted table, by kind of column (a) and by</w:t>
+        <w:t xml:space="preserve">Figure 6. Where each gold row of a GROUP BY column ends up in the extracted table, by kind of column (a) and by</w:t>
       </w:r>
       <w:r>
         <w:t xml:space="preserve"> </w:t>
@@ -788,61 +1524,43 @@
         <w:pStyle w:val="BodyText"/>
       </w:pPr>
       <w:r>
-        <w:t xml:space="preserve">The aggregate matters as much as the grouping. AVG queries score 0.38, SUM and MIN 0.32, COUNT 0.21 and MAX 0.17, and</w:t>
-      </w:r>
-      <w:r>
-        <w:t xml:space="preserve"> </w:t>
-      </w:r>
-      <w:r>
-        <w:rPr>
-          <w:b/>
-        </w:rPr>
-        <w:t xml:space="preserve">this ordering is the same at every drift level</w:t>
-      </w:r>
-      <w:r>
-        <w:t xml:space="preserve">, so it is a property of the aggregate rather than of drift. It</w:t>
-      </w:r>
-      <w:r>
-        <w:t xml:space="preserve"> </w:t>
-      </w:r>
-      <w:r>
-        <w:t xml:space="preserve">follows from how each aggregate reacts to one wrong or missing row. We matched predicted and gold groups by their keys</w:t>
-      </w:r>
-      <w:r>
-        <w:t xml:space="preserve"> </w:t>
-      </w:r>
-      <w:r>
-        <w:t xml:space="preserve">and compared the aggregate values. Averages and sums are within 20% of gold in 54% and 63% of groups because</w:t>
-      </w:r>
-      <w:r>
-        <w:t xml:space="preserve"> </w:t>
-      </w:r>
-      <w:r>
-        <w:t xml:space="preserve">individual errors partly cancel. MIN is within 20% in 78% of groups and almost never too low (2%): extraction rarely</w:t>
-      </w:r>
-      <w:r>
-        <w:t xml:space="preserve"> </w:t>
-      </w:r>
-      <w:r>
-        <w:t xml:space="preserve">produces a value smaller than the true minimum, so a minimum only goes wrong when its row is missing. MAX is wrong in</w:t>
-      </w:r>
-      <w:r>
-        <w:t xml:space="preserve"> </w:t>
-      </w:r>
-      <w:r>
-        <w:t xml:space="preserve">both directions (21% too high, 20% too low), because one inflated value anywhere in the group becomes the maximum.</w:t>
-      </w:r>
-      <w:r>
-        <w:t xml:space="preserve"> </w:t>
-      </w:r>
-      <w:r>
-        <w:t xml:space="preserve">COUNT is within 20% in only 42% of groups, too low in 33% and too high in 25%, because every row whose label is</w:t>
-      </w:r>
-      <w:r>
-        <w:t xml:space="preserve"> </w:t>
-      </w:r>
-      <w:r>
-        <w:t xml:space="preserve">missing or merged moves a count. That is the same label collapse as above.</w:t>
+        <w:t xml:space="preserve">The aggregate decides how much a wrong or missing row matters. We matched predicted and gold groups by their keys and</w:t>
+      </w:r>
+      <w:r>
+        <w:t xml:space="preserve"> </w:t>
+      </w:r>
+      <w:r>
+        <w:t xml:space="preserve">compared the aggregate values. Averages and sums are within 20% of gold in 54% and 63% of groups because individual</w:t>
+      </w:r>
+      <w:r>
+        <w:t xml:space="preserve"> </w:t>
+      </w:r>
+      <w:r>
+        <w:t xml:space="preserve">errors partly cancel. MIN is within 20% in 78% of groups and almost never too low (2%): extraction rarely produces a</w:t>
+      </w:r>
+      <w:r>
+        <w:t xml:space="preserve"> </w:t>
+      </w:r>
+      <w:r>
+        <w:t xml:space="preserve">value smaller than the true minimum, so a minimum only goes wrong when its row is missing. MAX is wrong in both</w:t>
+      </w:r>
+      <w:r>
+        <w:t xml:space="preserve"> </w:t>
+      </w:r>
+      <w:r>
+        <w:t xml:space="preserve">directions (21% too high, 20% too low), because one inflated value anywhere in the group becomes the maximum. COUNT is</w:t>
+      </w:r>
+      <w:r>
+        <w:t xml:space="preserve"> </w:t>
+      </w:r>
+      <w:r>
+        <w:t xml:space="preserve">within 20% in only 42% of groups, too low in 33% and too high in 25%, because every row whose label is missing or</w:t>
+      </w:r>
+      <w:r>
+        <w:t xml:space="preserve"> </w:t>
+      </w:r>
+      <w:r>
+        <w:t xml:space="preserve">merged moves a count.</w:t>
       </w:r>
     </w:p>
     <w:p>
@@ -854,7 +1572,7 @@
           <wp:inline>
             <wp:extent cx="5334000" cy="1891145"/>
             <wp:effectExtent b="0" l="0" r="0" t="0"/>
-            <wp:docPr descr="Figure 4. Mean score by aggregate across drift levels, with on-demand extraction (a) and the static build (b)." title="" id="1" name="Picture"/>
+            <wp:docPr descr="Figure 7. Mean score by aggregate across drift levels, with on-demand extraction (a) and the static build (b)." title="" id="1" name="Picture"/>
             <a:graphic>
               <a:graphicData uri="http://schemas.openxmlformats.org/drawingml/2006/picture">
                 <pic:pic>
@@ -865,7 +1583,7 @@
                     </pic:cNvPicPr>
                   </pic:nvPicPr>
                   <pic:blipFill>
-                    <a:blip r:embed="rId26"/>
+                    <a:blip r:embed="rId31"/>
                     <a:stretch>
                       <a:fillRect/>
                     </a:stretch>
@@ -897,7 +1615,7 @@
         <w:pStyle w:val="ImageCaption"/>
       </w:pPr>
       <w:r>
-        <w:t xml:space="preserve">Figure 4. Mean score by aggregate across drift levels, with on-demand extraction (a) and the static build</w:t>
+        <w:t xml:space="preserve">Figure 7. Mean score by aggregate across drift levels, with on-demand extraction (a) and the static build</w:t>
       </w:r>
       <w:r>
         <w:t xml:space="preserve"> </w:t>
@@ -915,7 +1633,7 @@
           <wp:inline>
             <wp:extent cx="5334000" cy="1909010"/>
             <wp:effectExtent b="0" l="0" r="0" t="0"/>
-            <wp:docPr descr="Figure 5. Aggregate values in matched groups at 100% drift: too low, within 20% of gold, or too high." title="" id="1" name="Picture"/>
+            <wp:docPr descr="Figure 8. Aggregate values in matched groups at 100% drift: too low, within 20% of gold, or too high." title="" id="1" name="Picture"/>
             <a:graphic>
               <a:graphicData uri="http://schemas.openxmlformats.org/drawingml/2006/picture">
                 <pic:pic>
@@ -926,7 +1644,7 @@
                     </pic:cNvPicPr>
                   </pic:nvPicPr>
                   <pic:blipFill>
-                    <a:blip r:embed="rId27"/>
+                    <a:blip r:embed="rId32"/>
                     <a:stretch>
                       <a:fillRect/>
                     </a:stretch>
@@ -958,7 +1676,7 @@
         <w:pStyle w:val="ImageCaption"/>
       </w:pPr>
       <w:r>
-        <w:t xml:space="preserve">Figure 5. Aggregate values in matched groups at 100% drift: too low, within 20% of gold, or too</w:t>
+        <w:t xml:space="preserve">Figure 8. Aggregate values in matched groups at 100% drift: too low, within 20% of gold, or too</w:t>
       </w:r>
       <w:r>
         <w:t xml:space="preserve"> </w:t>
@@ -972,6 +1690,89 @@
         <w:pStyle w:val="BodyText"/>
       </w:pPr>
       <w:r>
+        <w:t xml:space="preserve">Averaged over all corpora, AVG queries score 0.38, SUM and MIN 0.32, COUNT 0.21 and MAX 0.17, and this ordering is the</w:t>
+      </w:r>
+      <w:r>
+        <w:t xml:space="preserve"> </w:t>
+      </w:r>
+      <w:r>
+        <w:t xml:space="preserve">same at every drift level.</w:t>
+      </w:r>
+      <w:r>
+        <w:t xml:space="preserve"> </w:t>
+      </w:r>
+      <w:r>
+        <w:rPr>
+          <w:b/>
+        </w:rPr>
+        <w:t xml:space="preserve">Part of that ordering is a property of the aggregate and part is a property of which</w:t>
+      </w:r>
+      <w:r>
+        <w:rPr>
+          <w:b/>
+        </w:rPr>
+        <w:t xml:space="preserve"> </w:t>
+      </w:r>
+      <w:r>
+        <w:rPr>
+          <w:b/>
+        </w:rPr>
+        <w:t xml:space="preserve">corpora the queries come from.</w:t>
+      </w:r>
+      <w:r>
+        <w:t xml:space="preserve"> </w:t>
+      </w:r>
+      <w:r>
+        <w:t xml:space="preserve">To separate the two we compared each query with the mean score of its own corpus at</w:t>
+      </w:r>
+      <w:r>
+        <w:t xml:space="preserve"> </w:t>
+      </w:r>
+      <w:r>
+        <w:t xml:space="preserve">the same drift level. MAX stays the worst: its queries are below their corpus mean on all four corpora that have them</w:t>
+      </w:r>
+      <w:r>
+        <w:t xml:space="preserve"> </w:t>
+      </w:r>
+      <w:r>
+        <w:t xml:space="preserve">(by 0.086 on average). COUNT does not: its queries are slightly above their corpus mean on all five corpora, so its low</w:t>
+      </w:r>
+      <w:r>
+        <w:t xml:space="preserve"> </w:t>
+      </w:r>
+      <w:r>
+        <w:t xml:space="preserve">pooled score comes from where the COUNT queries are, not from counting. The same comparison confirms the grouping</w:t>
+      </w:r>
+      <w:r>
+        <w:t xml:space="preserve"> </w:t>
+      </w:r>
+      <w:r>
+        <w:t xml:space="preserve">result: queries that group by a list column are below their corpus mean on all three corpora that have them (by</w:t>
+      </w:r>
+      <w:r>
+        <w:t xml:space="preserve"> </w:t>
+      </w:r>
+      <w:r>
+        <w:t xml:space="preserve">0.095), and queries that group by a category on three of five. Grouping by free text is not a risk in itself: these</w:t>
+      </w:r>
+      <w:r>
+        <w:t xml:space="preserve"> </w:t>
+      </w:r>
+      <w:r>
+        <w:t xml:space="preserve">are mostly names such as a team or a judge, which documents state plainly. Only three test queries group by a number,</w:t>
+      </w:r>
+      <w:r>
+        <w:t xml:space="preserve"> </w:t>
+      </w:r>
+      <w:r>
+        <w:t xml:space="preserve">too few to measure.</w:t>
+      </w:r>
+    </w:p>
+    <w:p>
+      <w:pPr>
+        <w:pStyle w:val="BodyText"/>
+      </w:pPr>
+      <w:r>
         <w:t xml:space="preserve">Filters and joins follow the same logic. Queries with no filter score lowest (0.23, against 0.29 with one filter),</w:t>
       </w:r>
       <w:r>
@@ -1008,7 +1809,13 @@
         <w:t xml:space="preserve"> </w:t>
       </w:r>
       <w:r>
-        <w:t xml:space="preserve">consistently (see the DocETL section).</w:t>
+        <w:t xml:space="preserve">consistently (see the section on joins). Apart from the within-corpus comparison above, these patterns are</w:t>
+      </w:r>
+      <w:r>
+        <w:t xml:space="preserve"> </w:t>
+      </w:r>
+      <w:r>
+        <w:t xml:space="preserve">correlational.</w:t>
       </w:r>
     </w:p>
     <w:p>
@@ -1016,24 +1823,57 @@
         <w:pStyle w:val="BodyText"/>
       </w:pPr>
       <w:r>
-        <w:t xml:space="preserve">These patterns are correlational and partly confounded by corpus: joins occur only on basketball players, and the</w:t>
-      </w:r>
-      <w:r>
-        <w:t xml:space="preserve"> </w:t>
-      </w:r>
-      <w:r>
-        <w:t xml:space="preserve">corpora differ in how many groups their queries have.</w:t>
+        <w:rPr>
+          <w:i/>
+        </w:rPr>
+        <w:t xml:space="preserve">What this lets you decide.</w:t>
+      </w:r>
+      <w:r>
+        <w:t xml:space="preserve"> </w:t>
+      </w:r>
+      <w:r>
+        <w:t xml:space="preserve">Whether an answer over extracted data can be trusted can be judged from the query before</w:t>
+      </w:r>
+      <w:r>
+        <w:t xml:space="preserve"> </w:t>
+      </w:r>
+      <w:r>
+        <w:t xml:space="preserve">it runs. Grouping by a number, or by a name the documents state, is safe. Grouping by a list or by a category whose</w:t>
+      </w:r>
+      <w:r>
+        <w:t xml:space="preserve"> </w:t>
+      </w:r>
+      <w:r>
+        <w:t xml:space="preserve">boundaries are a matter of judgment loses groups, and more so the more groups the answer has. MIN, AVG and SUM tolerate</w:t>
+      </w:r>
+      <w:r>
+        <w:t xml:space="preserve"> </w:t>
+      </w:r>
+      <w:r>
+        <w:t xml:space="preserve">extraction errors; MAX does not, because one bad value decides it. A system can use this to warn about fragile</w:t>
+      </w:r>
+      <w:r>
+        <w:t xml:space="preserve"> </w:t>
+      </w:r>
+      <w:r>
+        <w:t xml:space="preserve">queries, to spend its extraction effort on the columns fragile queries group by, or to normalize those columns to a</w:t>
+      </w:r>
+      <w:r>
+        <w:t xml:space="preserve"> </w:t>
+      </w:r>
+      <w:r>
+        <w:t xml:space="preserve">fixed vocabulary before grouping.</w:t>
       </w:r>
     </w:p>
     <w:p>
       <w:pPr>
         <w:pStyle w:val="Heading1"/>
       </w:pPr>
-      <w:bookmarkStart w:id="28" w:name="why-is-reading-a-column-up-front-so-much-cheaper-than-extracting-it-later"/>
-      <w:r>
-        <w:t xml:space="preserve">Why is reading a column up front so much cheaper than extracting it later?</w:t>
-      </w:r>
-      <w:bookmarkEnd w:id="28"/>
+      <w:bookmarkStart w:id="33" w:name="why-is-anticipating-a-column-cheap-and-when-is-it-worth-it"/>
+      <w:r>
+        <w:t xml:space="preserve">Why is anticipating a column cheap, and when is it worth it?</w:t>
+      </w:r>
+      <w:bookmarkEnd w:id="33"/>
     </w:p>
     <w:p>
       <w:pPr>
@@ -1466,7 +2306,7 @@
           <wp:inline>
             <wp:extent cx="5334000" cy="2085109"/>
             <wp:effectExtent b="0" l="0" r="0" t="0"/>
-            <wp:docPr descr="Figure 6. Left: composition of one extraction prompt at each corpus’s median document length. Right: predicted and measured break-even probability." title="" id="1" name="Picture"/>
+            <wp:docPr descr="Figure 9. Left: composition of one extraction prompt at each corpus’s median document length. Right: predicted and measured break-even probability." title="" id="1" name="Picture"/>
             <a:graphic>
               <a:graphicData uri="http://schemas.openxmlformats.org/drawingml/2006/picture">
                 <pic:pic>
@@ -1477,7 +2317,7 @@
                     </pic:cNvPicPr>
                   </pic:nvPicPr>
                   <pic:blipFill>
-                    <a:blip r:embed="rId29"/>
+                    <a:blip r:embed="rId34"/>
                     <a:stretch>
                       <a:fillRect/>
                     </a:stretch>
@@ -1509,7 +2349,7 @@
         <w:pStyle w:val="ImageCaption"/>
       </w:pPr>
       <w:r>
-        <w:t xml:space="preserve">Figure 6. Left: composition of one extraction prompt at each corpus’s median document length. Right: predicted and</w:t>
+        <w:t xml:space="preserve">Figure 9. Left: composition of one extraction prompt at each corpus’s median document length. Right: predicted and</w:t>
       </w:r>
       <w:r>
         <w:t xml:space="preserve"> </w:t>
@@ -1523,30 +2363,116 @@
         <w:pStyle w:val="BodyText"/>
       </w:pPr>
       <w:r>
-        <w:t xml:space="preserve">For corpora with long documents this means almost any plausibly useful column is worth extracting up front, since the</w:t>
-      </w:r>
-      <w:r>
-        <w:t xml:space="preserve"> </w:t>
-      </w:r>
-      <w:r>
-        <w:t xml:space="preserve">threshold is around 2%. For short documents it is closer to 10%, and that is where knowing the workload saves the</w:t>
-      </w:r>
-      <w:r>
-        <w:t xml:space="preserve"> </w:t>
-      </w:r>
-      <w:r>
-        <w:t xml:space="preserve">most.</w:t>
+        <w:t xml:space="preserve">The other half of the decision is how likely a column is to be needed. In these benchmarks it is high. Of the columns</w:t>
+      </w:r>
+      <w:r>
+        <w:t xml:space="preserve"> </w:t>
+      </w:r>
+      <w:r>
+        <w:t xml:space="preserve">in each schema, 59% to 86% are used by at least one benchmark query, far above every corpus’s break-even. Once one test</w:t>
+      </w:r>
+      <w:r>
+        <w:t xml:space="preserve"> </w:t>
+      </w:r>
+      <w:r>
+        <w:t xml:space="preserve">query has asked for a column, another asks for it again in 57% to 100% of cases, and within the next ten queries in 36%</w:t>
+      </w:r>
+      <w:r>
+        <w:t xml:space="preserve"> </w:t>
+      </w:r>
+      <w:r>
+        <w:t xml:space="preserve">to 57%.</w:t>
+      </w:r>
+      <w:r>
+        <w:t xml:space="preserve"> </w:t>
+      </w:r>
+      <w:r>
+        <w:rPr>
+          <w:b/>
+        </w:rPr>
+        <w:t xml:space="preserve">By tokens alone, anticipating every column of these schemas would pay.</w:t>
+      </w:r>
+      <w:r>
+        <w:t xml:space="preserve"> </w:t>
+      </w:r>
+      <w:r>
+        <w:t xml:space="preserve">Two things limit this. Benchmark</w:t>
+      </w:r>
+      <w:r>
+        <w:t xml:space="preserve"> </w:t>
+      </w:r>
+      <w:r>
+        <w:t xml:space="preserve">schemas are curated, since a column exists because some query uses it, and an open-ended schema would have a much</w:t>
+      </w:r>
+      <w:r>
+        <w:t xml:space="preserve"> </w:t>
+      </w:r>
+      <w:r>
+        <w:t xml:space="preserve">lower base rate. And asking for more columns in one prompt changes the values, which is the first section’s finding:</w:t>
+      </w:r>
+      <w:r>
+        <w:t xml:space="preserve"> </w:t>
+      </w:r>
+      <w:r>
+        <w:t xml:space="preserve">with the 7B model, asking for fewer columns at once helps on papers and basketball players and hurts on artists.</w:t>
+      </w:r>
+    </w:p>
+    <w:p>
+      <w:pPr>
+        <w:pStyle w:val="BodyText"/>
+      </w:pPr>
+      <w:r>
+        <w:rPr>
+          <w:i/>
+        </w:rPr>
+        <w:t xml:space="preserve">What this lets you decide.</w:t>
+      </w:r>
+      <w:r>
+        <w:t xml:space="preserve"> </w:t>
+      </w:r>
+      <w:r>
+        <w:t xml:space="preserve">Whether to extract a column before anyone asks for it comes down to one comparison: the</w:t>
+      </w:r>
+      <w:r>
+        <w:t xml:space="preserve"> </w:t>
+      </w:r>
+      <w:r>
+        <w:t xml:space="preserve">probability that the workload will need it against the ratio of the column’s description tokens to the document’s</w:t>
+      </w:r>
+      <w:r>
+        <w:t xml:space="preserve"> </w:t>
+      </w:r>
+      <w:r>
+        <w:t xml:space="preserve">tokens. For long documents (thousands of tokens) the threshold is around 2%, and almost any plausibly useful column</w:t>
+      </w:r>
+      <w:r>
+        <w:t xml:space="preserve"> </w:t>
+      </w:r>
+      <w:r>
+        <w:t xml:space="preserve">should be extracted up front. For short documents it is around 10%, and that is where a known workload saves the most.</w:t>
+      </w:r>
+      <w:r>
+        <w:t xml:space="preserve"> </w:t>
+      </w:r>
+      <w:r>
+        <w:t xml:space="preserve">A column that has been asked for once is very likely to be asked for again and should be kept. The limit on adding</w:t>
+      </w:r>
+      <w:r>
+        <w:t xml:space="preserve"> </w:t>
+      </w:r>
+      <w:r>
+        <w:t xml:space="preserve">columns is accuracy, not cost.</w:t>
       </w:r>
     </w:p>
     <w:p>
       <w:pPr>
         <w:pStyle w:val="Heading1"/>
       </w:pPr>
-      <w:bookmarkStart w:id="30" w:name="why-cant-a-budget-policy-beat-extracting-whatever-fits-first-come-first-served"/>
-      <w:r>
-        <w:t xml:space="preserve">Why can’t a budget policy beat extracting whatever fits, first come, first served?</w:t>
-      </w:r>
-      <w:bookmarkEnd w:id="30"/>
+      <w:bookmarkStart w:id="35" w:name="why-cant-a-budget-policy-that-reasons-about-cost-and-timing-beat-first-come-first-served"/>
+      <w:r>
+        <w:t xml:space="preserve">Why can’t a budget policy that reasons about cost and timing beat first come, first served?</w:t>
+      </w:r>
+      <w:bookmarkEnd w:id="35"/>
     </w:p>
     <w:p>
       <w:pPr>
@@ -1585,9 +2511,11 @@
       <w:r>
         <w:t xml:space="preserve">17% on medical).</w:t>
       </w:r>
-      <w:r>
-        <w:t xml:space="preserve"> </w:t>
-      </w:r>
+    </w:p>
+    <w:p>
+      <w:pPr>
+        <w:pStyle w:val="BodyText"/>
+      </w:pPr>
       <w:r>
         <w:rPr>
           <w:b/>
@@ -1628,7 +2556,7 @@
           <wp:inline>
             <wp:extent cx="5334000" cy="2021305"/>
             <wp:effectExtent b="0" l="0" r="0" t="0"/>
-            <wp:docPr descr="Figure 7. Share of each extraction’s score gain that goes to its own query and to later queries." title="" id="1" name="Picture"/>
+            <wp:docPr descr="Figure 10. Share of each extraction’s score gain that goes to its own query and to later queries." title="" id="1" name="Picture"/>
             <a:graphic>
               <a:graphicData uri="http://schemas.openxmlformats.org/drawingml/2006/picture">
                 <pic:pic>
@@ -1639,7 +2567,7 @@
                     </pic:cNvPicPr>
                   </pic:nvPicPr>
                   <pic:blipFill>
-                    <a:blip r:embed="rId31"/>
+                    <a:blip r:embed="rId36"/>
                     <a:stretch>
                       <a:fillRect/>
                     </a:stretch>
@@ -1671,7 +2599,7 @@
         <w:pStyle w:val="ImageCaption"/>
       </w:pPr>
       <w:r>
-        <w:t xml:space="preserve">Figure 7. Share of each extraction’s score gain that goes to its own query and to later</w:t>
+        <w:t xml:space="preserve">Figure 10. Share of each extraction’s score gain that goes to its own query and to later</w:t>
       </w:r>
       <w:r>
         <w:t xml:space="preserve"> </w:t>
@@ -1816,19 +2744,13 @@
         <w:t xml:space="preserve"> </w:t>
       </w:r>
       <w:r>
-        <w:t xml:space="preserve">This is the prompt sensitivity of the</w:t>
-      </w:r>
-      <w:r>
-        <w:t xml:space="preserve"> </w:t>
-      </w:r>
-      <w:r>
-        <w:t xml:space="preserve">section on prompts below, appearing through the budget, and it explains why no policy that reasons only about cost</w:t>
-      </w:r>
-      <w:r>
-        <w:t xml:space="preserve"> </w:t>
-      </w:r>
-      <w:r>
-        <w:t xml:space="preserve">and timing can win reliably.</w:t>
+        <w:t xml:space="preserve">This is the first section’s prompt</w:t>
+      </w:r>
+      <w:r>
+        <w:t xml:space="preserve"> </w:t>
+      </w:r>
+      <w:r>
+        <w:t xml:space="preserve">effect, appearing through the budget.</w:t>
       </w:r>
     </w:p>
     <w:p>
@@ -1862,42 +2784,71 @@
         <w:pStyle w:val="BodyText"/>
       </w:pPr>
       <w:r>
-        <w:t xml:space="preserve">So budgeted extraction is a sequential problem in which value is deferred and shared between queries, and in which</w:t>
-      </w:r>
-      <w:r>
-        <w:t xml:space="preserve"> </w:t>
-      </w:r>
-      <w:r>
-        <w:t xml:space="preserve">moving an extraction changes its values as well as its timing. A useful policy would need to forecast which columns</w:t>
-      </w:r>
-      <w:r>
-        <w:t xml:space="preserve"> </w:t>
-      </w:r>
-      <w:r>
-        <w:t xml:space="preserve">future queries will use and keep each column’s extraction prompt fixed; estimating each extraction’s value on its own</w:t>
-      </w:r>
-      <w:r>
-        <w:t xml:space="preserve"> </w:t>
-      </w:r>
-      <w:r>
-        <w:t xml:space="preserve">is not enough. We do not yet have a true upper bound for budget policies, and we have not explained why the value</w:t>
-      </w:r>
-      <w:r>
-        <w:t xml:space="preserve"> </w:t>
-      </w:r>
-      <w:r>
-        <w:t xml:space="preserve">effect turns against pacing on basketball players.</w:t>
+        <w:t xml:space="preserve">We do not yet have a true upper bound for budget policies, and we have not explained why the value effect turns</w:t>
+      </w:r>
+      <w:r>
+        <w:t xml:space="preserve"> </w:t>
+      </w:r>
+      <w:r>
+        <w:t xml:space="preserve">against pacing on basketball players.</w:t>
+      </w:r>
+    </w:p>
+    <w:p>
+      <w:pPr>
+        <w:pStyle w:val="BodyText"/>
+      </w:pPr>
+      <w:r>
+        <w:rPr>
+          <w:i/>
+        </w:rPr>
+        <w:t xml:space="preserve">What this lets you decide.</w:t>
+      </w:r>
+      <w:r>
+        <w:t xml:space="preserve"> </w:t>
+      </w:r>
+      <w:r>
+        <w:t xml:space="preserve">A budget policy should be judged by three questions the results above answer. Will the</w:t>
+      </w:r>
+      <w:r>
+        <w:t xml:space="preserve"> </w:t>
+      </w:r>
+      <w:r>
+        <w:t xml:space="preserve">column be reused? Then its value is mostly in the future and a large extraction is worth more, not less. Does delaying</w:t>
+      </w:r>
+      <w:r>
+        <w:t xml:space="preserve"> </w:t>
+      </w:r>
+      <w:r>
+        <w:t xml:space="preserve">the extraction change the prompt it runs in? Then the delay changes the answers, and the prompt should be held fixed</w:t>
+      </w:r>
+      <w:r>
+        <w:t xml:space="preserve"> </w:t>
+      </w:r>
+      <w:r>
+        <w:t xml:space="preserve">per column so that only the timing moves. Does the extraction’s cost depend on earlier extractions? Then a plan that</w:t>
+      </w:r>
+      <w:r>
+        <w:t xml:space="preserve"> </w:t>
+      </w:r>
+      <w:r>
+        <w:t xml:space="preserve">reorders extractions mis-prices them. A policy that forecasts column reuse from the workload, keeps each column’s</w:t>
+      </w:r>
+      <w:r>
+        <w:t xml:space="preserve"> </w:t>
+      </w:r>
+      <w:r>
+        <w:t xml:space="preserve">prompt fixed, and orders extractions so that filter columns come first addresses all three; we have not built it.</w:t>
       </w:r>
     </w:p>
     <w:p>
       <w:pPr>
         <w:pStyle w:val="Heading1"/>
       </w:pPr>
-      <w:bookmarkStart w:id="32" w:name="why-do-field-descriptions-matter-more-than-anything-else-we-changed"/>
-      <w:r>
-        <w:t xml:space="preserve">Why do field descriptions matter more than anything else we changed?</w:t>
-      </w:r>
-      <w:bookmarkEnd w:id="32"/>
+      <w:bookmarkStart w:id="37" w:name="why-does-extracting-a-column-for-more-documents-sometimes-make-answers-worse"/>
+      <w:r>
+        <w:t xml:space="preserve">Why does extracting a column for more documents sometimes make answers worse?</w:t>
+      </w:r>
+      <w:bookmarkEnd w:id="37"/>
     </w:p>
     <w:p>
       <w:pPr>
@@ -1907,46 +2858,128 @@
         <w:rPr>
           <w:b/>
         </w:rPr>
-        <w:t xml:space="preserve">Most extraction errors come from the specification rather than from reading.</w:t>
-      </w:r>
-      <w:r>
-        <w:t xml:space="preserve"> </w:t>
-      </w:r>
-      <w:r>
-        <w:t xml:space="preserve">Given only a column name, the model</w:t>
-      </w:r>
-      <w:r>
-        <w:t xml:space="preserve"> </w:t>
-      </w:r>
-      <w:r>
-        <w:t xml:space="preserve">often does not know what to write, whether that is a count, a list of years, or a date in a particular format. It</w:t>
-      </w:r>
-      <w:r>
-        <w:t xml:space="preserve"> </w:t>
-      </w:r>
-      <w:r>
-        <w:t xml:space="preserve">leaves the cell empty or writes the value in another form. Without descriptions in the on-demand prompts, a count of</w:t>
-      </w:r>
-      <w:r>
-        <w:t xml:space="preserve"> </w:t>
-      </w:r>
-      <w:r>
-        <w:t xml:space="preserve">FIBA World Cup appearances falls from 0.86 to 0.01 correct because the model leaves it empty. An artist’s award count</w:t>
-      </w:r>
-      <w:r>
-        <w:t xml:space="preserve"> </w:t>
-      </w:r>
-      <w:r>
-        <w:t xml:space="preserve">falls from 0.74 to 0.06, and birth dates from 0.38 to 0.00 because they come back in a different format.</w:t>
-      </w:r>
-      <w:r>
-        <w:t xml:space="preserve"> </w:t>
-      </w:r>
+        <w:t xml:space="preserve">When a column does not apply to a document, the model rarely leaves it empty</w:t>
+      </w:r>
+      <w:r>
+        <w:t xml:space="preserve">, especially when the schema says the</w:t>
+      </w:r>
+      <w:r>
+        <w:t xml:space="preserve"> </w:t>
+      </w:r>
+      <w:r>
+        <w:t xml:space="preserve">column is never null. Extracting</w:t>
+      </w:r>
+      <w:r>
+        <w:t xml:space="preserve"> </w:t>
+      </w:r>
+      <w:r>
+        <w:t xml:space="preserve">“</w:t>
+      </w:r>
+      <w:r>
+        <w:t xml:space="preserve">agent framework</w:t>
+      </w:r>
+      <w:r>
+        <w:t xml:space="preserve">”</w:t>
+      </w:r>
+      <w:r>
+        <w:t xml:space="preserve"> </w:t>
+      </w:r>
+      <w:r>
+        <w:t xml:space="preserve">for every paper assigned one to 82 papers that have none. The</w:t>
+      </w:r>
+      <w:r>
+        <w:t xml:space="preserve"> </w:t>
+      </w:r>
+      <w:r>
+        <w:t xml:space="preserve">budgeted run extracted it only for the papers earlier queries had selected, and was more accurate. More generally, a</w:t>
+      </w:r>
+      <w:r>
+        <w:t xml:space="preserve"> </w:t>
+      </w:r>
+      <w:r>
+        <w:t xml:space="preserve">budgeted run beats the unlimited one on 8 to 31 queries per corpus, and nearly all of those queries were answered</w:t>
+      </w:r>
+      <w:r>
+        <w:t xml:space="preserve"> </w:t>
+      </w:r>
+      <w:r>
+        <w:t xml:space="preserve">without an extraction of their own.</w:t>
+      </w:r>
+    </w:p>
+    <w:p>
+      <w:pPr>
+        <w:pStyle w:val="BodyText"/>
+      </w:pPr>
+      <w:r>
+        <w:t xml:space="preserve">The benchmark makes this worse. It marks 19 of the 59 columns on three corpora as never null, although its own gold</w:t>
+      </w:r>
+      <w:r>
+        <w:t xml:space="preserve"> </w:t>
+      </w:r>
+      <w:r>
+        <w:t xml:space="preserve">data often leaves them empty. Emptying exactly those cells would raise the research-papers score from 0.153 to 0.193.</w:t>
+      </w:r>
+      <w:r>
+        <w:t xml:space="preserve"> </w:t>
+      </w:r>
+      <w:r>
+        <w:t xml:space="preserve">This rests on case evidence and an oracle measurement; we have not yet counted invented values against applicability</w:t>
+      </w:r>
+      <w:r>
+        <w:t xml:space="preserve"> </w:t>
+      </w:r>
+      <w:r>
+        <w:t xml:space="preserve">in a controlled way.</w:t>
+      </w:r>
+    </w:p>
+    <w:p>
+      <w:pPr>
+        <w:pStyle w:val="BodyText"/>
+      </w:pPr>
+      <w:r>
+        <w:rPr>
+          <w:i/>
+        </w:rPr>
+        <w:t xml:space="preserve">What this lets you decide.</w:t>
+      </w:r>
+      <w:r>
+        <w:t xml:space="preserve"> </w:t>
+      </w:r>
+      <w:r>
+        <w:t xml:space="preserve">Reading more documents is not free of error even when tokens are cheap. For columns that</w:t>
+      </w:r>
+      <w:r>
+        <w:t xml:space="preserve"> </w:t>
+      </w:r>
+      <w:r>
+        <w:t xml:space="preserve">apply only to some documents, extraction should be limited to the documents where the column applies, or the prompt</w:t>
+      </w:r>
+      <w:r>
+        <w:t xml:space="preserve"> </w:t>
+      </w:r>
+      <w:r>
+        <w:t xml:space="preserve">should allow and encourage an empty answer; a schema that declares such a column never null invites invented values.</w:t>
+      </w:r>
+    </w:p>
+    <w:p>
+      <w:pPr>
+        <w:pStyle w:val="Heading1"/>
+      </w:pPr>
+      <w:bookmarkStart w:id="38" w:name="why-does-a-planner-that-trusts-its-own-extractions-stop-improving"/>
+      <w:r>
+        <w:t xml:space="preserve">Why does a planner that trusts its own extractions stop improving?</w:t>
+      </w:r>
+      <w:bookmarkEnd w:id="38"/>
+    </w:p>
+    <w:p>
+      <w:pPr>
+        <w:pStyle w:val="FirstParagraph"/>
+      </w:pPr>
       <w:r>
         <w:rPr>
           <w:b/>
         </w:rPr>
-        <w:t xml:space="preserve">Adding the</w:t>
+        <w:t xml:space="preserve">The planner estimates its loss as disagreement with each query’s own extraction, which means it treats its own</w:t>
       </w:r>
       <w:r>
         <w:rPr>
@@ -1958,74 +2991,37 @@
         <w:rPr>
           <w:b/>
         </w:rPr>
-        <w:t xml:space="preserve">benchmark’s descriptions to a single extraction pass raised its score from 0.234 to 0.560, the largest effect in the</w:t>
-      </w:r>
-      <w:r>
-        <w:rPr>
-          <w:b/>
-        </w:rPr>
-        <w:t xml:space="preserve"> </w:t>
-      </w:r>
-      <w:r>
-        <w:rPr>
-          <w:b/>
-        </w:rPr>
-        <w:t xml:space="preserve">whole study.</w:t>
-      </w:r>
-    </w:p>
-    <w:p>
-      <w:pPr>
-        <w:pStyle w:val="CaptionedFigure"/>
-      </w:pPr>
-      <w:r>
-        <w:drawing>
-          <wp:inline>
-            <wp:extent cx="5334000" cy="2189747"/>
-            <wp:effectExtent b="0" l="0" r="0" t="0"/>
-            <wp:docPr descr="Figure 8. Share of cells correct with and without field descriptions." title="" id="1" name="Picture"/>
-            <a:graphic>
-              <a:graphicData uri="http://schemas.openxmlformats.org/drawingml/2006/picture">
-                <pic:pic>
-                  <pic:nvPicPr>
-                    <pic:cNvPr descr="figures/w6_specification.png" id="0" name="Picture"/>
-                    <pic:cNvPicPr>
-                      <a:picLocks noChangeArrowheads="1" noChangeAspect="1"/>
-                    </pic:cNvPicPr>
-                  </pic:nvPicPr>
-                  <pic:blipFill>
-                    <a:blip r:embed="rId33"/>
-                    <a:stretch>
-                      <a:fillRect/>
-                    </a:stretch>
-                  </pic:blipFill>
-                  <pic:spPr bwMode="auto">
-                    <a:xfrm>
-                      <a:off x="0" y="0"/>
-                      <a:ext cx="5334000" cy="2189747"/>
-                    </a:xfrm>
-                    <a:prstGeom prst="rect">
-                      <a:avLst/>
-                    </a:prstGeom>
-                    <a:noFill/>
-                    <a:ln w="9525">
-                      <a:noFill/>
-                      <a:headEnd/>
-                      <a:tailEnd/>
-                    </a:ln>
-                  </pic:spPr>
-                </pic:pic>
-              </a:graphicData>
-            </a:graphic>
-          </wp:inline>
-        </w:drawing>
-      </w:r>
-    </w:p>
-    <w:p>
-      <w:pPr>
-        <w:pStyle w:val="ImageCaption"/>
-      </w:pPr>
-      <w:r>
-        <w:t xml:space="preserve">Figure 8. Share of cells correct with and without field descriptions.</w:t>
+        <w:t xml:space="preserve">extractions as correct.</w:t>
+      </w:r>
+      <w:r>
+        <w:t xml:space="preserve"> </w:t>
+      </w:r>
+      <w:r>
+        <w:t xml:space="preserve">It cannot tell that a shared extraction is more accurate, and once its extractions agree with</w:t>
+      </w:r>
+      <w:r>
+        <w:t xml:space="preserve"> </w:t>
+      </w:r>
+      <w:r>
+        <w:t xml:space="preserve">each other it sees nothing left to gain. It also values columns one at a time, while a missing join key makes the</w:t>
+      </w:r>
+      <w:r>
+        <w:t xml:space="preserve"> </w:t>
+      </w:r>
+      <w:r>
+        <w:t xml:space="preserve">whole query fail. On basketball players its best configuration reaches 0.42, against 0.56 for one shared pass with</w:t>
+      </w:r>
+      <w:r>
+        <w:t xml:space="preserve"> </w:t>
+      </w:r>
+      <w:r>
+        <w:t xml:space="preserve">descriptions. At the full budget it plans only 4.9M of the 10.6M available tokens because its estimated loss is</w:t>
+      </w:r>
+      <w:r>
+        <w:t xml:space="preserve"> </w:t>
+      </w:r>
+      <w:r>
+        <w:t xml:space="preserve">already 0.027 per query.</w:t>
       </w:r>
     </w:p>
     <w:p>
@@ -2033,420 +3029,45 @@
         <w:pStyle w:val="BodyText"/>
       </w:pPr>
       <w:r>
-        <w:t xml:space="preserve">The same problem shows up in values that are right in substance but wrong in form. On one artist column, values agree</w:t>
-      </w:r>
-      <w:r>
-        <w:t xml:space="preserve"> </w:t>
-      </w:r>
-      <w:r>
-        <w:t xml:space="preserve">with the gold data 92% of the time if we ignore case, punctuation and list order, but only 13% of the time exactly,</w:t>
-      </w:r>
-      <w:r>
-        <w:t xml:space="preserve"> </w:t>
-      </w:r>
-      <w:r>
-        <w:t xml:space="preserve">and a GROUP BY needs the exact form. The evidence here comes from cell-level comparisons. We have not yet run the</w:t>
-      </w:r>
-      <w:r>
-        <w:t xml:space="preserve"> </w:t>
-      </w:r>
-      <w:r>
-        <w:t xml:space="preserve">causal test of rewriting ambiguous descriptions and measuring the gain.</w:t>
+        <w:rPr>
+          <w:i/>
+        </w:rPr>
+        <w:t xml:space="preserve">What this lets you decide.</w:t>
+      </w:r>
+      <w:r>
+        <w:t xml:space="preserve"> </w:t>
+      </w:r>
+      <w:r>
+        <w:t xml:space="preserve">A planner’s objective needs some estimate of accuracy that does not come from its own</w:t>
+      </w:r>
+      <w:r>
+        <w:t xml:space="preserve"> </w:t>
+      </w:r>
+      <w:r>
+        <w:t xml:space="preserve">outputs, for instance a small labelled sample or the disagreement between two prompts, with the caveat for categories</w:t>
+      </w:r>
+      <w:r>
+        <w:t xml:space="preserve"> </w:t>
+      </w:r>
+      <w:r>
+        <w:t xml:space="preserve">given above. Its value model also has to treat a query’s columns jointly, since one missing key loses the whole answer.</w:t>
+      </w:r>
+      <w:r>
+        <w:t xml:space="preserve"> </w:t>
+      </w:r>
+      <w:r>
+        <w:t xml:space="preserve">We know the cause but have not built such a planner.</w:t>
       </w:r>
     </w:p>
     <w:p>
       <w:pPr>
         <w:pStyle w:val="Heading1"/>
       </w:pPr>
-      <w:bookmarkStart w:id="34" w:name="why-are-some-columns-and-some-corpora-so-sensitive-to-the-prompt"/>
-      <w:r>
-        <w:t xml:space="preserve">Why are some columns, and some corpora, so sensitive to the prompt?</w:t>
-      </w:r>
-      <w:bookmarkEnd w:id="34"/>
-    </w:p>
-    <w:p>
-      <w:pPr>
-        <w:pStyle w:val="FirstParagraph"/>
-      </w:pPr>
-      <w:r>
-        <w:t xml:space="preserve">When a document states a value plainly, as with a number or a yes/no answer, any reasonable prompt returns it.</w:t>
-      </w:r>
-      <w:r>
-        <w:t xml:space="preserve"> </w:t>
-      </w:r>
-      <w:r>
-        <w:rPr>
-          <w:b/>
-        </w:rPr>
-        <w:t xml:space="preserve">When</w:t>
-      </w:r>
-      <w:r>
-        <w:rPr>
-          <w:b/>
-        </w:rPr>
-        <w:t xml:space="preserve"> </w:t>
-      </w:r>
-      <w:r>
-        <w:rPr>
-          <w:b/>
-        </w:rPr>
-        <w:t xml:space="preserve">the document does not settle the answer, the prompt decides.</w:t>
-      </w:r>
-      <w:r>
-        <w:t xml:space="preserve"> </w:t>
-      </w:r>
-      <w:r>
-        <w:t xml:space="preserve">Examples are a disease’s causes, a party’s status, or a</w:t>
-      </w:r>
-      <w:r>
-        <w:t xml:space="preserve"> </w:t>
-      </w:r>
-      <w:r>
-        <w:t xml:space="preserve">value the document never mentions. The prompt decides through how readily the model leaves a cell empty and through</w:t>
-      </w:r>
-      <w:r>
-        <w:t xml:space="preserve"> </w:t>
-      </w:r>
-      <w:r>
-        <w:t xml:space="preserve">the example values it shows.</w:t>
-      </w:r>
-    </w:p>
-    <w:p>
-      <w:pPr>
-        <w:pStyle w:val="BodyText"/>
-      </w:pPr>
-      <w:r>
-        <w:t xml:space="preserve">We measured, for each column the test queries need, how often the build’s prompt and the on-demand prompt give</w:t>
-      </w:r>
-      <w:r>
-        <w:t xml:space="preserve"> </w:t>
-      </w:r>
-      <w:r>
-        <w:t xml:space="preserve">different values for the same document.</w:t>
-      </w:r>
-      <w:r>
-        <w:t xml:space="preserve"> </w:t>
-      </w:r>
-      <w:r>
-        <w:rPr>
-          <w:b/>
-        </w:rPr>
-        <w:t xml:space="preserve">Across 41 columns this disagreement is a strong predictor of error</w:t>
-      </w:r>
-      <w:r>
-        <w:rPr>
-          <w:b/>
-        </w:rPr>
-        <w:t xml:space="preserve"> </w:t>
-      </w:r>
-      <w:r>
-        <w:rPr>
-          <w:b/>
-        </w:rPr>
-        <w:t xml:space="preserve">(Spearman −0.76).</w:t>
-      </w:r>
-      <w:r>
-        <w:t xml:space="preserve"> </w:t>
-      </w:r>
-      <w:r>
-        <w:t xml:space="preserve">Numbers disagree on 9% of cells, yes/no columns on 24%, free text on 47% and categories on 60%. No</w:t>
-      </w:r>
-      <w:r>
-        <w:t xml:space="preserve"> </w:t>
-      </w:r>
-      <w:r>
-        <w:t xml:space="preserve">column with more than about 55% disagreement is right more than 60% of the time. The reverse does not hold: some</w:t>
-      </w:r>
-      <w:r>
-        <w:t xml:space="preserve"> </w:t>
-      </w:r>
-      <w:r>
-        <w:t xml:space="preserve">columns are consistent and still wrong because both prompts make the same formatting error.</w:t>
-      </w:r>
-    </w:p>
-    <w:p>
-      <w:pPr>
-        <w:pStyle w:val="CaptionedFigure"/>
-      </w:pPr>
-      <w:r>
-        <w:drawing>
-          <wp:inline>
-            <wp:extent cx="5334000" cy="2582778"/>
-            <wp:effectExtent b="0" l="0" r="0" t="0"/>
-            <wp:docPr descr="Figure 9. Disagreement between two prompts against accuracy, one point per column." title="" id="1" name="Picture"/>
-            <a:graphic>
-              <a:graphicData uri="http://schemas.openxmlformats.org/drawingml/2006/picture">
-                <pic:pic>
-                  <pic:nvPicPr>
-                    <pic:cNvPr descr="figures/w4_determinacy.png" id="0" name="Picture"/>
-                    <pic:cNvPicPr>
-                      <a:picLocks noChangeArrowheads="1" noChangeAspect="1"/>
-                    </pic:cNvPicPr>
-                  </pic:nvPicPr>
-                  <pic:blipFill>
-                    <a:blip r:embed="rId35"/>
-                    <a:stretch>
-                      <a:fillRect/>
-                    </a:stretch>
-                  </pic:blipFill>
-                  <pic:spPr bwMode="auto">
-                    <a:xfrm>
-                      <a:off x="0" y="0"/>
-                      <a:ext cx="5334000" cy="2582778"/>
-                    </a:xfrm>
-                    <a:prstGeom prst="rect">
-                      <a:avLst/>
-                    </a:prstGeom>
-                    <a:noFill/>
-                    <a:ln w="9525">
-                      <a:noFill/>
-                      <a:headEnd/>
-                      <a:tailEnd/>
-                    </a:ln>
-                  </pic:spPr>
-                </pic:pic>
-              </a:graphicData>
-            </a:graphic>
-          </wp:inline>
-        </w:drawing>
-      </w:r>
-    </w:p>
-    <w:p>
-      <w:pPr>
-        <w:pStyle w:val="ImageCaption"/>
-      </w:pPr>
-      <w:r>
-        <w:t xml:space="preserve">Figure 9. Disagreement between two prompts against accuracy, one point per column.</w:t>
-      </w:r>
-    </w:p>
-    <w:p>
-      <w:pPr>
-        <w:pStyle w:val="BodyText"/>
-      </w:pPr>
-      <w:r>
-        <w:t xml:space="preserve">The medical corpus, whose columns are mostly descriptive judgments, stands out. Its two prompts disagree on 75% of</w:t>
-      </w:r>
-      <w:r>
-        <w:t xml:space="preserve"> </w:t>
-      </w:r>
-      <w:r>
-        <w:t xml:space="preserve">cells, against 28% to 34% for papers, artists and court judgments and 10% for basketball players. Document length</w:t>
-      </w:r>
-      <w:r>
-        <w:t xml:space="preserve"> </w:t>
-      </w:r>
-      <w:r>
-        <w:t xml:space="preserve">does not explain this; on the earlier version of the medical and legal queries, prompts disagreed about as often on</w:t>
-      </w:r>
-      <w:r>
-        <w:t xml:space="preserve"> </w:t>
-      </w:r>
-      <w:r>
-        <w:t xml:space="preserve">short documents as on long ones. With five corpora we cannot separate three properties that occur together in the</w:t>
-      </w:r>
-      <w:r>
-        <w:t xml:space="preserve"> </w:t>
-      </w:r>
-      <w:r>
-        <w:t xml:space="preserve">medical corpus: descriptive columns, gold values that are often empty, and list-valued columns. One practical use of</w:t>
-      </w:r>
-      <w:r>
-        <w:t xml:space="preserve"> </w:t>
-      </w:r>
-      <w:r>
-        <w:t xml:space="preserve">this result is that disagreement between two cheap prompts can flag columns that need a better description or a human</w:t>
-      </w:r>
-      <w:r>
-        <w:t xml:space="preserve"> </w:t>
-      </w:r>
-      <w:r>
-        <w:t xml:space="preserve">look, before any gold data exists.</w:t>
-      </w:r>
-    </w:p>
-    <w:p>
-      <w:pPr>
-        <w:pStyle w:val="Heading1"/>
-      </w:pPr>
-      <w:bookmarkStart w:id="36" w:name="why-does-extracting-a-column-for-more-documents-sometimes-make-answers-worse"/>
-      <w:r>
-        <w:t xml:space="preserve">Why does extracting a column for more documents sometimes make answers worse?</w:t>
-      </w:r>
-      <w:bookmarkEnd w:id="36"/>
-    </w:p>
-    <w:p>
-      <w:pPr>
-        <w:pStyle w:val="FirstParagraph"/>
-      </w:pPr>
-      <w:r>
-        <w:rPr>
-          <w:b/>
-        </w:rPr>
-        <w:t xml:space="preserve">When a column does not apply to a document, the model rarely leaves it empty</w:t>
-      </w:r>
-      <w:r>
-        <w:t xml:space="preserve">, especially when the schema says the</w:t>
-      </w:r>
-      <w:r>
-        <w:t xml:space="preserve"> </w:t>
-      </w:r>
-      <w:r>
-        <w:t xml:space="preserve">column is never null. Extracting</w:t>
-      </w:r>
-      <w:r>
-        <w:t xml:space="preserve"> </w:t>
-      </w:r>
-      <w:r>
-        <w:t xml:space="preserve">“</w:t>
-      </w:r>
-      <w:r>
-        <w:t xml:space="preserve">agent framework</w:t>
-      </w:r>
-      <w:r>
-        <w:t xml:space="preserve">”</w:t>
-      </w:r>
-      <w:r>
-        <w:t xml:space="preserve"> </w:t>
-      </w:r>
-      <w:r>
-        <w:t xml:space="preserve">for every paper assigned one to 82 papers that have none. The</w:t>
-      </w:r>
-      <w:r>
-        <w:t xml:space="preserve"> </w:t>
-      </w:r>
-      <w:r>
-        <w:t xml:space="preserve">budgeted run extracted it only for the papers earlier queries had selected, and was more accurate. More generally, a</w:t>
-      </w:r>
-      <w:r>
-        <w:t xml:space="preserve"> </w:t>
-      </w:r>
-      <w:r>
-        <w:t xml:space="preserve">budgeted run beats the unlimited one on 8 to 31 queries per corpus, and nearly all of those queries were answered</w:t>
-      </w:r>
-      <w:r>
-        <w:t xml:space="preserve"> </w:t>
-      </w:r>
-      <w:r>
-        <w:t xml:space="preserve">without an extraction of their own.</w:t>
-      </w:r>
-    </w:p>
-    <w:p>
-      <w:pPr>
-        <w:pStyle w:val="BodyText"/>
-      </w:pPr>
-      <w:r>
-        <w:t xml:space="preserve">The benchmark makes this worse. It marks 19 of the 59 columns on three corpora as never null, although its own gold</w:t>
-      </w:r>
-      <w:r>
-        <w:t xml:space="preserve"> </w:t>
-      </w:r>
-      <w:r>
-        <w:t xml:space="preserve">data often leaves them empty. Emptying exactly those cells would raise the research-papers score from 0.153 to 0.193.</w:t>
-      </w:r>
-      <w:r>
-        <w:t xml:space="preserve"> </w:t>
-      </w:r>
-      <w:r>
-        <w:t xml:space="preserve">Limiting extraction to documents where a column applies is therefore a matter of correctness as well as cost. This</w:t>
-      </w:r>
-      <w:r>
-        <w:t xml:space="preserve"> </w:t>
-      </w:r>
-      <w:r>
-        <w:t xml:space="preserve">rests on case evidence and an oracle measurement; we have not yet counted invented values against applicability in a</w:t>
-      </w:r>
-      <w:r>
-        <w:t xml:space="preserve"> </w:t>
-      </w:r>
-      <w:r>
-        <w:t xml:space="preserve">controlled way.</w:t>
-      </w:r>
-    </w:p>
-    <w:p>
-      <w:pPr>
-        <w:pStyle w:val="Heading1"/>
-      </w:pPr>
-      <w:bookmarkStart w:id="37" w:name="why-does-a-cost-based-extraction-planner-fall-short-of-one-shared-extraction-pass"/>
-      <w:r>
-        <w:t xml:space="preserve">Why does a cost-based extraction planner fall short of one shared extraction pass?</w:t>
-      </w:r>
-      <w:bookmarkEnd w:id="37"/>
-    </w:p>
-    <w:p>
-      <w:pPr>
-        <w:pStyle w:val="FirstParagraph"/>
-      </w:pPr>
-      <w:r>
-        <w:rPr>
-          <w:b/>
-        </w:rPr>
-        <w:t xml:space="preserve">The planner estimates its loss as disagreement with each query’s own extraction, which means it treats its own</w:t>
-      </w:r>
-      <w:r>
-        <w:rPr>
-          <w:b/>
-        </w:rPr>
-        <w:t xml:space="preserve"> </w:t>
-      </w:r>
-      <w:r>
-        <w:rPr>
-          <w:b/>
-        </w:rPr>
-        <w:t xml:space="preserve">extractions as correct.</w:t>
-      </w:r>
-      <w:r>
-        <w:t xml:space="preserve"> </w:t>
-      </w:r>
-      <w:r>
-        <w:t xml:space="preserve">It cannot tell that a shared extraction is more accurate, and once its extractions agree with</w:t>
-      </w:r>
-      <w:r>
-        <w:t xml:space="preserve"> </w:t>
-      </w:r>
-      <w:r>
-        <w:t xml:space="preserve">each other it sees nothing left to gain. It also values columns one at a time, while a missing join key makes the</w:t>
-      </w:r>
-      <w:r>
-        <w:t xml:space="preserve"> </w:t>
-      </w:r>
-      <w:r>
-        <w:t xml:space="preserve">whole query fail. On basketball players its best configuration reaches 0.42, against 0.56 for one shared pass with</w:t>
-      </w:r>
-      <w:r>
-        <w:t xml:space="preserve"> </w:t>
-      </w:r>
-      <w:r>
-        <w:t xml:space="preserve">descriptions. At the full budget it plans only 4.9M of the 10.6M available tokens because its estimated loss is</w:t>
-      </w:r>
-      <w:r>
-        <w:t xml:space="preserve"> </w:t>
-      </w:r>
-      <w:r>
-        <w:t xml:space="preserve">already 0.027 per query.</w:t>
-      </w:r>
-    </w:p>
-    <w:p>
-      <w:pPr>
-        <w:pStyle w:val="BodyText"/>
-      </w:pPr>
-      <w:r>
-        <w:t xml:space="preserve">We know the cause but have not built a planner with a different objective. Such a planner would need some estimate of</w:t>
-      </w:r>
-      <w:r>
-        <w:t xml:space="preserve"> </w:t>
-      </w:r>
-      <w:r>
-        <w:t xml:space="preserve">accuracy, for instance from a small labelled sample or from the disagreement between prompts described above.</w:t>
-      </w:r>
-    </w:p>
-    <w:p>
-      <w:pPr>
-        <w:pStyle w:val="Heading1"/>
-      </w:pPr>
-      <w:bookmarkStart w:id="38" w:name="why-does-docetl-fail-on-queries-that-join-tables"/>
-      <w:r>
-        <w:t xml:space="preserve">Why does DocETL fail on queries that join tables?</w:t>
-      </w:r>
-      <w:bookmarkEnd w:id="38"/>
+      <w:bookmarkStart w:id="39" w:name="why-do-joins-fail-when-each-tables-keys-are-extracted-separately"/>
+      <w:r>
+        <w:t xml:space="preserve">Why do joins fail when each table’s keys are extracted separately?</w:t>
+      </w:r>
+      <w:bookmarkEnd w:id="39"/>
     </w:p>
     <w:p>
       <w:pPr>
@@ -2516,7 +3137,7 @@
           <wp:inline>
             <wp:extent cx="5334000" cy="2311400"/>
             <wp:effectExtent b="0" l="0" r="0" t="0"/>
-            <wp:docPr descr="Figure 10. Share of rows whose join key finds a partner in the joined table." title="" id="1" name="Picture"/>
+            <wp:docPr descr="Figure 11. Share of rows whose join key finds a partner in the joined table." title="" id="1" name="Picture"/>
             <a:graphic>
               <a:graphicData uri="http://schemas.openxmlformats.org/drawingml/2006/picture">
                 <pic:pic>
@@ -2527,7 +3148,7 @@
                     </pic:cNvPicPr>
                   </pic:nvPicPr>
                   <pic:blipFill>
-                    <a:blip r:embed="rId39"/>
+                    <a:blip r:embed="rId40"/>
                     <a:stretch>
                       <a:fillRect/>
                     </a:stretch>
@@ -2559,7 +3180,7 @@
         <w:pStyle w:val="ImageCaption"/>
       </w:pPr>
       <w:r>
-        <w:t xml:space="preserve">Figure 10. Share of rows whose join key finds a partner in the joined table.</w:t>
+        <w:t xml:space="preserve">Figure 11. Share of rows whose join key finds a partner in the joined table.</w:t>
       </w:r>
     </w:p>
     <w:p>
@@ -2572,13 +3193,294 @@
     </w:p>
     <w:p>
       <w:pPr>
+        <w:pStyle w:val="BodyText"/>
+      </w:pPr>
+      <w:r>
+        <w:rPr>
+          <w:i/>
+        </w:rPr>
+        <w:t xml:space="preserve">What this lets you decide.</w:t>
+      </w:r>
+      <w:r>
+        <w:t xml:space="preserve"> </w:t>
+      </w:r>
+      <w:r>
+        <w:t xml:space="preserve">Join keys should be extracted once, with one definition, and shared by every query that</w:t>
+      </w:r>
+      <w:r>
+        <w:t xml:space="preserve"> </w:t>
+      </w:r>
+      <w:r>
+        <w:t xml:space="preserve">joins on them. This is the first section’s finding applied to keys: a key extracted in a different prompt is a</w:t>
+      </w:r>
+      <w:r>
+        <w:t xml:space="preserve"> </w:t>
+      </w:r>
+      <w:r>
+        <w:t xml:space="preserve">different value, and for a key, any difference breaks the match.</w:t>
+      </w:r>
+    </w:p>
+    <w:p>
+      <w:pPr>
         <w:pStyle w:val="Heading1"/>
       </w:pPr>
-      <w:bookmarkStart w:id="40" w:name="open-questions"/>
+      <w:bookmarkStart w:id="41" w:name="what-carries-over-to-other-problems"/>
+      <w:r>
+        <w:t xml:space="preserve">What carries over to other problems</w:t>
+      </w:r>
+      <w:bookmarkEnd w:id="41"/>
+    </w:p>
+    <w:p>
+      <w:pPr>
+        <w:pStyle w:val="FirstParagraph"/>
+      </w:pPr>
+      <w:r>
+        <w:t xml:space="preserve">Several of these findings are instances of ideas known in other areas, and the comparison shows what is new about an</w:t>
+      </w:r>
+      <w:r>
+        <w:t xml:space="preserve"> </w:t>
+      </w:r>
+      <w:r>
+        <w:t xml:space="preserve">LLM as the reader of the data.</w:t>
+      </w:r>
+    </w:p>
+    <w:p>
+      <w:pPr>
+        <w:pStyle w:val="BodyText"/>
+      </w:pPr>
+      <w:r>
+        <w:rPr>
+          <w:i/>
+        </w:rPr>
+        <w:t xml:space="preserve">Prefetching and shared scans.</w:t>
+      </w:r>
+      <w:r>
+        <w:t xml:space="preserve"> </w:t>
+      </w:r>
+      <w:r>
+        <w:t xml:space="preserve">Whether to anticipate a column is the classic prefetching decision: fetch ahead when</w:t>
+      </w:r>
+      <w:r>
+        <w:t xml:space="preserve"> </w:t>
+      </w:r>
+      <w:r>
+        <w:t xml:space="preserve">the probability of use exceeds the ratio of the cost of fetching ahead to the cost of a miss. Databases make the same</w:t>
+      </w:r>
+      <w:r>
+        <w:t xml:space="preserve"> </w:t>
+      </w:r>
+      <w:r>
+        <w:t xml:space="preserve">argument for shared scans, where one pass over a table serves several queries. What is specific to LLM extraction is</w:t>
+      </w:r>
+      <w:r>
+        <w:t xml:space="preserve"> </w:t>
+      </w:r>
+      <w:r>
+        <w:t xml:space="preserve">the size of that ratio. Because the document dominates every prompt, an extra column costs 1% to 13% of a separate</w:t>
+      </w:r>
+      <w:r>
+        <w:t xml:space="preserve"> </w:t>
+      </w:r>
+      <w:r>
+        <w:t xml:space="preserve">read, so the threshold is low and a workload forecast matters only for short documents. The cost model is simple</w:t>
+      </w:r>
+      <w:r>
+        <w:t xml:space="preserve"> </w:t>
+      </w:r>
+      <w:r>
+        <w:t xml:space="preserve">enough to apply to any pipeline that sends documents to an LLM, such as retrieval-augmented generation or labelling.</w:t>
+      </w:r>
+    </w:p>
+    <w:p>
+      <w:pPr>
+        <w:pStyle w:val="BodyText"/>
+      </w:pPr>
+      <w:r>
+        <w:rPr>
+          <w:i/>
+        </w:rPr>
+        <w:t xml:space="preserve">Caching and materialized views.</w:t>
+      </w:r>
+      <w:r>
+        <w:t xml:space="preserve"> </w:t>
+      </w:r>
+      <w:r>
+        <w:t xml:space="preserve">Reuse of extracted columns is a materialized view over the documents, and its value</w:t>
+      </w:r>
+      <w:r>
+        <w:t xml:space="preserve"> </w:t>
+      </w:r>
+      <w:r>
+        <w:t xml:space="preserve">comes from future queries, as with any cache. The difference is that the view’s contents depend on how they were</w:t>
+      </w:r>
+      <w:r>
+        <w:t xml:space="preserve"> </w:t>
+      </w:r>
+      <w:r>
+        <w:t xml:space="preserve">computed. A cache of LLM outputs keyed only by document and column will mix values from different prompts, and a</w:t>
+      </w:r>
+      <w:r>
+        <w:t xml:space="preserve"> </w:t>
+      </w:r>
+      <w:r>
+        <w:t xml:space="preserve">refresh is a new measurement rather than a recomputation. The pacing result is a direct example: moving an extraction</w:t>
+      </w:r>
+      <w:r>
+        <w:t xml:space="preserve"> </w:t>
+      </w:r>
+      <w:r>
+        <w:t xml:space="preserve">in time changed its values.</w:t>
+      </w:r>
+    </w:p>
+    <w:p>
+      <w:pPr>
+        <w:pStyle w:val="BodyText"/>
+      </w:pPr>
+      <w:r>
+        <w:rPr>
+          <w:i/>
+        </w:rPr>
+        <w:t xml:space="preserve">Agreement as a signal of reliability.</w:t>
+      </w:r>
+      <w:r>
+        <w:t xml:space="preserve"> </w:t>
+      </w:r>
+      <w:r>
+        <w:t xml:space="preserve">Asking twice and comparing is the idea behind self-consistency in LLM question</w:t>
+      </w:r>
+      <w:r>
+        <w:t xml:space="preserve"> </w:t>
+      </w:r>
+      <w:r>
+        <w:t xml:space="preserve">answering and behind inter-annotator agreement in crowdsourcing. Our results show it works at the level of a column,</w:t>
+      </w:r>
+      <w:r>
+        <w:t xml:space="preserve"> </w:t>
+      </w:r>
+      <w:r>
+        <w:t xml:space="preserve">across prompts and across systems: our disagreement predicts DocETL’s accuracy. They also show the known limit of</w:t>
+      </w:r>
+      <w:r>
+        <w:t xml:space="preserve"> </w:t>
+      </w:r>
+      <w:r>
+        <w:t xml:space="preserve">agreement among annotators who share a bias. On categories both prompts make the same coarse choice, so agreement does</w:t>
+      </w:r>
+      <w:r>
+        <w:t xml:space="preserve"> </w:t>
+      </w:r>
+      <w:r>
+        <w:t xml:space="preserve">not mean correctness. This is the one transfer we tested directly; the others in this section are arguments by</w:t>
+      </w:r>
+      <w:r>
+        <w:t xml:space="preserve"> </w:t>
+      </w:r>
+      <w:r>
+        <w:t xml:space="preserve">analogy.</w:t>
+      </w:r>
+    </w:p>
+    <w:p>
+      <w:pPr>
+        <w:pStyle w:val="BodyText"/>
+      </w:pPr>
+      <w:r>
+        <w:rPr>
+          <w:i/>
+        </w:rPr>
+        <w:t xml:space="preserve">Measurement error in aggregates.</w:t>
+      </w:r>
+      <w:r>
+        <w:t xml:space="preserve"> </w:t>
+      </w:r>
+      <w:r>
+        <w:t xml:space="preserve">The aggregate results are robust statistics in another guise. A maximum depends on a</w:t>
+      </w:r>
+      <w:r>
+        <w:t xml:space="preserve"> </w:t>
+      </w:r>
+      <w:r>
+        <w:t xml:space="preserve">single observation, so one inflated value decides it; a minimum is safe when errors only push values up; averages and</w:t>
+      </w:r>
+      <w:r>
+        <w:t xml:space="preserve"> </w:t>
+      </w:r>
+      <w:r>
+        <w:t xml:space="preserve">sums let errors cancel; counts move with every misclassified row. Anyone running analytics over labels produced by a</w:t>
+      </w:r>
+      <w:r>
+        <w:t xml:space="preserve"> </w:t>
+      </w:r>
+      <w:r>
+        <w:t xml:space="preserve">model can predict which aggregates to trust from the direction and kind of the labelling errors.</w:t>
+      </w:r>
+    </w:p>
+    <w:p>
+      <w:pPr>
+        <w:pStyle w:val="BodyText"/>
+      </w:pPr>
+      <w:r>
+        <w:rPr>
+          <w:i/>
+        </w:rPr>
+        <w:t xml:space="preserve">Entity resolution and data integration.</w:t>
+      </w:r>
+      <w:r>
+        <w:t xml:space="preserve"> </w:t>
+      </w:r>
+      <w:r>
+        <w:t xml:space="preserve">The join result is the familiar requirement that records from different</w:t>
+      </w:r>
+      <w:r>
+        <w:t xml:space="preserve"> </w:t>
+      </w:r>
+      <w:r>
+        <w:t xml:space="preserve">sources agree on a canonical key before they can be linked. Extraction by an LLM reproduces the problem inside one</w:t>
+      </w:r>
+      <w:r>
+        <w:t xml:space="preserve"> </w:t>
+      </w:r>
+      <w:r>
+        <w:t xml:space="preserve">system as soon as keys are extracted more than once.</w:t>
+      </w:r>
+    </w:p>
+    <w:p>
+      <w:pPr>
+        <w:pStyle w:val="BodyText"/>
+      </w:pPr>
+      <w:r>
+        <w:rPr>
+          <w:i/>
+        </w:rPr>
+        <w:t xml:space="preserve">Data documentation.</w:t>
+      </w:r>
+      <w:r>
+        <w:t xml:space="preserve"> </w:t>
+      </w:r>
+      <w:r>
+        <w:t xml:space="preserve">The largest effect in the study came from describing each column. For an LLM reader, schema</w:t>
+      </w:r>
+      <w:r>
+        <w:t xml:space="preserve"> </w:t>
+      </w:r>
+      <w:r>
+        <w:t xml:space="preserve">documentation is not optional metadata but the main input that decides accuracy, which argues for treating column</w:t>
+      </w:r>
+      <w:r>
+        <w:t xml:space="preserve"> </w:t>
+      </w:r>
+      <w:r>
+        <w:t xml:space="preserve">descriptions as part of the schema in any system that extracts structured data with a model.</w:t>
+      </w:r>
+    </w:p>
+    <w:p>
+      <w:pPr>
+        <w:pStyle w:val="Heading1"/>
+      </w:pPr>
+      <w:bookmarkStart w:id="42" w:name="open-questions"/>
       <w:r>
         <w:t xml:space="preserve">Open questions</w:t>
       </w:r>
-      <w:bookmarkEnd w:id="40"/>
+      <w:bookmarkEnd w:id="42"/>
     </w:p>
     <w:p>
       <w:pPr>
@@ -2611,16 +3513,22 @@
       <w:r>
         <w:t xml:space="preserve">tested beyond five corpora and three models, or on a different split of the workload into known and later queries.</w:t>
       </w:r>
+      <w:r>
+        <w:t xml:space="preserve"> </w:t>
+      </w:r>
+      <w:r>
+        <w:t xml:space="preserve">Of the transfers to other areas, only the one about agreement has been tested outside our system, on DocETL.</w:t>
+      </w:r>
     </w:p>
     <w:p>
       <w:pPr>
         <w:pStyle w:val="Heading1"/>
       </w:pPr>
-      <w:bookmarkStart w:id="41" w:name="methods"/>
+      <w:bookmarkStart w:id="43" w:name="methods"/>
       <w:r>
         <w:t xml:space="preserve">Methods</w:t>
       </w:r>
-      <w:bookmarkEnd w:id="41"/>
+      <w:bookmarkEnd w:id="43"/>
     </w:p>
     <w:p>
       <w:pPr>
@@ -2711,18 +3619,54 @@
         <w:t xml:space="preserve"> </w:t>
       </w:r>
       <w:r>
-        <w:t xml:space="preserve">needed columns when the query arrived.</w:t>
+        <w:t xml:space="preserve">needed columns when the query arrived. The disagreement check compares, for every cell of the 41 new columns, the</w:t>
+      </w:r>
+      <w:r>
+        <w:t xml:space="preserve"> </w:t>
+      </w:r>
+      <w:r>
+        <w:t xml:space="preserve">served value with the build’s value and with gold. The DocETL comparison pools every non-empty value DocETL produced</w:t>
+      </w:r>
+      <w:r>
+        <w:t xml:space="preserve"> </w:t>
+      </w:r>
+      <w:r>
+        <w:t xml:space="preserve">for a column across its per-query outputs (a query that did not process a document leaves it empty), and measures its</w:t>
+      </w:r>
+      <w:r>
+        <w:t xml:space="preserve"> </w:t>
+      </w:r>
+      <w:r>
+        <w:t xml:space="preserve">disagreement on documents that two or more queries extracted. The need analysis counts the schema columns that any</w:t>
+      </w:r>
+      <w:r>
+        <w:t xml:space="preserve"> </w:t>
+      </w:r>
+      <w:r>
+        <w:t xml:space="preserve">benchmark query uses and, in the fully drifted stream, how often a new column is asked for again. The within-corpus</w:t>
+      </w:r>
+      <w:r>
+        <w:t xml:space="preserve"> </w:t>
+      </w:r>
+      <w:r>
+        <w:t xml:space="preserve">query comparison subtracts each corpus’s mean score at the same drift level before averaging by aggregate or by kind</w:t>
+      </w:r>
+      <w:r>
+        <w:t xml:space="preserve"> </w:t>
+      </w:r>
+      <w:r>
+        <w:t xml:space="preserve">of GROUP BY column.</w:t>
       </w:r>
     </w:p>
     <w:p>
       <w:pPr>
         <w:pStyle w:val="Heading1"/>
       </w:pPr>
-      <w:bookmarkStart w:id="42" w:name="appendix-example-test-queries"/>
+      <w:bookmarkStart w:id="44" w:name="appendix-example-test-queries"/>
       <w:r>
         <w:t xml:space="preserve">Appendix: example test queries</w:t>
       </w:r>
-      <w:bookmarkEnd w:id="42"/>
+      <w:bookmarkEnd w:id="44"/>
     </w:p>
     <w:p>
       <w:pPr>
@@ -2736,11 +3680,11 @@
       <w:pPr>
         <w:pStyle w:val="Heading2"/>
       </w:pPr>
-      <w:bookmarkStart w:id="43" w:name="research-papers-59-test-queries"/>
+      <w:bookmarkStart w:id="45" w:name="research-papers-59-test-queries"/>
       <w:r>
         <w:t xml:space="preserve">Research papers (59 test queries)</w:t>
       </w:r>
-      <w:bookmarkEnd w:id="43"/>
+      <w:bookmarkEnd w:id="45"/>
     </w:p>
     <w:p>
       <w:pPr>
@@ -3702,11 +4646,11 @@
       <w:pPr>
         <w:pStyle w:val="Heading2"/>
       </w:pPr>
-      <w:bookmarkStart w:id="44" w:name="basketball-players-118-test-queries"/>
+      <w:bookmarkStart w:id="46" w:name="basketball-players-118-test-queries"/>
       <w:r>
         <w:t xml:space="preserve">Basketball players (118 test queries)</w:t>
       </w:r>
-      <w:bookmarkEnd w:id="44"/>
+      <w:bookmarkEnd w:id="46"/>
     </w:p>
     <w:p>
       <w:pPr>
@@ -4494,11 +5438,11 @@
       <w:pPr>
         <w:pStyle w:val="Heading2"/>
       </w:pPr>
-      <w:bookmarkStart w:id="45" w:name="artists-43-test-queries"/>
+      <w:bookmarkStart w:id="47" w:name="artists-43-test-queries"/>
       <w:r>
         <w:t xml:space="preserve">Artists (43 test queries)</w:t>
       </w:r>
-      <w:bookmarkEnd w:id="45"/>
+      <w:bookmarkEnd w:id="47"/>
     </w:p>
     <w:p>
       <w:pPr>
@@ -4986,11 +5930,11 @@
       <w:pPr>
         <w:pStyle w:val="Heading2"/>
       </w:pPr>
-      <w:bookmarkStart w:id="46" w:name="medical-43-test-queries"/>
+      <w:bookmarkStart w:id="48" w:name="medical-43-test-queries"/>
       <w:r>
         <w:t xml:space="preserve">Medical (43 test queries)</w:t>
       </w:r>
-      <w:bookmarkEnd w:id="46"/>
+      <w:bookmarkEnd w:id="48"/>
     </w:p>
     <w:p>
       <w:pPr>
@@ -5323,11 +6267,11 @@
       <w:pPr>
         <w:pStyle w:val="Heading2"/>
       </w:pPr>
-      <w:bookmarkStart w:id="47" w:name="court-judgments-27-test-queries"/>
+      <w:bookmarkStart w:id="49" w:name="court-judgments-27-test-queries"/>
       <w:r>
         <w:t xml:space="preserve">Court judgments (27 test queries)</w:t>
       </w:r>
-      <w:bookmarkEnd w:id="47"/>
+      <w:bookmarkEnd w:id="49"/>
     </w:p>
     <w:p>
       <w:pPr>
@@ -6215,7 +7159,7 @@
     </w:lvl>
   </w:abstractNum>
   <w:abstractNum w:abstractNumId="990">
-    <w:nsid w:val="af742c33"/>
+    <w:nsid w:val="5ed3b7ea"/>
     <w:multiLevelType w:val="multilevel"/>
     <w:lvl w:ilvl="0">
       <w:numFmt w:val="bullet"/>

</xml_diff>

<commit_message>
Do our explanations predict DocETL's failures: disagreement vs DocETL cell errors, label fate and aggregate direction on DocETL outputs, within-corpus effects on DocETL scores; label fate compares numbers as numbers; descriptions section shortened and credited to UDA-Bench
Co-Authored-By: Claude Opus 5.5 <noreply@anthropic.com>
</commit_message>
<xml_diff>
--- a/results/experiments/why/Key_findings_and_why.docx
+++ b/results/experiments/why/Key_findings_and_why.docx
@@ -880,205 +880,11 @@
       <w:pPr>
         <w:pStyle w:val="Heading1"/>
       </w:pPr>
-      <w:bookmarkStart w:id="26" w:name="why-does-telling-the-model-what-a-column-means-matter-more-than-anything-else-we-changed"/>
-      <w:r>
-        <w:t xml:space="preserve">Why does telling the model what a column means matter more than anything else we changed?</w:t>
+      <w:bookmarkStart w:id="26" w:name="why-do-aggregate-queries-over-extracted-values-lose-their-groups"/>
+      <w:r>
+        <w:t xml:space="preserve">Why do aggregate queries over extracted values lose their groups?</w:t>
       </w:r>
       <w:bookmarkEnd w:id="26"/>
-    </w:p>
-    <w:p>
-      <w:pPr>
-        <w:pStyle w:val="FirstParagraph"/>
-      </w:pPr>
-      <w:r>
-        <w:rPr>
-          <w:b/>
-        </w:rPr>
-        <w:t xml:space="preserve">Most extraction errors come from the specification rather than from reading.</w:t>
-      </w:r>
-      <w:r>
-        <w:t xml:space="preserve"> </w:t>
-      </w:r>
-      <w:r>
-        <w:t xml:space="preserve">Given only a column name, the model</w:t>
-      </w:r>
-      <w:r>
-        <w:t xml:space="preserve"> </w:t>
-      </w:r>
-      <w:r>
-        <w:t xml:space="preserve">often does not know what to write, whether that is a count, a list of years, or a date in a particular format. It</w:t>
-      </w:r>
-      <w:r>
-        <w:t xml:space="preserve"> </w:t>
-      </w:r>
-      <w:r>
-        <w:t xml:space="preserve">leaves the cell empty or writes the value in another form. Without descriptions in the on-demand prompts, a count of</w:t>
-      </w:r>
-      <w:r>
-        <w:t xml:space="preserve"> </w:t>
-      </w:r>
-      <w:r>
-        <w:t xml:space="preserve">FIBA World Cup appearances falls from 0.86 to 0.01 correct because the model leaves it empty. An artist’s award count</w:t>
-      </w:r>
-      <w:r>
-        <w:t xml:space="preserve"> </w:t>
-      </w:r>
-      <w:r>
-        <w:t xml:space="preserve">falls from 0.74 to 0.06, and birth dates from 0.38 to 0.00 because they come back in a different format.</w:t>
-      </w:r>
-      <w:r>
-        <w:t xml:space="preserve"> </w:t>
-      </w:r>
-      <w:r>
-        <w:rPr>
-          <w:b/>
-        </w:rPr>
-        <w:t xml:space="preserve">Adding the</w:t>
-      </w:r>
-      <w:r>
-        <w:rPr>
-          <w:b/>
-        </w:rPr>
-        <w:t xml:space="preserve"> </w:t>
-      </w:r>
-      <w:r>
-        <w:rPr>
-          <w:b/>
-        </w:rPr>
-        <w:t xml:space="preserve">benchmark’s descriptions to a single extraction pass raised its score from 0.234 to 0.560, the largest effect in the</w:t>
-      </w:r>
-      <w:r>
-        <w:rPr>
-          <w:b/>
-        </w:rPr>
-        <w:t xml:space="preserve"> </w:t>
-      </w:r>
-      <w:r>
-        <w:rPr>
-          <w:b/>
-        </w:rPr>
-        <w:t xml:space="preserve">whole study.</w:t>
-      </w:r>
-    </w:p>
-    <w:p>
-      <w:pPr>
-        <w:pStyle w:val="CaptionedFigure"/>
-      </w:pPr>
-      <w:r>
-        <w:drawing>
-          <wp:inline>
-            <wp:extent cx="5334000" cy="2189747"/>
-            <wp:effectExtent b="0" l="0" r="0" t="0"/>
-            <wp:docPr descr="Figure 4. Share of cells correct with and without field descriptions." title="" id="1" name="Picture"/>
-            <a:graphic>
-              <a:graphicData uri="http://schemas.openxmlformats.org/drawingml/2006/picture">
-                <pic:pic>
-                  <pic:nvPicPr>
-                    <pic:cNvPr descr="figures/w6_specification.png" id="0" name="Picture"/>
-                    <pic:cNvPicPr>
-                      <a:picLocks noChangeArrowheads="1" noChangeAspect="1"/>
-                    </pic:cNvPicPr>
-                  </pic:nvPicPr>
-                  <pic:blipFill>
-                    <a:blip r:embed="rId27"/>
-                    <a:stretch>
-                      <a:fillRect/>
-                    </a:stretch>
-                  </pic:blipFill>
-                  <pic:spPr bwMode="auto">
-                    <a:xfrm>
-                      <a:off x="0" y="0"/>
-                      <a:ext cx="5334000" cy="2189747"/>
-                    </a:xfrm>
-                    <a:prstGeom prst="rect">
-                      <a:avLst/>
-                    </a:prstGeom>
-                    <a:noFill/>
-                    <a:ln w="9525">
-                      <a:noFill/>
-                      <a:headEnd/>
-                      <a:tailEnd/>
-                    </a:ln>
-                  </pic:spPr>
-                </pic:pic>
-              </a:graphicData>
-            </a:graphic>
-          </wp:inline>
-        </w:drawing>
-      </w:r>
-    </w:p>
-    <w:p>
-      <w:pPr>
-        <w:pStyle w:val="ImageCaption"/>
-      </w:pPr>
-      <w:r>
-        <w:t xml:space="preserve">Figure 4. Share of cells correct with and without field descriptions.</w:t>
-      </w:r>
-    </w:p>
-    <w:p>
-      <w:pPr>
-        <w:pStyle w:val="BodyText"/>
-      </w:pPr>
-      <w:r>
-        <w:t xml:space="preserve">The same problem shows up in values that are right in substance but wrong in form. On one artist column, values agree</w:t>
-      </w:r>
-      <w:r>
-        <w:t xml:space="preserve"> </w:t>
-      </w:r>
-      <w:r>
-        <w:t xml:space="preserve">with the gold data 92% of the time if we ignore case, punctuation and list order, but only 13% of the time exactly,</w:t>
-      </w:r>
-      <w:r>
-        <w:t xml:space="preserve"> </w:t>
-      </w:r>
-      <w:r>
-        <w:t xml:space="preserve">and a GROUP BY needs the exact form. The evidence here comes from cell-level comparisons. We have not yet run the</w:t>
-      </w:r>
-      <w:r>
-        <w:t xml:space="preserve"> </w:t>
-      </w:r>
-      <w:r>
-        <w:t xml:space="preserve">causal test of rewriting ambiguous descriptions and measuring the gain.</w:t>
-      </w:r>
-    </w:p>
-    <w:p>
-      <w:pPr>
-        <w:pStyle w:val="BodyText"/>
-      </w:pPr>
-      <w:r>
-        <w:rPr>
-          <w:i/>
-        </w:rPr>
-        <w:t xml:space="preserve">What this lets you decide.</w:t>
-      </w:r>
-      <w:r>
-        <w:t xml:space="preserve"> </w:t>
-      </w:r>
-      <w:r>
-        <w:t xml:space="preserve">Effort spent on describing each column (its unit, its format, what to write when the</w:t>
-      </w:r>
-      <w:r>
-        <w:t xml:space="preserve"> </w:t>
-      </w:r>
-      <w:r>
-        <w:t xml:space="preserve">document is silent) pays more than effort spent on scheduling or budgeting extraction. The columns that need it most</w:t>
-      </w:r>
-      <w:r>
-        <w:t xml:space="preserve"> </w:t>
-      </w:r>
-      <w:r>
-        <w:t xml:space="preserve">are the ones the previous section flags: high disagreement, or categories whose labels the model draws differently.</w:t>
-      </w:r>
-    </w:p>
-    <w:p>
-      <w:pPr>
-        <w:pStyle w:val="Heading1"/>
-      </w:pPr>
-      <w:bookmarkStart w:id="28" w:name="why-do-aggregate-queries-over-extracted-values-lose-their-groups"/>
-      <w:r>
-        <w:t xml:space="preserve">Why do aggregate queries over extracted values lose their groups?</w:t>
-      </w:r>
-      <w:bookmarkEnd w:id="28"/>
     </w:p>
     <w:p>
       <w:pPr>
@@ -1183,7 +989,7 @@
           <wp:inline>
             <wp:extent cx="5334000" cy="1745672"/>
             <wp:effectExtent b="0" l="0" r="0" t="0"/>
-            <wp:docPr descr="Figure 5. (a) Distinct values in the extracted GROUP BY column relative to gold. (b) Share of queries returning too few groups, by the number of groups in the gold answer." title="" id="1" name="Picture"/>
+            <wp:docPr descr="Figure 4. (a) Distinct values in the extracted GROUP BY column relative to gold. (b) Share of queries returning too few groups, by the number of groups in the gold answer." title="" id="1" name="Picture"/>
             <a:graphic>
               <a:graphicData uri="http://schemas.openxmlformats.org/drawingml/2006/picture">
                 <pic:pic>
@@ -1194,7 +1000,7 @@
                     </pic:cNvPicPr>
                   </pic:nvPicPr>
                   <pic:blipFill>
-                    <a:blip r:embed="rId29"/>
+                    <a:blip r:embed="rId27"/>
                     <a:stretch>
                       <a:fillRect/>
                     </a:stretch>
@@ -1226,7 +1032,7 @@
         <w:pStyle w:val="ImageCaption"/>
       </w:pPr>
       <w:r>
-        <w:t xml:space="preserve">Figure 5. (a) Distinct values in the extracted GROUP BY column relative to gold. (b) Share of queries returning too</w:t>
+        <w:t xml:space="preserve">Figure 4. (a) Distinct values in the extracted GROUP BY column relative to gold. (b) Share of queries returning too</w:t>
       </w:r>
       <w:r>
         <w:t xml:space="preserve"> </w:t>
@@ -1246,7 +1052,7 @@
         <w:t xml:space="preserve"> </w:t>
       </w:r>
       <w:r>
-        <w:t xml:space="preserve">45% get the exact gold label. 22% get a label of their own that is spelled differently, so the group survives under</w:t>
+        <w:t xml:space="preserve">49% get the exact gold label. 19% get a label of their own that is spelled differently, so the group survives under</w:t>
       </w:r>
       <w:r>
         <w:t xml:space="preserve"> </w:t>
@@ -1261,7 +1067,7 @@
         <w:rPr>
           <w:b/>
         </w:rPr>
-        <w:t xml:space="preserve">24% are merged into a label that mostly belongs to a different gold group, and only 9% are left</w:t>
+        <w:t xml:space="preserve">23% are merged into a label that mostly belongs to a different gold group, and only 9% are left</w:t>
       </w:r>
       <w:r>
         <w:rPr>
@@ -1371,7 +1177,7 @@
         <w:t xml:space="preserve"> </w:t>
       </w:r>
       <w:r>
-        <w:t xml:space="preserve">administrative, 155 civil and 56 commercial cases. Two-valued columns (yes/no, 0/1) merge 24% of rows, almost always</w:t>
+        <w:t xml:space="preserve">administrative, 155 civil and 56 commercial cases. Two-valued columns (yes/no, 0/1) merge 18% of rows, almost always</w:t>
       </w:r>
       <w:r>
         <w:t xml:space="preserve"> </w:t>
@@ -1467,7 +1273,7 @@
           <wp:inline>
             <wp:extent cx="5334000" cy="3031957"/>
             <wp:effectExtent b="0" l="0" r="0" t="0"/>
-            <wp:docPr descr="Figure 6. Where each gold row of a GROUP BY column ends up in the extracted table, by kind of column (a) and by corpus (b), at 100% drift." title="" id="1" name="Picture"/>
+            <wp:docPr descr="Figure 5. Where each gold row of a GROUP BY column ends up in the extracted table, by kind of column (a) and by corpus (b), at 100% drift." title="" id="1" name="Picture"/>
             <a:graphic>
               <a:graphicData uri="http://schemas.openxmlformats.org/drawingml/2006/picture">
                 <pic:pic>
@@ -1478,7 +1284,7 @@
                     </pic:cNvPicPr>
                   </pic:nvPicPr>
                   <pic:blipFill>
-                    <a:blip r:embed="rId30"/>
+                    <a:blip r:embed="rId28"/>
                     <a:stretch>
                       <a:fillRect/>
                     </a:stretch>
@@ -1510,7 +1316,7 @@
         <w:pStyle w:val="ImageCaption"/>
       </w:pPr>
       <w:r>
-        <w:t xml:space="preserve">Figure 6. Where each gold row of a GROUP BY column ends up in the extracted table, by kind of column (a) and by</w:t>
+        <w:t xml:space="preserve">Figure 5. Where each gold row of a GROUP BY column ends up in the extracted table, by kind of column (a) and by</w:t>
       </w:r>
       <w:r>
         <w:t xml:space="preserve"> </w:t>
@@ -1572,7 +1378,7 @@
           <wp:inline>
             <wp:extent cx="5334000" cy="1891145"/>
             <wp:effectExtent b="0" l="0" r="0" t="0"/>
-            <wp:docPr descr="Figure 7. Mean score by aggregate across drift levels, with on-demand extraction (a) and the static build (b)." title="" id="1" name="Picture"/>
+            <wp:docPr descr="Figure 6. Mean score by aggregate across drift levels, with on-demand extraction (a) and the static build (b)." title="" id="1" name="Picture"/>
             <a:graphic>
               <a:graphicData uri="http://schemas.openxmlformats.org/drawingml/2006/picture">
                 <pic:pic>
@@ -1583,7 +1389,7 @@
                     </pic:cNvPicPr>
                   </pic:nvPicPr>
                   <pic:blipFill>
-                    <a:blip r:embed="rId31"/>
+                    <a:blip r:embed="rId29"/>
                     <a:stretch>
                       <a:fillRect/>
                     </a:stretch>
@@ -1615,7 +1421,7 @@
         <w:pStyle w:val="ImageCaption"/>
       </w:pPr>
       <w:r>
-        <w:t xml:space="preserve">Figure 7. Mean score by aggregate across drift levels, with on-demand extraction (a) and the static build</w:t>
+        <w:t xml:space="preserve">Figure 6. Mean score by aggregate across drift levels, with on-demand extraction (a) and the static build</w:t>
       </w:r>
       <w:r>
         <w:t xml:space="preserve"> </w:t>
@@ -1633,7 +1439,7 @@
           <wp:inline>
             <wp:extent cx="5334000" cy="1909010"/>
             <wp:effectExtent b="0" l="0" r="0" t="0"/>
-            <wp:docPr descr="Figure 8. Aggregate values in matched groups at 100% drift: too low, within 20% of gold, or too high." title="" id="1" name="Picture"/>
+            <wp:docPr descr="Figure 7. Aggregate values in matched groups at 100% drift: too low, within 20% of gold, or too high." title="" id="1" name="Picture"/>
             <a:graphic>
               <a:graphicData uri="http://schemas.openxmlformats.org/drawingml/2006/picture">
                 <pic:pic>
@@ -1644,7 +1450,7 @@
                     </pic:cNvPicPr>
                   </pic:nvPicPr>
                   <pic:blipFill>
-                    <a:blip r:embed="rId32"/>
+                    <a:blip r:embed="rId30"/>
                     <a:stretch>
                       <a:fillRect/>
                     </a:stretch>
@@ -1676,7 +1482,7 @@
         <w:pStyle w:val="ImageCaption"/>
       </w:pPr>
       <w:r>
-        <w:t xml:space="preserve">Figure 8. Aggregate values in matched groups at 100% drift: too low, within 20% of gold, or too</w:t>
+        <w:t xml:space="preserve">Figure 7. Aggregate values in matched groups at 100% drift: too low, within 20% of gold, or too</w:t>
       </w:r>
       <w:r>
         <w:t xml:space="preserve"> </w:t>
@@ -1863,6 +1669,274 @@
       </w:r>
       <w:r>
         <w:t xml:space="preserve">fixed vocabulary before grouping.</w:t>
+      </w:r>
+    </w:p>
+    <w:p>
+      <w:pPr>
+        <w:pStyle w:val="Heading1"/>
+      </w:pPr>
+      <w:bookmarkStart w:id="31" w:name="do-these-explanations-predict-where-another-system-fails"/>
+      <w:r>
+        <w:t xml:space="preserve">Do these explanations predict where another system fails?</w:t>
+      </w:r>
+      <w:bookmarkEnd w:id="31"/>
+    </w:p>
+    <w:p>
+      <w:pPr>
+        <w:pStyle w:val="FirstParagraph"/>
+      </w:pPr>
+      <w:r>
+        <w:t xml:space="preserve">An explanation that is about columns, values and aggregates, rather than about our system, should predict the</w:t>
+      </w:r>
+      <w:r>
+        <w:t xml:space="preserve"> </w:t>
+      </w:r>
+      <w:r>
+        <w:t xml:space="preserve">failures of any system that extracts the same columns with an LLM. We checked this on DocETL’s outputs for the same</w:t>
+      </w:r>
+      <w:r>
+        <w:t xml:space="preserve"> </w:t>
+      </w:r>
+      <w:r>
+        <w:t xml:space="preserve">corpora and queries, without changing DocETL. This tests the explanations as predictions; it does not yet test whether</w:t>
+      </w:r>
+      <w:r>
+        <w:t xml:space="preserve"> </w:t>
+      </w:r>
+      <w:r>
+        <w:t xml:space="preserve">applying them improves DocETL, which needs new runs.</w:t>
+      </w:r>
+    </w:p>
+    <w:p>
+      <w:pPr>
+        <w:pStyle w:val="BodyText"/>
+      </w:pPr>
+      <w:r>
+        <w:rPr>
+          <w:b/>
+        </w:rPr>
+        <w:t xml:space="preserve">Most predictions hold.</w:t>
+      </w:r>
+      <w:r>
+        <w:t xml:space="preserve"> </w:t>
+      </w:r>
+      <w:r>
+        <w:t xml:space="preserve">Where our two prompts disagree on a cell, DocETL’s value for that cell is wrong 78% of the</w:t>
+      </w:r>
+      <w:r>
+        <w:t xml:space="preserve"> </w:t>
+      </w:r>
+      <w:r>
+        <w:t xml:space="preserve">time; where they agree, 38%. The signal is strong for numbers (57% against 28%), lists (84% against 43%) and free text</w:t>
+      </w:r>
+      <w:r>
+        <w:t xml:space="preserve"> </w:t>
+      </w:r>
+      <w:r>
+        <w:t xml:space="preserve">(80% against 49%). List columns lose the most group labels in DocETL as well (37% of non-empty rows keep the exact</w:t>
+      </w:r>
+      <w:r>
+        <w:t xml:space="preserve"> </w:t>
+      </w:r>
+      <w:r>
+        <w:t xml:space="preserve">label, against 65% to 74% for the other kinds), and DocETL merges category and yes/no labels at rates close to ours</w:t>
+      </w:r>
+      <w:r>
+        <w:t xml:space="preserve"> </w:t>
+      </w:r>
+      <w:r>
+        <w:t xml:space="preserve">(19% and 21% of non-empty rows, against our 25% and 18%). MIN is almost never too low in DocETL either (3% of matched groups, ours 2%).</w:t>
+      </w:r>
+      <w:r>
+        <w:t xml:space="preserve"> </w:t>
+      </w:r>
+      <w:r>
+        <w:t xml:space="preserve">Within each corpus, DocETL’s MAX queries are below the corpus mean on four of five corpora, its COUNT queries are above</w:t>
+      </w:r>
+      <w:r>
+        <w:t xml:space="preserve"> </w:t>
+      </w:r>
+      <w:r>
+        <w:t xml:space="preserve">it on all five, as in our system, and grouping by a list column is below the mean on all three corpora that have one.</w:t>
+      </w:r>
+    </w:p>
+    <w:p>
+      <w:pPr>
+        <w:pStyle w:val="CaptionedFigure"/>
+      </w:pPr>
+      <w:r>
+        <w:drawing>
+          <wp:inline>
+            <wp:extent cx="5334000" cy="1981200"/>
+            <wp:effectExtent b="0" l="0" r="0" t="0"/>
+            <wp:docPr descr="Figure 8. (a) Share of DocETL’s values that are wrong, split by whether our two prompts agree on the cell. (b) Share of GROUP BY rows that keep the exact gold label, by kind of column, in our system and in DocETL (non-empty rows, numbers compared as numbers)." title="" id="1" name="Picture"/>
+            <a:graphic>
+              <a:graphicData uri="http://schemas.openxmlformats.org/drawingml/2006/picture">
+                <pic:pic>
+                  <pic:nvPicPr>
+                    <pic:cNvPr descr="figures/w8_docetl_predict.png" id="0" name="Picture"/>
+                    <pic:cNvPicPr>
+                      <a:picLocks noChangeArrowheads="1" noChangeAspect="1"/>
+                    </pic:cNvPicPr>
+                  </pic:nvPicPr>
+                  <pic:blipFill>
+                    <a:blip r:embed="rId32"/>
+                    <a:stretch>
+                      <a:fillRect/>
+                    </a:stretch>
+                  </pic:blipFill>
+                  <pic:spPr bwMode="auto">
+                    <a:xfrm>
+                      <a:off x="0" y="0"/>
+                      <a:ext cx="5334000" cy="1981200"/>
+                    </a:xfrm>
+                    <a:prstGeom prst="rect">
+                      <a:avLst/>
+                    </a:prstGeom>
+                    <a:noFill/>
+                    <a:ln w="9525">
+                      <a:noFill/>
+                      <a:headEnd/>
+                      <a:tailEnd/>
+                    </a:ln>
+                  </pic:spPr>
+                </pic:pic>
+              </a:graphicData>
+            </a:graphic>
+          </wp:inline>
+        </w:drawing>
+      </w:r>
+    </w:p>
+    <w:p>
+      <w:pPr>
+        <w:pStyle w:val="ImageCaption"/>
+      </w:pPr>
+      <w:r>
+        <w:t xml:space="preserve">Figure 8. (a) Share of DocETL’s values that are wrong, split by whether our two prompts agree on the cell. (b) Share</w:t>
+      </w:r>
+      <w:r>
+        <w:t xml:space="preserve"> </w:t>
+      </w:r>
+      <w:r>
+        <w:t xml:space="preserve">of GROUP BY rows that keep the exact gold label, by kind of column, in our system and in DocETL (non-empty rows,</w:t>
+      </w:r>
+      <w:r>
+        <w:t xml:space="preserve"> </w:t>
+      </w:r>
+      <w:r>
+        <w:t xml:space="preserve">numbers compared as numbers).</w:t>
+      </w:r>
+    </w:p>
+    <w:p>
+      <w:pPr>
+        <w:pStyle w:val="BodyText"/>
+      </w:pPr>
+      <w:r>
+        <w:rPr>
+          <w:b/>
+        </w:rPr>
+        <w:t xml:space="preserve">Three predictions fail, and each failure narrows an explanation.</w:t>
+      </w:r>
+      <w:r>
+        <w:t xml:space="preserve"> </w:t>
+      </w:r>
+      <w:r>
+        <w:t xml:space="preserve">Our disagreement says nothing about DocETL’s</w:t>
+      </w:r>
+      <w:r>
+        <w:t xml:space="preserve"> </w:t>
+      </w:r>
+      <w:r>
+        <w:t xml:space="preserve">yes/no errors (34% against 35%), and on categories it separates them only weakly (49% against 42%). So disagreement</w:t>
+      </w:r>
+      <w:r>
+        <w:t xml:space="preserve"> </w:t>
+      </w:r>
+      <w:r>
+        <w:t xml:space="preserve">transfers where errors come from the document leaving the answer open, and not where they come from how a system phrases</w:t>
+      </w:r>
+      <w:r>
+        <w:t xml:space="preserve"> </w:t>
+      </w:r>
+      <w:r>
+        <w:t xml:space="preserve">its labels, which differs between systems. Numbers keep the exact label for only 69% of DocETL’s rows, against 96% in</w:t>
+      </w:r>
+      <w:r>
+        <w:t xml:space="preserve"> </w:t>
+      </w:r>
+      <w:r>
+        <w:t xml:space="preserve">ours, because a quarter of its numbers come back in another form, so</w:t>
+      </w:r>
+      <w:r>
+        <w:t xml:space="preserve"> </w:t>
+      </w:r>
+      <w:r>
+        <w:t xml:space="preserve">“</w:t>
+      </w:r>
+      <w:r>
+        <w:t xml:space="preserve">numbers are safe to group by</w:t>
+      </w:r>
+      <w:r>
+        <w:t xml:space="preserve">”</w:t>
+      </w:r>
+      <w:r>
+        <w:t xml:space="preserve"> </w:t>
+      </w:r>
+      <w:r>
+        <w:t xml:space="preserve">depends on the</w:t>
+      </w:r>
+      <w:r>
+        <w:t xml:space="preserve"> </w:t>
+      </w:r>
+      <w:r>
+        <w:t xml:space="preserve">system writing numbers in one form. And DocETL’s AVG and SUM queries are below their corpus mean on four corpora, where</w:t>
+      </w:r>
+      <w:r>
+        <w:t xml:space="preserve"> </w:t>
+      </w:r>
+      <w:r>
+        <w:t xml:space="preserve">ours are not; our explanation that errors cancel in sums and averages assumes that every row is read, and DocETL reads</w:t>
+      </w:r>
+      <w:r>
+        <w:t xml:space="preserve"> </w:t>
+      </w:r>
+      <w:r>
+        <w:t xml:space="preserve">only the documents each query’s own filters keep, so rows go missing rather than errors cancelling.</w:t>
+      </w:r>
+    </w:p>
+    <w:p>
+      <w:pPr>
+        <w:pStyle w:val="BodyText"/>
+      </w:pPr>
+      <w:r>
+        <w:rPr>
+          <w:i/>
+        </w:rPr>
+        <w:t xml:space="preserve">What this lets you decide.</w:t>
+      </w:r>
+      <w:r>
+        <w:t xml:space="preserve"> </w:t>
+      </w:r>
+      <w:r>
+        <w:t xml:space="preserve">Disagreement between two cheap prompts can be used to judge columns for a different</w:t>
+      </w:r>
+      <w:r>
+        <w:t xml:space="preserve"> </w:t>
+      </w:r>
+      <w:r>
+        <w:t xml:space="preserve">system than the one that produced the prompts, at least for numbers, lists and free text. Which queries to distrust (a</w:t>
+      </w:r>
+      <w:r>
+        <w:t xml:space="preserve"> </w:t>
+      </w:r>
+      <w:r>
+        <w:t xml:space="preserve">list in the GROUP BY, a MAX) carries over too. Statements that depend on how a system writes values or which documents</w:t>
+      </w:r>
+      <w:r>
+        <w:t xml:space="preserve"> </w:t>
+      </w:r>
+      <w:r>
+        <w:t xml:space="preserve">it reads, such as the safety of numbers and of averages, have to be checked per system.</w:t>
       </w:r>
     </w:p>
     <w:p>
@@ -3224,11 +3298,149 @@
       <w:pPr>
         <w:pStyle w:val="Heading1"/>
       </w:pPr>
-      <w:bookmarkStart w:id="41" w:name="what-carries-over-to-other-problems"/>
+      <w:bookmarkStart w:id="41" w:name="why-does-telling-the-model-what-a-column-means-matter-so-much"/>
+      <w:r>
+        <w:t xml:space="preserve">Why does telling the model what a column means matter so much?</w:t>
+      </w:r>
+      <w:bookmarkEnd w:id="41"/>
+    </w:p>
+    <w:p>
+      <w:pPr>
+        <w:pStyle w:val="FirstParagraph"/>
+      </w:pPr>
+      <w:r>
+        <w:t xml:space="preserve">This one is expected and not new: UDA-Bench already evaluated DocETL with field descriptions in its prompts. We include</w:t>
+      </w:r>
+      <w:r>
+        <w:t xml:space="preserve"> </w:t>
+      </w:r>
+      <w:r>
+        <w:t xml:space="preserve">it because its size puts the other effects in perspective. Given only a column name, the model often does not know</w:t>
+      </w:r>
+      <w:r>
+        <w:t xml:space="preserve"> </w:t>
+      </w:r>
+      <w:r>
+        <w:t xml:space="preserve">what to write, whether that is a count, a list of years, or a date in a particular format, so it leaves the cell empty</w:t>
+      </w:r>
+      <w:r>
+        <w:t xml:space="preserve"> </w:t>
+      </w:r>
+      <w:r>
+        <w:t xml:space="preserve">or writes the value in another form. Without descriptions in the on-demand prompts, a count of FIBA World Cup</w:t>
+      </w:r>
+      <w:r>
+        <w:t xml:space="preserve"> </w:t>
+      </w:r>
+      <w:r>
+        <w:t xml:space="preserve">appearances falls from 0.86 to 0.01 correct, an artist’s award count from 0.74 to 0.06, and birth dates from 0.38 to</w:t>
+      </w:r>
+      <w:r>
+        <w:t xml:space="preserve"> </w:t>
+      </w:r>
+      <w:r>
+        <w:t xml:space="preserve">0.00. Adding the benchmark’s descriptions to a single extraction pass raised its score from 0.234 to 0.560, larger than</w:t>
+      </w:r>
+      <w:r>
+        <w:t xml:space="preserve"> </w:t>
+      </w:r>
+      <w:r>
+        <w:t xml:space="preserve">any scheduling or budget effect we measured.</w:t>
+      </w:r>
+    </w:p>
+    <w:p>
+      <w:pPr>
+        <w:pStyle w:val="CaptionedFigure"/>
+      </w:pPr>
+      <w:r>
+        <w:drawing>
+          <wp:inline>
+            <wp:extent cx="5334000" cy="2189747"/>
+            <wp:effectExtent b="0" l="0" r="0" t="0"/>
+            <wp:docPr descr="Figure 12. Share of cells correct with and without field descriptions." title="" id="1" name="Picture"/>
+            <a:graphic>
+              <a:graphicData uri="http://schemas.openxmlformats.org/drawingml/2006/picture">
+                <pic:pic>
+                  <pic:nvPicPr>
+                    <pic:cNvPr descr="figures/w6_specification.png" id="0" name="Picture"/>
+                    <pic:cNvPicPr>
+                      <a:picLocks noChangeArrowheads="1" noChangeAspect="1"/>
+                    </pic:cNvPicPr>
+                  </pic:nvPicPr>
+                  <pic:blipFill>
+                    <a:blip r:embed="rId42"/>
+                    <a:stretch>
+                      <a:fillRect/>
+                    </a:stretch>
+                  </pic:blipFill>
+                  <pic:spPr bwMode="auto">
+                    <a:xfrm>
+                      <a:off x="0" y="0"/>
+                      <a:ext cx="5334000" cy="2189747"/>
+                    </a:xfrm>
+                    <a:prstGeom prst="rect">
+                      <a:avLst/>
+                    </a:prstGeom>
+                    <a:noFill/>
+                    <a:ln w="9525">
+                      <a:noFill/>
+                      <a:headEnd/>
+                      <a:tailEnd/>
+                    </a:ln>
+                  </pic:spPr>
+                </pic:pic>
+              </a:graphicData>
+            </a:graphic>
+          </wp:inline>
+        </w:drawing>
+      </w:r>
+    </w:p>
+    <w:p>
+      <w:pPr>
+        <w:pStyle w:val="ImageCaption"/>
+      </w:pPr>
+      <w:r>
+        <w:t xml:space="preserve">Figure 12. Share of cells correct with and without field descriptions.</w:t>
+      </w:r>
+    </w:p>
+    <w:p>
+      <w:pPr>
+        <w:pStyle w:val="BodyText"/>
+      </w:pPr>
+      <w:r>
+        <w:rPr>
+          <w:i/>
+        </w:rPr>
+        <w:t xml:space="preserve">What this lets you decide.</w:t>
+      </w:r>
+      <w:r>
+        <w:t xml:space="preserve"> </w:t>
+      </w:r>
+      <w:r>
+        <w:t xml:space="preserve">Describing each column (its unit, its format, what to write when the document is silent)</w:t>
+      </w:r>
+      <w:r>
+        <w:t xml:space="preserve"> </w:t>
+      </w:r>
+      <w:r>
+        <w:t xml:space="preserve">comes before any scheduling or budgeting decision. The columns that need it most are the ones flagged by disagreement</w:t>
+      </w:r>
+      <w:r>
+        <w:t xml:space="preserve"> </w:t>
+      </w:r>
+      <w:r>
+        <w:t xml:space="preserve">between prompts, and categories whose labels the model draws differently from the data.</w:t>
+      </w:r>
+    </w:p>
+    <w:p>
+      <w:pPr>
+        <w:pStyle w:val="Heading1"/>
+      </w:pPr>
+      <w:bookmarkStart w:id="43" w:name="what-carries-over-to-other-problems"/>
       <w:r>
         <w:t xml:space="preserve">What carries over to other problems</w:t>
       </w:r>
-      <w:bookmarkEnd w:id="41"/>
+      <w:bookmarkEnd w:id="43"/>
     </w:p>
     <w:p>
       <w:pPr>
@@ -3370,13 +3582,13 @@
         <w:t xml:space="preserve"> </w:t>
       </w:r>
       <w:r>
-        <w:t xml:space="preserve">not mean correctness. This is the one transfer we tested directly; the others in this section are arguments by</w:t>
-      </w:r>
-      <w:r>
-        <w:t xml:space="preserve"> </w:t>
-      </w:r>
-      <w:r>
-        <w:t xml:space="preserve">analogy.</w:t>
+        <w:t xml:space="preserve">not mean correctness. This, and the aggregate and label patterns below, are the transfers we tested directly on</w:t>
+      </w:r>
+      <w:r>
+        <w:t xml:space="preserve"> </w:t>
+      </w:r>
+      <w:r>
+        <w:t xml:space="preserve">DocETL; the others in this section are arguments by analogy.</w:t>
       </w:r>
     </w:p>
     <w:p>
@@ -3457,30 +3669,24 @@
         <w:t xml:space="preserve"> </w:t>
       </w:r>
       <w:r>
-        <w:t xml:space="preserve">The largest effect in the study came from describing each column. For an LLM reader, schema</w:t>
-      </w:r>
-      <w:r>
-        <w:t xml:space="preserve"> </w:t>
-      </w:r>
-      <w:r>
-        <w:t xml:space="preserve">documentation is not optional metadata but the main input that decides accuracy, which argues for treating column</w:t>
-      </w:r>
-      <w:r>
-        <w:t xml:space="preserve"> </w:t>
-      </w:r>
-      <w:r>
-        <w:t xml:space="preserve">descriptions as part of the schema in any system that extracts structured data with a model.</w:t>
+        <w:t xml:space="preserve">Describing each column had the largest effect in the study, which UDA-Bench had already shown for</w:t>
+      </w:r>
+      <w:r>
+        <w:t xml:space="preserve"> </w:t>
+      </w:r>
+      <w:r>
+        <w:t xml:space="preserve">DocETL. For an LLM reader, schema documentation is not optional metadata but an input that decides accuracy.</w:t>
       </w:r>
     </w:p>
     <w:p>
       <w:pPr>
         <w:pStyle w:val="Heading1"/>
       </w:pPr>
-      <w:bookmarkStart w:id="42" w:name="open-questions"/>
+      <w:bookmarkStart w:id="44" w:name="open-questions"/>
       <w:r>
         <w:t xml:space="preserve">Open questions</w:t>
       </w:r>
-      <w:bookmarkEnd w:id="42"/>
+      <w:bookmarkEnd w:id="44"/>
     </w:p>
     <w:p>
       <w:pPr>
@@ -3517,18 +3723,24 @@
         <w:t xml:space="preserve"> </w:t>
       </w:r>
       <w:r>
-        <w:t xml:space="preserve">Of the transfers to other areas, only the one about agreement has been tested outside our system, on DocETL.</w:t>
+        <w:t xml:space="preserve">The explanations have been tested as predictions of DocETL’s failures, but not yet as changes to DocETL: whether</w:t>
+      </w:r>
+      <w:r>
+        <w:t xml:space="preserve"> </w:t>
+      </w:r>
+      <w:r>
+        <w:t xml:space="preserve">sharing one prompt per column, extracting join keys once, or batching upcoming columns improves DocETL needs new runs.</w:t>
       </w:r>
     </w:p>
     <w:p>
       <w:pPr>
         <w:pStyle w:val="Heading1"/>
       </w:pPr>
-      <w:bookmarkStart w:id="43" w:name="methods"/>
+      <w:bookmarkStart w:id="45" w:name="methods"/>
       <w:r>
         <w:t xml:space="preserve">Methods</w:t>
       </w:r>
-      <w:bookmarkEnd w:id="43"/>
+      <w:bookmarkEnd w:id="45"/>
     </w:p>
     <w:p>
       <w:pPr>
@@ -3625,7 +3837,7 @@
         <w:t xml:space="preserve"> </w:t>
       </w:r>
       <w:r>
-        <w:t xml:space="preserve">served value with the build’s value and with gold. The DocETL comparison pools every non-empty value DocETL produced</w:t>
+        <w:t xml:space="preserve">served value with the build’s value and with gold. The DocETL comparisons pool every non-empty value DocETL produced</w:t>
       </w:r>
       <w:r>
         <w:t xml:space="preserve"> </w:t>
@@ -3655,18 +3867,30 @@
         <w:t xml:space="preserve"> </w:t>
       </w:r>
       <w:r>
-        <w:t xml:space="preserve">of GROUP BY column.</w:t>
+        <w:t xml:space="preserve">of GROUP BY column. For DocETL, the same label, aggregate and within-corpus analyses run on its per-query</w:t>
+      </w:r>
+      <w:r>
+        <w:t xml:space="preserve"> </w:t>
+      </w:r>
+      <w:r>
+        <w:t xml:space="preserve">outputs and scores for the queries in the current catalogue; labels are compared on non-empty rows, because DocETL fills</w:t>
+      </w:r>
+      <w:r>
+        <w:t xml:space="preserve"> </w:t>
+      </w:r>
+      <w:r>
+        <w:t xml:space="preserve">a column only for the documents a query’s filters keep. Label comparisons treat numbers as numbers in both systems.</w:t>
       </w:r>
     </w:p>
     <w:p>
       <w:pPr>
         <w:pStyle w:val="Heading1"/>
       </w:pPr>
-      <w:bookmarkStart w:id="44" w:name="appendix-example-test-queries"/>
+      <w:bookmarkStart w:id="46" w:name="appendix-example-test-queries"/>
       <w:r>
         <w:t xml:space="preserve">Appendix: example test queries</w:t>
       </w:r>
-      <w:bookmarkEnd w:id="44"/>
+      <w:bookmarkEnd w:id="46"/>
     </w:p>
     <w:p>
       <w:pPr>
@@ -3680,11 +3904,11 @@
       <w:pPr>
         <w:pStyle w:val="Heading2"/>
       </w:pPr>
-      <w:bookmarkStart w:id="45" w:name="research-papers-59-test-queries"/>
+      <w:bookmarkStart w:id="47" w:name="research-papers-59-test-queries"/>
       <w:r>
         <w:t xml:space="preserve">Research papers (59 test queries)</w:t>
       </w:r>
-      <w:bookmarkEnd w:id="45"/>
+      <w:bookmarkEnd w:id="47"/>
     </w:p>
     <w:p>
       <w:pPr>
@@ -4646,11 +4870,11 @@
       <w:pPr>
         <w:pStyle w:val="Heading2"/>
       </w:pPr>
-      <w:bookmarkStart w:id="46" w:name="basketball-players-118-test-queries"/>
+      <w:bookmarkStart w:id="48" w:name="basketball-players-118-test-queries"/>
       <w:r>
         <w:t xml:space="preserve">Basketball players (118 test queries)</w:t>
       </w:r>
-      <w:bookmarkEnd w:id="46"/>
+      <w:bookmarkEnd w:id="48"/>
     </w:p>
     <w:p>
       <w:pPr>
@@ -5438,11 +5662,11 @@
       <w:pPr>
         <w:pStyle w:val="Heading2"/>
       </w:pPr>
-      <w:bookmarkStart w:id="47" w:name="artists-43-test-queries"/>
+      <w:bookmarkStart w:id="49" w:name="artists-43-test-queries"/>
       <w:r>
         <w:t xml:space="preserve">Artists (43 test queries)</w:t>
       </w:r>
-      <w:bookmarkEnd w:id="47"/>
+      <w:bookmarkEnd w:id="49"/>
     </w:p>
     <w:p>
       <w:pPr>
@@ -5930,11 +6154,11 @@
       <w:pPr>
         <w:pStyle w:val="Heading2"/>
       </w:pPr>
-      <w:bookmarkStart w:id="48" w:name="medical-43-test-queries"/>
+      <w:bookmarkStart w:id="50" w:name="medical-43-test-queries"/>
       <w:r>
         <w:t xml:space="preserve">Medical (43 test queries)</w:t>
       </w:r>
-      <w:bookmarkEnd w:id="48"/>
+      <w:bookmarkEnd w:id="50"/>
     </w:p>
     <w:p>
       <w:pPr>
@@ -6267,11 +6491,11 @@
       <w:pPr>
         <w:pStyle w:val="Heading2"/>
       </w:pPr>
-      <w:bookmarkStart w:id="49" w:name="court-judgments-27-test-queries"/>
+      <w:bookmarkStart w:id="51" w:name="court-judgments-27-test-queries"/>
       <w:r>
         <w:t xml:space="preserve">Court judgments (27 test queries)</w:t>
       </w:r>
-      <w:bookmarkEnd w:id="49"/>
+      <w:bookmarkEnd w:id="51"/>
     </w:p>
     <w:p>
       <w:pPr>
@@ -7159,7 +7383,7 @@
     </w:lvl>
   </w:abstractNum>
   <w:abstractNum w:abstractNumId="990">
-    <w:nsid w:val="5ed3b7ea"/>
+    <w:nsid w:val="23a6e593"/>
     <w:multiLevelType w:val="multilevel"/>
     <w:lvl w:ilvl="0">
       <w:numFmt w:val="bullet"/>

</xml_diff>

<commit_message>
Why document: the context intervention, second looks (two kinds of error), and frozen DocETL written into sections 1, 2 and the joins section; three new figures; methods and open questions updated
Co-Authored-By: Claude Fable 5.1 <noreply@anthropic.com>
</commit_message>
<xml_diff>
--- a/results/experiments/why/Key_findings_and_why.docx
+++ b/results/experiments/why/Key_findings_and_why.docx
@@ -417,6 +417,174 @@
         <w:pStyle w:val="BodyText"/>
       </w:pPr>
       <w:r>
+        <w:t xml:space="preserve">We then intervened directly. For every column the drifted workload needs and the build lacks, the same thirty sampled</w:t>
+      </w:r>
+      <w:r>
+        <w:t xml:space="preserve"> </w:t>
+      </w:r>
+      <w:r>
+        <w:t xml:space="preserve">documents were read in five contexts: the column alone, with two random columns of its table, with six, in the build’s</w:t>
+      </w:r>
+      <w:r>
+        <w:t xml:space="preserve"> </w:t>
+      </w:r>
+      <w:r>
+        <w:t xml:space="preserve">natural group, and alone with a paraphrased description (39 columns, 5,005 prompts).</w:t>
+      </w:r>
+      <w:r>
+        <w:t xml:space="preserve"> </w:t>
+      </w:r>
+      <w:r>
+        <w:rPr>
+          <w:b/>
+        </w:rPr>
+        <w:t xml:space="preserve">On average the context does not</w:t>
+      </w:r>
+      <w:r>
+        <w:rPr>
+          <w:b/>
+        </w:rPr>
+        <w:t xml:space="preserve"> </w:t>
+      </w:r>
+      <w:r>
+        <w:rPr>
+          <w:b/>
+        </w:rPr>
+        <w:t xml:space="preserve">move accuracy at all, 0.37 to 0.41 in every context, and the direction of its effect is the column’s own:</w:t>
+      </w:r>
+      <w:r>
+        <w:t xml:space="preserve"> </w:t>
+      </w:r>
+      <w:r>
+        <w:t xml:space="preserve">18 columns</w:t>
+      </w:r>
+      <w:r>
+        <w:t xml:space="preserve"> </w:t>
+      </w:r>
+      <w:r>
+        <w:t xml:space="preserve">are more accurate alone than in the group by 0.05 or more and 9 are less. How much a column’s value changes between</w:t>
+      </w:r>
+      <w:r>
+        <w:t xml:space="preserve"> </w:t>
+      </w:r>
+      <w:r>
+        <w:t xml:space="preserve">contexts is one property of the column: its sensitivity to adding two random columns, to adding six, to the natural</w:t>
+      </w:r>
+      <w:r>
+        <w:t xml:space="preserve"> </w:t>
+      </w:r>
+      <w:r>
+        <w:t xml:space="preserve">group and to a paraphrase rank the columns the same way (Spearman 0.82 to 0.93 between every pair), and so do the</w:t>
+      </w:r>
+      <w:r>
+        <w:t xml:space="preserve"> </w:t>
+      </w:r>
+      <w:r>
+        <w:t xml:space="preserve">changes we had already logged, removing the description, removing the workload-use phrase, regrouping, or cutting long</w:t>
+      </w:r>
+      <w:r>
+        <w:t xml:space="preserve"> </w:t>
+      </w:r>
+      <w:r>
+        <w:t xml:space="preserve">documents at the window (0.60 to 0.84 between kinds).</w:t>
+      </w:r>
+      <w:r>
+        <w:t xml:space="preserve"> </w:t>
+      </w:r>
+      <w:r>
+        <w:t xml:space="preserve">“</w:t>
+      </w:r>
+      <w:r>
+        <w:t xml:space="preserve">Ask for fewer columns at once</w:t>
+      </w:r>
+      <w:r>
+        <w:t xml:space="preserve">”</w:t>
+      </w:r>
+      <w:r>
+        <w:t xml:space="preserve"> </w:t>
+      </w:r>
+      <w:r>
+        <w:t xml:space="preserve">is therefore not a knob with a</w:t>
+      </w:r>
+      <w:r>
+        <w:t xml:space="preserve"> </w:t>
+      </w:r>
+      <w:r>
+        <w:t xml:space="preserve">direction; it is a per-column effect, and in Section 2 we show it is also the measure of how far the document</w:t>
+      </w:r>
+      <w:r>
+        <w:t xml:space="preserve"> </w:t>
+      </w:r>
+      <w:r>
+        <w:t xml:space="preserve">determines the value.</w:t>
+      </w:r>
+    </w:p>
+    <w:p>
+      <w:pPr>
+        <w:pStyle w:val="CaptionedFigure"/>
+      </w:pPr>
+      <w:r>
+        <w:drawing>
+          <wp:inline>
+            <wp:extent cx="5334000" cy="2032000"/>
+            <wp:effectExtent b="0" l="0" r="0" t="0"/>
+            <wp:docPr descr="Figure 2. The context intervention on fixed documents. (a) Mean accuracy and empty-answer rate in five contexts. (b) Each column’s accuracy alone against its accuracy in the build’s group." title="" id="1" name="Picture"/>
+            <a:graphic>
+              <a:graphicData uri="http://schemas.openxmlformats.org/drawingml/2006/picture">
+                <pic:pic>
+                  <pic:nvPicPr>
+                    <pic:cNvPr descr="figures/w9_context_intervention.png" id="0" name="Picture"/>
+                    <pic:cNvPicPr>
+                      <a:picLocks noChangeArrowheads="1" noChangeAspect="1"/>
+                    </pic:cNvPicPr>
+                  </pic:nvPicPr>
+                  <pic:blipFill>
+                    <a:blip r:embed="rId23"/>
+                    <a:stretch>
+                      <a:fillRect/>
+                    </a:stretch>
+                  </pic:blipFill>
+                  <pic:spPr bwMode="auto">
+                    <a:xfrm>
+                      <a:off x="0" y="0"/>
+                      <a:ext cx="5334000" cy="2032000"/>
+                    </a:xfrm>
+                    <a:prstGeom prst="rect">
+                      <a:avLst/>
+                    </a:prstGeom>
+                    <a:noFill/>
+                    <a:ln w="9525">
+                      <a:noFill/>
+                      <a:headEnd/>
+                      <a:tailEnd/>
+                    </a:ln>
+                  </pic:spPr>
+                </pic:pic>
+              </a:graphicData>
+            </a:graphic>
+          </wp:inline>
+        </w:drawing>
+      </w:r>
+    </w:p>
+    <w:p>
+      <w:pPr>
+        <w:pStyle w:val="ImageCaption"/>
+      </w:pPr>
+      <w:r>
+        <w:t xml:space="preserve">Figure 2. The context intervention on fixed documents. (a) Mean accuracy and empty-answer rate in five contexts. (b)</w:t>
+      </w:r>
+      <w:r>
+        <w:t xml:space="preserve"> </w:t>
+      </w:r>
+      <w:r>
+        <w:t xml:space="preserve">Each column’s accuracy alone against its accuracy in the build’s group.</w:t>
+      </w:r>
+    </w:p>
+    <w:p>
+      <w:pPr>
+        <w:pStyle w:val="BodyText"/>
+      </w:pPr>
+      <w:r>
         <w:rPr>
           <w:i/>
         </w:rPr>
@@ -463,11 +631,11 @@
       <w:pPr>
         <w:pStyle w:val="Heading1"/>
       </w:pPr>
-      <w:bookmarkStart w:id="23" w:name="why-can-a-columns-accuracy-be-predicted-without-any-gold-data"/>
+      <w:bookmarkStart w:id="24" w:name="why-can-a-columns-accuracy-be-predicted-without-any-gold-data"/>
       <w:r>
         <w:t xml:space="preserve">Why can a column’s accuracy be predicted without any gold data?</w:t>
       </w:r>
-      <w:bookmarkEnd w:id="23"/>
+      <w:bookmarkEnd w:id="24"/>
     </w:p>
     <w:p>
       <w:pPr>
@@ -578,7 +746,7 @@
           <wp:inline>
             <wp:extent cx="5334000" cy="2582778"/>
             <wp:effectExtent b="0" l="0" r="0" t="0"/>
-            <wp:docPr descr="Figure 2. Disagreement between two prompts against accuracy, one point per column." title="" id="1" name="Picture"/>
+            <wp:docPr descr="Figure 3. Disagreement between two prompts against accuracy, one point per column." title="" id="1" name="Picture"/>
             <a:graphic>
               <a:graphicData uri="http://schemas.openxmlformats.org/drawingml/2006/picture">
                 <pic:pic>
@@ -589,7 +757,7 @@
                     </pic:cNvPicPr>
                   </pic:nvPicPr>
                   <pic:blipFill>
-                    <a:blip r:embed="rId24"/>
+                    <a:blip r:embed="rId25"/>
                     <a:stretch>
                       <a:fillRect/>
                     </a:stretch>
@@ -621,7 +789,7 @@
         <w:pStyle w:val="ImageCaption"/>
       </w:pPr>
       <w:r>
-        <w:t xml:space="preserve">Figure 2. Disagreement between two prompts against accuracy, one point per column.</w:t>
+        <w:t xml:space="preserve">Figure 3. Disagreement between two prompts against accuracy, one point per column.</w:t>
       </w:r>
     </w:p>
     <w:p>
@@ -629,13 +797,19 @@
         <w:pStyle w:val="BodyText"/>
       </w:pPr>
       <w:r>
-        <w:t xml:space="preserve">The signal also works cell by cell. Where the two prompts disagree, the served value is wrong 79% of the time; where</w:t>
-      </w:r>
-      <w:r>
-        <w:t xml:space="preserve"> </w:t>
-      </w:r>
-      <w:r>
-        <w:t xml:space="preserve">they agree, 44%. The disagreeing cells are 36% of all cells and hold half of all wrong cells. Checking columns in order</w:t>
+        <w:t xml:space="preserve">The signal is cheap: estimated from ten sampled documents per column it ranks the columns almost as well as the full</w:t>
+      </w:r>
+      <w:r>
+        <w:t xml:space="preserve"> </w:t>
+      </w:r>
+      <w:r>
+        <w:t xml:space="preserve">corpus does (Spearman −0.66 against −0.72; five documents give −0.62). The signal also works cell by cell. Where the two</w:t>
+      </w:r>
+      <w:r>
+        <w:t xml:space="preserve"> </w:t>
+      </w:r>
+      <w:r>
+        <w:t xml:space="preserve">prompts disagree, the served value is wrong 79% of the time; where they agree, 44%. The disagreeing cells are 36% of all cells and hold half of all wrong cells. Checking columns in order</w:t>
       </w:r>
       <w:r>
         <w:t xml:space="preserve"> </w:t>
@@ -757,7 +931,7 @@
           <wp:inline>
             <wp:extent cx="5334000" cy="2032000"/>
             <wp:effectExtent b="0" l="0" r="0" t="0"/>
-            <wp:docPr descr="Figure 3. (a) Share of wrong cells where our two prompts agree or disagree, by kind of column. (b) Our two-prompt disagreement on a column against DocETL’s accuracy on the same column." title="" id="1" name="Picture"/>
+            <wp:docPr descr="Figure 4. (a) Share of wrong cells where our two prompts agree or disagree, by kind of column. (b) Our two-prompt disagreement on a column against DocETL’s accuracy on the same column." title="" id="1" name="Picture"/>
             <a:graphic>
               <a:graphicData uri="http://schemas.openxmlformats.org/drawingml/2006/picture">
                 <pic:pic>
@@ -768,7 +942,7 @@
                     </pic:cNvPicPr>
                   </pic:nvPicPr>
                   <pic:blipFill>
-                    <a:blip r:embed="rId25"/>
+                    <a:blip r:embed="rId26"/>
                     <a:stretch>
                       <a:fillRect/>
                     </a:stretch>
@@ -800,7 +974,7 @@
         <w:pStyle w:val="ImageCaption"/>
       </w:pPr>
       <w:r>
-        <w:t xml:space="preserve">Figure 3. (a) Share of wrong cells where our two prompts agree or disagree, by kind of column. (b) Our two-prompt</w:t>
+        <w:t xml:space="preserve">Figure 4. (a) Share of wrong cells where our two prompts agree or disagree, by kind of column. (b) Our two-prompt</w:t>
       </w:r>
       <w:r>
         <w:t xml:space="preserve"> </w:t>
@@ -847,44 +1021,230 @@
       </w:pPr>
       <w:r>
         <w:rPr>
+          <w:b/>
+        </w:rPr>
+        <w:t xml:space="preserve">A sensitive cell is one the document under-determines, and a stronger reader cannot determine it either.</w:t>
+      </w:r>
+      <w:r>
+        <w:t xml:space="preserve"> </w:t>
+      </w:r>
+      <w:r>
+        <w:t xml:space="preserve">We gave</w:t>
+      </w:r>
+      <w:r>
+        <w:t xml:space="preserve"> </w:t>
+      </w:r>
+      <w:r>
+        <w:t xml:space="preserve">a 32B model a second look at 1,719 cells the 7B had served, the column asked alone, and allocated a budget of 600 looks</w:t>
+      </w:r>
+      <w:r>
+        <w:t xml:space="preserve"> </w:t>
+      </w:r>
+      <w:r>
+        <w:t xml:space="preserve">three ways. Spending them on the most sensitive columns first fixed a net 110 errors per thousand looks; spreading them</w:t>
+      </w:r>
+      <w:r>
+        <w:t xml:space="preserve"> </w:t>
+      </w:r>
+      <w:r>
+        <w:t xml:space="preserve">evenly, 48; at random, 148. Sensitivity does not tell where a second look pays, in either direction (the 600 least</w:t>
+      </w:r>
+      <w:r>
+        <w:t xml:space="preserve"> </w:t>
+      </w:r>
+      <w:r>
+        <w:t xml:space="preserve">sensitive cells, chosen with hindsight, give 132). What it predicts is the 32B’s own accuracy on the column (−0.67,</w:t>
+      </w:r>
+      <w:r>
+        <w:t xml:space="preserve"> </w:t>
+      </w:r>
+      <w:r>
+        <w:t xml:space="preserve">as it predicts the 7B’s, Llama’s and DocETL’s): in the most sensitive band the 7B is right on 14% of cells and the 32B</w:t>
+      </w:r>
+      <w:r>
+        <w:t xml:space="preserve"> </w:t>
+      </w:r>
+      <w:r>
+        <w:t xml:space="preserve">on 24%; in the least sensitive band 59% and 80%. The cells a stronger reader repairs are determined ones the weaker</w:t>
+      </w:r>
+      <w:r>
+        <w:t xml:space="preserve"> </w:t>
+      </w:r>
+      <w:r>
+        <w:t xml:space="preserve">reader misread, which sit in low-sensitivity columns with poor accuracy, such as dates written in another format</w:t>
+      </w:r>
+      <w:r>
+        <w:t xml:space="preserve"> </w:t>
+      </w:r>
+      <w:r>
+        <w:t xml:space="preserve">(an artist’s death date: sensitivity 0.06, 84% of the 7B’s errors fixed; birth date 0.12 and 73%). So there are two</w:t>
+      </w:r>
+      <w:r>
+        <w:t xml:space="preserve"> </w:t>
+      </w:r>
+      <w:r>
+        <w:t xml:space="preserve">kinds of error.</w:t>
+      </w:r>
+      <w:r>
+        <w:t xml:space="preserve"> </w:t>
+      </w:r>
+      <w:r>
+        <w:rPr>
           <w:i/>
         </w:rPr>
+        <w:t xml:space="preserve">Under-determination</w:t>
+      </w:r>
+      <w:r>
+        <w:t xml:space="preserve"> </w:t>
+      </w:r>
+      <w:r>
+        <w:t xml:space="preserve">shows as disagreement and is not repaired by asking again, whatever the model;</w:t>
+      </w:r>
+      <w:r>
+        <w:t xml:space="preserve"> </w:t>
+      </w:r>
+      <w:r>
+        <w:rPr>
+          <w:i/>
+        </w:rPr>
+        <w:t xml:space="preserve">misreading</w:t>
+      </w:r>
+      <w:r>
+        <w:t xml:space="preserve"> </w:t>
+      </w:r>
+      <w:r>
+        <w:t xml:space="preserve">shows as agreement on a wrong value and is repaired by a different reader when the bias was the reader’s.</w:t>
+      </w:r>
+      <w:r>
+        <w:t xml:space="preserve"> </w:t>
+      </w:r>
+      <w:r>
+        <w:t xml:space="preserve">The category exception above is the same distinction: a shared label vocabulary is a bias no reader repairs. (On the</w:t>
+      </w:r>
+      <w:r>
+        <w:t xml:space="preserve"> </w:t>
+      </w:r>
+      <w:r>
+        <w:t xml:space="preserve">intervention’s own sample, which has only two choice-list columns, disagreement did predict error on categories too,</w:t>
+      </w:r>
+      <w:r>
+        <w:t xml:space="preserve"> </w:t>
+      </w:r>
+      <w:r>
+        <w:t xml:space="preserve">52% right when agreeing against 14% when not; the exception rests on the 41 logged columns.)</w:t>
+      </w:r>
+    </w:p>
+    <w:p>
+      <w:pPr>
+        <w:pStyle w:val="CaptionedFigure"/>
+      </w:pPr>
+      <w:r>
+        <w:drawing>
+          <wp:inline>
+            <wp:extent cx="5334000" cy="1981200"/>
+            <wp:effectExtent b="0" l="0" r="0" t="0"/>
+            <wp:docPr descr="Figure 5. Second looks by the 32B. (a) Accuracy of the served 7B value and of the 32B’s answer, by the column’s sensitivity. (b) Net errors fixed per thousand second looks under four allocations." title="" id="1" name="Picture"/>
+            <a:graphic>
+              <a:graphicData uri="http://schemas.openxmlformats.org/drawingml/2006/picture">
+                <pic:pic>
+                  <pic:nvPicPr>
+                    <pic:cNvPr descr="figures/w10_second_looks.png" id="0" name="Picture"/>
+                    <pic:cNvPicPr>
+                      <a:picLocks noChangeArrowheads="1" noChangeAspect="1"/>
+                    </pic:cNvPicPr>
+                  </pic:nvPicPr>
+                  <pic:blipFill>
+                    <a:blip r:embed="rId27"/>
+                    <a:stretch>
+                      <a:fillRect/>
+                    </a:stretch>
+                  </pic:blipFill>
+                  <pic:spPr bwMode="auto">
+                    <a:xfrm>
+                      <a:off x="0" y="0"/>
+                      <a:ext cx="5334000" cy="1981200"/>
+                    </a:xfrm>
+                    <a:prstGeom prst="rect">
+                      <a:avLst/>
+                    </a:prstGeom>
+                    <a:noFill/>
+                    <a:ln w="9525">
+                      <a:noFill/>
+                      <a:headEnd/>
+                      <a:tailEnd/>
+                    </a:ln>
+                  </pic:spPr>
+                </pic:pic>
+              </a:graphicData>
+            </a:graphic>
+          </wp:inline>
+        </w:drawing>
+      </w:r>
+    </w:p>
+    <w:p>
+      <w:pPr>
+        <w:pStyle w:val="ImageCaption"/>
+      </w:pPr>
+      <w:r>
+        <w:t xml:space="preserve">Figure 5. Second looks by the 32B. (a) Accuracy of the served 7B value and of the 32B’s answer, by the column’s</w:t>
+      </w:r>
+      <w:r>
+        <w:t xml:space="preserve"> </w:t>
+      </w:r>
+      <w:r>
+        <w:t xml:space="preserve">sensitivity. (b) Net errors fixed per thousand second looks under four allocations.</w:t>
+      </w:r>
+    </w:p>
+    <w:p>
+      <w:pPr>
+        <w:pStyle w:val="BodyText"/>
+      </w:pPr>
+      <w:r>
+        <w:rPr>
+          <w:i/>
+        </w:rPr>
         <w:t xml:space="preserve">What this lets you decide.</w:t>
       </w:r>
       <w:r>
         <w:t xml:space="preserve"> </w:t>
       </w:r>
       <w:r>
-        <w:t xml:space="preserve">Before any gold data exists, asking a column twice with two cheap prompts tells you which</w:t>
-      </w:r>
-      <w:r>
-        <w:t xml:space="preserve"> </w:t>
-      </w:r>
-      <w:r>
-        <w:t xml:space="preserve">columns to trust, which need a better description, and where to spend a human check or a larger model. For numbers,</w:t>
-      </w:r>
-      <w:r>
-        <w:t xml:space="preserve"> </w:t>
-      </w:r>
-      <w:r>
-        <w:t xml:space="preserve">yes/no answers, lists and free text, a disagreeing cell is a likely error. For categories, agreement is not evidence of</w:t>
-      </w:r>
-      <w:r>
-        <w:t xml:space="preserve"> </w:t>
-      </w:r>
-      <w:r>
-        <w:t xml:space="preserve">correctness, and the category definitions themselves need checking.</w:t>
+        <w:t xml:space="preserve">Before any gold data exists, asking a column twice with two cheap prompts on ten or so</w:t>
+      </w:r>
+      <w:r>
+        <w:t xml:space="preserve"> </w:t>
+      </w:r>
+      <w:r>
+        <w:t xml:space="preserve">documents tells you which columns the documents determine. Where they do not, re-asking is wasted, whatever the</w:t>
+      </w:r>
+      <w:r>
+        <w:t xml:space="preserve"> </w:t>
+      </w:r>
+      <w:r>
+        <w:t xml:space="preserve">model: change the specification, narrow the vocabulary, or ask a person. Where they do and the column is still wrong,</w:t>
+      </w:r>
+      <w:r>
+        <w:t xml:space="preserve"> </w:t>
+      </w:r>
+      <w:r>
+        <w:t xml:space="preserve">a different reader is the repair. For categories, agreement is not evidence of correctness, and the category</w:t>
+      </w:r>
+      <w:r>
+        <w:t xml:space="preserve"> </w:t>
+      </w:r>
+      <w:r>
+        <w:t xml:space="preserve">definitions themselves need checking.</w:t>
       </w:r>
     </w:p>
     <w:p>
       <w:pPr>
         <w:pStyle w:val="Heading1"/>
       </w:pPr>
-      <w:bookmarkStart w:id="26" w:name="why-do-aggregate-queries-over-extracted-values-lose-their-groups"/>
+      <w:bookmarkStart w:id="28" w:name="why-do-aggregate-queries-over-extracted-values-lose-their-groups"/>
       <w:r>
         <w:t xml:space="preserve">Why do aggregate queries over extracted values lose their groups?</w:t>
       </w:r>
-      <w:bookmarkEnd w:id="26"/>
+      <w:bookmarkEnd w:id="28"/>
     </w:p>
     <w:p>
       <w:pPr>
@@ -989,7 +1349,7 @@
           <wp:inline>
             <wp:extent cx="5334000" cy="1745672"/>
             <wp:effectExtent b="0" l="0" r="0" t="0"/>
-            <wp:docPr descr="Figure 4. (a) Distinct values in the extracted GROUP BY column relative to gold. (b) Share of queries returning too few groups, by the number of groups in the gold answer." title="" id="1" name="Picture"/>
+            <wp:docPr descr="Figure 6. (a) Distinct values in the extracted GROUP BY column relative to gold. (b) Share of queries returning too few groups, by the number of groups in the gold answer." title="" id="1" name="Picture"/>
             <a:graphic>
               <a:graphicData uri="http://schemas.openxmlformats.org/drawingml/2006/picture">
                 <pic:pic>
@@ -1000,7 +1360,7 @@
                     </pic:cNvPicPr>
                   </pic:nvPicPr>
                   <pic:blipFill>
-                    <a:blip r:embed="rId27"/>
+                    <a:blip r:embed="rId29"/>
                     <a:stretch>
                       <a:fillRect/>
                     </a:stretch>
@@ -1032,7 +1392,7 @@
         <w:pStyle w:val="ImageCaption"/>
       </w:pPr>
       <w:r>
-        <w:t xml:space="preserve">Figure 4. (a) Distinct values in the extracted GROUP BY column relative to gold. (b) Share of queries returning too</w:t>
+        <w:t xml:space="preserve">Figure 6. (a) Distinct values in the extracted GROUP BY column relative to gold. (b) Share of queries returning too</w:t>
       </w:r>
       <w:r>
         <w:t xml:space="preserve"> </w:t>
@@ -1273,7 +1633,7 @@
           <wp:inline>
             <wp:extent cx="5334000" cy="3031957"/>
             <wp:effectExtent b="0" l="0" r="0" t="0"/>
-            <wp:docPr descr="Figure 5. Where each gold row of a GROUP BY column ends up in the extracted table, by kind of column (a) and by corpus (b), at 100% drift." title="" id="1" name="Picture"/>
+            <wp:docPr descr="Figure 7. Where each gold row of a GROUP BY column ends up in the extracted table, by kind of column (a) and by corpus (b), at 100% drift." title="" id="1" name="Picture"/>
             <a:graphic>
               <a:graphicData uri="http://schemas.openxmlformats.org/drawingml/2006/picture">
                 <pic:pic>
@@ -1284,7 +1644,7 @@
                     </pic:cNvPicPr>
                   </pic:nvPicPr>
                   <pic:blipFill>
-                    <a:blip r:embed="rId28"/>
+                    <a:blip r:embed="rId30"/>
                     <a:stretch>
                       <a:fillRect/>
                     </a:stretch>
@@ -1316,7 +1676,7 @@
         <w:pStyle w:val="ImageCaption"/>
       </w:pPr>
       <w:r>
-        <w:t xml:space="preserve">Figure 5. Where each gold row of a GROUP BY column ends up in the extracted table, by kind of column (a) and by</w:t>
+        <w:t xml:space="preserve">Figure 7. Where each gold row of a GROUP BY column ends up in the extracted table, by kind of column (a) and by</w:t>
       </w:r>
       <w:r>
         <w:t xml:space="preserve"> </w:t>
@@ -1378,7 +1738,7 @@
           <wp:inline>
             <wp:extent cx="5334000" cy="1891145"/>
             <wp:effectExtent b="0" l="0" r="0" t="0"/>
-            <wp:docPr descr="Figure 6. Mean score by aggregate across drift levels, with on-demand extraction (a) and the static build (b)." title="" id="1" name="Picture"/>
+            <wp:docPr descr="Figure 8. Mean score by aggregate across drift levels, with on-demand extraction (a) and the static build (b)." title="" id="1" name="Picture"/>
             <a:graphic>
               <a:graphicData uri="http://schemas.openxmlformats.org/drawingml/2006/picture">
                 <pic:pic>
@@ -1389,7 +1749,7 @@
                     </pic:cNvPicPr>
                   </pic:nvPicPr>
                   <pic:blipFill>
-                    <a:blip r:embed="rId29"/>
+                    <a:blip r:embed="rId31"/>
                     <a:stretch>
                       <a:fillRect/>
                     </a:stretch>
@@ -1421,7 +1781,7 @@
         <w:pStyle w:val="ImageCaption"/>
       </w:pPr>
       <w:r>
-        <w:t xml:space="preserve">Figure 6. Mean score by aggregate across drift levels, with on-demand extraction (a) and the static build</w:t>
+        <w:t xml:space="preserve">Figure 8. Mean score by aggregate across drift levels, with on-demand extraction (a) and the static build</w:t>
       </w:r>
       <w:r>
         <w:t xml:space="preserve"> </w:t>
@@ -1439,7 +1799,7 @@
           <wp:inline>
             <wp:extent cx="5334000" cy="1909010"/>
             <wp:effectExtent b="0" l="0" r="0" t="0"/>
-            <wp:docPr descr="Figure 7. Aggregate values in matched groups at 100% drift: too low, within 20% of gold, or too high." title="" id="1" name="Picture"/>
+            <wp:docPr descr="Figure 9. Aggregate values in matched groups at 100% drift: too low, within 20% of gold, or too high." title="" id="1" name="Picture"/>
             <a:graphic>
               <a:graphicData uri="http://schemas.openxmlformats.org/drawingml/2006/picture">
                 <pic:pic>
@@ -1450,7 +1810,7 @@
                     </pic:cNvPicPr>
                   </pic:nvPicPr>
                   <pic:blipFill>
-                    <a:blip r:embed="rId30"/>
+                    <a:blip r:embed="rId32"/>
                     <a:stretch>
                       <a:fillRect/>
                     </a:stretch>
@@ -1482,7 +1842,7 @@
         <w:pStyle w:val="ImageCaption"/>
       </w:pPr>
       <w:r>
-        <w:t xml:space="preserve">Figure 7. Aggregate values in matched groups at 100% drift: too low, within 20% of gold, or too</w:t>
+        <w:t xml:space="preserve">Figure 9. Aggregate values in matched groups at 100% drift: too low, within 20% of gold, or too</w:t>
       </w:r>
       <w:r>
         <w:t xml:space="preserve"> </w:t>
@@ -1675,11 +2035,11 @@
       <w:pPr>
         <w:pStyle w:val="Heading1"/>
       </w:pPr>
-      <w:bookmarkStart w:id="31" w:name="do-these-explanations-predict-where-another-system-fails"/>
+      <w:bookmarkStart w:id="33" w:name="do-these-explanations-predict-where-another-system-fails"/>
       <w:r>
         <w:t xml:space="preserve">Do these explanations predict where another system fails?</w:t>
       </w:r>
-      <w:bookmarkEnd w:id="31"/>
+      <w:bookmarkEnd w:id="33"/>
     </w:p>
     <w:p>
       <w:pPr>
@@ -1769,7 +2129,7 @@
           <wp:inline>
             <wp:extent cx="5334000" cy="1981200"/>
             <wp:effectExtent b="0" l="0" r="0" t="0"/>
-            <wp:docPr descr="Figure 8. (a) Share of DocETL’s values that are wrong, split by whether our two prompts agree on the cell. (b) Share of GROUP BY rows that keep the exact gold label, by kind of column, in our system and in DocETL (non-empty rows, numbers compared as numbers)." title="" id="1" name="Picture"/>
+            <wp:docPr descr="Figure 10. (a) Share of DocETL’s values that are wrong, split by whether our two prompts agree on the cell. (b) Share of GROUP BY rows that keep the exact gold label, by kind of column, in our system and in DocETL (non-empty rows, numbers compared as numbers)." title="" id="1" name="Picture"/>
             <a:graphic>
               <a:graphicData uri="http://schemas.openxmlformats.org/drawingml/2006/picture">
                 <pic:pic>
@@ -1780,7 +2140,7 @@
                     </pic:cNvPicPr>
                   </pic:nvPicPr>
                   <pic:blipFill>
-                    <a:blip r:embed="rId32"/>
+                    <a:blip r:embed="rId34"/>
                     <a:stretch>
                       <a:fillRect/>
                     </a:stretch>
@@ -1812,7 +2172,7 @@
         <w:pStyle w:val="ImageCaption"/>
       </w:pPr>
       <w:r>
-        <w:t xml:space="preserve">Figure 8. (a) Share of DocETL’s values that are wrong, split by whether our two prompts agree on the cell. (b) Share</w:t>
+        <w:t xml:space="preserve">Figure 10. (a) Share of DocETL’s values that are wrong, split by whether our two prompts agree on the cell. (b) Share</w:t>
       </w:r>
       <w:r>
         <w:t xml:space="preserve"> </w:t>
@@ -1943,11 +2303,11 @@
       <w:pPr>
         <w:pStyle w:val="Heading1"/>
       </w:pPr>
-      <w:bookmarkStart w:id="33" w:name="why-is-anticipating-a-column-cheap-and-when-is-it-worth-it"/>
+      <w:bookmarkStart w:id="35" w:name="why-is-anticipating-a-column-cheap-and-when-is-it-worth-it"/>
       <w:r>
         <w:t xml:space="preserve">Why is anticipating a column cheap, and when is it worth it?</w:t>
       </w:r>
-      <w:bookmarkEnd w:id="33"/>
+      <w:bookmarkEnd w:id="35"/>
     </w:p>
     <w:p>
       <w:pPr>
@@ -2380,7 +2740,7 @@
           <wp:inline>
             <wp:extent cx="5334000" cy="2085109"/>
             <wp:effectExtent b="0" l="0" r="0" t="0"/>
-            <wp:docPr descr="Figure 9. Left: composition of one extraction prompt at each corpus’s median document length. Right: predicted and measured break-even probability." title="" id="1" name="Picture"/>
+            <wp:docPr descr="Figure 11. Left: composition of one extraction prompt at each corpus’s median document length. Right: predicted and measured break-even probability." title="" id="1" name="Picture"/>
             <a:graphic>
               <a:graphicData uri="http://schemas.openxmlformats.org/drawingml/2006/picture">
                 <pic:pic>
@@ -2391,7 +2751,7 @@
                     </pic:cNvPicPr>
                   </pic:nvPicPr>
                   <pic:blipFill>
-                    <a:blip r:embed="rId34"/>
+                    <a:blip r:embed="rId36"/>
                     <a:stretch>
                       <a:fillRect/>
                     </a:stretch>
@@ -2423,7 +2783,7 @@
         <w:pStyle w:val="ImageCaption"/>
       </w:pPr>
       <w:r>
-        <w:t xml:space="preserve">Figure 9. Left: composition of one extraction prompt at each corpus’s median document length. Right: predicted and</w:t>
+        <w:t xml:space="preserve">Figure 11. Left: composition of one extraction prompt at each corpus’s median document length. Right: predicted and</w:t>
       </w:r>
       <w:r>
         <w:t xml:space="preserve"> </w:t>
@@ -2542,11 +2902,11 @@
       <w:pPr>
         <w:pStyle w:val="Heading1"/>
       </w:pPr>
-      <w:bookmarkStart w:id="35" w:name="why-cant-a-budget-policy-that-reasons-about-cost-and-timing-beat-first-come-first-served"/>
+      <w:bookmarkStart w:id="37" w:name="why-cant-a-budget-policy-that-reasons-about-cost-and-timing-beat-first-come-first-served"/>
       <w:r>
         <w:t xml:space="preserve">Why can’t a budget policy that reasons about cost and timing beat first come, first served?</w:t>
       </w:r>
-      <w:bookmarkEnd w:id="35"/>
+      <w:bookmarkEnd w:id="37"/>
     </w:p>
     <w:p>
       <w:pPr>
@@ -2630,7 +2990,7 @@
           <wp:inline>
             <wp:extent cx="5334000" cy="2021305"/>
             <wp:effectExtent b="0" l="0" r="0" t="0"/>
-            <wp:docPr descr="Figure 10. Share of each extraction’s score gain that goes to its own query and to later queries." title="" id="1" name="Picture"/>
+            <wp:docPr descr="Figure 12. Share of each extraction’s score gain that goes to its own query and to later queries." title="" id="1" name="Picture"/>
             <a:graphic>
               <a:graphicData uri="http://schemas.openxmlformats.org/drawingml/2006/picture">
                 <pic:pic>
@@ -2641,7 +3001,7 @@
                     </pic:cNvPicPr>
                   </pic:nvPicPr>
                   <pic:blipFill>
-                    <a:blip r:embed="rId36"/>
+                    <a:blip r:embed="rId38"/>
                     <a:stretch>
                       <a:fillRect/>
                     </a:stretch>
@@ -2673,7 +3033,7 @@
         <w:pStyle w:val="ImageCaption"/>
       </w:pPr>
       <w:r>
-        <w:t xml:space="preserve">Figure 10. Share of each extraction’s score gain that goes to its own query and to later</w:t>
+        <w:t xml:space="preserve">Figure 12. Share of each extraction’s score gain that goes to its own query and to later</w:t>
       </w:r>
       <w:r>
         <w:t xml:space="preserve"> </w:t>
@@ -2918,11 +3278,11 @@
       <w:pPr>
         <w:pStyle w:val="Heading1"/>
       </w:pPr>
-      <w:bookmarkStart w:id="37" w:name="why-does-extracting-a-column-for-more-documents-sometimes-make-answers-worse"/>
+      <w:bookmarkStart w:id="39" w:name="why-does-extracting-a-column-for-more-documents-sometimes-make-answers-worse"/>
       <w:r>
         <w:t xml:space="preserve">Why does extracting a column for more documents sometimes make answers worse?</w:t>
       </w:r>
-      <w:bookmarkEnd w:id="37"/>
+      <w:bookmarkEnd w:id="39"/>
     </w:p>
     <w:p>
       <w:pPr>
@@ -3039,11 +3399,11 @@
       <w:pPr>
         <w:pStyle w:val="Heading1"/>
       </w:pPr>
-      <w:bookmarkStart w:id="38" w:name="why-does-a-planner-that-trusts-its-own-extractions-stop-improving"/>
+      <w:bookmarkStart w:id="40" w:name="why-does-a-planner-that-trusts-its-own-extractions-stop-improving"/>
       <w:r>
         <w:t xml:space="preserve">Why does a planner that trusts its own extractions stop improving?</w:t>
       </w:r>
-      <w:bookmarkEnd w:id="38"/>
+      <w:bookmarkEnd w:id="40"/>
     </w:p>
     <w:p>
       <w:pPr>
@@ -3137,11 +3497,11 @@
       <w:pPr>
         <w:pStyle w:val="Heading1"/>
       </w:pPr>
-      <w:bookmarkStart w:id="39" w:name="why-do-joins-fail-when-each-tables-keys-are-extracted-separately"/>
+      <w:bookmarkStart w:id="41" w:name="why-do-joins-fail-when-each-tables-keys-are-extracted-separately"/>
       <w:r>
         <w:t xml:space="preserve">Why do joins fail when each table’s keys are extracted separately?</w:t>
       </w:r>
-      <w:bookmarkEnd w:id="39"/>
+      <w:bookmarkEnd w:id="41"/>
     </w:p>
     <w:p>
       <w:pPr>
@@ -3211,7 +3571,7 @@
           <wp:inline>
             <wp:extent cx="5334000" cy="2311400"/>
             <wp:effectExtent b="0" l="0" r="0" t="0"/>
-            <wp:docPr descr="Figure 11. Share of rows whose join key finds a partner in the joined table." title="" id="1" name="Picture"/>
+            <wp:docPr descr="Figure 13. Share of rows whose join key finds a partner in the joined table." title="" id="1" name="Picture"/>
             <a:graphic>
               <a:graphicData uri="http://schemas.openxmlformats.org/drawingml/2006/picture">
                 <pic:pic>
@@ -3222,7 +3582,7 @@
                     </pic:cNvPicPr>
                   </pic:nvPicPr>
                   <pic:blipFill>
-                    <a:blip r:embed="rId40"/>
+                    <a:blip r:embed="rId42"/>
                     <a:stretch>
                       <a:fillRect/>
                     </a:stretch>
@@ -3254,7 +3614,7 @@
         <w:pStyle w:val="ImageCaption"/>
       </w:pPr>
       <w:r>
-        <w:t xml:space="preserve">Figure 11. Share of rows whose join key finds a partner in the joined table.</w:t>
+        <w:t xml:space="preserve">Figure 13. Share of rows whose join key finds a partner in the joined table.</w:t>
       </w:r>
     </w:p>
     <w:p>
@@ -3262,7 +3622,200 @@
         <w:pStyle w:val="BodyText"/>
       </w:pPr>
       <w:r>
-        <w:t xml:space="preserve">Basketball players is the only corpus with joins, so this rests on one corpus.</w:t>
+        <w:t xml:space="preserve">We then changed DocETL to find out. Each column is extracted once, by the first query that needs it and in that query’s</w:t>
+      </w:r>
+      <w:r>
+        <w:t xml:space="preserve"> </w:t>
+      </w:r>
+      <w:r>
+        <w:t xml:space="preserve">own prompt, and every later query reuses the value. On papers and players this cuts DocETL’s calls fifteen-fold but</w:t>
+      </w:r>
+      <w:r>
+        <w:t xml:space="preserve"> </w:t>
+      </w:r>
+      <w:r>
+        <w:t xml:space="preserve">loses accuracy (papers 0.122 → 0.059, players 0.108 → 0.054), and the per-column numbers show why: in DocETL’s</w:t>
+      </w:r>
+      <w:r>
+        <w:t xml:space="preserve"> </w:t>
+      </w:r>
+      <w:r>
+        <w:t xml:space="preserve">original run the share of documents for which a column is filled at all ranges from 1% to 100% depending on which</w:t>
+      </w:r>
+      <w:r>
+        <w:t xml:space="preserve"> </w:t>
+      </w:r>
+      <w:r>
+        <w:t xml:space="preserve">query’s prompt extracted it (paper name: 44 prompts, median fill 0.53, the first query’s 0.01).</w:t>
+      </w:r>
+      <w:r>
+        <w:t xml:space="preserve"> </w:t>
+      </w:r>
+      <w:r>
+        <w:rPr>
+          <w:i/>
+        </w:rPr>
+        <w:t xml:space="preserve">Per-query extraction</w:t>
+      </w:r>
+      <w:r>
+        <w:rPr>
+          <w:i/>
+        </w:rPr>
+        <w:t xml:space="preserve"> </w:t>
+      </w:r>
+      <w:r>
+        <w:rPr>
+          <w:i/>
+        </w:rPr>
+        <w:t xml:space="preserve">is a lottery over contexts, and freezing on the first draw makes every later query hostage to it.</w:t>
+      </w:r>
+      <w:r>
+        <w:t xml:space="preserve"> </w:t>
+      </w:r>
+      <w:r>
+        <w:t xml:space="preserve">Joins still improve</w:t>
+      </w:r>
+      <w:r>
+        <w:t xml:space="preserve"> </w:t>
+      </w:r>
+      <w:r>
+        <w:t xml:space="preserve">(0.022 → 0.041; player–team keys matching 0.19 → 0.30), because even a poor key is the same key everywhere.</w:t>
+      </w:r>
+      <w:r>
+        <w:t xml:space="preserve"> </w:t>
+      </w:r>
+      <w:r>
+        <w:t xml:space="preserve">Freezing instead on the better of a column’s first two contexts, chosen without labels by the share of documents it</w:t>
+      </w:r>
+      <w:r>
+        <w:t xml:space="preserve"> </w:t>
+      </w:r>
+      <w:r>
+        <w:t xml:space="preserve">fills, recovers it:</w:t>
+      </w:r>
+      <w:r>
+        <w:t xml:space="preserve"> </w:t>
+      </w:r>
+      <w:r>
+        <w:rPr>
+          <w:b/>
+        </w:rPr>
+        <w:t xml:space="preserve">on players DocETL then scores 0.164 against its own 0.108, with join queries at 0.055 against</w:t>
+      </w:r>
+      <w:r>
+        <w:rPr>
+          <w:b/>
+        </w:rPr>
+        <w:t xml:space="preserve"> </w:t>
+      </w:r>
+      <w:r>
+        <w:rPr>
+          <w:b/>
+        </w:rPr>
+        <w:t xml:space="preserve">0.022 and 66 queries better against 35 worse, at a twelfth of the calls</w:t>
+      </w:r>
+      <w:r>
+        <w:t xml:space="preserve">; on papers 0.101 against 0.122 at an eighth.</w:t>
+      </w:r>
+      <w:r>
+        <w:t xml:space="preserve"> </w:t>
+      </w:r>
+      <w:r>
+        <w:t xml:space="preserve">The gain is largest where queries join and group and smallest where they filter single tables. And it comes despite</w:t>
+      </w:r>
+      <w:r>
+        <w:t xml:space="preserve"> </w:t>
+      </w:r>
+      <w:r>
+        <w:t xml:space="preserve">the frozen values being</w:t>
+      </w:r>
+      <w:r>
+        <w:t xml:space="preserve"> </w:t>
+      </w:r>
+      <w:r>
+        <w:rPr>
+          <w:i/>
+        </w:rPr>
+        <w:t xml:space="preserve">less</w:t>
+      </w:r>
+      <w:r>
+        <w:t xml:space="preserve"> </w:t>
+      </w:r>
+      <w:r>
+        <w:t xml:space="preserve">accurate per column than the original’s pooled values (draft pick 0.95 → 0.63): one</w:t>
+      </w:r>
+      <w:r>
+        <w:t xml:space="preserve"> </w:t>
+      </w:r>
+      <w:r>
+        <w:t xml:space="preserve">value per cell, the same for every query and agreeing across tables, is worth more to a join or a GROUP BY than a</w:t>
+      </w:r>
+      <w:r>
+        <w:t xml:space="preserve"> </w:t>
+      </w:r>
+      <w:r>
+        <w:t xml:space="preserve">higher accuracy that differs from query to query.</w:t>
+      </w:r>
+    </w:p>
+    <w:p>
+      <w:pPr>
+        <w:pStyle w:val="CaptionedFigure"/>
+      </w:pPr>
+      <w:r>
+        <w:drawing>
+          <wp:inline>
+            <wp:extent cx="5334000" cy="1981200"/>
+            <wp:effectExtent b="0" l="0" r="0" t="0"/>
+            <wp:docPr descr="Figure 14. DocETL’s mean query score and number of model calls on the same queries: per-query extraction, every column frozen on its first context, and frozen on the better of its first two contexts." title="" id="1" name="Picture"/>
+            <a:graphic>
+              <a:graphicData uri="http://schemas.openxmlformats.org/drawingml/2006/picture">
+                <pic:pic>
+                  <pic:nvPicPr>
+                    <pic:cNvPr descr="figures/w11_frozen_docetl.png" id="0" name="Picture"/>
+                    <pic:cNvPicPr>
+                      <a:picLocks noChangeArrowheads="1" noChangeAspect="1"/>
+                    </pic:cNvPicPr>
+                  </pic:nvPicPr>
+                  <pic:blipFill>
+                    <a:blip r:embed="rId43"/>
+                    <a:stretch>
+                      <a:fillRect/>
+                    </a:stretch>
+                  </pic:blipFill>
+                  <pic:spPr bwMode="auto">
+                    <a:xfrm>
+                      <a:off x="0" y="0"/>
+                      <a:ext cx="5334000" cy="1981200"/>
+                    </a:xfrm>
+                    <a:prstGeom prst="rect">
+                      <a:avLst/>
+                    </a:prstGeom>
+                    <a:noFill/>
+                    <a:ln w="9525">
+                      <a:noFill/>
+                      <a:headEnd/>
+                      <a:tailEnd/>
+                    </a:ln>
+                  </pic:spPr>
+                </pic:pic>
+              </a:graphicData>
+            </a:graphic>
+          </wp:inline>
+        </w:drawing>
+      </w:r>
+    </w:p>
+    <w:p>
+      <w:pPr>
+        <w:pStyle w:val="ImageCaption"/>
+      </w:pPr>
+      <w:r>
+        <w:t xml:space="preserve">Figure 14. DocETL’s mean query score and number of model calls on the same queries: per-query extraction, every</w:t>
+      </w:r>
+      <w:r>
+        <w:t xml:space="preserve"> </w:t>
+      </w:r>
+      <w:r>
+        <w:t xml:space="preserve">column frozen on its first context, and frozen on the better of its first two contexts.</w:t>
       </w:r>
     </w:p>
     <w:p>
@@ -3270,6 +3823,14 @@
         <w:pStyle w:val="BodyText"/>
       </w:pPr>
       <w:r>
+        <w:t xml:space="preserve">Basketball players is the only corpus with joins, so the join part rests on one corpus.</w:t>
+      </w:r>
+    </w:p>
+    <w:p>
+      <w:pPr>
+        <w:pStyle w:val="BodyText"/>
+      </w:pPr>
+      <w:r>
         <w:rPr>
           <w:i/>
         </w:rPr>
@@ -3285,24 +3846,36 @@
         <w:t xml:space="preserve"> </w:t>
       </w:r>
       <w:r>
-        <w:t xml:space="preserve">joins on them. This is the first section’s finding applied to keys: a key extracted in a different prompt is a</w:t>
-      </w:r>
-      <w:r>
-        <w:t xml:space="preserve"> </w:t>
-      </w:r>
-      <w:r>
-        <w:t xml:space="preserve">different value, and for a key, any difference breaks the match.</w:t>
+        <w:t xml:space="preserve">joins on them; more generally a stored value should be the same for every query that reads it, and the context it is</w:t>
+      </w:r>
+      <w:r>
+        <w:t xml:space="preserve"> </w:t>
+      </w:r>
+      <w:r>
+        <w:t xml:space="preserve">frozen on should be chosen for how well it determines the column, not for which query came first. This is the first</w:t>
+      </w:r>
+      <w:r>
+        <w:t xml:space="preserve"> </w:t>
+      </w:r>
+      <w:r>
+        <w:t xml:space="preserve">section’s finding applied to a store: consistency of a value across its uses matters more than the accuracy of any one</w:t>
+      </w:r>
+      <w:r>
+        <w:t xml:space="preserve"> </w:t>
+      </w:r>
+      <w:r>
+        <w:t xml:space="preserve">extraction of it.</w:t>
       </w:r>
     </w:p>
     <w:p>
       <w:pPr>
         <w:pStyle w:val="Heading1"/>
       </w:pPr>
-      <w:bookmarkStart w:id="41" w:name="why-does-telling-the-model-what-a-column-means-matter-so-much"/>
+      <w:bookmarkStart w:id="44" w:name="why-does-telling-the-model-what-a-column-means-matter-so-much"/>
       <w:r>
         <w:t xml:space="preserve">Why does telling the model what a column means matter so much?</w:t>
       </w:r>
-      <w:bookmarkEnd w:id="41"/>
+      <w:bookmarkEnd w:id="44"/>
     </w:p>
     <w:p>
       <w:pPr>
@@ -3357,7 +3930,7 @@
           <wp:inline>
             <wp:extent cx="5334000" cy="2189747"/>
             <wp:effectExtent b="0" l="0" r="0" t="0"/>
-            <wp:docPr descr="Figure 12. Share of cells correct with and without field descriptions." title="" id="1" name="Picture"/>
+            <wp:docPr descr="Figure 15. Share of cells correct with and without field descriptions." title="" id="1" name="Picture"/>
             <a:graphic>
               <a:graphicData uri="http://schemas.openxmlformats.org/drawingml/2006/picture">
                 <pic:pic>
@@ -3368,7 +3941,7 @@
                     </pic:cNvPicPr>
                   </pic:nvPicPr>
                   <pic:blipFill>
-                    <a:blip r:embed="rId42"/>
+                    <a:blip r:embed="rId45"/>
                     <a:stretch>
                       <a:fillRect/>
                     </a:stretch>
@@ -3400,7 +3973,7 @@
         <w:pStyle w:val="ImageCaption"/>
       </w:pPr>
       <w:r>
-        <w:t xml:space="preserve">Figure 12. Share of cells correct with and without field descriptions.</w:t>
+        <w:t xml:space="preserve">Figure 15. Share of cells correct with and without field descriptions.</w:t>
       </w:r>
     </w:p>
     <w:p>
@@ -3436,11 +4009,11 @@
       <w:pPr>
         <w:pStyle w:val="Heading1"/>
       </w:pPr>
-      <w:bookmarkStart w:id="43" w:name="what-carries-over-to-other-problems"/>
+      <w:bookmarkStart w:id="46" w:name="what-carries-over-to-other-problems"/>
       <w:r>
         <w:t xml:space="preserve">What carries over to other problems</w:t>
       </w:r>
-      <w:bookmarkEnd w:id="43"/>
+      <w:bookmarkEnd w:id="46"/>
     </w:p>
     <w:p>
       <w:pPr>
@@ -3682,11 +4255,11 @@
       <w:pPr>
         <w:pStyle w:val="Heading1"/>
       </w:pPr>
-      <w:bookmarkStart w:id="44" w:name="open-questions"/>
+      <w:bookmarkStart w:id="47" w:name="open-questions"/>
       <w:r>
         <w:t xml:space="preserve">Open questions</w:t>
       </w:r>
-      <w:bookmarkEnd w:id="44"/>
+      <w:bookmarkEnd w:id="47"/>
     </w:p>
     <w:p>
       <w:pPr>
@@ -3723,24 +4296,36 @@
         <w:t xml:space="preserve"> </w:t>
       </w:r>
       <w:r>
-        <w:t xml:space="preserve">The explanations have been tested as predictions of DocETL’s failures, but not yet as changes to DocETL: whether</w:t>
-      </w:r>
-      <w:r>
-        <w:t xml:space="preserve"> </w:t>
-      </w:r>
-      <w:r>
-        <w:t xml:space="preserve">sharing one prompt per column, extracting join keys once, or batching upcoming columns improves DocETL needs new runs.</w:t>
+        <w:t xml:space="preserve">Two changes to DocETL have been tested (freezing each column on one context); whether keeping drawing contexts until</w:t>
+      </w:r>
+      <w:r>
+        <w:t xml:space="preserve"> </w:t>
+      </w:r>
+      <w:r>
+        <w:t xml:space="preserve">one determines a column, a budget policy that forecasts reuse with frozen contexts, and choosing the build’s prompt</w:t>
+      </w:r>
+      <w:r>
+        <w:t xml:space="preserve"> </w:t>
+      </w:r>
+      <w:r>
+        <w:t xml:space="preserve">groups by each column’s measured context effect improve matters are running (I3c, I4, I5 in RESEARCH_DEPTH.md), as is</w:t>
+      </w:r>
+      <w:r>
+        <w:t xml:space="preserve"> </w:t>
+      </w:r>
+      <w:r>
+        <w:t xml:space="preserve">the context intervention on the 32B.</w:t>
       </w:r>
     </w:p>
     <w:p>
       <w:pPr>
         <w:pStyle w:val="Heading1"/>
       </w:pPr>
-      <w:bookmarkStart w:id="45" w:name="methods"/>
+      <w:bookmarkStart w:id="48" w:name="methods"/>
       <w:r>
         <w:t xml:space="preserve">Methods</w:t>
       </w:r>
-      <w:bookmarkEnd w:id="45"/>
+      <w:bookmarkEnd w:id="48"/>
     </w:p>
     <w:p>
       <w:pPr>
@@ -3867,7 +4452,43 @@
         <w:t xml:space="preserve"> </w:t>
       </w:r>
       <w:r>
-        <w:t xml:space="preserve">of GROUP BY column. For DocETL, the same label, aggregate and within-corpus analyses run on its per-query</w:t>
+        <w:t xml:space="preserve">of GROUP BY column. The context intervention reads thirty sampled documents per table (those with a gold row and at most</w:t>
+      </w:r>
+      <w:r>
+        <w:t xml:space="preserve"> </w:t>
+      </w:r>
+      <w:r>
+        <w:t xml:space="preserve">9,000 tokens) in five contexts with the drift run’s prompt renderer and generation settings; sensitivity to a context</w:t>
+      </w:r>
+      <w:r>
+        <w:t xml:space="preserve"> </w:t>
+      </w:r>
+      <w:r>
+        <w:t xml:space="preserve">is the share of documents whose normalized value differs from the lone answer. The second looks re-ask the 32B, column</w:t>
+      </w:r>
+      <w:r>
+        <w:t xml:space="preserve"> </w:t>
+      </w:r>
+      <w:r>
+        <w:t xml:space="preserve">alone, for cells of the new columns at 100% drift in documents of at most 6,000 tokens; a look catches an error when the</w:t>
+      </w:r>
+      <w:r>
+        <w:t xml:space="preserve"> </w:t>
+      </w:r>
+      <w:r>
+        <w:t xml:space="preserve">served value is wrong and the new one right, and introduces one in the opposite case. The frozen DocETL runs keep</w:t>
+      </w:r>
+      <w:r>
+        <w:t xml:space="preserve"> </w:t>
+      </w:r>
+      <w:r>
+        <w:t xml:space="preserve">DocETL’s prompt, documents, model, scoring and query order, and only reuse a column’s values across queries once it has</w:t>
+      </w:r>
+      <w:r>
+        <w:t xml:space="preserve"> </w:t>
+      </w:r>
+      <w:r>
+        <w:t xml:space="preserve">been extracted by the first (or the better of the first two) queries that needed it. For DocETL, the same label, aggregate and within-corpus analyses run on its per-query</w:t>
       </w:r>
       <w:r>
         <w:t xml:space="preserve"> </w:t>
@@ -3886,11 +4507,11 @@
       <w:pPr>
         <w:pStyle w:val="Heading1"/>
       </w:pPr>
-      <w:bookmarkStart w:id="46" w:name="appendix-example-test-queries"/>
+      <w:bookmarkStart w:id="49" w:name="appendix-example-test-queries"/>
       <w:r>
         <w:t xml:space="preserve">Appendix: example test queries</w:t>
       </w:r>
-      <w:bookmarkEnd w:id="46"/>
+      <w:bookmarkEnd w:id="49"/>
     </w:p>
     <w:p>
       <w:pPr>
@@ -3904,11 +4525,11 @@
       <w:pPr>
         <w:pStyle w:val="Heading2"/>
       </w:pPr>
-      <w:bookmarkStart w:id="47" w:name="research-papers-59-test-queries"/>
+      <w:bookmarkStart w:id="50" w:name="research-papers-59-test-queries"/>
       <w:r>
         <w:t xml:space="preserve">Research papers (59 test queries)</w:t>
       </w:r>
-      <w:bookmarkEnd w:id="47"/>
+      <w:bookmarkEnd w:id="50"/>
     </w:p>
     <w:p>
       <w:pPr>
@@ -4870,11 +5491,11 @@
       <w:pPr>
         <w:pStyle w:val="Heading2"/>
       </w:pPr>
-      <w:bookmarkStart w:id="48" w:name="basketball-players-118-test-queries"/>
+      <w:bookmarkStart w:id="51" w:name="basketball-players-118-test-queries"/>
       <w:r>
         <w:t xml:space="preserve">Basketball players (118 test queries)</w:t>
       </w:r>
-      <w:bookmarkEnd w:id="48"/>
+      <w:bookmarkEnd w:id="51"/>
     </w:p>
     <w:p>
       <w:pPr>
@@ -5662,11 +6283,11 @@
       <w:pPr>
         <w:pStyle w:val="Heading2"/>
       </w:pPr>
-      <w:bookmarkStart w:id="49" w:name="artists-43-test-queries"/>
+      <w:bookmarkStart w:id="52" w:name="artists-43-test-queries"/>
       <w:r>
         <w:t xml:space="preserve">Artists (43 test queries)</w:t>
       </w:r>
-      <w:bookmarkEnd w:id="49"/>
+      <w:bookmarkEnd w:id="52"/>
     </w:p>
     <w:p>
       <w:pPr>
@@ -6154,11 +6775,11 @@
       <w:pPr>
         <w:pStyle w:val="Heading2"/>
       </w:pPr>
-      <w:bookmarkStart w:id="50" w:name="medical-43-test-queries"/>
+      <w:bookmarkStart w:id="53" w:name="medical-43-test-queries"/>
       <w:r>
         <w:t xml:space="preserve">Medical (43 test queries)</w:t>
       </w:r>
-      <w:bookmarkEnd w:id="50"/>
+      <w:bookmarkEnd w:id="53"/>
     </w:p>
     <w:p>
       <w:pPr>
@@ -6491,11 +7112,11 @@
       <w:pPr>
         <w:pStyle w:val="Heading2"/>
       </w:pPr>
-      <w:bookmarkStart w:id="51" w:name="court-judgments-27-test-queries"/>
+      <w:bookmarkStart w:id="54" w:name="court-judgments-27-test-queries"/>
       <w:r>
         <w:t xml:space="preserve">Court judgments (27 test queries)</w:t>
       </w:r>
-      <w:bookmarkEnd w:id="51"/>
+      <w:bookmarkEnd w:id="54"/>
     </w:p>
     <w:p>
       <w:pPr>
@@ -7383,7 +8004,7 @@
     </w:lvl>
   </w:abstractNum>
   <w:abstractNum w:abstractNumId="990">
-    <w:nsid w:val="23a6e593"/>
+    <w:nsid w:val="ebf02ba4"/>
     <w:multiLevelType w:val="multilevel"/>
     <w:lvl w:ilvl="0">
       <w:numFmt w:val="bullet"/>

</xml_diff>

<commit_message>
I3d replicate on players: 0.145 vs 0.164 (original 0.108); why document and figure updated with the range, the determined-context rule and the sampling note
Co-Authored-By: Claude Fable 5.1 <noreply@anthropic.com>
</commit_message>
<xml_diff>
--- a/results/experiments/why/Key_findings_and_why.docx
+++ b/results/experiments/why/Key_findings_and_why.docx
@@ -3700,7 +3700,7 @@
         <w:rPr>
           <w:b/>
         </w:rPr>
-        <w:t xml:space="preserve">on players DocETL then scores 0.164 against its own 0.108, with join queries at 0.055 against</w:t>
+        <w:t xml:space="preserve">on players DocETL then scores 0.145 to 0.164 in two runs against its own 0.108, with join</w:t>
       </w:r>
       <w:r>
         <w:rPr>
@@ -3712,22 +3712,64 @@
         <w:rPr>
           <w:b/>
         </w:rPr>
-        <w:t xml:space="preserve">0.022 and 66 queries better against 35 worse, at a twelfth of the calls</w:t>
-      </w:r>
-      <w:r>
-        <w:t xml:space="preserve">; on papers 0.101 against 0.122 at an eighth.</w:t>
-      </w:r>
-      <w:r>
-        <w:t xml:space="preserve"> </w:t>
-      </w:r>
-      <w:r>
-        <w:t xml:space="preserve">The gain is largest where queries join and group and smallest where they filter single tables. And it comes despite</w:t>
-      </w:r>
-      <w:r>
-        <w:t xml:space="preserve"> </w:t>
-      </w:r>
-      <w:r>
-        <w:t xml:space="preserve">the frozen values being</w:t>
+        <w:t xml:space="preserve">queries at 0.029 to 0.055 against 0.022 and about 60 queries better against 35 worse, at a twelfth of the calls</w:t>
+      </w:r>
+      <w:r>
+        <w:t xml:space="preserve">; on</w:t>
+      </w:r>
+      <w:r>
+        <w:t xml:space="preserve"> </w:t>
+      </w:r>
+      <w:r>
+        <w:t xml:space="preserve">papers 0.101 against 0.122 at an eighth. Keeping drawing contexts until one fills half the documents (at most four)</w:t>
+      </w:r>
+      <w:r>
+        <w:t xml:space="preserve"> </w:t>
+      </w:r>
+      <w:r>
+        <w:t xml:space="preserve">gives 0.113 on papers at a fifth of the calls and 0.119 on players. The two runs differ because DocETL sets no</w:t>
+      </w:r>
+      <w:r>
+        <w:t xml:space="preserve"> </w:t>
+      </w:r>
+      <w:r>
+        <w:t xml:space="preserve">temperature and so samples its answers: the same prompt on the same documents returns the same value only 69% to</w:t>
+      </w:r>
+      <w:r>
+        <w:t xml:space="preserve"> </w:t>
+      </w:r>
+      <w:r>
+        <w:t xml:space="preserve">100% of the time, which is a third reason a stored value is not</w:t>
+      </w:r>
+      <w:r>
+        <w:t xml:space="preserve"> </w:t>
+      </w:r>
+      <w:r>
+        <w:t xml:space="preserve">“</w:t>
+      </w:r>
+      <w:r>
+        <w:t xml:space="preserve">the</w:t>
+      </w:r>
+      <w:r>
+        <w:t xml:space="preserve">”</w:t>
+      </w:r>
+      <w:r>
+        <w:t xml:space="preserve"> </w:t>
+      </w:r>
+      <w:r>
+        <w:t xml:space="preserve">value, besides the prompt’s context and the</w:t>
+      </w:r>
+      <w:r>
+        <w:t xml:space="preserve"> </w:t>
+      </w:r>
+      <w:r>
+        <w:t xml:space="preserve">model, and it applies to the original per-query run as well. The gain is largest where queries join and group and</w:t>
+      </w:r>
+      <w:r>
+        <w:t xml:space="preserve"> </w:t>
+      </w:r>
+      <w:r>
+        <w:t xml:space="preserve">smallest where they filter single tables. And it comes despite the frozen values being</w:t>
       </w:r>
       <w:r>
         <w:t xml:space="preserve"> </w:t>
@@ -3742,19 +3784,19 @@
         <w:t xml:space="preserve"> </w:t>
       </w:r>
       <w:r>
-        <w:t xml:space="preserve">accurate per column than the original’s pooled values (draft pick 0.95 → 0.63): one</w:t>
-      </w:r>
-      <w:r>
-        <w:t xml:space="preserve"> </w:t>
-      </w:r>
-      <w:r>
-        <w:t xml:space="preserve">value per cell, the same for every query and agreeing across tables, is worth more to a join or a GROUP BY than a</w:t>
-      </w:r>
-      <w:r>
-        <w:t xml:space="preserve"> </w:t>
-      </w:r>
-      <w:r>
-        <w:t xml:space="preserve">higher accuracy that differs from query to query.</w:t>
+        <w:t xml:space="preserve">accurate per column</w:t>
+      </w:r>
+      <w:r>
+        <w:t xml:space="preserve"> </w:t>
+      </w:r>
+      <w:r>
+        <w:t xml:space="preserve">than the original’s pooled values (draft pick 0.95 → 0.63): one value per cell, the same for every query and agreeing</w:t>
+      </w:r>
+      <w:r>
+        <w:t xml:space="preserve"> </w:t>
+      </w:r>
+      <w:r>
+        <w:t xml:space="preserve">across tables, is worth more to a join or a GROUP BY than a higher accuracy that differs from query to query.</w:t>
       </w:r>
     </w:p>
     <w:p>
@@ -3766,7 +3808,7 @@
           <wp:inline>
             <wp:extent cx="5334000" cy="1981200"/>
             <wp:effectExtent b="0" l="0" r="0" t="0"/>
-            <wp:docPr descr="Figure 14. DocETL’s mean query score and number of model calls on the same queries: per-query extraction, every column frozen on its first context, and frozen on the better of its first two contexts." title="" id="1" name="Picture"/>
+            <wp:docPr descr="Figure 14. DocETL’s mean query score and number of model calls on the same queries: per-query extraction, every column frozen on its first context, frozen on the better of its first two contexts (two runs), and frozen on a determined context." title="" id="1" name="Picture"/>
             <a:graphic>
               <a:graphicData uri="http://schemas.openxmlformats.org/drawingml/2006/picture">
                 <pic:pic>
@@ -3815,7 +3857,13 @@
         <w:t xml:space="preserve"> </w:t>
       </w:r>
       <w:r>
-        <w:t xml:space="preserve">column frozen on its first context, and frozen on the better of its first two contexts.</w:t>
+        <w:t xml:space="preserve">column frozen on its first context, frozen on the better of its first two contexts (two runs), and frozen on a</w:t>
+      </w:r>
+      <w:r>
+        <w:t xml:space="preserve"> </w:t>
+      </w:r>
+      <w:r>
+        <w:t xml:space="preserve">determined context.</w:t>
       </w:r>
     </w:p>
     <w:p>
@@ -8004,7 +8052,7 @@
     </w:lvl>
   </w:abstractNum>
   <w:abstractNum w:abstractNumId="990">
-    <w:nsid w:val="ebf02ba4"/>
+    <w:nsid w:val="af4d9848"/>
     <w:multiLevelType w:val="multilevel"/>
     <w:lvl w:ilvl="0">
       <w:numFmt w:val="bullet"/>

</xml_diff>

<commit_message>
Key findings: field order as context, stated vs inferred and the label-free verifier priced per dollar, what the workload supplies, the per-column catalogue; docx rebuilt
Co-Authored-By: Claude Fable 5.1 <noreply@anthropic.com>
</commit_message>
<xml_diff>
--- a/results/experiments/why/Key_findings_and_why.docx
+++ b/results/experiments/why/Key_findings_and_why.docx
@@ -112,6 +112,7 @@
       </w:r>
       <w:r>
         <w:rPr>
+          <w:iCs/>
           <w:i/>
         </w:rPr>
         <w:t xml:space="preserve">build</w:t>
@@ -130,6 +131,7 @@
       </w:r>
       <w:r>
         <w:rPr>
+          <w:iCs/>
           <w:i/>
         </w:rPr>
         <w:t xml:space="preserve">on demand</w:t>
@@ -142,18 +144,21 @@
       </w:r>
       <w:r>
         <w:rPr>
+          <w:iCs/>
           <w:i/>
         </w:rPr>
         <w:t xml:space="preserve">Workload</w:t>
       </w:r>
       <w:r>
         <w:rPr>
+          <w:iCs/>
           <w:i/>
         </w:rPr>
         <w:t xml:space="preserve"> </w:t>
       </w:r>
       <w:r>
         <w:rPr>
+          <w:iCs/>
           <w:i/>
         </w:rPr>
         <w:t xml:space="preserve">drift</w:t>
@@ -209,15 +214,14 @@
         <w:t xml:space="preserve">transferable, and the last one connects the findings to other areas.</w:t>
       </w:r>
     </w:p>
+    <w:bookmarkStart w:id="26" w:name="Xe19f0d41bf1e45df9ecf4e2098db67899aa14c0"/>
     <w:p>
       <w:pPr>
         <w:pStyle w:val="Heading1"/>
       </w:pPr>
-      <w:bookmarkStart w:id="21" w:name="why-does-an-extracted-value-depend-on-how-the-question-is-asked-but-not-on-when"/>
       <w:r>
         <w:t xml:space="preserve">Why does an extracted value depend on how the question is asked, but not on when?</w:t>
       </w:r>
-      <w:bookmarkEnd w:id="21"/>
     </w:p>
     <w:p>
       <w:pPr>
@@ -225,6 +229,7 @@
       </w:pPr>
       <w:r>
         <w:rPr>
+          <w:bCs/>
           <w:b/>
         </w:rPr>
         <w:t xml:space="preserve">Extraction timing turns out to be irrelevant; what matters is the prompt.</w:t>
@@ -252,6 +257,7 @@
       </w:r>
       <w:r>
         <w:rPr>
+          <w:bCs/>
           <w:b/>
         </w:rPr>
         <w:t xml:space="preserve">463 of the 467 queries then scored the same as when everything was extracted up front.</w:t>
@@ -317,6 +323,7 @@
       </w:r>
       <w:r>
         <w:rPr>
+          <w:iCs/>
           <w:i/>
         </w:rPr>
         <w:t xml:space="preserve">and of the prompt it was asked in</w:t>
@@ -340,18 +347,18 @@
           <wp:inline>
             <wp:extent cx="5334000" cy="2240280"/>
             <wp:effectExtent b="0" l="0" r="0" t="0"/>
-            <wp:docPr descr="Figure 1. Scores with everything extracted up front, with on-demand extraction, and with on-demand extraction using the build’s prompt." title="" id="1" name="Picture"/>
+            <wp:docPr descr="Figure 1. Scores with everything extracted up front, with on-demand extraction, and with on-demand extraction using the build’s prompt." title="" id="21" name="Picture"/>
             <a:graphic>
               <a:graphicData uri="http://schemas.openxmlformats.org/drawingml/2006/picture">
                 <pic:pic>
                   <pic:nvPicPr>
-                    <pic:cNvPr descr="figures/w1_when_vs_how.png" id="0" name="Picture"/>
+                    <pic:cNvPr descr="figures/w1_when_vs_how.png" id="22" name="Picture"/>
                     <pic:cNvPicPr>
                       <a:picLocks noChangeArrowheads="1" noChangeAspect="1"/>
                     </pic:cNvPicPr>
                   </pic:nvPicPr>
                   <pic:blipFill>
-                    <a:blip r:embed="rId22"/>
+                    <a:blip r:embed="rId20"/>
                     <a:stretch>
                       <a:fillRect/>
                     </a:stretch>
@@ -436,18 +443,21 @@
       </w:r>
       <w:r>
         <w:rPr>
+          <w:bCs/>
           <w:b/>
         </w:rPr>
         <w:t xml:space="preserve">On average the context does not</w:t>
       </w:r>
       <w:r>
         <w:rPr>
+          <w:bCs/>
           <w:b/>
         </w:rPr>
         <w:t xml:space="preserve"> </w:t>
       </w:r>
       <w:r>
         <w:rPr>
+          <w:bCs/>
           <w:b/>
         </w:rPr>
         <w:t xml:space="preserve">move accuracy at all, 0.37 to 0.41 in every context, and the direction of its effect is the column’s own:</w:t>
@@ -517,6 +527,136 @@
       </w:r>
       <w:r>
         <w:t xml:space="preserve">determines the value.</w:t>
+      </w:r>
+    </w:p>
+    <w:p>
+      <w:pPr>
+        <w:pStyle w:val="BodyText"/>
+      </w:pPr>
+      <w:r>
+        <w:t xml:space="preserve">The order of the field lines is part of the context too, and it is as strong as the set. For the 24 columns the</w:t>
+      </w:r>
+      <w:r>
+        <w:t xml:space="preserve"> </w:t>
+      </w:r>
+      <w:r>
+        <w:t xml:space="preserve">natural groups contain, the same fields were asked in the build’s order, shuffled, and reversed.</w:t>
+      </w:r>
+      <w:r>
+        <w:t xml:space="preserve"> </w:t>
+      </w:r>
+      <w:r>
+        <w:rPr>
+          <w:bCs/>
+          <w:b/>
+        </w:rPr>
+        <w:t xml:space="preserve">Shuffling changes</w:t>
+      </w:r>
+      <w:r>
+        <w:rPr>
+          <w:bCs/>
+          <w:b/>
+        </w:rPr>
+        <w:t xml:space="preserve"> </w:t>
+      </w:r>
+      <w:r>
+        <w:rPr>
+          <w:bCs/>
+          <w:b/>
+        </w:rPr>
+        <w:t xml:space="preserve">40% of the cells’ values and reversing them 44%, as much as adding six random columns (44%), against 5% to 6% when the</w:t>
+      </w:r>
+      <w:r>
+        <w:rPr>
+          <w:bCs/>
+          <w:b/>
+        </w:rPr>
+        <w:t xml:space="preserve"> </w:t>
+      </w:r>
+      <w:r>
+        <w:rPr>
+          <w:bCs/>
+          <w:b/>
+        </w:rPr>
+        <w:t xml:space="preserve">same prompt is simply run twice.</w:t>
+      </w:r>
+      <w:r>
+        <w:t xml:space="preserve"> </w:t>
+      </w:r>
+      <w:r>
+        <w:t xml:space="preserve">The columns that move are the same ones (Spearman 0.83 between a column’s order</w:t>
+      </w:r>
+      <w:r>
+        <w:t xml:space="preserve"> </w:t>
+      </w:r>
+      <w:r>
+        <w:t xml:space="preserve">change and its set sensitivity; lists 0.56 and categories 0.52, numbers 0.15 and yes/no 0.10), and the mean accuracy</w:t>
+      </w:r>
+      <w:r>
+        <w:t xml:space="preserve"> </w:t>
+      </w:r>
+      <w:r>
+        <w:t xml:space="preserve">again does not move (0.388 against 0.381) while single columns do: a paper’s agent framework, whose gold is empty for</w:t>
+      </w:r>
+      <w:r>
+        <w:t xml:space="preserve"> </w:t>
+      </w:r>
+      <w:r>
+        <w:t xml:space="preserve">25 of 30 papers, is answered</w:t>
+      </w:r>
+      <w:r>
+        <w:t xml:space="preserve"> </w:t>
+      </w:r>
+      <w:r>
+        <w:t xml:space="preserve">‘</w:t>
+      </w:r>
+      <w:r>
+        <w:t xml:space="preserve">Other</w:t>
+      </w:r>
+      <w:r>
+        <w:t xml:space="preserve">’</w:t>
+      </w:r>
+      <w:r>
+        <w:t xml:space="preserve"> </w:t>
+      </w:r>
+      <w:r>
+        <w:t xml:space="preserve">on 28 papers when it is the first field line and left empty on 25 when it is the</w:t>
+      </w:r>
+      <w:r>
+        <w:t xml:space="preserve"> </w:t>
+      </w:r>
+      <w:r>
+        <w:t xml:space="preserve">eleventh or the last (accuracy 0.20 against 0.77). So</w:t>
+      </w:r>
+      <w:r>
+        <w:t xml:space="preserve"> </w:t>
+      </w:r>
+      <w:r>
+        <w:t xml:space="preserve">“</w:t>
+      </w:r>
+      <w:r>
+        <w:t xml:space="preserve">context</w:t>
+      </w:r>
+      <w:r>
+        <w:t xml:space="preserve">”</w:t>
+      </w:r>
+      <w:r>
+        <w:t xml:space="preserve"> </w:t>
+      </w:r>
+      <w:r>
+        <w:t xml:space="preserve">is not a semantic interaction among fields but the</w:t>
+      </w:r>
+      <w:r>
+        <w:t xml:space="preserve"> </w:t>
+      </w:r>
+      <w:r>
+        <w:t xml:space="preserve">prompt’s arrangement. A canonical prompt has to be fixed as a byte string, order included, and a serving optimization</w:t>
+      </w:r>
+      <w:r>
+        <w:t xml:space="preserve"> </w:t>
+      </w:r>
+      <w:r>
+        <w:t xml:space="preserve">that reorders fields for cache hits changes the answers.</w:t>
       </w:r>
     </w:p>
     <w:p>
@@ -528,12 +668,12 @@
           <wp:inline>
             <wp:extent cx="5334000" cy="2032000"/>
             <wp:effectExtent b="0" l="0" r="0" t="0"/>
-            <wp:docPr descr="Figure 2. The context intervention on fixed documents. (a) Mean accuracy and empty-answer rate in five contexts. (b) Each column’s accuracy alone against its accuracy in the build’s group." title="" id="1" name="Picture"/>
+            <wp:docPr descr="Figure 2. The context intervention on fixed documents. (a) Mean accuracy and empty-answer rate in five contexts. (b) Each column’s accuracy alone against its accuracy in the build’s group." title="" id="24" name="Picture"/>
             <a:graphic>
               <a:graphicData uri="http://schemas.openxmlformats.org/drawingml/2006/picture">
                 <pic:pic>
                   <pic:nvPicPr>
-                    <pic:cNvPr descr="figures/w9_context_intervention.png" id="0" name="Picture"/>
+                    <pic:cNvPr descr="figures/w9_context_intervention.png" id="25" name="Picture"/>
                     <pic:cNvPicPr>
                       <a:picLocks noChangeArrowheads="1" noChangeAspect="1"/>
                     </pic:cNvPicPr>
@@ -586,6 +726,7 @@
       </w:pPr>
       <w:r>
         <w:rPr>
+          <w:iCs/>
           <w:i/>
         </w:rPr>
         <w:t xml:space="preserve">What this lets you decide.</w:t>
@@ -627,15 +768,15 @@
         <w:t xml:space="preserve">answers.</w:t>
       </w:r>
     </w:p>
+    <w:bookmarkEnd w:id="26"/>
+    <w:bookmarkStart w:id="36" w:name="Xcd9ef142658e17c03921f37a5d5460a46636688"/>
     <w:p>
       <w:pPr>
         <w:pStyle w:val="Heading1"/>
       </w:pPr>
-      <w:bookmarkStart w:id="24" w:name="why-can-a-columns-accuracy-be-predicted-without-any-gold-data"/>
       <w:r>
         <w:t xml:space="preserve">Why can a column’s accuracy be predicted without any gold data?</w:t>
       </w:r>
-      <w:bookmarkEnd w:id="24"/>
     </w:p>
     <w:p>
       <w:pPr>
@@ -649,18 +790,21 @@
       </w:r>
       <w:r>
         <w:rPr>
+          <w:bCs/>
           <w:b/>
         </w:rPr>
         <w:t xml:space="preserve">When</w:t>
       </w:r>
       <w:r>
         <w:rPr>
+          <w:bCs/>
           <w:b/>
         </w:rPr>
         <w:t xml:space="preserve"> </w:t>
       </w:r>
       <w:r>
         <w:rPr>
+          <w:bCs/>
           <w:b/>
         </w:rPr>
         <w:t xml:space="preserve">the document does not settle the answer, the prompt decides.</w:t>
@@ -708,18 +852,21 @@
       </w:r>
       <w:r>
         <w:rPr>
+          <w:bCs/>
           <w:b/>
         </w:rPr>
         <w:t xml:space="preserve">Across 41 columns this disagreement is a strong predictor of error</w:t>
       </w:r>
       <w:r>
         <w:rPr>
+          <w:bCs/>
           <w:b/>
         </w:rPr>
         <w:t xml:space="preserve"> </w:t>
       </w:r>
       <w:r>
         <w:rPr>
+          <w:bCs/>
           <w:b/>
         </w:rPr>
         <w:t xml:space="preserve">(Spearman −0.76).</w:t>
@@ -746,18 +893,18 @@
           <wp:inline>
             <wp:extent cx="5334000" cy="2582778"/>
             <wp:effectExtent b="0" l="0" r="0" t="0"/>
-            <wp:docPr descr="Figure 3. Disagreement between two prompts against accuracy, one point per column." title="" id="1" name="Picture"/>
+            <wp:docPr descr="Figure 3. Disagreement between two prompts against accuracy, one point per column." title="" id="28" name="Picture"/>
             <a:graphic>
               <a:graphicData uri="http://schemas.openxmlformats.org/drawingml/2006/picture">
                 <pic:pic>
                   <pic:nvPicPr>
-                    <pic:cNvPr descr="figures/w4_determinacy.png" id="0" name="Picture"/>
+                    <pic:cNvPr descr="figures/w4_determinacy.png" id="29" name="Picture"/>
                     <pic:cNvPicPr>
                       <a:picLocks noChangeArrowheads="1" noChangeAspect="1"/>
                     </pic:cNvPicPr>
                   </pic:nvPicPr>
                   <pic:blipFill>
-                    <a:blip r:embed="rId25"/>
+                    <a:blip r:embed="rId27"/>
                     <a:stretch>
                       <a:fillRect/>
                     </a:stretch>
@@ -828,30 +975,35 @@
       </w:r>
       <w:r>
         <w:rPr>
+          <w:bCs/>
           <w:b/>
         </w:rPr>
         <w:t xml:space="preserve">The signal fails in one place, and the failure is</w:t>
       </w:r>
       <w:r>
         <w:rPr>
+          <w:bCs/>
           <w:b/>
         </w:rPr>
         <w:t xml:space="preserve"> </w:t>
       </w:r>
       <w:r>
         <w:rPr>
+          <w:bCs/>
           <w:b/>
         </w:rPr>
         <w:t xml:space="preserve">informative: on category columns, cells where the prompts agree are wrong more often (57%) than cells where they</w:t>
       </w:r>
       <w:r>
         <w:rPr>
+          <w:bCs/>
           <w:b/>
         </w:rPr>
         <w:t xml:space="preserve"> </w:t>
       </w:r>
       <w:r>
         <w:rPr>
+          <w:bCs/>
           <w:b/>
         </w:rPr>
         <w:t xml:space="preserve">disagree (49%).</w:t>
@@ -881,6 +1033,7 @@
       </w:pPr>
       <w:r>
         <w:rPr>
+          <w:bCs/>
           <w:b/>
         </w:rPr>
         <w:t xml:space="preserve">The property belongs to the column, not to our system.</w:t>
@@ -931,18 +1084,18 @@
           <wp:inline>
             <wp:extent cx="5334000" cy="2032000"/>
             <wp:effectExtent b="0" l="0" r="0" t="0"/>
-            <wp:docPr descr="Figure 4. (a) Share of wrong cells where our two prompts agree or disagree, by kind of column. (b) Our two-prompt disagreement on a column against DocETL’s accuracy on the same column." title="" id="1" name="Picture"/>
+            <wp:docPr descr="Figure 4. (a) Share of wrong cells where our two prompts agree or disagree, by kind of column. (b) Our two-prompt disagreement on a column against DocETL’s accuracy on the same column." title="" id="31" name="Picture"/>
             <a:graphic>
               <a:graphicData uri="http://schemas.openxmlformats.org/drawingml/2006/picture">
                 <pic:pic>
                   <pic:nvPicPr>
-                    <pic:cNvPr descr="figures/w7_transfer.png" id="0" name="Picture"/>
+                    <pic:cNvPr descr="figures/w7_transfer.png" id="32" name="Picture"/>
                     <pic:cNvPicPr>
                       <a:picLocks noChangeArrowheads="1" noChangeAspect="1"/>
                     </pic:cNvPicPr>
                   </pic:nvPicPr>
                   <pic:blipFill>
-                    <a:blip r:embed="rId26"/>
+                    <a:blip r:embed="rId30"/>
                     <a:stretch>
                       <a:fillRect/>
                     </a:stretch>
@@ -1021,6 +1174,7 @@
       </w:pPr>
       <w:r>
         <w:rPr>
+          <w:bCs/>
           <w:b/>
         </w:rPr>
         <w:t xml:space="preserve">A sensitive cell is one the document under-determines, and a stronger reader cannot determine it either.</w:t>
@@ -1090,6 +1244,7 @@
       </w:r>
       <w:r>
         <w:rPr>
+          <w:iCs/>
           <w:i/>
         </w:rPr>
         <w:t xml:space="preserve">Under-determination</w:t>
@@ -1105,6 +1260,7 @@
       </w:r>
       <w:r>
         <w:rPr>
+          <w:iCs/>
           <w:i/>
         </w:rPr>
         <w:t xml:space="preserve">misreading</w:t>
@@ -1143,18 +1299,18 @@
           <wp:inline>
             <wp:extent cx="5334000" cy="1981200"/>
             <wp:effectExtent b="0" l="0" r="0" t="0"/>
-            <wp:docPr descr="Figure 5. Second looks by the 32B. (a) Accuracy of the served 7B value and of the 32B’s answer, by the column’s sensitivity. (b) Net errors fixed per thousand second looks under four allocations." title="" id="1" name="Picture"/>
+            <wp:docPr descr="Figure 5. Second looks by the 32B. (a) Accuracy of the served 7B value and of the 32B’s answer, by the column’s sensitivity. (b) Net errors fixed per thousand second looks under four allocations." title="" id="34" name="Picture"/>
             <a:graphic>
               <a:graphicData uri="http://schemas.openxmlformats.org/drawingml/2006/picture">
                 <pic:pic>
                   <pic:nvPicPr>
-                    <pic:cNvPr descr="figures/w10_second_looks.png" id="0" name="Picture"/>
+                    <pic:cNvPr descr="figures/w10_second_looks.png" id="35" name="Picture"/>
                     <pic:cNvPicPr>
                       <a:picLocks noChangeArrowheads="1" noChangeAspect="1"/>
                     </pic:cNvPicPr>
                   </pic:nvPicPr>
                   <pic:blipFill>
-                    <a:blip r:embed="rId27"/>
+                    <a:blip r:embed="rId33"/>
                     <a:stretch>
                       <a:fillRect/>
                     </a:stretch>
@@ -1201,8 +1357,143 @@
       </w:pPr>
       <w:r>
         <w:rPr>
+          <w:bCs/>
+          <w:b/>
+        </w:rPr>
+        <w:t xml:space="preserve">Under-determination is not the absence of the fact from the text.</w:t>
+      </w:r>
+      <w:r>
+        <w:t xml:space="preserve"> </w:t>
+      </w:r>
+      <w:r>
+        <w:t xml:space="preserve">Checking every cell of the recorded run against</w:t>
+      </w:r>
+      <w:r>
+        <w:t xml:space="preserve"> </w:t>
+      </w:r>
+      <w:r>
+        <w:t xml:space="preserve">its document (36,801 cells, 23,716 with a non-trivial value), whether the gold value is stated verbatim makes no</w:t>
+      </w:r>
+      <w:r>
+        <w:t xml:space="preserve"> </w:t>
+      </w:r>
+      <w:r>
+        <w:t xml:space="preserve">difference to whether the two prompts disagree, 48.6% when it is and 48.8% when it is not, though stated values are</w:t>
+      </w:r>
+      <w:r>
+        <w:t xml:space="preserve"> </w:t>
+      </w:r>
+      <w:r>
+        <w:t xml:space="preserve">extracted right more often (0.43 against 0.32). What the prompts disagree about is which of the mentioned items belong</w:t>
+      </w:r>
+      <w:r>
+        <w:t xml:space="preserve"> </w:t>
+      </w:r>
+      <w:r>
+        <w:t xml:space="preserve">in a list, which label a passage maps to, and whether to leave the cell empty, not what the document says. Whether the</w:t>
+      </w:r>
+      <w:r>
+        <w:t xml:space="preserve"> </w:t>
+      </w:r>
+      <w:r>
+        <w:rPr>
+          <w:iCs/>
           <w:i/>
         </w:rPr>
+        <w:t xml:space="preserve">extracted</w:t>
+      </w:r>
+      <w:r>
+        <w:t xml:space="preserve"> </w:t>
+      </w:r>
+      <w:r>
+        <w:t xml:space="preserve">value is stated in the document, a string check that needs no model and no labels, does carry information,</w:t>
+      </w:r>
+      <w:r>
+        <w:t xml:space="preserve"> </w:t>
+      </w:r>
+      <w:r>
+        <w:t xml:space="preserve">but by kind: numbers found verbatim are right 95% of the time against 73% when not, free text 64% against 39%,</w:t>
+      </w:r>
+      <w:r>
+        <w:t xml:space="preserve"> </w:t>
+      </w:r>
+      <w:r>
+        <w:t xml:space="preserve">categories 69% against 61% (labels are rarely in the text), and lists 28% against 14%, where the decisive check is</w:t>
+      </w:r>
+      <w:r>
+        <w:t xml:space="preserve"> </w:t>
+      </w:r>
+      <w:r>
+        <w:t xml:space="preserve">whether every item is stated (36% right when all are, 0% when any item is invented). Put together, grounding,</w:t>
+      </w:r>
+      <w:r>
+        <w:t xml:space="preserve"> </w:t>
+      </w:r>
+      <w:r>
+        <w:t xml:space="preserve">disagreement, emptiness, value length, the column’s sensitivity from ten documents and its kind make a label-free</w:t>
+      </w:r>
+      <w:r>
+        <w:t xml:space="preserve"> </w:t>
+      </w:r>
+      <w:r>
+        <w:t xml:space="preserve">verifier: a logistic regression on them predicts whether a cell is wrong with AUROC 0.85 when cross-validated by</w:t>
+      </w:r>
+      <w:r>
+        <w:t xml:space="preserve"> </w:t>
+      </w:r>
+      <w:r>
+        <w:t xml:space="preserve">column, and 0.75 to 0.89 when trained on four corpora and tested on the fifth. Grounding alone is useless (0.44),</w:t>
+      </w:r>
+      <w:r>
+        <w:t xml:space="preserve"> </w:t>
+      </w:r>
+      <w:r>
+        <w:t xml:space="preserve">disagreement alone gives 0.70; the largest weights are an empty cell, a sensitive column and an invented list item.</w:t>
+      </w:r>
+      <w:r>
+        <w:t xml:space="preserve"> </w:t>
+      </w:r>
+      <w:r>
+        <w:rPr>
+          <w:bCs/>
+          <w:b/>
+        </w:rPr>
+        <w:t xml:space="preserve">Priced rather than counted, the second looks tell a different story from Figure 5b:</w:t>
+      </w:r>
+      <w:r>
+        <w:t xml:space="preserve"> </w:t>
+      </w:r>
+      <w:r>
+        <w:t xml:space="preserve">the most sensitive columns sit</w:t>
+      </w:r>
+      <w:r>
+        <w:t xml:space="preserve"> </w:t>
+      </w:r>
+      <w:r>
+        <w:t xml:space="preserve">in short documents, so most-sensitive-first gives 152 net fixes per dollar at the 32B’s price against 93 for random and</w:t>
+      </w:r>
+      <w:r>
+        <w:t xml:space="preserve"> </w:t>
+      </w:r>
+      <w:r>
+        <w:t xml:space="preserve">111 for the verifier’s ranking, and the document’s length, not the rule, sets the price of a fix. A cascade over</w:t>
+      </w:r>
+      <w:r>
+        <w:t xml:space="preserve"> </w:t>
+      </w:r>
+      <w:r>
+        <w:t xml:space="preserve">documents has to be budgeted in tokens, and a router should weigh the expected fix by the length of what it must read.</w:t>
+      </w:r>
+    </w:p>
+    <w:p>
+      <w:pPr>
+        <w:pStyle w:val="BodyText"/>
+      </w:pPr>
+      <w:r>
+        <w:rPr>
+          <w:iCs/>
+          <w:i/>
+        </w:rPr>
         <w:t xml:space="preserve">What this lets you decide.</w:t>
       </w:r>
       <w:r>
@@ -1233,18 +1524,30 @@
         <w:t xml:space="preserve"> </w:t>
       </w:r>
       <w:r>
-        <w:t xml:space="preserve">definitions themselves need checking.</w:t>
-      </w:r>
-    </w:p>
+        <w:t xml:space="preserve">definitions themselves need checking. A verifier built from grounding, disagreement and sensitivity, which needs</w:t>
+      </w:r>
+      <w:r>
+        <w:t xml:space="preserve"> </w:t>
+      </w:r>
+      <w:r>
+        <w:t xml:space="preserve">neither labels nor a model, tells which cells to trust and which to send to a stronger reader, and that routing should</w:t>
+      </w:r>
+      <w:r>
+        <w:t xml:space="preserve"> </w:t>
+      </w:r>
+      <w:r>
+        <w:t xml:space="preserve">be priced per token, not per cell.</w:t>
+      </w:r>
+    </w:p>
+    <w:bookmarkEnd w:id="36"/>
+    <w:bookmarkStart w:id="49" w:name="X18984107c3adb65f1412ca1d0a0006afa236e9f"/>
     <w:p>
       <w:pPr>
         <w:pStyle w:val="Heading1"/>
       </w:pPr>
-      <w:bookmarkStart w:id="28" w:name="why-do-aggregate-queries-over-extracted-values-lose-their-groups"/>
       <w:r>
         <w:t xml:space="preserve">Why do aggregate queries over extracted values lose their groups?</w:t>
       </w:r>
-      <w:bookmarkEnd w:id="28"/>
     </w:p>
     <w:p>
       <w:pPr>
@@ -1258,18 +1561,21 @@
       </w:r>
       <w:r>
         <w:rPr>
+          <w:bCs/>
           <w:b/>
         </w:rPr>
         <w:t xml:space="preserve">most failures are the wrong set of groups, and almost always too</w:t>
       </w:r>
       <w:r>
         <w:rPr>
+          <w:bCs/>
           <w:b/>
         </w:rPr>
         <w:t xml:space="preserve"> </w:t>
       </w:r>
       <w:r>
         <w:rPr>
+          <w:bCs/>
           <w:b/>
         </w:rPr>
         <w:t xml:space="preserve">few groups.</w:t>
@@ -1299,6 +1605,7 @@
       </w:pPr>
       <w:r>
         <w:rPr>
+          <w:bCs/>
           <w:b/>
         </w:rPr>
         <w:t xml:space="preserve">The groups go missing because extraction collapses labels.</w:t>
@@ -1349,18 +1656,18 @@
           <wp:inline>
             <wp:extent cx="5334000" cy="1745672"/>
             <wp:effectExtent b="0" l="0" r="0" t="0"/>
-            <wp:docPr descr="Figure 6. (a) Distinct values in the extracted GROUP BY column relative to gold. (b) Share of queries returning too few groups, by the number of groups in the gold answer." title="" id="1" name="Picture"/>
+            <wp:docPr descr="Figure 6. (a) Distinct values in the extracted GROUP BY column relative to gold. (b) Share of queries returning too few groups, by the number of groups in the gold answer." title="" id="38" name="Picture"/>
             <a:graphic>
               <a:graphicData uri="http://schemas.openxmlformats.org/drawingml/2006/picture">
                 <pic:pic>
                   <pic:nvPicPr>
-                    <pic:cNvPr descr="figures/b7_label_collapse.png" id="0" name="Picture"/>
+                    <pic:cNvPr descr="figures/b7_label_collapse.png" id="39" name="Picture"/>
                     <pic:cNvPicPr>
                       <a:picLocks noChangeArrowheads="1" noChangeAspect="1"/>
                     </pic:cNvPicPr>
                   </pic:nvPicPr>
                   <pic:blipFill>
-                    <a:blip r:embed="rId29"/>
+                    <a:blip r:embed="rId37"/>
                     <a:stretch>
                       <a:fillRect/>
                     </a:stretch>
@@ -1425,18 +1732,21 @@
       </w:r>
       <w:r>
         <w:rPr>
+          <w:bCs/>
           <w:b/>
         </w:rPr>
         <w:t xml:space="preserve">23% are merged into a label that mostly belongs to a different gold group, and only 9% are left</w:t>
       </w:r>
       <w:r>
         <w:rPr>
+          <w:bCs/>
           <w:b/>
         </w:rPr>
         <w:t xml:space="preserve"> </w:t>
       </w:r>
       <w:r>
         <w:rPr>
+          <w:bCs/>
           <w:b/>
         </w:rPr>
         <w:t xml:space="preserve">empty.</w:t>
@@ -1460,6 +1770,7 @@
       </w:pPr>
       <w:r>
         <w:rPr>
+          <w:bCs/>
           <w:b/>
         </w:rPr>
         <w:t xml:space="preserve">Whether a column collapses depends on what kind of value it holds.</w:t>
@@ -1633,18 +1944,18 @@
           <wp:inline>
             <wp:extent cx="5334000" cy="3031957"/>
             <wp:effectExtent b="0" l="0" r="0" t="0"/>
-            <wp:docPr descr="Figure 7. Where each gold row of a GROUP BY column ends up in the extracted table, by kind of column (a) and by corpus (b), at 100% drift." title="" id="1" name="Picture"/>
+            <wp:docPr descr="Figure 7. Where each gold row of a GROUP BY column ends up in the extracted table, by kind of column (a) and by corpus (b), at 100% drift." title="" id="41" name="Picture"/>
             <a:graphic>
               <a:graphicData uri="http://schemas.openxmlformats.org/drawingml/2006/picture">
                 <pic:pic>
                   <pic:nvPicPr>
-                    <pic:cNvPr descr="figures/b8_label_fate.png" id="0" name="Picture"/>
+                    <pic:cNvPr descr="figures/b8_label_fate.png" id="42" name="Picture"/>
                     <pic:cNvPicPr>
                       <a:picLocks noChangeArrowheads="1" noChangeAspect="1"/>
                     </pic:cNvPicPr>
                   </pic:nvPicPr>
                   <pic:blipFill>
-                    <a:blip r:embed="rId30"/>
+                    <a:blip r:embed="rId40"/>
                     <a:stretch>
                       <a:fillRect/>
                     </a:stretch>
@@ -1738,18 +2049,18 @@
           <wp:inline>
             <wp:extent cx="5334000" cy="1891145"/>
             <wp:effectExtent b="0" l="0" r="0" t="0"/>
-            <wp:docPr descr="Figure 8. Mean score by aggregate across drift levels, with on-demand extraction (a) and the static build (b)." title="" id="1" name="Picture"/>
+            <wp:docPr descr="Figure 8. Mean score by aggregate across drift levels, with on-demand extraction (a) and the static build (b)." title="" id="44" name="Picture"/>
             <a:graphic>
               <a:graphicData uri="http://schemas.openxmlformats.org/drawingml/2006/picture">
                 <pic:pic>
                   <pic:nvPicPr>
-                    <pic:cNvPr descr="figures/b1_aggregate_drift.png" id="0" name="Picture"/>
+                    <pic:cNvPr descr="figures/b1_aggregate_drift.png" id="45" name="Picture"/>
                     <pic:cNvPicPr>
                       <a:picLocks noChangeArrowheads="1" noChangeAspect="1"/>
                     </pic:cNvPicPr>
                   </pic:nvPicPr>
                   <pic:blipFill>
-                    <a:blip r:embed="rId31"/>
+                    <a:blip r:embed="rId43"/>
                     <a:stretch>
                       <a:fillRect/>
                     </a:stretch>
@@ -1799,18 +2110,18 @@
           <wp:inline>
             <wp:extent cx="5334000" cy="1909010"/>
             <wp:effectExtent b="0" l="0" r="0" t="0"/>
-            <wp:docPr descr="Figure 9. Aggregate values in matched groups at 100% drift: too low, within 20% of gold, or too high." title="" id="1" name="Picture"/>
+            <wp:docPr descr="Figure 9. Aggregate values in matched groups at 100% drift: too low, within 20% of gold, or too high." title="" id="47" name="Picture"/>
             <a:graphic>
               <a:graphicData uri="http://schemas.openxmlformats.org/drawingml/2006/picture">
                 <pic:pic>
                   <pic:nvPicPr>
-                    <pic:cNvPr descr="figures/b6_aggregate_direction.png" id="0" name="Picture"/>
+                    <pic:cNvPr descr="figures/b6_aggregate_direction.png" id="48" name="Picture"/>
                     <pic:cNvPicPr>
                       <a:picLocks noChangeArrowheads="1" noChangeAspect="1"/>
                     </pic:cNvPicPr>
                   </pic:nvPicPr>
                   <pic:blipFill>
-                    <a:blip r:embed="rId32"/>
+                    <a:blip r:embed="rId46"/>
                     <a:stretch>
                       <a:fillRect/>
                     </a:stretch>
@@ -1869,18 +2180,21 @@
       </w:r>
       <w:r>
         <w:rPr>
+          <w:bCs/>
           <w:b/>
         </w:rPr>
         <w:t xml:space="preserve">Part of that ordering is a property of the aggregate and part is a property of which</w:t>
       </w:r>
       <w:r>
         <w:rPr>
+          <w:bCs/>
           <w:b/>
         </w:rPr>
         <w:t xml:space="preserve"> </w:t>
       </w:r>
       <w:r>
         <w:rPr>
+          <w:bCs/>
           <w:b/>
         </w:rPr>
         <w:t xml:space="preserve">corpora the queries come from.</w:t>
@@ -1990,6 +2304,7 @@
       </w:pPr>
       <w:r>
         <w:rPr>
+          <w:iCs/>
           <w:i/>
         </w:rPr>
         <w:t xml:space="preserve">What this lets you decide.</w:t>
@@ -2031,15 +2346,15 @@
         <w:t xml:space="preserve">fixed vocabulary before grouping.</w:t>
       </w:r>
     </w:p>
+    <w:bookmarkEnd w:id="49"/>
+    <w:bookmarkStart w:id="53" w:name="X6ecc12248d1b3b38a7c6a82bb5429965b7549d2"/>
     <w:p>
       <w:pPr>
         <w:pStyle w:val="Heading1"/>
       </w:pPr>
-      <w:bookmarkStart w:id="33" w:name="do-these-explanations-predict-where-another-system-fails"/>
       <w:r>
         <w:t xml:space="preserve">Do these explanations predict where another system fails?</w:t>
       </w:r>
-      <w:bookmarkEnd w:id="33"/>
     </w:p>
     <w:p>
       <w:pPr>
@@ -2073,6 +2388,7 @@
       </w:pPr>
       <w:r>
         <w:rPr>
+          <w:bCs/>
           <w:b/>
         </w:rPr>
         <w:t xml:space="preserve">Most predictions hold.</w:t>
@@ -2129,18 +2445,18 @@
           <wp:inline>
             <wp:extent cx="5334000" cy="1981200"/>
             <wp:effectExtent b="0" l="0" r="0" t="0"/>
-            <wp:docPr descr="Figure 10. (a) Share of DocETL’s values that are wrong, split by whether our two prompts agree on the cell. (b) Share of GROUP BY rows that keep the exact gold label, by kind of column, in our system and in DocETL (non-empty rows, numbers compared as numbers)." title="" id="1" name="Picture"/>
+            <wp:docPr descr="Figure 10. (a) Share of DocETL’s values that are wrong, split by whether our two prompts agree on the cell. (b) Share of GROUP BY rows that keep the exact gold label, by kind of column, in our system and in DocETL (non-empty rows, numbers compared as numbers)." title="" id="51" name="Picture"/>
             <a:graphic>
               <a:graphicData uri="http://schemas.openxmlformats.org/drawingml/2006/picture">
                 <pic:pic>
                   <pic:nvPicPr>
-                    <pic:cNvPr descr="figures/w8_docetl_predict.png" id="0" name="Picture"/>
+                    <pic:cNvPr descr="figures/w8_docetl_predict.png" id="52" name="Picture"/>
                     <pic:cNvPicPr>
                       <a:picLocks noChangeArrowheads="1" noChangeAspect="1"/>
                     </pic:cNvPicPr>
                   </pic:nvPicPr>
                   <pic:blipFill>
-                    <a:blip r:embed="rId34"/>
+                    <a:blip r:embed="rId50"/>
                     <a:stretch>
                       <a:fillRect/>
                     </a:stretch>
@@ -2193,6 +2509,7 @@
       </w:pPr>
       <w:r>
         <w:rPr>
+          <w:bCs/>
           <w:b/>
         </w:rPr>
         <w:t xml:space="preserve">Three predictions fail, and each failure narrows an explanation.</w:t>
@@ -2270,6 +2587,7 @@
       </w:pPr>
       <w:r>
         <w:rPr>
+          <w:iCs/>
           <w:i/>
         </w:rPr>
         <w:t xml:space="preserve">What this lets you decide.</w:t>
@@ -2299,15 +2617,15 @@
         <w:t xml:space="preserve">it reads, such as the safety of numbers and of averages, have to be checked per system.</w:t>
       </w:r>
     </w:p>
+    <w:bookmarkEnd w:id="53"/>
+    <w:bookmarkStart w:id="57" w:name="X064feaf67e951941e24849376974c3442da14c9"/>
     <w:p>
       <w:pPr>
         <w:pStyle w:val="Heading1"/>
       </w:pPr>
-      <w:bookmarkStart w:id="35" w:name="why-is-anticipating-a-column-cheap-and-when-is-it-worth-it"/>
       <w:r>
         <w:t xml:space="preserve">Why is anticipating a column cheap, and when is it worth it?</w:t>
       </w:r>
-      <w:bookmarkEnd w:id="35"/>
     </w:p>
     <w:p>
       <w:pPr>
@@ -2321,6 +2639,7 @@
       </w:r>
       <w:r>
         <w:rPr>
+          <w:iCs/>
           <w:i/>
         </w:rPr>
         <w:t xml:space="preserve">break-even probability</w:t>
@@ -2342,18 +2661,21 @@
       </w:r>
       <w:r>
         <w:rPr>
+          <w:bCs/>
           <w:b/>
         </w:rPr>
         <w:t xml:space="preserve">Both follow</w:t>
       </w:r>
       <w:r>
         <w:rPr>
+          <w:bCs/>
           <w:b/>
         </w:rPr>
         <w:t xml:space="preserve"> </w:t>
       </w:r>
       <w:r>
         <w:rPr>
+          <w:bCs/>
           <w:b/>
         </w:rPr>
         <w:t xml:space="preserve">from where the tokens go: every extraction prompt contains the whole document.</w:t>
@@ -2389,6 +2711,7 @@
       </w:pPr>
       <w:r>
         <w:rPr>
+          <w:bCs/>
           <w:b/>
         </w:rPr>
         <w:t xml:space="preserve">A model built only from these token counts predicts the measured break-even within about 30% on every corpus</w:t>
@@ -2409,21 +2732,21 @@
     <w:tbl>
       <w:tblPr>
         <w:tblStyle w:val="Table"/>
-        <w:tblW w:type="pct" w:w="0.0"/>
-        <w:tblLook w:firstRow="1"/>
+        <w:tblW w:type="auto" w:w="0"/>
+        <w:tblLook w:firstRow="1" w:lastRow="0" w:firstColumn="0" w:lastColumn="0" w:noHBand="0" w:noVBand="0" w:val="0020"/>
       </w:tblPr>
-      <w:tblGrid/>
+      <w:tblGrid>
+        <w:gridCol w:w="1980"/>
+        <w:gridCol w:w="1980"/>
+        <w:gridCol w:w="1980"/>
+        <w:gridCol w:w="1980"/>
+      </w:tblGrid>
       <w:tr>
         <w:trPr>
-          <w:cnfStyle w:firstRow="1"/>
+          <w:tblHeader w:val="true"/>
         </w:trPr>
         <w:tc>
-          <w:tcPr>
-            <w:tcBorders>
-              <w:bottom w:val="single"/>
-            </w:tcBorders>
-            <w:vAlign w:val="bottom"/>
-          </w:tcPr>
+          <w:tcPr/>
           <w:p>
             <w:pPr>
               <w:pStyle w:val="Compact"/>
@@ -2435,12 +2758,7 @@
           </w:p>
         </w:tc>
         <w:tc>
-          <w:tcPr>
-            <w:tcBorders>
-              <w:bottom w:val="single"/>
-            </w:tcBorders>
-            <w:vAlign w:val="bottom"/>
-          </w:tcPr>
+          <w:tcPr/>
           <w:p>
             <w:pPr>
               <w:pStyle w:val="Compact"/>
@@ -2452,12 +2770,7 @@
           </w:p>
         </w:tc>
         <w:tc>
-          <w:tcPr>
-            <w:tcBorders>
-              <w:bottom w:val="single"/>
-            </w:tcBorders>
-            <w:vAlign w:val="bottom"/>
-          </w:tcPr>
+          <w:tcPr/>
           <w:p>
             <w:pPr>
               <w:pStyle w:val="Compact"/>
@@ -2469,12 +2782,7 @@
           </w:p>
         </w:tc>
         <w:tc>
-          <w:tcPr>
-            <w:tcBorders>
-              <w:bottom w:val="single"/>
-            </w:tcBorders>
-            <w:vAlign w:val="bottom"/>
-          </w:tcPr>
+          <w:tcPr/>
           <w:p>
             <w:pPr>
               <w:pStyle w:val="Compact"/>
@@ -2488,6 +2796,7 @@
       </w:tr>
       <w:tr>
         <w:tc>
+          <w:tcPr/>
           <w:p>
             <w:pPr>
               <w:pStyle w:val="Compact"/>
@@ -2499,6 +2808,7 @@
           </w:p>
         </w:tc>
         <w:tc>
+          <w:tcPr/>
           <w:p>
             <w:pPr>
               <w:pStyle w:val="Compact"/>
@@ -2510,6 +2820,7 @@
           </w:p>
         </w:tc>
         <w:tc>
+          <w:tcPr/>
           <w:p>
             <w:pPr>
               <w:pStyle w:val="Compact"/>
@@ -2521,6 +2832,7 @@
           </w:p>
         </w:tc>
         <w:tc>
+          <w:tcPr/>
           <w:p>
             <w:pPr>
               <w:pStyle w:val="Compact"/>
@@ -2534,6 +2846,7 @@
       </w:tr>
       <w:tr>
         <w:tc>
+          <w:tcPr/>
           <w:p>
             <w:pPr>
               <w:pStyle w:val="Compact"/>
@@ -2545,6 +2858,7 @@
           </w:p>
         </w:tc>
         <w:tc>
+          <w:tcPr/>
           <w:p>
             <w:pPr>
               <w:pStyle w:val="Compact"/>
@@ -2556,6 +2870,7 @@
           </w:p>
         </w:tc>
         <w:tc>
+          <w:tcPr/>
           <w:p>
             <w:pPr>
               <w:pStyle w:val="Compact"/>
@@ -2567,6 +2882,7 @@
           </w:p>
         </w:tc>
         <w:tc>
+          <w:tcPr/>
           <w:p>
             <w:pPr>
               <w:pStyle w:val="Compact"/>
@@ -2580,6 +2896,7 @@
       </w:tr>
       <w:tr>
         <w:tc>
+          <w:tcPr/>
           <w:p>
             <w:pPr>
               <w:pStyle w:val="Compact"/>
@@ -2591,6 +2908,7 @@
           </w:p>
         </w:tc>
         <w:tc>
+          <w:tcPr/>
           <w:p>
             <w:pPr>
               <w:pStyle w:val="Compact"/>
@@ -2602,6 +2920,7 @@
           </w:p>
         </w:tc>
         <w:tc>
+          <w:tcPr/>
           <w:p>
             <w:pPr>
               <w:pStyle w:val="Compact"/>
@@ -2613,6 +2932,7 @@
           </w:p>
         </w:tc>
         <w:tc>
+          <w:tcPr/>
           <w:p>
             <w:pPr>
               <w:pStyle w:val="Compact"/>
@@ -2626,6 +2946,7 @@
       </w:tr>
       <w:tr>
         <w:tc>
+          <w:tcPr/>
           <w:p>
             <w:pPr>
               <w:pStyle w:val="Compact"/>
@@ -2637,6 +2958,7 @@
           </w:p>
         </w:tc>
         <w:tc>
+          <w:tcPr/>
           <w:p>
             <w:pPr>
               <w:pStyle w:val="Compact"/>
@@ -2648,6 +2970,7 @@
           </w:p>
         </w:tc>
         <w:tc>
+          <w:tcPr/>
           <w:p>
             <w:pPr>
               <w:pStyle w:val="Compact"/>
@@ -2659,6 +2982,7 @@
           </w:p>
         </w:tc>
         <w:tc>
+          <w:tcPr/>
           <w:p>
             <w:pPr>
               <w:pStyle w:val="Compact"/>
@@ -2672,6 +2996,7 @@
       </w:tr>
       <w:tr>
         <w:tc>
+          <w:tcPr/>
           <w:p>
             <w:pPr>
               <w:pStyle w:val="Compact"/>
@@ -2683,6 +3008,7 @@
           </w:p>
         </w:tc>
         <w:tc>
+          <w:tcPr/>
           <w:p>
             <w:pPr>
               <w:pStyle w:val="Compact"/>
@@ -2694,6 +3020,7 @@
           </w:p>
         </w:tc>
         <w:tc>
+          <w:tcPr/>
           <w:p>
             <w:pPr>
               <w:pStyle w:val="Compact"/>
@@ -2705,6 +3032,7 @@
           </w:p>
         </w:tc>
         <w:tc>
+          <w:tcPr/>
           <w:p>
             <w:pPr>
               <w:pStyle w:val="Compact"/>
@@ -2740,18 +3068,18 @@
           <wp:inline>
             <wp:extent cx="5334000" cy="2085109"/>
             <wp:effectExtent b="0" l="0" r="0" t="0"/>
-            <wp:docPr descr="Figure 11. Left: composition of one extraction prompt at each corpus’s median document length. Right: predicted and measured break-even probability." title="" id="1" name="Picture"/>
+            <wp:docPr descr="Figure 11. Left: composition of one extraction prompt at each corpus’s median document length. Right: predicted and measured break-even probability." title="" id="55" name="Picture"/>
             <a:graphic>
               <a:graphicData uri="http://schemas.openxmlformats.org/drawingml/2006/picture">
                 <pic:pic>
                   <pic:nvPicPr>
-                    <pic:cNvPr descr="figures/w2_cost_mechanism.png" id="0" name="Picture"/>
+                    <pic:cNvPr descr="figures/w2_cost_mechanism.png" id="56" name="Picture"/>
                     <pic:cNvPicPr>
                       <a:picLocks noChangeArrowheads="1" noChangeAspect="1"/>
                     </pic:cNvPicPr>
                   </pic:nvPicPr>
                   <pic:blipFill>
-                    <a:blip r:embed="rId36"/>
+                    <a:blip r:embed="rId54"/>
                     <a:stretch>
                       <a:fillRect/>
                     </a:stretch>
@@ -2822,6 +3150,7 @@
       </w:r>
       <w:r>
         <w:rPr>
+          <w:bCs/>
           <w:b/>
         </w:rPr>
         <w:t xml:space="preserve">By tokens alone, anticipating every column of these schemas would pay.</w:t>
@@ -2857,6 +3186,7 @@
       </w:pPr>
       <w:r>
         <w:rPr>
+          <w:iCs/>
           <w:i/>
         </w:rPr>
         <w:t xml:space="preserve">What this lets you decide.</w:t>
@@ -2898,15 +3228,15 @@
         <w:t xml:space="preserve">columns is accuracy, not cost.</w:t>
       </w:r>
     </w:p>
+    <w:bookmarkEnd w:id="57"/>
+    <w:bookmarkStart w:id="61" w:name="Xdb61421cd5492d7ce390f9f554972516b04d38e"/>
     <w:p>
       <w:pPr>
         <w:pStyle w:val="Heading1"/>
       </w:pPr>
-      <w:bookmarkStart w:id="37" w:name="why-cant-a-budget-policy-that-reasons-about-cost-and-timing-beat-first-come-first-served"/>
       <w:r>
         <w:t xml:space="preserve">Why can’t a budget policy that reasons about cost and timing beat first come, first served?</w:t>
       </w:r>
-      <w:bookmarkEnd w:id="37"/>
     </w:p>
     <w:p>
       <w:pPr>
@@ -2952,6 +3282,7 @@
       </w:pPr>
       <w:r>
         <w:rPr>
+          <w:bCs/>
           <w:b/>
         </w:rPr>
         <w:t xml:space="preserve">The main reason is that an extraction’s value mostly arrives later.</w:t>
@@ -2990,18 +3321,18 @@
           <wp:inline>
             <wp:extent cx="5334000" cy="2021305"/>
             <wp:effectExtent b="0" l="0" r="0" t="0"/>
-            <wp:docPr descr="Figure 12. Share of each extraction’s score gain that goes to its own query and to later queries." title="" id="1" name="Picture"/>
+            <wp:docPr descr="Figure 12. Share of each extraction’s score gain that goes to its own query and to later queries." title="" id="59" name="Picture"/>
             <a:graphic>
               <a:graphicData uri="http://schemas.openxmlformats.org/drawingml/2006/picture">
                 <pic:pic>
                   <pic:nvPicPr>
-                    <pic:cNvPr descr="figures/w3_value_timing.png" id="0" name="Picture"/>
+                    <pic:cNvPr descr="figures/w3_value_timing.png" id="60" name="Picture"/>
                     <pic:cNvPicPr>
                       <a:picLocks noChangeArrowheads="1" noChangeAspect="1"/>
                     </pic:cNvPicPr>
                   </pic:nvPicPr>
                   <pic:blipFill>
-                    <a:blip r:embed="rId38"/>
+                    <a:blip r:embed="rId58"/>
                     <a:stretch>
                       <a:fillRect/>
                     </a:stretch>
@@ -3048,18 +3379,21 @@
       </w:pPr>
       <w:r>
         <w:rPr>
+          <w:bCs/>
           <w:b/>
         </w:rPr>
         <w:t xml:space="preserve">Capping the size of an extraction always loses (by 0.006 to 0.029), because the largest extractions are the most</w:t>
       </w:r>
       <w:r>
         <w:rPr>
+          <w:bCs/>
           <w:b/>
         </w:rPr>
         <w:t xml:space="preserve"> </w:t>
       </w:r>
       <w:r>
         <w:rPr>
+          <w:bCs/>
           <w:b/>
         </w:rPr>
         <w:t xml:space="preserve">valuable ones.</w:t>
@@ -3095,6 +3429,7 @@
       </w:pPr>
       <w:r>
         <w:rPr>
+          <w:bCs/>
           <w:b/>
         </w:rPr>
         <w:t xml:space="preserve">Pacing does not drop extractions, it delays them, so whether it helps depends on two opposing effects.</w:t>
@@ -3158,18 +3493,21 @@
       </w:r>
       <w:r>
         <w:rPr>
+          <w:bCs/>
           <w:b/>
         </w:rPr>
         <w:t xml:space="preserve">So pacing wins only when re-extracting a column in</w:t>
       </w:r>
       <w:r>
         <w:rPr>
+          <w:bCs/>
           <w:b/>
         </w:rPr>
         <w:t xml:space="preserve"> </w:t>
       </w:r>
       <w:r>
         <w:rPr>
+          <w:bCs/>
           <w:b/>
         </w:rPr>
         <w:t xml:space="preserve">different company happens to improve its values by more than the delay costs.</w:t>
@@ -3233,6 +3571,7 @@
       </w:pPr>
       <w:r>
         <w:rPr>
+          <w:iCs/>
           <w:i/>
         </w:rPr>
         <w:t xml:space="preserve">What this lets you decide.</w:t>
@@ -3274,15 +3613,15 @@
         <w:t xml:space="preserve">prompt fixed, and orders extractions so that filter columns come first addresses all three; we have not built it.</w:t>
       </w:r>
     </w:p>
+    <w:bookmarkEnd w:id="61"/>
+    <w:bookmarkStart w:id="62" w:name="Xbd5cb092345892faad08ce8e3e52d3f9d449dcf"/>
     <w:p>
       <w:pPr>
         <w:pStyle w:val="Heading1"/>
       </w:pPr>
-      <w:bookmarkStart w:id="39" w:name="why-does-extracting-a-column-for-more-documents-sometimes-make-answers-worse"/>
       <w:r>
         <w:t xml:space="preserve">Why does extracting a column for more documents sometimes make answers worse?</w:t>
       </w:r>
-      <w:bookmarkEnd w:id="39"/>
     </w:p>
     <w:p>
       <w:pPr>
@@ -3290,6 +3629,7 @@
       </w:pPr>
       <w:r>
         <w:rPr>
+          <w:bCs/>
           <w:b/>
         </w:rPr>
         <w:t xml:space="preserve">When a column does not apply to a document, the model rarely leaves it empty</w:t>
@@ -3372,6 +3712,7 @@
       </w:pPr>
       <w:r>
         <w:rPr>
+          <w:iCs/>
           <w:i/>
         </w:rPr>
         <w:t xml:space="preserve">What this lets you decide.</w:t>
@@ -3395,15 +3736,15 @@
         <w:t xml:space="preserve">should allow and encourage an empty answer; a schema that declares such a column never null invites invented values.</w:t>
       </w:r>
     </w:p>
+    <w:bookmarkEnd w:id="62"/>
+    <w:bookmarkStart w:id="63" w:name="Xb940d56232251f922fc395f7be93a4c760c95be"/>
     <w:p>
       <w:pPr>
         <w:pStyle w:val="Heading1"/>
       </w:pPr>
-      <w:bookmarkStart w:id="40" w:name="why-does-a-planner-that-trusts-its-own-extractions-stop-improving"/>
       <w:r>
         <w:t xml:space="preserve">Why does a planner that trusts its own extractions stop improving?</w:t>
       </w:r>
-      <w:bookmarkEnd w:id="40"/>
     </w:p>
     <w:p>
       <w:pPr>
@@ -3411,18 +3752,21 @@
       </w:pPr>
       <w:r>
         <w:rPr>
+          <w:bCs/>
           <w:b/>
         </w:rPr>
         <w:t xml:space="preserve">The planner estimates its loss as disagreement with each query’s own extraction, which means it treats its own</w:t>
       </w:r>
       <w:r>
         <w:rPr>
+          <w:bCs/>
           <w:b/>
         </w:rPr>
         <w:t xml:space="preserve"> </w:t>
       </w:r>
       <w:r>
         <w:rPr>
+          <w:bCs/>
           <w:b/>
         </w:rPr>
         <w:t xml:space="preserve">extractions as correct.</w:t>
@@ -3464,6 +3808,7 @@
       </w:pPr>
       <w:r>
         <w:rPr>
+          <w:iCs/>
           <w:i/>
         </w:rPr>
         <w:t xml:space="preserve">What this lets you decide.</w:t>
@@ -3493,15 +3838,15 @@
         <w:t xml:space="preserve">We know the cause but have not built such a planner.</w:t>
       </w:r>
     </w:p>
+    <w:bookmarkEnd w:id="63"/>
+    <w:bookmarkStart w:id="70" w:name="Xdb894172f5ab5998735e9c0e4b8026977bb2e39"/>
     <w:p>
       <w:pPr>
         <w:pStyle w:val="Heading1"/>
       </w:pPr>
-      <w:bookmarkStart w:id="41" w:name="why-do-joins-fail-when-each-tables-keys-are-extracted-separately"/>
       <w:r>
         <w:t xml:space="preserve">Why do joins fail when each table’s keys are extracted separately?</w:t>
       </w:r>
-      <w:bookmarkEnd w:id="41"/>
     </w:p>
     <w:p>
       <w:pPr>
@@ -3521,18 +3866,21 @@
       </w:r>
       <w:r>
         <w:rPr>
+          <w:bCs/>
           <w:b/>
         </w:rPr>
         <w:t xml:space="preserve">A join only matches rows whose keys agree, and keys</w:t>
       </w:r>
       <w:r>
         <w:rPr>
+          <w:bCs/>
           <w:b/>
         </w:rPr>
         <w:t xml:space="preserve"> </w:t>
       </w:r>
       <w:r>
         <w:rPr>
+          <w:bCs/>
           <w:b/>
         </w:rPr>
         <w:t xml:space="preserve">extracted independently mostly do not.</w:t>
@@ -3571,18 +3919,18 @@
           <wp:inline>
             <wp:extent cx="5334000" cy="2311400"/>
             <wp:effectExtent b="0" l="0" r="0" t="0"/>
-            <wp:docPr descr="Figure 13. Share of rows whose join key finds a partner in the joined table." title="" id="1" name="Picture"/>
+            <wp:docPr descr="Figure 13. Share of rows whose join key finds a partner in the joined table." title="" id="65" name="Picture"/>
             <a:graphic>
               <a:graphicData uri="http://schemas.openxmlformats.org/drawingml/2006/picture">
                 <pic:pic>
                   <pic:nvPicPr>
-                    <pic:cNvPr descr="figures/w5_join_keys.png" id="0" name="Picture"/>
+                    <pic:cNvPr descr="figures/w5_join_keys.png" id="66" name="Picture"/>
                     <pic:cNvPicPr>
                       <a:picLocks noChangeArrowheads="1" noChangeAspect="1"/>
                     </pic:cNvPicPr>
                   </pic:nvPicPr>
                   <pic:blipFill>
-                    <a:blip r:embed="rId42"/>
+                    <a:blip r:embed="rId64"/>
                     <a:stretch>
                       <a:fillRect/>
                     </a:stretch>
@@ -3653,18 +4001,21 @@
       </w:r>
       <w:r>
         <w:rPr>
+          <w:iCs/>
           <w:i/>
         </w:rPr>
         <w:t xml:space="preserve">Per-query extraction</w:t>
       </w:r>
       <w:r>
         <w:rPr>
+          <w:iCs/>
           <w:i/>
         </w:rPr>
         <w:t xml:space="preserve"> </w:t>
       </w:r>
       <w:r>
         <w:rPr>
+          <w:iCs/>
           <w:i/>
         </w:rPr>
         <w:t xml:space="preserve">is a lottery over contexts, and freezing on the first draw makes every later query hostage to it.</w:t>
@@ -3698,18 +4049,21 @@
       </w:r>
       <w:r>
         <w:rPr>
+          <w:bCs/>
           <w:b/>
         </w:rPr>
         <w:t xml:space="preserve">on players DocETL then scores 0.145 to 0.164 in two runs against its own 0.108, with join</w:t>
       </w:r>
       <w:r>
         <w:rPr>
+          <w:bCs/>
           <w:b/>
         </w:rPr>
         <w:t xml:space="preserve"> </w:t>
       </w:r>
       <w:r>
         <w:rPr>
+          <w:bCs/>
           <w:b/>
         </w:rPr>
         <w:t xml:space="preserve">queries at 0.029 to 0.055 against 0.022 and about 60 queries better against 35 worse, at a twelfth of the calls</w:t>
@@ -3776,6 +4130,7 @@
       </w:r>
       <w:r>
         <w:rPr>
+          <w:iCs/>
           <w:i/>
         </w:rPr>
         <w:t xml:space="preserve">less</w:t>
@@ -3808,18 +4163,18 @@
           <wp:inline>
             <wp:extent cx="5334000" cy="1981200"/>
             <wp:effectExtent b="0" l="0" r="0" t="0"/>
-            <wp:docPr descr="Figure 14. DocETL’s mean query score and number of model calls on the same queries: per-query extraction, every column frozen on its first context, frozen on the better of its first two contexts (two runs), and frozen on a determined context." title="" id="1" name="Picture"/>
+            <wp:docPr descr="Figure 14. DocETL’s mean query score and number of model calls on the same queries: per-query extraction, every column frozen on its first context, frozen on the better of its first two contexts (two runs), and frozen on a determined context." title="" id="68" name="Picture"/>
             <a:graphic>
               <a:graphicData uri="http://schemas.openxmlformats.org/drawingml/2006/picture">
                 <pic:pic>
                   <pic:nvPicPr>
-                    <pic:cNvPr descr="figures/w11_frozen_docetl.png" id="0" name="Picture"/>
+                    <pic:cNvPr descr="figures/w11_frozen_docetl.png" id="69" name="Picture"/>
                     <pic:cNvPicPr>
                       <a:picLocks noChangeArrowheads="1" noChangeAspect="1"/>
                     </pic:cNvPicPr>
                   </pic:nvPicPr>
                   <pic:blipFill>
-                    <a:blip r:embed="rId43"/>
+                    <a:blip r:embed="rId67"/>
                     <a:stretch>
                       <a:fillRect/>
                     </a:stretch>
@@ -3880,6 +4235,7 @@
       </w:pPr>
       <w:r>
         <w:rPr>
+          <w:iCs/>
           <w:i/>
         </w:rPr>
         <w:t xml:space="preserve">What this lets you decide.</w:t>
@@ -3915,15 +4271,15 @@
         <w:t xml:space="preserve">extraction of it.</w:t>
       </w:r>
     </w:p>
+    <w:bookmarkEnd w:id="70"/>
+    <w:bookmarkStart w:id="74" w:name="Xbd704315bbce43bad443e692e96e2196f2e3232"/>
     <w:p>
       <w:pPr>
         <w:pStyle w:val="Heading1"/>
       </w:pPr>
-      <w:bookmarkStart w:id="44" w:name="why-does-telling-the-model-what-a-column-means-matter-so-much"/>
       <w:r>
         <w:t xml:space="preserve">Why does telling the model what a column means matter so much?</w:t>
       </w:r>
-      <w:bookmarkEnd w:id="44"/>
     </w:p>
     <w:p>
       <w:pPr>
@@ -3978,18 +4334,18 @@
           <wp:inline>
             <wp:extent cx="5334000" cy="2189747"/>
             <wp:effectExtent b="0" l="0" r="0" t="0"/>
-            <wp:docPr descr="Figure 15. Share of cells correct with and without field descriptions." title="" id="1" name="Picture"/>
+            <wp:docPr descr="Figure 15. Share of cells correct with and without field descriptions." title="" id="72" name="Picture"/>
             <a:graphic>
               <a:graphicData uri="http://schemas.openxmlformats.org/drawingml/2006/picture">
                 <pic:pic>
                   <pic:nvPicPr>
-                    <pic:cNvPr descr="figures/w6_specification.png" id="0" name="Picture"/>
+                    <pic:cNvPr descr="figures/w6_specification.png" id="73" name="Picture"/>
                     <pic:cNvPicPr>
                       <a:picLocks noChangeArrowheads="1" noChangeAspect="1"/>
                     </pic:cNvPicPr>
                   </pic:nvPicPr>
                   <pic:blipFill>
-                    <a:blip r:embed="rId45"/>
+                    <a:blip r:embed="rId71"/>
                     <a:stretch>
                       <a:fillRect/>
                     </a:stretch>
@@ -4030,6 +4386,7 @@
       </w:pPr>
       <w:r>
         <w:rPr>
+          <w:iCs/>
           <w:i/>
         </w:rPr>
         <w:t xml:space="preserve">What this lets you decide.</w:t>
@@ -4053,15 +4410,382 @@
         <w:t xml:space="preserve">between prompts, and categories whose labels the model draws differently from the data.</w:t>
       </w:r>
     </w:p>
+    <w:bookmarkEnd w:id="74"/>
+    <w:bookmarkStart w:id="75" w:name="X34eaed4bbf940b4d6e6bee49bb90fe986f37356"/>
     <w:p>
       <w:pPr>
         <w:pStyle w:val="Heading1"/>
       </w:pPr>
-      <w:bookmarkStart w:id="46" w:name="what-carries-over-to-other-problems"/>
+      <w:r>
+        <w:t xml:space="preserve">What does the workload tell the system that the documents do not?</w:t>
+      </w:r>
+    </w:p>
+    <w:p>
+      <w:pPr>
+        <w:pStyle w:val="FirstParagraph"/>
+      </w:pPr>
+      <w:r>
+        <w:t xml:space="preserve">The system reads the reference workload for five things, and each has been measured on its own</w:t>
+      </w:r>
+      <w:r>
+        <w:t xml:space="preserve"> </w:t>
+      </w:r>
+      <w:r>
+        <w:t xml:space="preserve">(</w:t>
+      </w:r>
+      <w:r>
+        <w:rPr>
+          <w:rStyle w:val="VerbatimChar"/>
+        </w:rPr>
+        <w:t xml:space="preserve">WORKLOAD_AWARENESS.md</w:t>
+      </w:r>
+      <w:r>
+        <w:t xml:space="preserve">).</w:t>
+      </w:r>
+      <w:r>
+        <w:t xml:space="preserve"> </w:t>
+      </w:r>
+      <w:r>
+        <w:rPr>
+          <w:iCs/>
+          <w:i/>
+        </w:rPr>
+        <w:t xml:space="preserve">Which columns to extract:</w:t>
+      </w:r>
+      <w:r>
+        <w:t xml:space="preserve"> </w:t>
+      </w:r>
+      <w:r>
+        <w:t xml:space="preserve">the reference queries use 26% to 48% of the schema’s columns,</w:t>
+      </w:r>
+      <w:r>
+        <w:t xml:space="preserve"> </w:t>
+      </w:r>
+      <w:r>
+        <w:t xml:space="preserve">and their three most used columns carry 43% to 53% of all uses; reading them up front buys cost, not accuracy, since</w:t>
+      </w:r>
+      <w:r>
+        <w:t xml:space="preserve"> </w:t>
+      </w:r>
+      <w:r>
+        <w:t xml:space="preserve">cutting the reference workload to a tenth of its queries raises tokens by 7% to 23% and leaves the scores unchanged.</w:t>
+      </w:r>
+      <w:r>
+        <w:t xml:space="preserve"> </w:t>
+      </w:r>
+      <w:r>
+        <w:rPr>
+          <w:iCs/>
+          <w:i/>
+        </w:rPr>
+        <w:t xml:space="preserve">The shape of the queries to come:</w:t>
+      </w:r>
+      <w:r>
+        <w:t xml:space="preserve"> </w:t>
+      </w:r>
+      <w:r>
+        <w:t xml:space="preserve">by construction no test query’s source is among the reference queries, yet 76% to</w:t>
+      </w:r>
+      <w:r>
+        <w:t xml:space="preserve"> </w:t>
+      </w:r>
+      <w:r>
+        <w:t xml:space="preserve">100% of them share the tables, joins, aggregates and grouping of a reference query, so under full column drift the</w:t>
+      </w:r>
+      <w:r>
+        <w:t xml:space="preserve"> </w:t>
+      </w:r>
+      <w:r>
+        <w:t xml:space="preserve">workload still says</w:t>
+      </w:r>
+      <w:r>
+        <w:t xml:space="preserve"> </w:t>
+      </w:r>
+      <w:r>
+        <w:rPr>
+          <w:iCs/>
+          <w:i/>
+        </w:rPr>
+        <w:t xml:space="preserve">how</w:t>
+      </w:r>
+      <w:r>
+        <w:t xml:space="preserve"> </w:t>
+      </w:r>
+      <w:r>
+        <w:t xml:space="preserve">a column will be used, which is what gives one definition per join key, derived attributes,</w:t>
+      </w:r>
+      <w:r>
+        <w:t xml:space="preserve"> </w:t>
+      </w:r>
+      <w:r>
+        <w:t xml:space="preserve">and the value kind a column needs.</w:t>
+      </w:r>
+      <w:r>
+        <w:t xml:space="preserve"> </w:t>
+      </w:r>
+      <w:r>
+        <w:rPr>
+          <w:iCs/>
+          <w:i/>
+        </w:rPr>
+        <w:t xml:space="preserve">The vocabulary queries compare against:</w:t>
+      </w:r>
+      <w:r>
+        <w:t xml:space="preserve"> </w:t>
+      </w:r>
+      <w:r>
+        <w:t xml:space="preserve">about half of the constants in the test</w:t>
+      </w:r>
+      <w:r>
+        <w:t xml:space="preserve"> </w:t>
+      </w:r>
+      <w:r>
+        <w:t xml:space="preserve">queries never appear verbatim in the documents whose gold value matches them (players 93% verbatim, papers 41%,</w:t>
+      </w:r>
+      <w:r>
+        <w:t xml:space="preserve"> </w:t>
+      </w:r>
+      <w:r>
+        <w:t xml:space="preserve">artists 40%, medical 69%, legal 57%), and some appear nowhere (</w:t>
+      </w:r>
+      <w:r>
+        <w:t xml:space="preserve">‘</w:t>
+      </w:r>
+      <w:r>
+        <w:t xml:space="preserve">Earth Tones</w:t>
+      </w:r>
+      <w:r>
+        <w:t xml:space="preserve">’</w:t>
+      </w:r>
+      <w:r>
+        <w:t xml:space="preserve">,</w:t>
+      </w:r>
+      <w:r>
+        <w:t xml:space="preserve"> </w:t>
+      </w:r>
+      <w:r>
+        <w:t xml:space="preserve">‘</w:t>
+      </w:r>
+      <w:r>
+        <w:t xml:space="preserve">20th-21st</w:t>
+      </w:r>
+      <w:r>
+        <w:t xml:space="preserve">’</w:t>
+      </w:r>
+      <w:r>
+        <w:t xml:space="preserve">,</w:t>
+      </w:r>
+      <w:r>
+        <w:t xml:space="preserve"> </w:t>
+      </w:r>
+      <w:r>
+        <w:t xml:space="preserve">‘</w:t>
+      </w:r>
+      <w:r>
+        <w:t xml:space="preserve">Administrative Case</w:t>
+      </w:r>
+      <w:r>
+        <w:t xml:space="preserve">’</w:t>
+      </w:r>
+      <w:r>
+        <w:t xml:space="preserve">), so</w:t>
+      </w:r>
+      <w:r>
+        <w:t xml:space="preserve"> </w:t>
+      </w:r>
+      <w:r>
+        <w:t xml:space="preserve">only a system that has seen the workload can produce them in the form a query compares.</w:t>
+      </w:r>
+      <w:r>
+        <w:t xml:space="preserve"> </w:t>
+      </w:r>
+      <w:r>
+        <w:rPr>
+          <w:iCs/>
+          <w:i/>
+        </w:rPr>
+        <w:t xml:space="preserve">Normalization targets</w:t>
+      </w:r>
+      <w:r>
+        <w:t xml:space="preserve"> </w:t>
+      </w:r>
+      <w:r>
+        <w:t xml:space="preserve">(0.13</w:t>
+      </w:r>
+      <w:r>
+        <w:t xml:space="preserve"> </w:t>
+      </w:r>
+      <w:r>
+        <w:t xml:space="preserve">on players, 0.07 on artists) and</w:t>
+      </w:r>
+      <w:r>
+        <w:t xml:space="preserve"> </w:t>
+      </w:r>
+      <w:r>
+        <w:rPr>
+          <w:iCs/>
+          <w:i/>
+        </w:rPr>
+        <w:t xml:space="preserve">scope</w:t>
+      </w:r>
+      <w:r>
+        <w:t xml:space="preserve"> </w:t>
+      </w:r>
+      <w:r>
+        <w:t xml:space="preserve">from the queries’ filters (up to 46% of on-demand tokens). Two things often</w:t>
+      </w:r>
+      <w:r>
+        <w:t xml:space="preserve"> </w:t>
+      </w:r>
+      <w:r>
+        <w:t xml:space="preserve">credited to workload awareness are not: the descriptions come from the schema, and the drift result holds at every</w:t>
+      </w:r>
+      <w:r>
+        <w:t xml:space="preserve"> </w:t>
+      </w:r>
+      <w:r>
+        <w:t xml:space="preserve">share of the workload. The honest summary is that the workload tells the system what to normalize to, what to join</w:t>
+      </w:r>
+      <w:r>
+        <w:t xml:space="preserve"> </w:t>
+      </w:r>
+      <w:r>
+        <w:t xml:space="preserve">on and what to read first, not what to extract, because under drift what is asked next is what has not been asked.</w:t>
+      </w:r>
+    </w:p>
+    <w:p>
+      <w:pPr>
+        <w:pStyle w:val="BodyText"/>
+      </w:pPr>
+      <w:r>
+        <w:t xml:space="preserve">The vocabulary point has a limit we found only by checking all 47 GROUP BY columns of the test queries. The largest</w:t>
+      </w:r>
+      <w:r>
+        <w:t xml:space="preserve"> </w:t>
+      </w:r>
+      <w:r>
+        <w:t xml:space="preserve">merges (235 administrative cases served as civil; artists’ continents; papers’ topics) happen on columns whose prompt</w:t>
+      </w:r>
+      <w:r>
+        <w:t xml:space="preserve"> </w:t>
+      </w:r>
+      <w:r>
+        <w:t xml:space="preserve">already lists the labels; 17 of the 25 columns read on demand are identifiers or open lists no declaration could</w:t>
+      </w:r>
+      <w:r>
+        <w:t xml:space="preserve"> </w:t>
+      </w:r>
+      <w:r>
+        <w:t xml:space="preserve">enumerate; only 5 lack a small vocabulary the prompt does not state. Label collapse is mostly the model’s mapping of a</w:t>
+      </w:r>
+      <w:r>
+        <w:t xml:space="preserve"> </w:t>
+      </w:r>
+      <w:r>
+        <w:t xml:space="preserve">passage to a declared label, which is what sensitivity measures; declaring the vocabulary can fix only the few columns</w:t>
+      </w:r>
+      <w:r>
+        <w:t xml:space="preserve"> </w:t>
+      </w:r>
+      <w:r>
+        <w:t xml:space="preserve">where none exists (a run on those five is queued).</w:t>
+      </w:r>
+    </w:p>
+    <w:p>
+      <w:pPr>
+        <w:pStyle w:val="BodyText"/>
+      </w:pPr>
+      <w:r>
+        <w:t xml:space="preserve">Where a value sits in a document is a column property too, and it is learnable without gold. For each column read on</w:t>
+      </w:r>
+      <w:r>
+        <w:t xml:space="preserve"> </w:t>
+      </w:r>
+      <w:r>
+        <w:t xml:space="preserve">demand, the 90th percentile of the position of the 7B’s own served value, when it is stated verbatim, falls within</w:t>
+      </w:r>
+      <w:r>
+        <w:t xml:space="preserve"> </w:t>
+      </w:r>
+      <w:r>
+        <w:t xml:space="preserve">0.01 to 0.08 of the gold-based position on papers, players and artists: players’ columns need the first 29% to 53% of</w:t>
+      </w:r>
+      <w:r>
+        <w:t xml:space="preserve"> </w:t>
+      </w:r>
+      <w:r>
+        <w:t xml:space="preserve">an entry, artists’ dates and nationality the first tenth, while the legal corpus’s on-demand columns (judge, year, the</w:t>
+      </w:r>
+      <w:r>
+        <w:t xml:space="preserve"> </w:t>
+      </w:r>
+      <w:r>
+        <w:t xml:space="preserve">parties’ status) sit in the last 2% of a judgment. A per-column window is a read plan that needs no model and refines</w:t>
+      </w:r>
+      <w:r>
+        <w:t xml:space="preserve"> </w:t>
+      </w:r>
+      <w:r>
+        <w:t xml:space="preserve">the fixed first-window cut of the ablation (21% to 42% of tokens for −0.012 to +0.015); a run with it is queued.</w:t>
+      </w:r>
+      <w:r>
+        <w:t xml:space="preserve"> </w:t>
+      </w:r>
+      <w:r>
+        <w:t xml:space="preserve">Together with determinacy from ten documents, fill rate per context, grounding rate and the cost lemma, these form a</w:t>
+      </w:r>
+      <w:r>
+        <w:t xml:space="preserve"> </w:t>
+      </w:r>
+      <w:r>
+        <w:t xml:space="preserve">per-column catalogue, which is to an LLM-built database what cardinalities and selectivities are to a relational one:</w:t>
+      </w:r>
+      <w:r>
+        <w:t xml:space="preserve"> </w:t>
+      </w:r>
+      <w:r>
+        <w:t xml:space="preserve">the statistics a planner needs, computed once, cheaply, and not by a model.</w:t>
+      </w:r>
+    </w:p>
+    <w:p>
+      <w:pPr>
+        <w:pStyle w:val="BodyText"/>
+      </w:pPr>
+      <w:r>
+        <w:rPr>
+          <w:iCs/>
+          <w:i/>
+        </w:rPr>
+        <w:t xml:space="preserve">What this lets you decide.</w:t>
+      </w:r>
+      <w:r>
+        <w:t xml:space="preserve"> </w:t>
+      </w:r>
+      <w:r>
+        <w:t xml:space="preserve">Learn structure (keys, kinds, groupings, normal forms) from the workload and columns on</w:t>
+      </w:r>
+      <w:r>
+        <w:t xml:space="preserve"> </w:t>
+      </w:r>
+      <w:r>
+        <w:t xml:space="preserve">demand; forecasting columns under drift does not work. Treat the label vocabulary as a schema input, and expect it to</w:t>
+      </w:r>
+      <w:r>
+        <w:t xml:space="preserve"> </w:t>
+      </w:r>
+      <w:r>
+        <w:t xml:space="preserve">fix only columns that lack one. Read each column only as far as its values sit.</w:t>
+      </w:r>
+    </w:p>
+    <w:bookmarkEnd w:id="75"/>
+    <w:bookmarkStart w:id="76" w:name="what-carries-over-to-other-problems"/>
+    <w:p>
+      <w:pPr>
+        <w:pStyle w:val="Heading1"/>
+      </w:pPr>
       <w:r>
         <w:t xml:space="preserve">What carries over to other problems</w:t>
       </w:r>
-      <w:bookmarkEnd w:id="46"/>
     </w:p>
     <w:p>
       <w:pPr>
@@ -4083,6 +4807,7 @@
       </w:pPr>
       <w:r>
         <w:rPr>
+          <w:iCs/>
           <w:i/>
         </w:rPr>
         <w:t xml:space="preserve">Prefetching and shared scans.</w:t>
@@ -4130,6 +4855,7 @@
       </w:pPr>
       <w:r>
         <w:rPr>
+          <w:iCs/>
           <w:i/>
         </w:rPr>
         <w:t xml:space="preserve">Caching and materialized views.</w:t>
@@ -4171,6 +4897,7 @@
       </w:pPr>
       <w:r>
         <w:rPr>
+          <w:iCs/>
           <w:i/>
         </w:rPr>
         <w:t xml:space="preserve">Agreement as a signal of reliability.</w:t>
@@ -4218,8 +4945,45 @@
       </w:pPr>
       <w:r>
         <w:rPr>
+          <w:iCs/>
           <w:i/>
         </w:rPr>
+        <w:t xml:space="preserve">Cascades and verifiers.</w:t>
+      </w:r>
+      <w:r>
+        <w:t xml:space="preserve"> </w:t>
+      </w:r>
+      <w:r>
+        <w:t xml:space="preserve">Model cascades in query processing (SUPG, LOTUS) route items to a stronger model by a proxy</w:t>
+      </w:r>
+      <w:r>
+        <w:t xml:space="preserve"> </w:t>
+      </w:r>
+      <w:r>
+        <w:t xml:space="preserve">score and budget in oracle calls. Our verifier is such a proxy that needs no labels, and the pricing result says the</w:t>
+      </w:r>
+      <w:r>
+        <w:t xml:space="preserve"> </w:t>
+      </w:r>
+      <w:r>
+        <w:t xml:space="preserve">budget has to be in tokens: when the item is a document, a second look costs the document’s length, and the rule that</w:t>
+      </w:r>
+      <w:r>
+        <w:t xml:space="preserve"> </w:t>
+      </w:r>
+      <w:r>
+        <w:t xml:space="preserve">fixes the most cells per call is not the one that fixes the most per dollar.</w:t>
+      </w:r>
+    </w:p>
+    <w:p>
+      <w:pPr>
+        <w:pStyle w:val="BodyText"/>
+      </w:pPr>
+      <w:r>
+        <w:rPr>
+          <w:iCs/>
+          <w:i/>
+        </w:rPr>
         <w:t xml:space="preserve">Measurement error in aggregates.</w:t>
       </w:r>
       <w:r>
@@ -4253,6 +5017,7 @@
       </w:pPr>
       <w:r>
         <w:rPr>
+          <w:iCs/>
           <w:i/>
         </w:rPr>
         <w:t xml:space="preserve">Entity resolution and data integration.</w:t>
@@ -4282,6 +5047,7 @@
       </w:pPr>
       <w:r>
         <w:rPr>
+          <w:iCs/>
           <w:i/>
         </w:rPr>
         <w:t xml:space="preserve">Data documentation.</w:t>
@@ -4299,15 +5065,15 @@
         <w:t xml:space="preserve">DocETL. For an LLM reader, schema documentation is not optional metadata but an input that decides accuracy.</w:t>
       </w:r>
     </w:p>
+    <w:bookmarkEnd w:id="76"/>
+    <w:bookmarkStart w:id="77" w:name="open-questions"/>
     <w:p>
       <w:pPr>
         <w:pStyle w:val="Heading1"/>
       </w:pPr>
-      <w:bookmarkStart w:id="47" w:name="open-questions"/>
       <w:r>
         <w:t xml:space="preserve">Open questions</w:t>
       </w:r>
-      <w:bookmarkEnd w:id="47"/>
     </w:p>
     <w:p>
       <w:pPr>
@@ -4344,36 +5110,42 @@
         <w:t xml:space="preserve"> </w:t>
       </w:r>
       <w:r>
-        <w:t xml:space="preserve">Two changes to DocETL have been tested (freezing each column on one context); whether keeping drawing contexts until</w:t>
-      </w:r>
-      <w:r>
-        <w:t xml:space="preserve"> </w:t>
-      </w:r>
-      <w:r>
-        <w:t xml:space="preserve">one determines a column, a budget policy that forecasts reuse with frozen contexts, and choosing the build’s prompt</w:t>
-      </w:r>
-      <w:r>
-        <w:t xml:space="preserve"> </w:t>
-      </w:r>
-      <w:r>
-        <w:t xml:space="preserve">groups by each column’s measured context effect improve matters are running (I3c, I4, I5 in RESEARCH_DEPTH.md), as is</w:t>
-      </w:r>
-      <w:r>
-        <w:t xml:space="preserve"> </w:t>
-      </w:r>
-      <w:r>
-        <w:t xml:space="preserve">the context intervention on the 32B.</w:t>
-      </w:r>
-    </w:p>
+        <w:t xml:space="preserve">Three changes to DocETL have been tested (freezing each column on its first context, on the better of two, and on a</w:t>
+      </w:r>
+      <w:r>
+        <w:t xml:space="preserve"> </w:t>
+      </w:r>
+      <w:r>
+        <w:t xml:space="preserve">determined one). Running or queued, each with its prediction written first (RESEARCH_DEPTH.md): the budget policy</w:t>
+      </w:r>
+      <w:r>
+        <w:t xml:space="preserve"> </w:t>
+      </w:r>
+      <w:r>
+        <w:t xml:space="preserve">that forecasts reuse with frozen contexts (I4, to be added to the budget section), the build’s prompt groups chosen</w:t>
+      </w:r>
+      <w:r>
+        <w:t xml:space="preserve"> </w:t>
+      </w:r>
+      <w:r>
+        <w:t xml:space="preserve">by each column’s measured context effect (I5), the verifier as the router of second looks on the 32B (I2b), the label</w:t>
+      </w:r>
+      <w:r>
+        <w:t xml:space="preserve"> </w:t>
+      </w:r>
+      <w:r>
+        <w:t xml:space="preserve">contract on the five columns that lack a vocabulary (I6), and per-column read windows (I7).</w:t>
+      </w:r>
+    </w:p>
+    <w:bookmarkEnd w:id="77"/>
+    <w:bookmarkStart w:id="78" w:name="methods"/>
     <w:p>
       <w:pPr>
         <w:pStyle w:val="Heading1"/>
       </w:pPr>
-      <w:bookmarkStart w:id="48" w:name="methods"/>
       <w:r>
         <w:t xml:space="preserve">Methods</w:t>
       </w:r>
-      <w:bookmarkEnd w:id="48"/>
     </w:p>
     <w:p>
       <w:pPr>
@@ -4550,16 +5322,76 @@
       <w:r>
         <w:t xml:space="preserve">a column only for the documents a query’s filters keep. Label comparisons treat numbers as numbers in both systems.</w:t>
       </w:r>
-    </w:p>
+      <w:r>
+        <w:t xml:space="preserve"> </w:t>
+      </w:r>
+      <w:r>
+        <w:t xml:space="preserve">The grounding check lowercases the document and looks for each item of a value (numbers in their common forms); the</w:t>
+      </w:r>
+      <w:r>
+        <w:t xml:space="preserve"> </w:t>
+      </w:r>
+      <w:r>
+        <w:t xml:space="preserve">verifier is a logistic regression on grounding, full grounding, disagreement, emptiness, log value length, sensitivity,</w:t>
+      </w:r>
+      <w:r>
+        <w:t xml:space="preserve"> </w:t>
+      </w:r>
+      <w:r>
+        <w:t xml:space="preserve">fill rate and kind, cross-validated with whole columns held out and again with whole corpora held out. The cascade</w:t>
+      </w:r>
+      <w:r>
+        <w:t xml:space="preserve"> </w:t>
+      </w:r>
+      <w:r>
+        <w:t xml:space="preserve">pricing uses the 32B’s recorded prompt and output tokens per second look at OpenRouter’s list prices. The position</w:t>
+      </w:r>
+      <w:r>
+        <w:t xml:space="preserve"> </w:t>
+      </w:r>
+      <w:r>
+        <w:t xml:space="preserve">model takes, per column, the relative character position of the first verbatim occurrence of the served (or gold)</w:t>
+      </w:r>
+      <w:r>
+        <w:t xml:space="preserve"> </w:t>
+      </w:r>
+      <w:r>
+        <w:t xml:space="preserve">value and its 90th percentile over documents. The field-order test asks each natural group in the build’s order, a</w:t>
+      </w:r>
+      <w:r>
+        <w:t xml:space="preserve"> </w:t>
+      </w:r>
+      <w:r>
+        <w:t xml:space="preserve">fixed shuffle and the reverse on the same thirty documents and counts cells whose normalized value differs from the</w:t>
+      </w:r>
+      <w:r>
+        <w:t xml:space="preserve"> </w:t>
+      </w:r>
+      <w:r>
+        <w:t xml:space="preserve">natural order’s; the run-to-run rate is from the repeated streams of E1.1. The workload analysis counts, per corpus,</w:t>
+      </w:r>
+      <w:r>
+        <w:t xml:space="preserve"> </w:t>
+      </w:r>
+      <w:r>
+        <w:t xml:space="preserve">the schema columns the reference and test queries use, matches each test query’s template and shape against the</w:t>
+      </w:r>
+      <w:r>
+        <w:t xml:space="preserve"> </w:t>
+      </w:r>
+      <w:r>
+        <w:t xml:space="preserve">reference queries, and checks each query constant for a verbatim occurrence in the documents whose gold value equals it.</w:t>
+      </w:r>
+    </w:p>
+    <w:bookmarkEnd w:id="78"/>
+    <w:bookmarkStart w:id="84" w:name="appendix-example-test-queries"/>
     <w:p>
       <w:pPr>
         <w:pStyle w:val="Heading1"/>
       </w:pPr>
-      <w:bookmarkStart w:id="49" w:name="appendix-example-test-queries"/>
       <w:r>
         <w:t xml:space="preserve">Appendix: example test queries</w:t>
       </w:r>
-      <w:bookmarkEnd w:id="49"/>
     </w:p>
     <w:p>
       <w:pPr>
@@ -4569,15 +5401,14 @@
         <w:t xml:space="preserve">Each test query is a benchmark query with one column replaced by a column the build did not read. A few per corpus, chosen to cover the aggregates and, where the corpus has them, joins and several filter conditions.</w:t>
       </w:r>
     </w:p>
+    <w:bookmarkStart w:id="79" w:name="research-papers-59-test-queries"/>
     <w:p>
       <w:pPr>
         <w:pStyle w:val="Heading2"/>
       </w:pPr>
-      <w:bookmarkStart w:id="50" w:name="research-papers-59-test-queries"/>
       <w:r>
         <w:t xml:space="preserve">Research papers (59 test queries)</w:t>
       </w:r>
-      <w:bookmarkEnd w:id="50"/>
     </w:p>
     <w:p>
       <w:pPr>
@@ -4641,7 +5472,19 @@
         <w:rPr>
           <w:rStyle w:val="NormalTok"/>
         </w:rPr>
-        <w:t xml:space="preserve"> uses_reranker = </w:t>
+        <w:t xml:space="preserve"> uses_reranker </w:t>
+      </w:r>
+      <w:r>
+        <w:rPr>
+          <w:rStyle w:val="OperatorTok"/>
+        </w:rPr>
+        <w:t xml:space="preserve">=</w:t>
+      </w:r>
+      <w:r>
+        <w:rPr>
+          <w:rStyle w:val="NormalTok"/>
+        </w:rPr>
+        <w:t xml:space="preserve"> </w:t>
       </w:r>
       <w:r>
         <w:rPr>
@@ -4742,7 +5585,19 @@
         <w:rPr>
           <w:rStyle w:val="NormalTok"/>
         </w:rPr>
-        <w:t xml:space="preserve"> uses_reranker = </w:t>
+        <w:t xml:space="preserve"> uses_reranker </w:t>
+      </w:r>
+      <w:r>
+        <w:rPr>
+          <w:rStyle w:val="OperatorTok"/>
+        </w:rPr>
+        <w:t xml:space="preserve">=</w:t>
+      </w:r>
+      <w:r>
+        <w:rPr>
+          <w:rStyle w:val="NormalTok"/>
+        </w:rPr>
+        <w:t xml:space="preserve"> </w:t>
       </w:r>
       <w:r>
         <w:rPr>
@@ -4766,7 +5621,19 @@
         <w:rPr>
           <w:rStyle w:val="NormalTok"/>
         </w:rPr>
-        <w:t xml:space="preserve"> performance_on_hotpotqa = </w:t>
+        <w:t xml:space="preserve"> performance_on_hotpotqa </w:t>
+      </w:r>
+      <w:r>
+        <w:rPr>
+          <w:rStyle w:val="OperatorTok"/>
+        </w:rPr>
+        <w:t xml:space="preserve">=</w:t>
+      </w:r>
+      <w:r>
+        <w:rPr>
+          <w:rStyle w:val="NormalTok"/>
+        </w:rPr>
+        <w:t xml:space="preserve"> </w:t>
       </w:r>
       <w:r>
         <w:rPr>
@@ -4790,7 +5657,19 @@
         <w:rPr>
           <w:rStyle w:val="NormalTok"/>
         </w:rPr>
-        <w:t xml:space="preserve"> baseline = </w:t>
+        <w:t xml:space="preserve"> baseline </w:t>
+      </w:r>
+      <w:r>
+        <w:rPr>
+          <w:rStyle w:val="OperatorTok"/>
+        </w:rPr>
+        <w:t xml:space="preserve">=</w:t>
+      </w:r>
+      <w:r>
+        <w:rPr>
+          <w:rStyle w:val="NormalTok"/>
+        </w:rPr>
+        <w:t xml:space="preserve"> </w:t>
       </w:r>
       <w:r>
         <w:rPr>
@@ -5020,7 +5899,7 @@
       </w:r>
       <w:r>
         <w:rPr>
-          <w:rStyle w:val="KeywordTok"/>
+          <w:rStyle w:val="ControlFlowTok"/>
         </w:rPr>
         <w:t xml:space="preserve">CASE</w:t>
       </w:r>
@@ -5032,7 +5911,7 @@
       </w:r>
       <w:r>
         <w:rPr>
-          <w:rStyle w:val="KeywordTok"/>
+          <w:rStyle w:val="ControlFlowTok"/>
         </w:rPr>
         <w:t xml:space="preserve">WHEN</w:t>
       </w:r>
@@ -5068,7 +5947,7 @@
       </w:r>
       <w:r>
         <w:rPr>
-          <w:rStyle w:val="KeywordTok"/>
+          <w:rStyle w:val="ControlFlowTok"/>
         </w:rPr>
         <w:t xml:space="preserve">THEN</w:t>
       </w:r>
@@ -5092,7 +5971,7 @@
       </w:r>
       <w:r>
         <w:rPr>
-          <w:rStyle w:val="KeywordTok"/>
+          <w:rStyle w:val="ControlFlowTok"/>
         </w:rPr>
         <w:t xml:space="preserve">WHEN</w:t>
       </w:r>
@@ -5128,7 +6007,7 @@
       </w:r>
       <w:r>
         <w:rPr>
-          <w:rStyle w:val="KeywordTok"/>
+          <w:rStyle w:val="ControlFlowTok"/>
         </w:rPr>
         <w:t xml:space="preserve">THEN</w:t>
       </w:r>
@@ -5152,7 +6031,7 @@
       </w:r>
       <w:r>
         <w:rPr>
-          <w:rStyle w:val="KeywordTok"/>
+          <w:rStyle w:val="ControlFlowTok"/>
         </w:rPr>
         <w:t xml:space="preserve">WHEN</w:t>
       </w:r>
@@ -5188,7 +6067,7 @@
       </w:r>
       <w:r>
         <w:rPr>
-          <w:rStyle w:val="KeywordTok"/>
+          <w:rStyle w:val="ControlFlowTok"/>
         </w:rPr>
         <w:t xml:space="preserve">THEN</w:t>
       </w:r>
@@ -5212,7 +6091,7 @@
       </w:r>
       <w:r>
         <w:rPr>
-          <w:rStyle w:val="KeywordTok"/>
+          <w:rStyle w:val="ControlFlowTok"/>
         </w:rPr>
         <w:t xml:space="preserve">WHEN</w:t>
       </w:r>
@@ -5248,7 +6127,7 @@
       </w:r>
       <w:r>
         <w:rPr>
-          <w:rStyle w:val="KeywordTok"/>
+          <w:rStyle w:val="ControlFlowTok"/>
         </w:rPr>
         <w:t xml:space="preserve">THEN</w:t>
       </w:r>
@@ -5272,7 +6151,7 @@
       </w:r>
       <w:r>
         <w:rPr>
-          <w:rStyle w:val="KeywordTok"/>
+          <w:rStyle w:val="ControlFlowTok"/>
         </w:rPr>
         <w:t xml:space="preserve">WHEN</w:t>
       </w:r>
@@ -5308,7 +6187,7 @@
       </w:r>
       <w:r>
         <w:rPr>
-          <w:rStyle w:val="KeywordTok"/>
+          <w:rStyle w:val="ControlFlowTok"/>
         </w:rPr>
         <w:t xml:space="preserve">THEN</w:t>
       </w:r>
@@ -5332,7 +6211,7 @@
       </w:r>
       <w:r>
         <w:rPr>
-          <w:rStyle w:val="KeywordTok"/>
+          <w:rStyle w:val="ControlFlowTok"/>
         </w:rPr>
         <w:t xml:space="preserve">WHEN</w:t>
       </w:r>
@@ -5340,7 +6219,19 @@
         <w:rPr>
           <w:rStyle w:val="NormalTok"/>
         </w:rPr>
-        <w:t xml:space="preserve"> retrieval_method &lt;&gt; </w:t>
+        <w:t xml:space="preserve"> retrieval_method </w:t>
+      </w:r>
+      <w:r>
+        <w:rPr>
+          <w:rStyle w:val="OperatorTok"/>
+        </w:rPr>
+        <w:t xml:space="preserve">&lt;&gt;</w:t>
+      </w:r>
+      <w:r>
+        <w:rPr>
+          <w:rStyle w:val="NormalTok"/>
+        </w:rPr>
+        <w:t xml:space="preserve"> </w:t>
       </w:r>
       <w:r>
         <w:rPr>
@@ -5356,7 +6247,7 @@
       </w:r>
       <w:r>
         <w:rPr>
-          <w:rStyle w:val="KeywordTok"/>
+          <w:rStyle w:val="ControlFlowTok"/>
         </w:rPr>
         <w:t xml:space="preserve">THEN</w:t>
       </w:r>
@@ -5380,7 +6271,7 @@
       </w:r>
       <w:r>
         <w:rPr>
-          <w:rStyle w:val="KeywordTok"/>
+          <w:rStyle w:val="ControlFlowTok"/>
         </w:rPr>
         <w:t xml:space="preserve">END</w:t>
       </w:r>
@@ -5412,7 +6303,19 @@
         <w:rPr>
           <w:rStyle w:val="NormalTok"/>
         </w:rPr>
-        <w:t xml:space="preserve">(*) </w:t>
+        <w:t xml:space="preserve">(</w:t>
+      </w:r>
+      <w:r>
+        <w:rPr>
+          <w:rStyle w:val="OperatorTok"/>
+        </w:rPr>
+        <w:t xml:space="preserve">*</w:t>
+      </w:r>
+      <w:r>
+        <w:rPr>
+          <w:rStyle w:val="NormalTok"/>
+        </w:rPr>
+        <w:t xml:space="preserve">) </w:t>
       </w:r>
       <w:r>
         <w:rPr>
@@ -5448,7 +6351,19 @@
         <w:rPr>
           <w:rStyle w:val="NormalTok"/>
         </w:rPr>
-        <w:t xml:space="preserve"> retrieval_method &lt;&gt; </w:t>
+        <w:t xml:space="preserve"> retrieval_method </w:t>
+      </w:r>
+      <w:r>
+        <w:rPr>
+          <w:rStyle w:val="OperatorTok"/>
+        </w:rPr>
+        <w:t xml:space="preserve">&lt;&gt;</w:t>
+      </w:r>
+      <w:r>
+        <w:rPr>
+          <w:rStyle w:val="NormalTok"/>
+        </w:rPr>
+        <w:t xml:space="preserve"> </w:t>
       </w:r>
       <w:r>
         <w:rPr>
@@ -5535,15 +6450,15 @@
         <w:t xml:space="preserve"> retrieval_family, agent_framework</w:t>
       </w:r>
     </w:p>
+    <w:bookmarkEnd w:id="79"/>
+    <w:bookmarkStart w:id="80" w:name="basketball-players-118-test-queries"/>
     <w:p>
       <w:pPr>
         <w:pStyle w:val="Heading2"/>
       </w:pPr>
-      <w:bookmarkStart w:id="51" w:name="basketball-players-118-test-queries"/>
       <w:r>
         <w:t xml:space="preserve">Basketball players (118 test queries)</w:t>
       </w:r>
-      <w:bookmarkEnd w:id="51"/>
     </w:p>
     <w:p>
       <w:pPr>
@@ -5571,7 +6486,19 @@
         <w:rPr>
           <w:rStyle w:val="NormalTok"/>
         </w:rPr>
-        <w:t xml:space="preserve">(*) </w:t>
+        <w:t xml:space="preserve">(</w:t>
+      </w:r>
+      <w:r>
+        <w:rPr>
+          <w:rStyle w:val="OperatorTok"/>
+        </w:rPr>
+        <w:t xml:space="preserve">*</w:t>
+      </w:r>
+      <w:r>
+        <w:rPr>
+          <w:rStyle w:val="NormalTok"/>
+        </w:rPr>
+        <w:t xml:space="preserve">) </w:t>
       </w:r>
       <w:r>
         <w:rPr>
@@ -5623,7 +6550,7 @@
       </w:r>
       <w:r>
         <w:rPr>
-          <w:rStyle w:val="KeywordTok"/>
+          <w:rStyle w:val="ControlFlowTok"/>
         </w:rPr>
         <w:t xml:space="preserve">CASE</w:t>
       </w:r>
@@ -5635,7 +6562,7 @@
       </w:r>
       <w:r>
         <w:rPr>
-          <w:rStyle w:val="KeywordTok"/>
+          <w:rStyle w:val="ControlFlowTok"/>
         </w:rPr>
         <w:t xml:space="preserve">WHEN</w:t>
       </w:r>
@@ -5683,7 +6610,7 @@
       </w:r>
       <w:r>
         <w:rPr>
-          <w:rStyle w:val="KeywordTok"/>
+          <w:rStyle w:val="ControlFlowTok"/>
         </w:rPr>
         <w:t xml:space="preserve">THEN</w:t>
       </w:r>
@@ -5695,7 +6622,7 @@
       </w:r>
       <w:r>
         <w:rPr>
-          <w:rStyle w:val="KeywordTok"/>
+          <w:rStyle w:val="ControlFlowTok"/>
         </w:rPr>
         <w:t xml:space="preserve">ELSE</w:t>
       </w:r>
@@ -5719,7 +6646,7 @@
       </w:r>
       <w:r>
         <w:rPr>
-          <w:rStyle w:val="KeywordTok"/>
+          <w:rStyle w:val="ControlFlowTok"/>
         </w:rPr>
         <w:t xml:space="preserve">END</w:t>
       </w:r>
@@ -5811,7 +6738,19 @@
         <w:rPr>
           <w:rStyle w:val="NormalTok"/>
         </w:rPr>
-        <w:t xml:space="preserve">(p.team) = </w:t>
+        <w:t xml:space="preserve">(p.team) </w:t>
+      </w:r>
+      <w:r>
+        <w:rPr>
+          <w:rStyle w:val="OperatorTok"/>
+        </w:rPr>
+        <w:t xml:space="preserve">=</w:t>
+      </w:r>
+      <w:r>
+        <w:rPr>
+          <w:rStyle w:val="NormalTok"/>
+        </w:rPr>
+        <w:t xml:space="preserve"> </w:t>
       </w:r>
       <w:r>
         <w:rPr>
@@ -5871,7 +6810,31 @@
         <w:rPr>
           <w:rStyle w:val="NormalTok"/>
         </w:rPr>
-        <w:t xml:space="preserve">(*) &gt;= </w:t>
+        <w:t xml:space="preserve">(</w:t>
+      </w:r>
+      <w:r>
+        <w:rPr>
+          <w:rStyle w:val="OperatorTok"/>
+        </w:rPr>
+        <w:t xml:space="preserve">*</w:t>
+      </w:r>
+      <w:r>
+        <w:rPr>
+          <w:rStyle w:val="NormalTok"/>
+        </w:rPr>
+        <w:t xml:space="preserve">) </w:t>
+      </w:r>
+      <w:r>
+        <w:rPr>
+          <w:rStyle w:val="OperatorTok"/>
+        </w:rPr>
+        <w:t xml:space="preserve">&gt;=</w:t>
+      </w:r>
+      <w:r>
+        <w:rPr>
+          <w:rStyle w:val="NormalTok"/>
+        </w:rPr>
+        <w:t xml:space="preserve"> </w:t>
       </w:r>
       <w:r>
         <w:rPr>
@@ -5954,7 +6917,19 @@
         <w:rPr>
           <w:rStyle w:val="NormalTok"/>
         </w:rPr>
-        <w:t xml:space="preserve"> player.team = team.team_name </w:t>
+        <w:t xml:space="preserve"> player.team </w:t>
+      </w:r>
+      <w:r>
+        <w:rPr>
+          <w:rStyle w:val="OperatorTok"/>
+        </w:rPr>
+        <w:t xml:space="preserve">=</w:t>
+      </w:r>
+      <w:r>
+        <w:rPr>
+          <w:rStyle w:val="NormalTok"/>
+        </w:rPr>
+        <w:t xml:space="preserve"> team.team_name </w:t>
       </w:r>
       <w:r>
         <w:rPr>
@@ -5978,7 +6953,19 @@
         <w:rPr>
           <w:rStyle w:val="NormalTok"/>
         </w:rPr>
-        <w:t xml:space="preserve"> team.location = city.city_name </w:t>
+        <w:t xml:space="preserve"> team.location </w:t>
+      </w:r>
+      <w:r>
+        <w:rPr>
+          <w:rStyle w:val="OperatorTok"/>
+        </w:rPr>
+        <w:t xml:space="preserve">=</w:t>
+      </w:r>
+      <w:r>
+        <w:rPr>
+          <w:rStyle w:val="NormalTok"/>
+        </w:rPr>
+        <w:t xml:space="preserve"> city.city_name </w:t>
       </w:r>
       <w:r>
         <w:rPr>
@@ -5990,7 +6977,19 @@
         <w:rPr>
           <w:rStyle w:val="NormalTok"/>
         </w:rPr>
-        <w:t xml:space="preserve"> player.age &gt; </w:t>
+        <w:t xml:space="preserve"> player.age </w:t>
+      </w:r>
+      <w:r>
+        <w:rPr>
+          <w:rStyle w:val="OperatorTok"/>
+        </w:rPr>
+        <w:t xml:space="preserve">&gt;</w:t>
+      </w:r>
+      <w:r>
+        <w:rPr>
+          <w:rStyle w:val="NormalTok"/>
+        </w:rPr>
+        <w:t xml:space="preserve"> </w:t>
       </w:r>
       <w:r>
         <w:rPr>
@@ -6103,7 +7102,19 @@
         <w:rPr>
           <w:rStyle w:val="NormalTok"/>
         </w:rPr>
-        <w:t xml:space="preserve"> player.team = team.team_name </w:t>
+        <w:t xml:space="preserve"> player.team </w:t>
+      </w:r>
+      <w:r>
+        <w:rPr>
+          <w:rStyle w:val="OperatorTok"/>
+        </w:rPr>
+        <w:t xml:space="preserve">=</w:t>
+      </w:r>
+      <w:r>
+        <w:rPr>
+          <w:rStyle w:val="NormalTok"/>
+        </w:rPr>
+        <w:t xml:space="preserve"> team.team_name </w:t>
       </w:r>
       <w:r>
         <w:rPr>
@@ -6127,7 +7138,19 @@
         <w:rPr>
           <w:rStyle w:val="NormalTok"/>
         </w:rPr>
-        <w:t xml:space="preserve"> team.location = city.city_name </w:t>
+        <w:t xml:space="preserve"> team.location </w:t>
+      </w:r>
+      <w:r>
+        <w:rPr>
+          <w:rStyle w:val="OperatorTok"/>
+        </w:rPr>
+        <w:t xml:space="preserve">=</w:t>
+      </w:r>
+      <w:r>
+        <w:rPr>
+          <w:rStyle w:val="NormalTok"/>
+        </w:rPr>
+        <w:t xml:space="preserve"> city.city_name </w:t>
       </w:r>
       <w:r>
         <w:rPr>
@@ -6228,7 +7251,19 @@
         <w:rPr>
           <w:rStyle w:val="NormalTok"/>
         </w:rPr>
-        <w:t xml:space="preserve"> player.team = team.team_name </w:t>
+        <w:t xml:space="preserve"> player.team </w:t>
+      </w:r>
+      <w:r>
+        <w:rPr>
+          <w:rStyle w:val="OperatorTok"/>
+        </w:rPr>
+        <w:t xml:space="preserve">=</w:t>
+      </w:r>
+      <w:r>
+        <w:rPr>
+          <w:rStyle w:val="NormalTok"/>
+        </w:rPr>
+        <w:t xml:space="preserve"> team.team_name </w:t>
       </w:r>
       <w:r>
         <w:rPr>
@@ -6252,7 +7287,19 @@
         <w:rPr>
           <w:rStyle w:val="NormalTok"/>
         </w:rPr>
-        <w:t xml:space="preserve"> team.location = city.city_name </w:t>
+        <w:t xml:space="preserve"> team.location </w:t>
+      </w:r>
+      <w:r>
+        <w:rPr>
+          <w:rStyle w:val="OperatorTok"/>
+        </w:rPr>
+        <w:t xml:space="preserve">=</w:t>
+      </w:r>
+      <w:r>
+        <w:rPr>
+          <w:rStyle w:val="NormalTok"/>
+        </w:rPr>
+        <w:t xml:space="preserve"> city.city_name </w:t>
       </w:r>
       <w:r>
         <w:rPr>
@@ -6264,7 +7311,19 @@
         <w:rPr>
           <w:rStyle w:val="NormalTok"/>
         </w:rPr>
-        <w:t xml:space="preserve"> (city.city_name = </w:t>
+        <w:t xml:space="preserve"> (city.city_name </w:t>
+      </w:r>
+      <w:r>
+        <w:rPr>
+          <w:rStyle w:val="OperatorTok"/>
+        </w:rPr>
+        <w:t xml:space="preserve">=</w:t>
+      </w:r>
+      <w:r>
+        <w:rPr>
+          <w:rStyle w:val="NormalTok"/>
+        </w:rPr>
+        <w:t xml:space="preserve"> </w:t>
       </w:r>
       <w:r>
         <w:rPr>
@@ -6288,7 +7347,19 @@
         <w:rPr>
           <w:rStyle w:val="NormalTok"/>
         </w:rPr>
-        <w:t xml:space="preserve"> (player.mvp_awards &gt;= </w:t>
+        <w:t xml:space="preserve"> (player.mvp_awards </w:t>
+      </w:r>
+      <w:r>
+        <w:rPr>
+          <w:rStyle w:val="OperatorTok"/>
+        </w:rPr>
+        <w:t xml:space="preserve">&gt;=</w:t>
+      </w:r>
+      <w:r>
+        <w:rPr>
+          <w:rStyle w:val="NormalTok"/>
+        </w:rPr>
+        <w:t xml:space="preserve"> </w:t>
       </w:r>
       <w:r>
         <w:rPr>
@@ -6327,15 +7398,15 @@
         <w:t xml:space="preserve"> player.team</w:t>
       </w:r>
     </w:p>
+    <w:bookmarkEnd w:id="80"/>
+    <w:bookmarkStart w:id="81" w:name="artists-43-test-queries"/>
     <w:p>
       <w:pPr>
         <w:pStyle w:val="Heading2"/>
       </w:pPr>
-      <w:bookmarkStart w:id="52" w:name="artists-43-test-queries"/>
       <w:r>
         <w:t xml:space="preserve">Artists (43 test queries)</w:t>
       </w:r>
-      <w:bookmarkEnd w:id="52"/>
     </w:p>
     <w:p>
       <w:pPr>
@@ -6476,7 +7547,19 @@
         <w:rPr>
           <w:rStyle w:val="NormalTok"/>
         </w:rPr>
-        <w:t xml:space="preserve"> birth_country = </w:t>
+        <w:t xml:space="preserve"> birth_country </w:t>
+      </w:r>
+      <w:r>
+        <w:rPr>
+          <w:rStyle w:val="OperatorTok"/>
+        </w:rPr>
+        <w:t xml:space="preserve">=</w:t>
+      </w:r>
+      <w:r>
+        <w:rPr>
+          <w:rStyle w:val="NormalTok"/>
+        </w:rPr>
+        <w:t xml:space="preserve"> </w:t>
       </w:r>
       <w:r>
         <w:rPr>
@@ -6500,7 +7583,19 @@
         <w:rPr>
           <w:rStyle w:val="NormalTok"/>
         </w:rPr>
-        <w:t xml:space="preserve"> teaching &lt;&gt; </w:t>
+        <w:t xml:space="preserve"> teaching </w:t>
+      </w:r>
+      <w:r>
+        <w:rPr>
+          <w:rStyle w:val="OperatorTok"/>
+        </w:rPr>
+        <w:t xml:space="preserve">&lt;&gt;</w:t>
+      </w:r>
+      <w:r>
+        <w:rPr>
+          <w:rStyle w:val="NormalTok"/>
+        </w:rPr>
+        <w:t xml:space="preserve"> </w:t>
       </w:r>
       <w:r>
         <w:rPr>
@@ -6601,7 +7696,19 @@
         <w:rPr>
           <w:rStyle w:val="NormalTok"/>
         </w:rPr>
-        <w:t xml:space="preserve"> tone = </w:t>
+        <w:t xml:space="preserve"> tone </w:t>
+      </w:r>
+      <w:r>
+        <w:rPr>
+          <w:rStyle w:val="OperatorTok"/>
+        </w:rPr>
+        <w:t xml:space="preserve">=</w:t>
+      </w:r>
+      <w:r>
+        <w:rPr>
+          <w:rStyle w:val="NormalTok"/>
+        </w:rPr>
+        <w:t xml:space="preserve"> </w:t>
       </w:r>
       <w:r>
         <w:rPr>
@@ -6666,7 +7773,19 @@
         <w:rPr>
           <w:rStyle w:val="NormalTok"/>
         </w:rPr>
-        <w:t xml:space="preserve">(*) </w:t>
+        <w:t xml:space="preserve">(</w:t>
+      </w:r>
+      <w:r>
+        <w:rPr>
+          <w:rStyle w:val="OperatorTok"/>
+        </w:rPr>
+        <w:t xml:space="preserve">*</w:t>
+      </w:r>
+      <w:r>
+        <w:rPr>
+          <w:rStyle w:val="NormalTok"/>
+        </w:rPr>
+        <w:t xml:space="preserve">) </w:t>
       </w:r>
       <w:r>
         <w:rPr>
@@ -6750,7 +7869,19 @@
         <w:rPr>
           <w:rStyle w:val="NormalTok"/>
         </w:rPr>
-        <w:t xml:space="preserve"> nationality &lt;&gt; </w:t>
+        <w:t xml:space="preserve"> nationality </w:t>
+      </w:r>
+      <w:r>
+        <w:rPr>
+          <w:rStyle w:val="OperatorTok"/>
+        </w:rPr>
+        <w:t xml:space="preserve">&lt;&gt;</w:t>
+      </w:r>
+      <w:r>
+        <w:rPr>
+          <w:rStyle w:val="NormalTok"/>
+        </w:rPr>
+        <w:t xml:space="preserve"> </w:t>
       </w:r>
       <w:r>
         <w:rPr>
@@ -6810,7 +7941,31 @@
         <w:rPr>
           <w:rStyle w:val="NormalTok"/>
         </w:rPr>
-        <w:t xml:space="preserve">(*) &gt;= </w:t>
+        <w:t xml:space="preserve">(</w:t>
+      </w:r>
+      <w:r>
+        <w:rPr>
+          <w:rStyle w:val="OperatorTok"/>
+        </w:rPr>
+        <w:t xml:space="preserve">*</w:t>
+      </w:r>
+      <w:r>
+        <w:rPr>
+          <w:rStyle w:val="NormalTok"/>
+        </w:rPr>
+        <w:t xml:space="preserve">) </w:t>
+      </w:r>
+      <w:r>
+        <w:rPr>
+          <w:rStyle w:val="OperatorTok"/>
+        </w:rPr>
+        <w:t xml:space="preserve">&gt;=</w:t>
+      </w:r>
+      <w:r>
+        <w:rPr>
+          <w:rStyle w:val="NormalTok"/>
+        </w:rPr>
+        <w:t xml:space="preserve"> </w:t>
       </w:r>
       <w:r>
         <w:rPr>
@@ -6819,15 +7974,15 @@
         <w:t xml:space="preserve">5</w:t>
       </w:r>
     </w:p>
+    <w:bookmarkEnd w:id="81"/>
+    <w:bookmarkStart w:id="82" w:name="medical-43-test-queries"/>
     <w:p>
       <w:pPr>
         <w:pStyle w:val="Heading2"/>
       </w:pPr>
-      <w:bookmarkStart w:id="53" w:name="medical-43-test-queries"/>
       <w:r>
         <w:t xml:space="preserve">Medical (43 test queries)</w:t>
       </w:r>
-      <w:bookmarkEnd w:id="53"/>
     </w:p>
     <w:p>
       <w:pPr>
@@ -6891,7 +8046,19 @@
         <w:rPr>
           <w:rStyle w:val="NormalTok"/>
         </w:rPr>
-        <w:t xml:space="preserve"> administration_route &lt;&gt; </w:t>
+        <w:t xml:space="preserve"> administration_route </w:t>
+      </w:r>
+      <w:r>
+        <w:rPr>
+          <w:rStyle w:val="OperatorTok"/>
+        </w:rPr>
+        <w:t xml:space="preserve">&lt;&gt;</w:t>
+      </w:r>
+      <w:r>
+        <w:rPr>
+          <w:rStyle w:val="NormalTok"/>
+        </w:rPr>
+        <w:t xml:space="preserve"> </w:t>
       </w:r>
       <w:r>
         <w:rPr>
@@ -7004,7 +8171,19 @@
         <w:rPr>
           <w:rStyle w:val="NormalTok"/>
         </w:rPr>
-        <w:t xml:space="preserve"> drug.disease_name = disease.disease_name </w:t>
+        <w:t xml:space="preserve"> drug.disease_name </w:t>
+      </w:r>
+      <w:r>
+        <w:rPr>
+          <w:rStyle w:val="OperatorTok"/>
+        </w:rPr>
+        <w:t xml:space="preserve">=</w:t>
+      </w:r>
+      <w:r>
+        <w:rPr>
+          <w:rStyle w:val="NormalTok"/>
+        </w:rPr>
+        <w:t xml:space="preserve"> disease.disease_name </w:t>
       </w:r>
       <w:r>
         <w:rPr>
@@ -7093,7 +8272,19 @@
         <w:rPr>
           <w:rStyle w:val="NormalTok"/>
         </w:rPr>
-        <w:t xml:space="preserve"> (administration_route = </w:t>
+        <w:t xml:space="preserve"> (administration_route </w:t>
+      </w:r>
+      <w:r>
+        <w:rPr>
+          <w:rStyle w:val="OperatorTok"/>
+        </w:rPr>
+        <w:t xml:space="preserve">=</w:t>
+      </w:r>
+      <w:r>
+        <w:rPr>
+          <w:rStyle w:val="NormalTok"/>
+        </w:rPr>
+        <w:t xml:space="preserve"> </w:t>
       </w:r>
       <w:r>
         <w:rPr>
@@ -7117,7 +8308,19 @@
         <w:rPr>
           <w:rStyle w:val="NormalTok"/>
         </w:rPr>
-        <w:t xml:space="preserve"> (administration_route &lt;&gt; </w:t>
+        <w:t xml:space="preserve"> (administration_route </w:t>
+      </w:r>
+      <w:r>
+        <w:rPr>
+          <w:rStyle w:val="OperatorTok"/>
+        </w:rPr>
+        <w:t xml:space="preserve">&lt;&gt;</w:t>
+      </w:r>
+      <w:r>
+        <w:rPr>
+          <w:rStyle w:val="NormalTok"/>
+        </w:rPr>
+        <w:t xml:space="preserve"> </w:t>
       </w:r>
       <w:r>
         <w:rPr>
@@ -7156,15 +8359,15 @@
         <w:t xml:space="preserve"> prescription_status</w:t>
       </w:r>
     </w:p>
+    <w:bookmarkEnd w:id="82"/>
+    <w:bookmarkStart w:id="83" w:name="court-judgments-27-test-queries"/>
     <w:p>
       <w:pPr>
         <w:pStyle w:val="Heading2"/>
       </w:pPr>
-      <w:bookmarkStart w:id="54" w:name="court-judgments-27-test-queries"/>
       <w:r>
         <w:t xml:space="preserve">Court judgments (27 test queries)</w:t>
       </w:r>
-      <w:bookmarkEnd w:id="54"/>
     </w:p>
     <w:p>
       <w:pPr>
@@ -7184,7 +8387,7 @@
       </w:r>
       <w:r>
         <w:rPr>
-          <w:rStyle w:val="KeywordTok"/>
+          <w:rStyle w:val="ControlFlowTok"/>
         </w:rPr>
         <w:t xml:space="preserve">CASE</w:t>
       </w:r>
@@ -7196,7 +8399,7 @@
       </w:r>
       <w:r>
         <w:rPr>
-          <w:rStyle w:val="KeywordTok"/>
+          <w:rStyle w:val="ControlFlowTok"/>
         </w:rPr>
         <w:t xml:space="preserve">WHEN</w:t>
       </w:r>
@@ -7256,7 +8459,7 @@
       </w:r>
       <w:r>
         <w:rPr>
-          <w:rStyle w:val="KeywordTok"/>
+          <w:rStyle w:val="ControlFlowTok"/>
         </w:rPr>
         <w:t xml:space="preserve">THEN</w:t>
       </w:r>
@@ -7268,7 +8471,7 @@
       </w:r>
       <w:r>
         <w:rPr>
-          <w:rStyle w:val="KeywordTok"/>
+          <w:rStyle w:val="ControlFlowTok"/>
         </w:rPr>
         <w:t xml:space="preserve">ELSE</w:t>
       </w:r>
@@ -7292,7 +8495,7 @@
       </w:r>
       <w:r>
         <w:rPr>
-          <w:rStyle w:val="KeywordTok"/>
+          <w:rStyle w:val="ControlFlowTok"/>
         </w:rPr>
         <w:t xml:space="preserve">END</w:t>
       </w:r>
@@ -7324,7 +8527,19 @@
         <w:rPr>
           <w:rStyle w:val="NormalTok"/>
         </w:rPr>
-        <w:t xml:space="preserve">(*) </w:t>
+        <w:t xml:space="preserve">(</w:t>
+      </w:r>
+      <w:r>
+        <w:rPr>
+          <w:rStyle w:val="OperatorTok"/>
+        </w:rPr>
+        <w:t xml:space="preserve">*</w:t>
+      </w:r>
+      <w:r>
+        <w:rPr>
+          <w:rStyle w:val="NormalTok"/>
+        </w:rPr>
+        <w:t xml:space="preserve">) </w:t>
       </w:r>
       <w:r>
         <w:rPr>
@@ -7453,7 +8668,7 @@
       </w:r>
       <w:r>
         <w:rPr>
-          <w:rStyle w:val="KeywordTok"/>
+          <w:rStyle w:val="ControlFlowTok"/>
         </w:rPr>
         <w:t xml:space="preserve">CASE</w:t>
       </w:r>
@@ -7465,7 +8680,7 @@
       </w:r>
       <w:r>
         <w:rPr>
-          <w:rStyle w:val="KeywordTok"/>
+          <w:rStyle w:val="ControlFlowTok"/>
         </w:rPr>
         <w:t xml:space="preserve">WHEN</w:t>
       </w:r>
@@ -7525,7 +8740,7 @@
       </w:r>
       <w:r>
         <w:rPr>
-          <w:rStyle w:val="KeywordTok"/>
+          <w:rStyle w:val="ControlFlowTok"/>
         </w:rPr>
         <w:t xml:space="preserve">THEN</w:t>
       </w:r>
@@ -7537,7 +8752,7 @@
       </w:r>
       <w:r>
         <w:rPr>
-          <w:rStyle w:val="KeywordTok"/>
+          <w:rStyle w:val="ControlFlowTok"/>
         </w:rPr>
         <w:t xml:space="preserve">ELSE</w:t>
       </w:r>
@@ -7561,7 +8776,7 @@
       </w:r>
       <w:r>
         <w:rPr>
-          <w:rStyle w:val="KeywordTok"/>
+          <w:rStyle w:val="ControlFlowTok"/>
         </w:rPr>
         <w:t xml:space="preserve">END</w:t>
       </w:r>
@@ -7629,7 +8844,19 @@
         <w:rPr>
           <w:rStyle w:val="NormalTok"/>
         </w:rPr>
-        <w:t xml:space="preserve"> judgment_year = </w:t>
+        <w:t xml:space="preserve"> judgment_year </w:t>
+      </w:r>
+      <w:r>
+        <w:rPr>
+          <w:rStyle w:val="OperatorTok"/>
+        </w:rPr>
+        <w:t xml:space="preserve">=</w:t>
+      </w:r>
+      <w:r>
+        <w:rPr>
+          <w:rStyle w:val="NormalTok"/>
+        </w:rPr>
+        <w:t xml:space="preserve"> </w:t>
       </w:r>
       <w:r>
         <w:rPr>
@@ -7653,7 +8880,19 @@
         <w:rPr>
           <w:rStyle w:val="NormalTok"/>
         </w:rPr>
-        <w:t xml:space="preserve"> case_number &gt;= </w:t>
+        <w:t xml:space="preserve"> case_number </w:t>
+      </w:r>
+      <w:r>
+        <w:rPr>
+          <w:rStyle w:val="OperatorTok"/>
+        </w:rPr>
+        <w:t xml:space="preserve">&gt;=</w:t>
+      </w:r>
+      <w:r>
+        <w:rPr>
+          <w:rStyle w:val="NormalTok"/>
+        </w:rPr>
+        <w:t xml:space="preserve"> </w:t>
       </w:r>
       <w:r>
         <w:rPr>
@@ -7831,7 +9070,19 @@
         <w:rPr>
           <w:rStyle w:val="NormalTok"/>
         </w:rPr>
-        <w:t xml:space="preserve"> fine_amount = </w:t>
+        <w:t xml:space="preserve"> fine_amount </w:t>
+      </w:r>
+      <w:r>
+        <w:rPr>
+          <w:rStyle w:val="OperatorTok"/>
+        </w:rPr>
+        <w:t xml:space="preserve">=</w:t>
+      </w:r>
+      <w:r>
+        <w:rPr>
+          <w:rStyle w:val="NormalTok"/>
+        </w:rPr>
+        <w:t xml:space="preserve"> </w:t>
       </w:r>
       <w:r>
         <w:rPr>
@@ -7855,7 +9106,19 @@
         <w:rPr>
           <w:rStyle w:val="NormalTok"/>
         </w:rPr>
-        <w:t xml:space="preserve"> defendant &lt;&gt; </w:t>
+        <w:t xml:space="preserve"> defendant </w:t>
+      </w:r>
+      <w:r>
+        <w:rPr>
+          <w:rStyle w:val="OperatorTok"/>
+        </w:rPr>
+        <w:t xml:space="preserve">&lt;&gt;</w:t>
+      </w:r>
+      <w:r>
+        <w:rPr>
+          <w:rStyle w:val="NormalTok"/>
+        </w:rPr>
+        <w:t xml:space="preserve"> </w:t>
       </w:r>
       <w:r>
         <w:rPr>
@@ -7879,7 +9142,19 @@
         <w:rPr>
           <w:rStyle w:val="NormalTok"/>
         </w:rPr>
-        <w:t xml:space="preserve"> fine_amount &lt;&gt; </w:t>
+        <w:t xml:space="preserve"> fine_amount </w:t>
+      </w:r>
+      <w:r>
+        <w:rPr>
+          <w:rStyle w:val="OperatorTok"/>
+        </w:rPr>
+        <w:t xml:space="preserve">&lt;&gt;</w:t>
+      </w:r>
+      <w:r>
+        <w:rPr>
+          <w:rStyle w:val="NormalTok"/>
+        </w:rPr>
+        <w:t xml:space="preserve"> </w:t>
       </w:r>
       <w:r>
         <w:rPr>
@@ -7918,6 +9193,8 @@
         <w:t xml:space="preserve"> verdict</w:t>
       </w:r>
     </w:p>
+    <w:bookmarkEnd w:id="83"/>
+    <w:bookmarkEnd w:id="84"/>
     <w:sectPr/>
   </w:body>
 </w:document>
@@ -7949,17 +9226,14 @@
 <file path=word/numbering.xml><?xml version="1.0" encoding="utf-8"?>
 <w:numbering xmlns:w="http://schemas.openxmlformats.org/wordprocessingml/2006/main">
   <w:abstractNum w:abstractNumId="990">
-    <w:nsid w:val="170cd2de"/>
+    <w:nsid w:val="A990"/>
     <w:multiLevelType w:val="multilevel"/>
     <w:lvl w:ilvl="0">
       <w:numFmt w:val="bullet"/>
       <w:lvlText w:val=" "/>
       <w:lvlJc w:val="left"/>
       <w:pPr>
-        <w:tabs>
-          <w:tab w:val="num" w:pos="0"/>
-        </w:tabs>
-        <w:ind w:left="480" w:hanging="480"/>
+        <w:ind w:left="720" w:hanging="480"/>
       </w:pPr>
     </w:lvl>
     <w:lvl w:ilvl="1">
@@ -7967,10 +9241,7 @@
       <w:lvlText w:val=" "/>
       <w:lvlJc w:val="left"/>
       <w:pPr>
-        <w:tabs>
-          <w:tab w:val="num" w:pos="720"/>
-        </w:tabs>
-        <w:ind w:left="1200" w:hanging="480"/>
+        <w:ind w:left="1440" w:hanging="480"/>
       </w:pPr>
     </w:lvl>
     <w:lvl w:ilvl="2">
@@ -7978,10 +9249,7 @@
       <w:lvlText w:val=" "/>
       <w:lvlJc w:val="left"/>
       <w:pPr>
-        <w:tabs>
-          <w:tab w:val="num" w:pos="1440"/>
-        </w:tabs>
-        <w:ind w:left="1920" w:hanging="480"/>
+        <w:ind w:left="2160" w:hanging="480"/>
       </w:pPr>
     </w:lvl>
     <w:lvl w:ilvl="3">
@@ -7989,10 +9257,7 @@
       <w:lvlText w:val=" "/>
       <w:lvlJc w:val="left"/>
       <w:pPr>
-        <w:tabs>
-          <w:tab w:val="num" w:pos="2160"/>
-        </w:tabs>
-        <w:ind w:left="2640" w:hanging="480"/>
+        <w:ind w:left="2880" w:hanging="480"/>
       </w:pPr>
     </w:lvl>
     <w:lvl w:ilvl="4">
@@ -8000,10 +9265,7 @@
       <w:lvlText w:val=" "/>
       <w:lvlJc w:val="left"/>
       <w:pPr>
-        <w:tabs>
-          <w:tab w:val="num" w:pos="2880"/>
-        </w:tabs>
-        <w:ind w:left="3360" w:hanging="480"/>
+        <w:ind w:left="3600" w:hanging="480"/>
       </w:pPr>
     </w:lvl>
     <w:lvl w:ilvl="5">
@@ -8011,10 +9273,7 @@
       <w:lvlText w:val=" "/>
       <w:lvlJc w:val="left"/>
       <w:pPr>
-        <w:tabs>
-          <w:tab w:val="num" w:pos="3600"/>
-        </w:tabs>
-        <w:ind w:left="4080" w:hanging="480"/>
+        <w:ind w:left="4320" w:hanging="480"/>
       </w:pPr>
     </w:lvl>
     <w:lvl w:ilvl="6">
@@ -8022,10 +9281,7 @@
       <w:lvlText w:val=" "/>
       <w:lvlJc w:val="left"/>
       <w:pPr>
-        <w:tabs>
-          <w:tab w:val="num" w:pos="4320"/>
-        </w:tabs>
-        <w:ind w:left="4800" w:hanging="480"/>
+        <w:ind w:left="5040" w:hanging="480"/>
       </w:pPr>
     </w:lvl>
     <w:lvl w:ilvl="7">
@@ -8033,10 +9289,7 @@
       <w:lvlText w:val=" "/>
       <w:lvlJc w:val="left"/>
       <w:pPr>
-        <w:tabs>
-          <w:tab w:val="num" w:pos="5040"/>
-        </w:tabs>
-        <w:ind w:left="5520" w:hanging="480"/>
+        <w:ind w:left="5760" w:hanging="480"/>
       </w:pPr>
     </w:lvl>
     <w:lvl w:ilvl="8">
@@ -8044,119 +9297,10 @@
       <w:lvlText w:val=" "/>
       <w:lvlJc w:val="left"/>
       <w:pPr>
-        <w:tabs>
-          <w:tab w:val="num" w:pos="5760"/>
-        </w:tabs>
-        <w:ind w:left="6240" w:hanging="480"/>
+        <w:ind w:left="6480" w:hanging="480"/>
       </w:pPr>
     </w:lvl>
   </w:abstractNum>
-  <w:abstractNum w:abstractNumId="990">
-    <w:nsid w:val="af4d9848"/>
-    <w:multiLevelType w:val="multilevel"/>
-    <w:lvl w:ilvl="0">
-      <w:numFmt w:val="bullet"/>
-      <w:lvlText w:val=" "/>
-      <w:lvlJc w:val="left"/>
-      <w:pPr>
-        <w:tabs>
-          <w:tab w:val="num" w:pos="0"/>
-        </w:tabs>
-        <w:ind w:left="480" w:hanging="480"/>
-      </w:pPr>
-    </w:lvl>
-    <w:lvl w:ilvl="1">
-      <w:numFmt w:val="bullet"/>
-      <w:lvlText w:val=" "/>
-      <w:lvlJc w:val="left"/>
-      <w:pPr>
-        <w:tabs>
-          <w:tab w:val="num" w:pos="720"/>
-        </w:tabs>
-        <w:ind w:left="1200" w:hanging="480"/>
-      </w:pPr>
-    </w:lvl>
-    <w:lvl w:ilvl="2">
-      <w:numFmt w:val="bullet"/>
-      <w:lvlText w:val=" "/>
-      <w:lvlJc w:val="left"/>
-      <w:pPr>
-        <w:tabs>
-          <w:tab w:val="num" w:pos="1440"/>
-        </w:tabs>
-        <w:ind w:left="1920" w:hanging="480"/>
-      </w:pPr>
-    </w:lvl>
-    <w:lvl w:ilvl="3">
-      <w:numFmt w:val="bullet"/>
-      <w:lvlText w:val=" "/>
-      <w:lvlJc w:val="left"/>
-      <w:pPr>
-        <w:tabs>
-          <w:tab w:val="num" w:pos="2160"/>
-        </w:tabs>
-        <w:ind w:left="2640" w:hanging="480"/>
-      </w:pPr>
-    </w:lvl>
-    <w:lvl w:ilvl="4">
-      <w:numFmt w:val="bullet"/>
-      <w:lvlText w:val=" "/>
-      <w:lvlJc w:val="left"/>
-      <w:pPr>
-        <w:tabs>
-          <w:tab w:val="num" w:pos="2880"/>
-        </w:tabs>
-        <w:ind w:left="3360" w:hanging="480"/>
-      </w:pPr>
-    </w:lvl>
-    <w:lvl w:ilvl="5">
-      <w:numFmt w:val="bullet"/>
-      <w:lvlText w:val=" "/>
-      <w:lvlJc w:val="left"/>
-      <w:pPr>
-        <w:tabs>
-          <w:tab w:val="num" w:pos="3600"/>
-        </w:tabs>
-        <w:ind w:left="4080" w:hanging="480"/>
-      </w:pPr>
-    </w:lvl>
-    <w:lvl w:ilvl="6">
-      <w:numFmt w:val="bullet"/>
-      <w:lvlText w:val=" "/>
-      <w:lvlJc w:val="left"/>
-      <w:pPr>
-        <w:tabs>
-          <w:tab w:val="num" w:pos="4320"/>
-        </w:tabs>
-        <w:ind w:left="4800" w:hanging="480"/>
-      </w:pPr>
-    </w:lvl>
-    <w:lvl w:ilvl="7">
-      <w:numFmt w:val="bullet"/>
-      <w:lvlText w:val=" "/>
-      <w:lvlJc w:val="left"/>
-      <w:pPr>
-        <w:tabs>
-          <w:tab w:val="num" w:pos="5040"/>
-        </w:tabs>
-        <w:ind w:left="5520" w:hanging="480"/>
-      </w:pPr>
-    </w:lvl>
-    <w:lvl w:ilvl="8">
-      <w:numFmt w:val="bullet"/>
-      <w:lvlText w:val=" "/>
-      <w:lvlJc w:val="left"/>
-      <w:pPr>
-        <w:tabs>
-          <w:tab w:val="num" w:pos="5760"/>
-        </w:tabs>
-        <w:ind w:left="6240" w:hanging="480"/>
-      </w:pPr>
-    </w:lvl>
-  </w:abstractNum>
-  <w:num w:numId="1000">
-    <w:abstractNumId w:val="990"/>
-  </w:num>
   <w:num w:numId="1000">
     <w:abstractNumId w:val="990"/>
   </w:num>
@@ -8168,10 +9312,10 @@
   <w:docDefaults>
     <w:rPrDefault>
       <w:rPr>
-        <w:rFonts w:asciiTheme="minorHAnsi" w:eastAsiaTheme="minorHAnsi" w:hAnsiTheme="minorHAnsi" w:cstheme="minorBidi"/>
+        <w:rFonts w:asciiTheme="minorHAnsi" w:cstheme="minorBidi" w:eastAsiaTheme="minorHAnsi" w:hAnsiTheme="minorHAnsi"/>
         <w:sz w:val="24"/>
         <w:szCs w:val="24"/>
-        <w:lang w:val="en-US" w:eastAsia="en-US" w:bidi="ar-SA"/>
+        <w:lang w:bidi="ar-SA" w:eastAsia="en-US" w:val="en-US"/>
       </w:rPr>
     </w:rPrDefault>
     <w:pPrDefault>
@@ -8180,35 +9324,35 @@
       </w:pPr>
     </w:pPrDefault>
   </w:docDefaults>
-  <w:latentStyles w:defLockedState="0" w:defUIPriority="0" w:defSemiHidden="0" w:defUnhideWhenUsed="0" w:defQFormat="0" w:count="276"/>
-  <w:style w:type="paragraph" w:default="1" w:styleId="Normal">
+  <w:latentStyles w:count="276" w:defLockedState="0" w:defQFormat="0" w:defSemiHidden="0" w:defUIPriority="0" w:defUnhideWhenUsed="0"/>
+  <w:style w:default="1" w:styleId="Normal" w:type="paragraph">
     <w:name w:val="Normal"/>
     <w:qFormat/>
   </w:style>
-  <w:style w:type="paragraph" w:styleId="BodyText">
+  <w:style w:styleId="BodyText" w:type="paragraph">
     <w:name w:val="Body Text"/>
     <w:basedOn w:val="Normal"/>
     <w:link w:val="BodyTextChar"/>
     <w:pPr>
-      <w:spacing w:before="180" w:after="180"/>
+      <w:spacing w:after="180" w:before="180"/>
     </w:pPr>
     <w:qFormat/>
   </w:style>
-  <w:style w:type="paragraph" w:customStyle="1" w:styleId="FirstParagraph">
+  <w:style w:customStyle="1" w:styleId="FirstParagraph" w:type="paragraph">
     <w:name w:val="First Paragraph"/>
     <w:basedOn w:val="BodyText"/>
     <w:next w:val="BodyText"/>
     <w:qFormat/>
   </w:style>
-  <w:style w:type="paragraph" w:customStyle="1" w:styleId="Compact">
+  <w:style w:customStyle="1" w:styleId="Compact" w:type="paragraph">
     <w:name w:val="Compact"/>
     <w:basedOn w:val="BodyText"/>
     <w:qFormat/>
     <w:pPr>
-      <w:spacing w:before="36" w:after="36"/>
+      <w:spacing w:after="36" w:before="36"/>
     </w:pPr>
   </w:style>
-  <w:style w:type="paragraph" w:styleId="Title">
+  <w:style w:styleId="Title" w:type="paragraph">
     <w:name w:val="Title"/>
     <w:basedOn w:val="Normal"/>
     <w:next w:val="BodyText"/>
@@ -8216,19 +9360,19 @@
     <w:pPr>
       <w:keepNext/>
       <w:keepLines/>
-      <w:spacing w:before="480" w:after="240"/>
+      <w:spacing w:after="240" w:before="480"/>
       <w:jc w:val="center"/>
     </w:pPr>
     <w:rPr>
-      <w:rFonts w:asciiTheme="majorHAnsi" w:eastAsiaTheme="majorEastAsia" w:hAnsiTheme="majorHAnsi" w:cstheme="majorBidi"/>
+      <w:rFonts w:asciiTheme="majorHAnsi" w:cstheme="majorBidi" w:eastAsiaTheme="majorEastAsia" w:hAnsiTheme="majorHAnsi"/>
       <w:b/>
       <w:bCs/>
-      <w:color w:val="345A8A" w:themeColor="accent1" w:themeShade="B5"/>
+      <w:color w:themeColor="accent1" w:themeShade="B5" w:val="345A8A"/>
       <w:sz w:val="36"/>
       <w:szCs w:val="36"/>
     </w:rPr>
   </w:style>
-  <w:style w:type="paragraph" w:styleId="Subtitle">
+  <w:style w:styleId="Subtitle" w:type="paragraph">
     <w:name w:val="Subtitle"/>
     <w:basedOn w:val="Title"/>
     <w:next w:val="BodyText"/>
@@ -8236,7 +9380,7 @@
     <w:pPr>
       <w:keepNext/>
       <w:keepLines/>
-      <w:spacing w:before="240" w:after="240"/>
+      <w:spacing w:after="240" w:before="240"/>
       <w:jc w:val="center"/>
     </w:pPr>
     <w:rPr>
@@ -8244,7 +9388,7 @@
       <w:szCs w:val="30"/>
     </w:rPr>
   </w:style>
-  <w:style w:type="paragraph" w:customStyle="1" w:styleId="Author">
+  <w:style w:customStyle="1" w:styleId="Author" w:type="paragraph">
     <w:name w:val="Author"/>
     <w:next w:val="BodyText"/>
     <w:qFormat/>
@@ -8254,7 +9398,7 @@
       <w:jc w:val="center"/>
     </w:pPr>
   </w:style>
-  <w:style w:type="paragraph" w:styleId="Date">
+  <w:style w:styleId="Date" w:type="paragraph">
     <w:name w:val="Date"/>
     <w:next w:val="BodyText"/>
     <w:qFormat/>
@@ -8264,7 +9408,7 @@
       <w:jc w:val="center"/>
     </w:pPr>
   </w:style>
-  <w:style w:type="paragraph" w:customStyle="1" w:styleId="Abstract">
+  <w:style w:customStyle="1" w:styleId="Abstract" w:type="paragraph">
     <w:name w:val="Abstract"/>
     <w:basedOn w:val="Normal"/>
     <w:next w:val="BodyText"/>
@@ -8272,14 +9416,14 @@
     <w:pPr>
       <w:keepNext/>
       <w:keepLines/>
-      <w:spacing w:before="300" w:after="300"/>
+      <w:spacing w:after="300" w:before="300"/>
     </w:pPr>
     <w:rPr>
       <w:sz w:val="20"/>
       <w:szCs w:val="20"/>
     </w:rPr>
   </w:style>
-  <w:style w:type="paragraph" w:styleId="Bibliography">
+  <w:style w:styleId="Bibliography" w:type="paragraph">
     <w:name w:val="Bibliography"/>
     <w:basedOn w:val="Normal"/>
     <w:next w:val="Bibliography"/>
@@ -8287,7 +9431,7 @@
     <w:pPr/>
     <w:rPr/>
   </w:style>
-  <w:style w:type="paragraph" w:styleId="Heading1">
+  <w:style w:styleId="Heading1" w:type="paragraph">
     <w:name w:val="Heading 1"/>
     <w:basedOn w:val="Normal"/>
     <w:next w:val="BodyText"/>
@@ -8296,19 +9440,19 @@
     <w:pPr>
       <w:keepNext/>
       <w:keepLines/>
-      <w:spacing w:before="480" w:after="0"/>
+      <w:spacing w:after="0" w:before="480"/>
       <w:outlineLvl w:val="0"/>
     </w:pPr>
     <w:rPr>
-      <w:rFonts w:asciiTheme="majorHAnsi" w:eastAsiaTheme="majorEastAsia" w:hAnsiTheme="majorHAnsi" w:cstheme="majorBidi"/>
+      <w:rFonts w:asciiTheme="majorHAnsi" w:cstheme="majorBidi" w:eastAsiaTheme="majorEastAsia" w:hAnsiTheme="majorHAnsi"/>
       <w:b/>
       <w:bCs/>
-      <w:color w:val="345A8A" w:themeColor="accent1" w:themeShade="B5"/>
+      <w:color w:themeColor="accent1" w:val="4F81BD"/>
       <w:sz w:val="32"/>
       <w:szCs w:val="32"/>
     </w:rPr>
   </w:style>
-  <w:style w:type="paragraph" w:styleId="Heading2">
+  <w:style w:styleId="Heading2" w:type="paragraph">
     <w:name w:val="Heading 2"/>
     <w:basedOn w:val="Normal"/>
     <w:next w:val="BodyText"/>
@@ -8318,19 +9462,19 @@
     <w:pPr>
       <w:keepNext/>
       <w:keepLines/>
-      <w:spacing w:before="200" w:after="0"/>
+      <w:spacing w:after="0" w:before="200"/>
       <w:outlineLvl w:val="1"/>
     </w:pPr>
     <w:rPr>
-      <w:rFonts w:asciiTheme="majorHAnsi" w:eastAsiaTheme="majorEastAsia" w:hAnsiTheme="majorHAnsi" w:cstheme="majorBidi"/>
+      <w:rFonts w:asciiTheme="majorHAnsi" w:cstheme="majorBidi" w:eastAsiaTheme="majorEastAsia" w:hAnsiTheme="majorHAnsi"/>
       <w:b/>
       <w:bCs/>
-      <w:color w:val="4F81BD" w:themeColor="accent1"/>
-      <w:sz w:val="32"/>
-      <w:szCs w:val="32"/>
+      <w:color w:themeColor="accent1" w:val="4F81BD"/>
+      <w:sz w:val="28"/>
+      <w:szCs w:val="28"/>
     </w:rPr>
   </w:style>
-  <w:style w:type="paragraph" w:styleId="Heading3">
+  <w:style w:styleId="Heading3" w:type="paragraph">
     <w:name w:val="Heading 3"/>
     <w:basedOn w:val="Normal"/>
     <w:next w:val="BodyText"/>
@@ -8340,19 +9484,19 @@
     <w:pPr>
       <w:keepNext/>
       <w:keepLines/>
-      <w:spacing w:before="200" w:after="0"/>
+      <w:spacing w:after="0" w:before="200"/>
       <w:outlineLvl w:val="2"/>
     </w:pPr>
     <w:rPr>
-      <w:rFonts w:asciiTheme="majorHAnsi" w:eastAsiaTheme="majorEastAsia" w:hAnsiTheme="majorHAnsi" w:cstheme="majorBidi"/>
+      <w:rFonts w:asciiTheme="majorHAnsi" w:cstheme="majorBidi" w:eastAsiaTheme="majorEastAsia" w:hAnsiTheme="majorHAnsi"/>
       <w:b/>
       <w:bCs/>
-      <w:color w:val="4F81BD" w:themeColor="accent1"/>
-      <w:sz w:val="28"/>
-      <w:szCs w:val="28"/>
+      <w:color w:themeColor="accent1" w:val="4F81BD"/>
+      <w:sz w:val="24"/>
+      <w:szCs w:val="24"/>
     </w:rPr>
   </w:style>
-  <w:style w:type="paragraph" w:styleId="Heading4">
+  <w:style w:styleId="Heading4" w:type="paragraph">
     <w:name w:val="Heading 4"/>
     <w:basedOn w:val="Normal"/>
     <w:next w:val="BodyText"/>
@@ -8362,19 +9506,19 @@
     <w:pPr>
       <w:keepNext/>
       <w:keepLines/>
-      <w:spacing w:before="200" w:after="0"/>
+      <w:spacing w:after="0" w:before="200"/>
       <w:outlineLvl w:val="3"/>
     </w:pPr>
     <w:rPr>
-      <w:rFonts w:asciiTheme="majorHAnsi" w:eastAsiaTheme="majorEastAsia" w:hAnsiTheme="majorHAnsi" w:cstheme="majorBidi"/>
-      <w:b/>
+      <w:rFonts w:asciiTheme="majorHAnsi" w:cstheme="majorBidi" w:eastAsiaTheme="majorEastAsia" w:hAnsiTheme="majorHAnsi"/>
+      <w:i/>
       <w:bCs/>
-      <w:color w:val="4F81BD" w:themeColor="accent1"/>
+      <w:color w:themeColor="accent1" w:val="4F81BD"/>
       <w:sz w:val="24"/>
       <w:szCs w:val="24"/>
     </w:rPr>
   </w:style>
-  <w:style w:type="paragraph" w:styleId="Heading5">
+  <w:style w:styleId="Heading5" w:type="paragraph">
     <w:name w:val="Heading 5"/>
     <w:basedOn w:val="Normal"/>
     <w:next w:val="BodyText"/>
@@ -8384,19 +9528,18 @@
     <w:pPr>
       <w:keepNext/>
       <w:keepLines/>
-      <w:spacing w:before="200" w:after="0"/>
+      <w:spacing w:after="0" w:before="200"/>
       <w:outlineLvl w:val="4"/>
     </w:pPr>
     <w:rPr>
-      <w:rFonts w:asciiTheme="majorHAnsi" w:eastAsiaTheme="majorEastAsia" w:hAnsiTheme="majorHAnsi" w:cstheme="majorBidi"/>
-      <w:i/>
+      <w:rFonts w:asciiTheme="majorHAnsi" w:cstheme="majorBidi" w:eastAsiaTheme="majorEastAsia" w:hAnsiTheme="majorHAnsi"/>
       <w:iCs/>
-      <w:color w:val="4F81BD" w:themeColor="accent1"/>
+      <w:color w:themeColor="accent1" w:val="4F81BD"/>
       <w:sz w:val="24"/>
       <w:szCs w:val="24"/>
     </w:rPr>
   </w:style>
-  <w:style w:type="paragraph" w:styleId="Heading6">
+  <w:style w:styleId="Heading6" w:type="paragraph">
     <w:name w:val="Heading 6"/>
     <w:basedOn w:val="Normal"/>
     <w:next w:val="BodyText"/>
@@ -8406,17 +9549,17 @@
     <w:pPr>
       <w:keepNext/>
       <w:keepLines/>
-      <w:spacing w:before="200" w:after="0"/>
+      <w:spacing w:after="0" w:before="200"/>
       <w:outlineLvl w:val="5"/>
     </w:pPr>
     <w:rPr>
-      <w:rFonts w:asciiTheme="majorHAnsi" w:eastAsiaTheme="majorEastAsia" w:hAnsiTheme="majorHAnsi" w:cstheme="majorBidi"/>
-      <w:color w:val="4F81BD" w:themeColor="accent1"/>
+      <w:rFonts w:asciiTheme="majorHAnsi" w:cstheme="majorBidi" w:eastAsiaTheme="majorEastAsia" w:hAnsiTheme="majorHAnsi"/>
+      <w:color w:themeColor="accent1" w:val="4F81BD"/>
       <w:sz w:val="24"/>
       <w:szCs w:val="24"/>
     </w:rPr>
   </w:style>
-  <w:style w:type="paragraph" w:styleId="Heading7">
+  <w:style w:styleId="Heading7" w:type="paragraph">
     <w:name w:val="Heading 7"/>
     <w:basedOn w:val="Normal"/>
     <w:next w:val="BodyText"/>
@@ -8426,17 +9569,17 @@
     <w:pPr>
       <w:keepNext/>
       <w:keepLines/>
-      <w:spacing w:before="200" w:after="0"/>
+      <w:spacing w:after="0" w:before="200"/>
       <w:outlineLvl w:val="6"/>
     </w:pPr>
     <w:rPr>
-      <w:rFonts w:asciiTheme="majorHAnsi" w:eastAsiaTheme="majorEastAsia" w:hAnsiTheme="majorHAnsi" w:cstheme="majorBidi"/>
-      <w:color w:val="4F81BD" w:themeColor="accent1"/>
+      <w:rFonts w:asciiTheme="majorHAnsi" w:cstheme="majorBidi" w:eastAsiaTheme="majorEastAsia" w:hAnsiTheme="majorHAnsi"/>
+      <w:color w:themeColor="accent1" w:val="4F81BD"/>
       <w:sz w:val="24"/>
       <w:szCs w:val="24"/>
     </w:rPr>
   </w:style>
-  <w:style w:type="paragraph" w:styleId="Heading8">
+  <w:style w:styleId="Heading8" w:type="paragraph">
     <w:name w:val="Heading 8"/>
     <w:basedOn w:val="Normal"/>
     <w:next w:val="BodyText"/>
@@ -8446,17 +9589,17 @@
     <w:pPr>
       <w:keepNext/>
       <w:keepLines/>
-      <w:spacing w:before="200" w:after="0"/>
+      <w:spacing w:after="0" w:before="200"/>
       <w:outlineLvl w:val="7"/>
     </w:pPr>
     <w:rPr>
-      <w:rFonts w:asciiTheme="majorHAnsi" w:eastAsiaTheme="majorEastAsia" w:hAnsiTheme="majorHAnsi" w:cstheme="majorBidi"/>
-      <w:color w:val="4F81BD" w:themeColor="accent1"/>
+      <w:rFonts w:asciiTheme="majorHAnsi" w:cstheme="majorBidi" w:eastAsiaTheme="majorEastAsia" w:hAnsiTheme="majorHAnsi"/>
+      <w:color w:themeColor="accent1" w:val="4F81BD"/>
       <w:sz w:val="24"/>
       <w:szCs w:val="24"/>
     </w:rPr>
   </w:style>
-  <w:style w:type="paragraph" w:styleId="Heading9">
+  <w:style w:styleId="Heading9" w:type="paragraph">
     <w:name w:val="Heading 9"/>
     <w:basedOn w:val="Normal"/>
     <w:next w:val="BodyText"/>
@@ -8466,17 +9609,17 @@
     <w:pPr>
       <w:keepNext/>
       <w:keepLines/>
-      <w:spacing w:before="200" w:after="0"/>
+      <w:spacing w:after="0" w:before="200"/>
       <w:outlineLvl w:val="8"/>
     </w:pPr>
     <w:rPr>
-      <w:rFonts w:asciiTheme="majorHAnsi" w:eastAsiaTheme="majorEastAsia" w:hAnsiTheme="majorHAnsi" w:cstheme="majorBidi"/>
-      <w:color w:val="4F81BD" w:themeColor="accent1"/>
+      <w:rFonts w:asciiTheme="majorHAnsi" w:cstheme="majorBidi" w:eastAsiaTheme="majorEastAsia" w:hAnsiTheme="majorHAnsi"/>
+      <w:color w:themeColor="accent1" w:val="4F81BD"/>
       <w:sz w:val="24"/>
       <w:szCs w:val="24"/>
     </w:rPr>
   </w:style>
-  <w:style w:type="paragraph" w:styleId="BlockText">
+  <w:style w:styleId="BlockText" w:type="paragraph">
     <w:name w:val="Block Text"/>
     <w:basedOn w:val="BodyText"/>
     <w:next w:val="BodyText"/>
@@ -8484,17 +9627,11 @@
     <w:unhideWhenUsed/>
     <w:qFormat/>
     <w:pPr>
-      <w:spacing w:before="100" w:after="100"/>
-      <w:ind w:firstLine="0"/>
+      <w:spacing w:after="100" w:before="100"/>
+      <w:ind w:firstLine="0" w:left="480" w:right="480"/>
     </w:pPr>
-    <w:rPr>
-      <w:rFonts w:asciiTheme="majorHAnsi" w:eastAsiaTheme="majorEastAsia" w:hAnsiTheme="majorHAnsi" w:cstheme="majorBidi"/>
-      <w:bCs/>
-      <w:sz w:val="20"/>
-      <w:szCs w:val="20"/>
-    </w:rPr>
   </w:style>
-  <w:style w:type="paragraph" w:styleId="FootnoteText">
+  <w:style w:styleId="FootnoteText" w:type="paragraph">
     <w:name w:val="Footnote Text"/>
     <w:basedOn w:val="Normal"/>
     <w:next w:val="FootnoteText"/>
@@ -8502,28 +9639,43 @@
     <w:unhideWhenUsed/>
     <w:qFormat/>
   </w:style>
-  <w:style w:type="character" w:default="1" w:styleId="DefaultParagraphFont">
+  <w:style w:default="1" w:styleId="DefaultParagraphFont" w:type="character">
     <w:name w:val="Default Paragraph Font"/>
     <w:semiHidden/>
     <w:unhideWhenUsed/>
   </w:style>
-  <w:style w:type="table" w:default="1" w:styleId="Table">
+  <w:style w:default="1" w:styleId="Table" w:type="table">
     <w:name w:val="Table"/>
     <w:basedOn w:val="TableNormal"/>
     <w:semiHidden/>
     <w:unhideWhenUsed/>
     <w:qFormat/>
     <w:tblPr>
-      <w:tblInd w:w="0" w:type="dxa"/>
+      <w:tblInd w:type="dxa" w:w="0"/>
       <w:tblCellMar>
-        <w:top w:w="0" w:type="dxa"/>
-        <w:left w:w="108" w:type="dxa"/>
-        <w:bottom w:w="0" w:type="dxa"/>
-        <w:right w:w="108" w:type="dxa"/>
+        <w:top w:type="dxa" w:w="0"/>
+        <w:left w:type="dxa" w:w="108"/>
+        <w:bottom w:type="dxa" w:w="0"/>
+        <w:right w:type="dxa" w:w="108"/>
       </w:tblCellMar>
     </w:tblPr>
+    <w:tblStylePr w:type="firstRow">
+      <w:tblPr>
+        <w:jc w:val="left"/>
+        <w:tblInd w:type="dxa" w:w="0"/>
+      </w:tblPr>
+      <w:trPr>
+        <w:jc w:val="left"/>
+      </w:trPr>
+      <w:tcPr>
+        <w:vAlign w:val="bottom"/>
+        <w:tcBorders>
+          <w:bottom w:val="single"/>
+        </w:tcBorders>
+      </w:tcPr>
+    </w:tblStylePr>
   </w:style>
-  <w:style w:type="paragraph" w:customStyle="1" w:styleId="DefinitionTerm">
+  <w:style w:customStyle="1" w:styleId="DefinitionTerm" w:type="paragraph">
     <w:name w:val="Definition Term"/>
     <w:basedOn w:val="Normal"/>
     <w:next w:val="Definition"/>
@@ -8536,49 +9688,49 @@
       <w:b/>
     </w:rPr>
   </w:style>
-  <w:style w:type="paragraph" w:customStyle="1" w:styleId="Definition">
+  <w:style w:customStyle="1" w:styleId="Definition" w:type="paragraph">
     <w:name w:val="Definition"/>
     <w:basedOn w:val="Normal"/>
   </w:style>
-  <w:style w:type="paragraph" w:styleId="Caption">
+  <w:style w:styleId="Caption" w:type="paragraph">
     <w:name w:val="Caption"/>
     <w:basedOn w:val="Normal"/>
     <w:link w:val="BodyTextChar"/>
     <w:pPr>
-      <w:spacing w:before="0" w:after="120"/>
+      <w:spacing w:after="120" w:before="0"/>
     </w:pPr>
     <w:rPr>
       <w:i/>
     </w:rPr>
   </w:style>
-  <w:style w:type="paragraph" w:customStyle="1" w:styleId="TableCaption">
+  <w:style w:customStyle="1" w:styleId="TableCaption" w:type="paragraph">
     <w:name w:val="Table Caption"/>
     <w:basedOn w:val="Caption"/>
     <w:pPr>
       <w:keepNext/>
     </w:pPr>
   </w:style>
-  <w:style w:type="paragraph" w:customStyle="1" w:styleId="ImageCaption">
+  <w:style w:customStyle="1" w:styleId="ImageCaption" w:type="paragraph">
     <w:name w:val="Image Caption"/>
     <w:basedOn w:val="Caption"/>
   </w:style>
-  <w:style w:type="paragraph" w:customStyle="1" w:styleId="Figure">
+  <w:style w:customStyle="1" w:styleId="Figure" w:type="paragraph">
     <w:name w:val="Figure"/>
     <w:basedOn w:val="Normal"/>
   </w:style>
-  <w:style w:type="paragraph" w:customStyle="1" w:styleId="CaptionedFigure">
+  <w:style w:customStyle="1" w:styleId="CaptionedFigure" w:type="paragraph">
     <w:name w:val="Captioned Figure"/>
     <w:basedOn w:val="Figure"/>
     <w:pPr>
       <w:keepNext/>
     </w:pPr>
   </w:style>
-  <w:style w:type="character" w:customStyle="1" w:styleId="BodyTextChar">
+  <w:style w:customStyle="1" w:styleId="BodyTextChar" w:type="character">
     <w:name w:val="Body Text Char"/>
     <w:basedOn w:val="DefaultParagraphFont"/>
     <w:link w:val="BodyText"/>
   </w:style>
-  <w:style w:type="character" w:customStyle="1" w:styleId="VerbatimChar">
+  <w:style w:customStyle="1" w:styleId="VerbatimChar" w:type="character">
     <w:name w:val="Verbatim Char"/>
     <w:basedOn w:val="BodyTextChar"/>
     <w:rPr>
@@ -8586,21 +9738,25 @@
       <w:sz w:val="22"/>
     </w:rPr>
   </w:style>
-  <w:style w:type="character" w:styleId="FootnoteReference">
+  <w:style w:customStyle="1" w:styleId="SectionNumber" w:type="character">
+    <w:name w:val="Section Number"/>
+    <w:basedOn w:val="BodyTextChar"/>
+  </w:style>
+  <w:style w:styleId="FootnoteReference" w:type="character">
     <w:name w:val="Footnote Reference"/>
     <w:basedOn w:val="BodyTextChar"/>
     <w:rPr>
       <w:vertAlign w:val="superscript"/>
     </w:rPr>
   </w:style>
-  <w:style w:type="character" w:styleId="Hyperlink">
+  <w:style w:styleId="Hyperlink" w:type="character">
     <w:name w:val="Hyperlink"/>
     <w:basedOn w:val="BodyTextChar"/>
     <w:rPr>
-      <w:color w:val="4F81BD" w:themeColor="accent1"/>
+      <w:color w:themeColor="accent1" w:val="4F81BD"/>
     </w:rPr>
   </w:style>
-  <w:style w:type="paragraph" w:styleId="TOCHeading">
+  <w:style w:styleId="TOCHeading" w:type="paragraph">
     <w:name w:val="TOC Heading"/>
     <w:basedOn w:val="Heading1"/>
     <w:next w:val="BodyText"/>
@@ -8612,10 +9768,10 @@
       <w:outlineLvl w:val="9"/>
     </w:pPr>
     <w:rPr>
-      <w:rFonts w:asciiTheme="majorHAnsi" w:eastAsiaTheme="majorEastAsia" w:hAnsiTheme="majorHAnsi" w:cstheme="majorBidi"/>
+      <w:rFonts w:asciiTheme="majorHAnsi" w:cstheme="majorBidi" w:eastAsiaTheme="majorEastAsia" w:hAnsiTheme="majorHAnsi"/>
       <w:b w:val="0"/>
       <w:bCs w:val="0"/>
-      <w:color w:val="365F91" w:themeColor="accent1" w:themeShade="BF"/>
+      <w:color w:themeColor="accent1" w:themeShade="BF" w:val="365F91"/>
     </w:rPr>
   </w:style>
   <w:style w:type="paragraph" w:customStyle="1" w:styleId="SourceCode">
@@ -8707,7 +9863,10 @@
   <w:style w:type="character" w:customStyle="1" w:styleId="ImportTok">
     <w:name w:val="ImportTok"/>
     <w:basedOn w:val="VerbatimChar"/>
-    <w:rPr/>
+    <w:rPr>
+      <w:color w:val="008000"/>
+      <w:b/>
+    </w:rPr>
   </w:style>
   <w:style w:type="character" w:customStyle="1" w:styleId="CommentTok">
     <w:name w:val="CommentTok"/>
@@ -8782,7 +9941,9 @@
   <w:style w:type="character" w:customStyle="1" w:styleId="BuiltInTok">
     <w:name w:val="BuiltInTok"/>
     <w:basedOn w:val="VerbatimChar"/>
-    <w:rPr/>
+    <w:rPr>
+      <w:color w:val="008000"/>
+    </w:rPr>
   </w:style>
   <w:style w:type="character" w:customStyle="1" w:styleId="ExtensionTok">
     <w:name w:val="ExtensionTok"/>

</xml_diff>

<commit_message>
Budget section: the forecast policy with frozen prompts fails (no reuse history under drift), pacing fails on lumpy spends, the unit moves the curve; figure 13; docx rebuilt
Co-Authored-By: Claude Fable 5.1 <noreply@anthropic.com>
</commit_message>
<xml_diff>
--- a/results/experiments/why/Key_findings_and_why.docx
+++ b/results/experiments/why/Key_findings_and_why.docx
@@ -3229,7 +3229,7 @@
       </w:r>
     </w:p>
     <w:bookmarkEnd w:id="57"/>
-    <w:bookmarkStart w:id="61" w:name="Xdb61421cd5492d7ce390f9f554972516b04d38e"/>
+    <w:bookmarkStart w:id="64" w:name="Xdb61421cd5492d7ce390f9f554972516b04d38e"/>
     <w:p>
       <w:pPr>
         <w:pStyle w:val="Heading1"/>
@@ -3556,358 +3556,241 @@
         <w:pStyle w:val="BodyText"/>
       </w:pPr>
       <w:r>
-        <w:t xml:space="preserve">We do not yet have a true upper bound for budget policies, and we have not explained why the value effect turns</w:t>
-      </w:r>
-      <w:r>
-        <w:t xml:space="preserve"> </w:t>
-      </w:r>
-      <w:r>
-        <w:t xml:space="preserve">against pacing on basketball players.</w:t>
-      </w:r>
-    </w:p>
-    <w:p>
-      <w:pPr>
-        <w:pStyle w:val="BodyText"/>
-      </w:pPr>
+        <w:rPr>
+          <w:bCs/>
+          <w:b/>
+        </w:rPr>
+        <w:t xml:space="preserve">We then built the policy the first version of this section called for, and it does not beat first come, first</w:t>
+      </w:r>
+      <w:r>
+        <w:rPr>
+          <w:bCs/>
+          <w:b/>
+        </w:rPr>
+        <w:t xml:space="preserve"> </w:t>
+      </w:r>
+      <w:r>
+        <w:rPr>
+          <w:bCs/>
+          <w:b/>
+        </w:rPr>
+        <w:t xml:space="preserve">served either.</w:t>
+      </w:r>
+      <w:r>
+        <w:t xml:space="preserve"> </w:t>
+      </w:r>
+      <w:r>
+        <w:t xml:space="preserve">Each table’s new columns are frozen into one prompt, so delaying an extraction cannot change its</w:t>
+      </w:r>
+      <w:r>
+        <w:t xml:space="preserve"> </w:t>
+      </w:r>
+      <w:r>
+        <w:t xml:space="preserve">values, and a patch is skipped when none of its columns has been reused and its estimated cost exceeds a tenth of the</w:t>
+      </w:r>
+      <w:r>
+        <w:t xml:space="preserve"> </w:t>
+      </w:r>
+      <w:r>
+        <w:t xml:space="preserve">remaining budget. Against first come, first served with the same frozen prompts, at budgets of 25% and 50% on five</w:t>
+      </w:r>
+      <w:r>
+        <w:t xml:space="preserve"> </w:t>
+      </w:r>
+      <w:r>
+        <w:t xml:space="preserve">corpora, the forecast policy loses 0.011 on average, with no wins and six losses; the one large loss is medical at</w:t>
+      </w:r>
+      <w:r>
+        <w:t xml:space="preserve"> </w:t>
+      </w:r>
+      <w:r>
+        <w:t xml:space="preserve">50% (−0.055), where an early expensive patch with no reuse history was skipped and later queries needed its columns</w:t>
+      </w:r>
+      <w:r>
+        <w:t xml:space="preserve"> </w:t>
+      </w:r>
+      <w:r>
+        <w:t xml:space="preserve">most. The reason generalizes. Under column drift the columns in demand are those no known query uses, so a reuse</w:t>
+      </w:r>
+      <w:r>
+        <w:t xml:space="preserve"> </w:t>
+      </w:r>
+      <w:r>
+        <w:t xml:space="preserve">forecast has nothing to forecast from until the first request, and the first request is itself the best predictor</w:t>
+      </w:r>
+      <w:r>
+        <w:t xml:space="preserve"> </w:t>
+      </w:r>
+      <w:r>
+        <w:t xml:space="preserve">of reuse (57% to 100% of columns asked once are asked again). First come, first served</w:t>
+      </w:r>
+      <w:r>
+        <w:t xml:space="preserve"> </w:t>
+      </w:r>
       <w:r>
         <w:rPr>
           <w:iCs/>
           <w:i/>
         </w:rPr>
-        <w:t xml:space="preserve">What this lets you decide.</w:t>
-      </w:r>
-      <w:r>
-        <w:t xml:space="preserve"> </w:t>
-      </w:r>
-      <w:r>
-        <w:t xml:space="preserve">A budget policy should be judged by three questions the results above answer. Will the</w:t>
-      </w:r>
-      <w:r>
-        <w:t xml:space="preserve"> </w:t>
-      </w:r>
-      <w:r>
-        <w:t xml:space="preserve">column be reused? Then its value is mostly in the future and a large extraction is worth more, not less. Does delaying</w:t>
-      </w:r>
-      <w:r>
-        <w:t xml:space="preserve"> </w:t>
-      </w:r>
-      <w:r>
-        <w:t xml:space="preserve">the extraction change the prompt it runs in? Then the delay changes the answers, and the prompt should be held fixed</w:t>
-      </w:r>
-      <w:r>
-        <w:t xml:space="preserve"> </w:t>
-      </w:r>
-      <w:r>
-        <w:t xml:space="preserve">per column so that only the timing moves. Does the extraction’s cost depend on earlier extractions? Then a plan that</w:t>
-      </w:r>
-      <w:r>
-        <w:t xml:space="preserve"> </w:t>
-      </w:r>
-      <w:r>
-        <w:t xml:space="preserve">reorders extractions mis-prices them. A policy that forecasts column reuse from the workload, keeps each column’s</w:t>
-      </w:r>
-      <w:r>
-        <w:t xml:space="preserve"> </w:t>
-      </w:r>
-      <w:r>
-        <w:t xml:space="preserve">prompt fixed, and orders extractions so that filter columns come first addresses all three; we have not built it.</w:t>
-      </w:r>
-    </w:p>
-    <w:bookmarkEnd w:id="61"/>
-    <w:bookmarkStart w:id="62" w:name="Xbd5cb092345892faad08ce8e3e52d3f9d449dcf"/>
-    <w:p>
-      <w:pPr>
-        <w:pStyle w:val="Heading1"/>
-      </w:pPr>
-      <w:r>
-        <w:t xml:space="preserve">Why does extracting a column for more documents sometimes make answers worse?</w:t>
-      </w:r>
-    </w:p>
-    <w:p>
-      <w:pPr>
-        <w:pStyle w:val="FirstParagraph"/>
+        <w:t xml:space="preserve">is</w:t>
+      </w:r>
+      <w:r>
+        <w:t xml:space="preserve"> </w:t>
+      </w:r>
+      <w:r>
+        <w:t xml:space="preserve">the forecast policy in</w:t>
+      </w:r>
+      <w:r>
+        <w:t xml:space="preserve"> </w:t>
+      </w:r>
+      <w:r>
+        <w:t xml:space="preserve">that regime; forecasting pays where the workload repeats templates, not where it drifts. Without the frozen prompts</w:t>
+      </w:r>
+      <w:r>
+        <w:t xml:space="preserve"> </w:t>
+      </w:r>
+      <w:r>
+        <w:t xml:space="preserve">the same policy is a wash (+0.005, four wins and six losses at 86% of the tokens), and its gains on artists and</w:t>
+      </w:r>
+      <w:r>
+        <w:t xml:space="preserve"> </w:t>
+      </w:r>
+      <w:r>
+        <w:t xml:space="preserve">losses on papers, medical and court judgments are the value effect above, not the schedule.</w:t>
+      </w:r>
+    </w:p>
+    <w:p>
+      <w:pPr>
+        <w:pStyle w:val="BodyText"/>
       </w:pPr>
       <w:r>
         <w:rPr>
           <w:bCs/>
           <w:b/>
         </w:rPr>
-        <w:t xml:space="preserve">When a column does not apply to a document, the model rarely leaves it empty</w:t>
-      </w:r>
-      <w:r>
-        <w:t xml:space="preserve">, especially when the schema says the</w:t>
-      </w:r>
-      <w:r>
-        <w:t xml:space="preserve"> </w:t>
-      </w:r>
-      <w:r>
-        <w:t xml:space="preserve">column is never null. Extracting</w:t>
-      </w:r>
-      <w:r>
-        <w:t xml:space="preserve"> </w:t>
-      </w:r>
-      <w:r>
-        <w:t xml:space="preserve">“</w:t>
-      </w:r>
-      <w:r>
-        <w:t xml:space="preserve">agent framework</w:t>
-      </w:r>
-      <w:r>
-        <w:t xml:space="preserve">”</w:t>
-      </w:r>
-      <w:r>
-        <w:t xml:space="preserve"> </w:t>
-      </w:r>
-      <w:r>
-        <w:t xml:space="preserve">for every paper assigned one to 82 papers that have none. The</w:t>
-      </w:r>
-      <w:r>
-        <w:t xml:space="preserve"> </w:t>
-      </w:r>
-      <w:r>
-        <w:t xml:space="preserve">budgeted run extracted it only for the papers earlier queries had selected, and was more accurate. More generally, a</w:t>
-      </w:r>
-      <w:r>
-        <w:t xml:space="preserve"> </w:t>
-      </w:r>
-      <w:r>
-        <w:t xml:space="preserve">budgeted run beats the unlimited one on 8 to 31 queries per corpus, and nearly all of those queries were answered</w:t>
-      </w:r>
-      <w:r>
-        <w:t xml:space="preserve"> </w:t>
-      </w:r>
-      <w:r>
-        <w:t xml:space="preserve">without an extraction of their own.</w:t>
-      </w:r>
-    </w:p>
-    <w:p>
-      <w:pPr>
-        <w:pStyle w:val="BodyText"/>
-      </w:pPr>
-      <w:r>
-        <w:t xml:space="preserve">The benchmark makes this worse. It marks 19 of the 59 columns on three corpora as never null, although its own gold</w:t>
-      </w:r>
-      <w:r>
-        <w:t xml:space="preserve"> </w:t>
-      </w:r>
-      <w:r>
-        <w:t xml:space="preserve">data often leaves them empty. Emptying exactly those cells would raise the research-papers score from 0.153 to 0.193.</w:t>
-      </w:r>
-      <w:r>
-        <w:t xml:space="preserve"> </w:t>
-      </w:r>
-      <w:r>
-        <w:t xml:space="preserve">This rests on case evidence and an oracle measurement; we have not yet counted invented values against applicability</w:t>
-      </w:r>
-      <w:r>
-        <w:t xml:space="preserve"> </w:t>
-      </w:r>
-      <w:r>
-        <w:t xml:space="preserve">in a controlled way.</w:t>
-      </w:r>
-    </w:p>
-    <w:p>
-      <w:pPr>
-        <w:pStyle w:val="BodyText"/>
-      </w:pPr>
-      <w:r>
-        <w:rPr>
-          <w:iCs/>
-          <w:i/>
-        </w:rPr>
-        <w:t xml:space="preserve">What this lets you decide.</w:t>
-      </w:r>
-      <w:r>
-        <w:t xml:space="preserve"> </w:t>
-      </w:r>
-      <w:r>
-        <w:t xml:space="preserve">Reading more documents is not free of error even when tokens are cheap. For columns that</w:t>
-      </w:r>
-      <w:r>
-        <w:t xml:space="preserve"> </w:t>
-      </w:r>
-      <w:r>
-        <w:t xml:space="preserve">apply only to some documents, extraction should be limited to the documents where the column applies, or the prompt</w:t>
-      </w:r>
-      <w:r>
-        <w:t xml:space="preserve"> </w:t>
-      </w:r>
-      <w:r>
-        <w:t xml:space="preserve">should allow and encourage an empty answer; a schema that declares such a column never null invites invented values.</w:t>
-      </w:r>
-    </w:p>
-    <w:bookmarkEnd w:id="62"/>
-    <w:bookmarkStart w:id="63" w:name="Xb940d56232251f922fc395f7be93a4c760c95be"/>
-    <w:p>
-      <w:pPr>
-        <w:pStyle w:val="Heading1"/>
-      </w:pPr>
-      <w:r>
-        <w:t xml:space="preserve">Why does a planner that trusts its own extractions stop improving?</w:t>
-      </w:r>
-    </w:p>
-    <w:p>
-      <w:pPr>
-        <w:pStyle w:val="FirstParagraph"/>
-      </w:pPr>
+        <w:t xml:space="preserve">Pacing fails for a reason the frozen prompt exposes: the unit of extraction decides which policies are</w:t>
+      </w:r>
       <w:r>
         <w:rPr>
           <w:bCs/>
           <w:b/>
         </w:rPr>
-        <w:t xml:space="preserve">The planner estimates its loss as disagreement with each query’s own extraction, which means it treats its own</w:t>
+        <w:t xml:space="preserve"> </w:t>
       </w:r>
       <w:r>
         <w:rPr>
           <w:bCs/>
           <w:b/>
         </w:rPr>
-        <w:t xml:space="preserve"> </w:t>
-      </w:r>
+        <w:t xml:space="preserve">admissible.</w:t>
+      </w:r>
+      <w:r>
+        <w:t xml:space="preserve"> </w:t>
+      </w:r>
+      <w:r>
+        <w:t xml:space="preserve">A frozen patch reads all of a table’s new columns in one prompt, so it is one large indivisible spend</w:t>
+      </w:r>
+      <w:r>
+        <w:t xml:space="preserve"> </w:t>
+      </w:r>
+      <w:r>
+        <w:t xml:space="preserve">(on players, 0.98M tokens at the first query), and a rule that releases the budget in proportion to the stream’s</w:t>
+      </w:r>
+      <w:r>
+        <w:t xml:space="preserve"> </w:t>
+      </w:r>
+      <w:r>
+        <w:t xml:space="preserve">progress cannot afford it until late. On players at 50% the paced stream skips the first query’s patch and the 101</w:t>
+      </w:r>
+      <w:r>
+        <w:t xml:space="preserve"> </w:t>
+      </w:r>
+      <w:r>
+        <w:t xml:space="preserve">later queries that need the same table, spends half its budget on two small patches, and scores 0.142 against 0.348</w:t>
+      </w:r>
+      <w:r>
+        <w:t xml:space="preserve"> </w:t>
+      </w:r>
+      <w:r>
+        <w:t xml:space="preserve">for first come, first served, which spent the budget at the first query and answered 111 queries. Over ten streams</w:t>
+      </w:r>
+      <w:r>
+        <w:t xml:space="preserve"> </w:t>
+      </w:r>
+      <w:r>
+        <w:t xml:space="preserve">pacing with frozen prompts loses 0.034 on average (one win, six losses); with per-query prompts, whose patches are</w:t>
+      </w:r>
+      <w:r>
+        <w:t xml:space="preserve"> </w:t>
+      </w:r>
+      <w:r>
+        <w:t xml:space="preserve">small, it is a wash (+0.006). Grouping makes spending lumpy, and a lumpy spend needs a lump-sum rule.</w:t>
+      </w:r>
+    </w:p>
+    <w:p>
+      <w:pPr>
+        <w:pStyle w:val="BodyText"/>
+      </w:pPr>
       <w:r>
         <w:rPr>
           <w:bCs/>
           <w:b/>
         </w:rPr>
-        <w:t xml:space="preserve">extractions as correct.</w:t>
-      </w:r>
-      <w:r>
-        <w:t xml:space="preserve"> </w:t>
-      </w:r>
-      <w:r>
-        <w:t xml:space="preserve">It cannot tell that a shared extraction is more accurate, and once its extractions agree with</w:t>
-      </w:r>
-      <w:r>
-        <w:t xml:space="preserve"> </w:t>
-      </w:r>
-      <w:r>
-        <w:t xml:space="preserve">each other it sees nothing left to gain. It also values columns one at a time, while a missing join key makes the</w:t>
-      </w:r>
-      <w:r>
-        <w:t xml:space="preserve"> </w:t>
-      </w:r>
-      <w:r>
-        <w:t xml:space="preserve">whole query fail. On basketball players its best configuration reaches 0.42, against 0.56 for one shared pass with</w:t>
-      </w:r>
-      <w:r>
-        <w:t xml:space="preserve"> </w:t>
-      </w:r>
-      <w:r>
-        <w:t xml:space="preserve">descriptions. At the full budget it plans only 4.9M of the 10.6M available tokens because its estimated loss is</w:t>
-      </w:r>
-      <w:r>
-        <w:t xml:space="preserve"> </w:t>
-      </w:r>
-      <w:r>
-        <w:t xml:space="preserve">already 0.027 per query.</w:t>
-      </w:r>
-    </w:p>
-    <w:p>
-      <w:pPr>
-        <w:pStyle w:val="BodyText"/>
-      </w:pPr>
-      <w:r>
-        <w:rPr>
-          <w:iCs/>
-          <w:i/>
-        </w:rPr>
-        <w:t xml:space="preserve">What this lets you decide.</w:t>
-      </w:r>
-      <w:r>
-        <w:t xml:space="preserve"> </w:t>
-      </w:r>
-      <w:r>
-        <w:t xml:space="preserve">A planner’s objective needs some estimate of accuracy that does not come from its own</w:t>
-      </w:r>
-      <w:r>
-        <w:t xml:space="preserve"> </w:t>
-      </w:r>
-      <w:r>
-        <w:t xml:space="preserve">outputs, for instance a small labelled sample or the disagreement between two prompts, with the caveat for categories</w:t>
-      </w:r>
-      <w:r>
-        <w:t xml:space="preserve"> </w:t>
-      </w:r>
-      <w:r>
-        <w:t xml:space="preserve">given above. Its value model also has to treat a query’s columns jointly, since one missing key loses the whole answer.</w:t>
-      </w:r>
-      <w:r>
-        <w:t xml:space="preserve"> </w:t>
-      </w:r>
-      <w:r>
-        <w:t xml:space="preserve">We know the cause but have not built such a planner.</w:t>
-      </w:r>
-    </w:p>
-    <w:bookmarkEnd w:id="63"/>
-    <w:bookmarkStart w:id="70" w:name="Xdb894172f5ab5998735e9c0e4b8026977bb2e39"/>
-    <w:p>
-      <w:pPr>
-        <w:pStyle w:val="Heading1"/>
-      </w:pPr>
-      <w:r>
-        <w:t xml:space="preserve">Why do joins fail when each table’s keys are extracted separately?</w:t>
-      </w:r>
-    </w:p>
-    <w:p>
-      <w:pPr>
-        <w:pStyle w:val="FirstParagraph"/>
-      </w:pPr>
-      <w:r>
-        <w:t xml:space="preserve">DocETL extracts each table separately for each query. On basketball players its scores drop from 0.125 for queries</w:t>
-      </w:r>
-      <w:r>
-        <w:t xml:space="preserve"> </w:t>
-      </w:r>
-      <w:r>
-        <w:t xml:space="preserve">without joins to 0.034 with one join and 0.008 with two or more.</w:t>
-      </w:r>
-      <w:r>
-        <w:t xml:space="preserve"> </w:t>
-      </w:r>
-      <w:r>
-        <w:rPr>
-          <w:bCs/>
-          <w:b/>
-        </w:rPr>
-        <w:t xml:space="preserve">A join only matches rows whose keys agree, and keys</w:t>
-      </w:r>
-      <w:r>
-        <w:rPr>
-          <w:bCs/>
-          <w:b/>
-        </w:rPr>
-        <w:t xml:space="preserve"> </w:t>
-      </w:r>
-      <w:r>
-        <w:rPr>
-          <w:bCs/>
-          <w:b/>
-        </w:rPr>
-        <w:t xml:space="preserve">extracted independently mostly do not.</w:t>
-      </w:r>
-      <w:r>
-        <w:t xml:space="preserve"> </w:t>
-      </w:r>
-      <w:r>
-        <w:t xml:space="preserve">In DocETL’s per-query tables, 18% of player rows find their team and 19% of</w:t>
-      </w:r>
-      <w:r>
-        <w:t xml:space="preserve"> </w:t>
-      </w:r>
-      <w:r>
-        <w:t xml:space="preserve">team rows find their city. In our build the figures are 75% and 97%, and in the gold data 63% and 93% (the gold data</w:t>
-      </w:r>
-      <w:r>
-        <w:t xml:space="preserve"> </w:t>
-      </w:r>
-      <w:r>
-        <w:t xml:space="preserve">contains players whose team has no row of its own). Our build extracts each table’s keys once with the same field</w:t>
-      </w:r>
-      <w:r>
-        <w:t xml:space="preserve"> </w:t>
-      </w:r>
-      <w:r>
-        <w:t xml:space="preserve">definitions, and later queries reuse them.</w:t>
+        <w:t xml:space="preserve">What moves the budget curve is the extraction unit, not the schedule.</w:t>
+      </w:r>
+      <w:r>
+        <w:t xml:space="preserve"> </w:t>
+      </w:r>
+      <w:r>
+        <w:t xml:space="preserve">Compared on absolute tokens (each family’s</w:t>
+      </w:r>
+      <w:r>
+        <w:t xml:space="preserve"> </w:t>
+      </w:r>
+      <w:r>
+        <w:t xml:space="preserve">percentage budgets are shares of its own unlimited spend, which differ three- to sixfold), freezing each table’s new</w:t>
+      </w:r>
+      <w:r>
+        <w:t xml:space="preserve"> </w:t>
+      </w:r>
+      <w:r>
+        <w:t xml:space="preserve">columns into one prompt dominates the recorded one-prompt-per-query policy on four of five corpora: players 0.348 at</w:t>
+      </w:r>
+      <w:r>
+        <w:t xml:space="preserve"> </w:t>
+      </w:r>
+      <w:r>
+        <w:t xml:space="preserve">0.98M tokens against the recorded 0.293 at 2.8M; artists 0.197 at 0.8M against 0.191 at 2.5M; medical 0.122 at 1.2M</w:t>
+      </w:r>
+      <w:r>
+        <w:t xml:space="preserve"> </w:t>
+      </w:r>
+      <w:r>
+        <w:t xml:space="preserve">against 0.115 at 13.1M; court judgments 0.192 at 4.3M (unlimited) against 0.170 at 19.8M. Research papers is the</w:t>
+      </w:r>
+      <w:r>
+        <w:t xml:space="preserve"> </w:t>
+      </w:r>
+      <w:r>
+        <w:t xml:space="preserve">exception: the recorded run reaches 0.153 at 1.2M tokens where the frozen one stops at 0.131, because grouping lowers</w:t>
+      </w:r>
+      <w:r>
+        <w:t xml:space="preserve"> </w:t>
+      </w:r>
+      <w:r>
+        <w:t xml:space="preserve">the accuracy of papers’ most used columns (Section 1). Across every policy we tried, the schedule moves the score by</w:t>
+      </w:r>
+      <w:r>
+        <w:t xml:space="preserve"> </w:t>
+      </w:r>
+      <w:r>
+        <w:t xml:space="preserve">about 0.01 at a given budget; changing what one prompt asks for moves the tokens needed for a given score by three-</w:t>
+      </w:r>
+      <w:r>
+        <w:t xml:space="preserve"> </w:t>
+      </w:r>
+      <w:r>
+        <w:t xml:space="preserve">to tenfold.</w:t>
       </w:r>
     </w:p>
     <w:p>
@@ -3917,20 +3800,452 @@
       <w:r>
         <w:drawing>
           <wp:inline>
-            <wp:extent cx="5334000" cy="2311400"/>
+            <wp:extent cx="5334000" cy="1295400"/>
             <wp:effectExtent b="0" l="0" r="0" t="0"/>
-            <wp:docPr descr="Figure 13. Share of rows whose join key finds a partner in the joined table." title="" id="65" name="Picture"/>
+            <wp:docPr descr="Figure 13. Mean query score against tokens spent, at budgets from 10% to unlimited, for the recorded one-prompt-per-query policy and for frozen prompts under first come, first served, the forecast policy and pacing." title="" id="62" name="Picture"/>
             <a:graphic>
               <a:graphicData uri="http://schemas.openxmlformats.org/drawingml/2006/picture">
                 <pic:pic>
                   <pic:nvPicPr>
-                    <pic:cNvPr descr="figures/w5_join_keys.png" id="66" name="Picture"/>
+                    <pic:cNvPr descr="figures/w12_budget_curves.png" id="63" name="Picture"/>
                     <pic:cNvPicPr>
                       <a:picLocks noChangeArrowheads="1" noChangeAspect="1"/>
                     </pic:cNvPicPr>
                   </pic:nvPicPr>
                   <pic:blipFill>
-                    <a:blip r:embed="rId64"/>
+                    <a:blip r:embed="rId61"/>
+                    <a:stretch>
+                      <a:fillRect/>
+                    </a:stretch>
+                  </pic:blipFill>
+                  <pic:spPr bwMode="auto">
+                    <a:xfrm>
+                      <a:off x="0" y="0"/>
+                      <a:ext cx="5334000" cy="1295400"/>
+                    </a:xfrm>
+                    <a:prstGeom prst="rect">
+                      <a:avLst/>
+                    </a:prstGeom>
+                    <a:noFill/>
+                    <a:ln w="9525">
+                      <a:noFill/>
+                      <a:headEnd/>
+                      <a:tailEnd/>
+                    </a:ln>
+                  </pic:spPr>
+                </pic:pic>
+              </a:graphicData>
+            </a:graphic>
+          </wp:inline>
+        </w:drawing>
+      </w:r>
+    </w:p>
+    <w:p>
+      <w:pPr>
+        <w:pStyle w:val="ImageCaption"/>
+      </w:pPr>
+      <w:r>
+        <w:t xml:space="preserve">Figure 13. Mean query score against tokens spent, at budgets from 10% to unlimited, for the recorded</w:t>
+      </w:r>
+      <w:r>
+        <w:t xml:space="preserve"> </w:t>
+      </w:r>
+      <w:r>
+        <w:t xml:space="preserve">one-prompt-per-query policy and for frozen prompts under first come, first served, the forecast policy and</w:t>
+      </w:r>
+      <w:r>
+        <w:t xml:space="preserve"> </w:t>
+      </w:r>
+      <w:r>
+        <w:t xml:space="preserve">pacing.</w:t>
+      </w:r>
+    </w:p>
+    <w:p>
+      <w:pPr>
+        <w:pStyle w:val="BodyText"/>
+      </w:pPr>
+      <w:r>
+        <w:t xml:space="preserve">We do not yet have a true upper bound for budget policies.</w:t>
+      </w:r>
+    </w:p>
+    <w:p>
+      <w:pPr>
+        <w:pStyle w:val="BodyText"/>
+      </w:pPr>
+      <w:r>
+        <w:rPr>
+          <w:iCs/>
+          <w:i/>
+        </w:rPr>
+        <w:t xml:space="preserve">What this lets you decide.</w:t>
+      </w:r>
+      <w:r>
+        <w:t xml:space="preserve"> </w:t>
+      </w:r>
+      <w:r>
+        <w:t xml:space="preserve">A budget policy should be judged by three questions the results above answer. Will the</w:t>
+      </w:r>
+      <w:r>
+        <w:t xml:space="preserve"> </w:t>
+      </w:r>
+      <w:r>
+        <w:t xml:space="preserve">column be reused? Then its value is mostly in the future and a large extraction is worth more, not less. Does delaying</w:t>
+      </w:r>
+      <w:r>
+        <w:t xml:space="preserve"> </w:t>
+      </w:r>
+      <w:r>
+        <w:t xml:space="preserve">the extraction change the prompt it runs in? Then the delay changes the answers, and the prompt should be held fixed</w:t>
+      </w:r>
+      <w:r>
+        <w:t xml:space="preserve"> </w:t>
+      </w:r>
+      <w:r>
+        <w:t xml:space="preserve">per column so that only the timing moves. Does the extraction’s cost depend on earlier extractions? Then a plan that</w:t>
+      </w:r>
+      <w:r>
+        <w:t xml:space="preserve"> </w:t>
+      </w:r>
+      <w:r>
+        <w:t xml:space="preserve">reorders extractions mis-prices them. We built the first two parts of that policy, and it does not beat first come,</w:t>
+      </w:r>
+      <w:r>
+        <w:t xml:space="preserve"> </w:t>
+      </w:r>
+      <w:r>
+        <w:t xml:space="preserve">first served, because under drift there is no reuse history to forecast from. The decision that matters is made</w:t>
+      </w:r>
+      <w:r>
+        <w:t xml:space="preserve"> </w:t>
+      </w:r>
+      <w:r>
+        <w:t xml:space="preserve">before scheduling: fix the unit of extraction by each column’s context effect, then spend first come, first served,</w:t>
+      </w:r>
+      <w:r>
+        <w:t xml:space="preserve"> </w:t>
+      </w:r>
+      <w:r>
+        <w:t xml:space="preserve">and do not pace a lumpy spend.</w:t>
+      </w:r>
+    </w:p>
+    <w:bookmarkEnd w:id="64"/>
+    <w:bookmarkStart w:id="65" w:name="Xbd5cb092345892faad08ce8e3e52d3f9d449dcf"/>
+    <w:p>
+      <w:pPr>
+        <w:pStyle w:val="Heading1"/>
+      </w:pPr>
+      <w:r>
+        <w:t xml:space="preserve">Why does extracting a column for more documents sometimes make answers worse?</w:t>
+      </w:r>
+    </w:p>
+    <w:p>
+      <w:pPr>
+        <w:pStyle w:val="FirstParagraph"/>
+      </w:pPr>
+      <w:r>
+        <w:rPr>
+          <w:bCs/>
+          <w:b/>
+        </w:rPr>
+        <w:t xml:space="preserve">When a column does not apply to a document, the model rarely leaves it empty</w:t>
+      </w:r>
+      <w:r>
+        <w:t xml:space="preserve">, especially when the schema says the</w:t>
+      </w:r>
+      <w:r>
+        <w:t xml:space="preserve"> </w:t>
+      </w:r>
+      <w:r>
+        <w:t xml:space="preserve">column is never null. Extracting</w:t>
+      </w:r>
+      <w:r>
+        <w:t xml:space="preserve"> </w:t>
+      </w:r>
+      <w:r>
+        <w:t xml:space="preserve">“</w:t>
+      </w:r>
+      <w:r>
+        <w:t xml:space="preserve">agent framework</w:t>
+      </w:r>
+      <w:r>
+        <w:t xml:space="preserve">”</w:t>
+      </w:r>
+      <w:r>
+        <w:t xml:space="preserve"> </w:t>
+      </w:r>
+      <w:r>
+        <w:t xml:space="preserve">for every paper assigned one to 82 papers that have none. The</w:t>
+      </w:r>
+      <w:r>
+        <w:t xml:space="preserve"> </w:t>
+      </w:r>
+      <w:r>
+        <w:t xml:space="preserve">budgeted run extracted it only for the papers earlier queries had selected, and was more accurate. More generally, a</w:t>
+      </w:r>
+      <w:r>
+        <w:t xml:space="preserve"> </w:t>
+      </w:r>
+      <w:r>
+        <w:t xml:space="preserve">budgeted run beats the unlimited one on 8 to 31 queries per corpus, and nearly all of those queries were answered</w:t>
+      </w:r>
+      <w:r>
+        <w:t xml:space="preserve"> </w:t>
+      </w:r>
+      <w:r>
+        <w:t xml:space="preserve">without an extraction of their own.</w:t>
+      </w:r>
+    </w:p>
+    <w:p>
+      <w:pPr>
+        <w:pStyle w:val="BodyText"/>
+      </w:pPr>
+      <w:r>
+        <w:t xml:space="preserve">The benchmark makes this worse. It marks 19 of the 59 columns on three corpora as never null, although its own gold</w:t>
+      </w:r>
+      <w:r>
+        <w:t xml:space="preserve"> </w:t>
+      </w:r>
+      <w:r>
+        <w:t xml:space="preserve">data often leaves them empty. Emptying exactly those cells would raise the research-papers score from 0.153 to 0.193.</w:t>
+      </w:r>
+      <w:r>
+        <w:t xml:space="preserve"> </w:t>
+      </w:r>
+      <w:r>
+        <w:t xml:space="preserve">This rests on case evidence and an oracle measurement; we have not yet counted invented values against applicability</w:t>
+      </w:r>
+      <w:r>
+        <w:t xml:space="preserve"> </w:t>
+      </w:r>
+      <w:r>
+        <w:t xml:space="preserve">in a controlled way.</w:t>
+      </w:r>
+    </w:p>
+    <w:p>
+      <w:pPr>
+        <w:pStyle w:val="BodyText"/>
+      </w:pPr>
+      <w:r>
+        <w:rPr>
+          <w:iCs/>
+          <w:i/>
+        </w:rPr>
+        <w:t xml:space="preserve">What this lets you decide.</w:t>
+      </w:r>
+      <w:r>
+        <w:t xml:space="preserve"> </w:t>
+      </w:r>
+      <w:r>
+        <w:t xml:space="preserve">Reading more documents is not free of error even when tokens are cheap. For columns that</w:t>
+      </w:r>
+      <w:r>
+        <w:t xml:space="preserve"> </w:t>
+      </w:r>
+      <w:r>
+        <w:t xml:space="preserve">apply only to some documents, extraction should be limited to the documents where the column applies, or the prompt</w:t>
+      </w:r>
+      <w:r>
+        <w:t xml:space="preserve"> </w:t>
+      </w:r>
+      <w:r>
+        <w:t xml:space="preserve">should allow and encourage an empty answer; a schema that declares such a column never null invites invented values.</w:t>
+      </w:r>
+    </w:p>
+    <w:bookmarkEnd w:id="65"/>
+    <w:bookmarkStart w:id="66" w:name="Xb940d56232251f922fc395f7be93a4c760c95be"/>
+    <w:p>
+      <w:pPr>
+        <w:pStyle w:val="Heading1"/>
+      </w:pPr>
+      <w:r>
+        <w:t xml:space="preserve">Why does a planner that trusts its own extractions stop improving?</w:t>
+      </w:r>
+    </w:p>
+    <w:p>
+      <w:pPr>
+        <w:pStyle w:val="FirstParagraph"/>
+      </w:pPr>
+      <w:r>
+        <w:rPr>
+          <w:bCs/>
+          <w:b/>
+        </w:rPr>
+        <w:t xml:space="preserve">The planner estimates its loss as disagreement with each query’s own extraction, which means it treats its own</w:t>
+      </w:r>
+      <w:r>
+        <w:rPr>
+          <w:bCs/>
+          <w:b/>
+        </w:rPr>
+        <w:t xml:space="preserve"> </w:t>
+      </w:r>
+      <w:r>
+        <w:rPr>
+          <w:bCs/>
+          <w:b/>
+        </w:rPr>
+        <w:t xml:space="preserve">extractions as correct.</w:t>
+      </w:r>
+      <w:r>
+        <w:t xml:space="preserve"> </w:t>
+      </w:r>
+      <w:r>
+        <w:t xml:space="preserve">It cannot tell that a shared extraction is more accurate, and once its extractions agree with</w:t>
+      </w:r>
+      <w:r>
+        <w:t xml:space="preserve"> </w:t>
+      </w:r>
+      <w:r>
+        <w:t xml:space="preserve">each other it sees nothing left to gain. It also values columns one at a time, while a missing join key makes the</w:t>
+      </w:r>
+      <w:r>
+        <w:t xml:space="preserve"> </w:t>
+      </w:r>
+      <w:r>
+        <w:t xml:space="preserve">whole query fail. On basketball players its best configuration reaches 0.42, against 0.56 for one shared pass with</w:t>
+      </w:r>
+      <w:r>
+        <w:t xml:space="preserve"> </w:t>
+      </w:r>
+      <w:r>
+        <w:t xml:space="preserve">descriptions. At the full budget it plans only 4.9M of the 10.6M available tokens because its estimated loss is</w:t>
+      </w:r>
+      <w:r>
+        <w:t xml:space="preserve"> </w:t>
+      </w:r>
+      <w:r>
+        <w:t xml:space="preserve">already 0.027 per query.</w:t>
+      </w:r>
+    </w:p>
+    <w:p>
+      <w:pPr>
+        <w:pStyle w:val="BodyText"/>
+      </w:pPr>
+      <w:r>
+        <w:rPr>
+          <w:iCs/>
+          <w:i/>
+        </w:rPr>
+        <w:t xml:space="preserve">What this lets you decide.</w:t>
+      </w:r>
+      <w:r>
+        <w:t xml:space="preserve"> </w:t>
+      </w:r>
+      <w:r>
+        <w:t xml:space="preserve">A planner’s objective needs some estimate of accuracy that does not come from its own</w:t>
+      </w:r>
+      <w:r>
+        <w:t xml:space="preserve"> </w:t>
+      </w:r>
+      <w:r>
+        <w:t xml:space="preserve">outputs, for instance a small labelled sample or the disagreement between two prompts, with the caveat for categories</w:t>
+      </w:r>
+      <w:r>
+        <w:t xml:space="preserve"> </w:t>
+      </w:r>
+      <w:r>
+        <w:t xml:space="preserve">given above. Its value model also has to treat a query’s columns jointly, since one missing key loses the whole answer.</w:t>
+      </w:r>
+      <w:r>
+        <w:t xml:space="preserve"> </w:t>
+      </w:r>
+      <w:r>
+        <w:t xml:space="preserve">We know the cause but have not built such a planner.</w:t>
+      </w:r>
+    </w:p>
+    <w:bookmarkEnd w:id="66"/>
+    <w:bookmarkStart w:id="73" w:name="Xdb894172f5ab5998735e9c0e4b8026977bb2e39"/>
+    <w:p>
+      <w:pPr>
+        <w:pStyle w:val="Heading1"/>
+      </w:pPr>
+      <w:r>
+        <w:t xml:space="preserve">Why do joins fail when each table’s keys are extracted separately?</w:t>
+      </w:r>
+    </w:p>
+    <w:p>
+      <w:pPr>
+        <w:pStyle w:val="FirstParagraph"/>
+      </w:pPr>
+      <w:r>
+        <w:t xml:space="preserve">DocETL extracts each table separately for each query. On basketball players its scores drop from 0.125 for queries</w:t>
+      </w:r>
+      <w:r>
+        <w:t xml:space="preserve"> </w:t>
+      </w:r>
+      <w:r>
+        <w:t xml:space="preserve">without joins to 0.034 with one join and 0.008 with two or more.</w:t>
+      </w:r>
+      <w:r>
+        <w:t xml:space="preserve"> </w:t>
+      </w:r>
+      <w:r>
+        <w:rPr>
+          <w:bCs/>
+          <w:b/>
+        </w:rPr>
+        <w:t xml:space="preserve">A join only matches rows whose keys agree, and keys</w:t>
+      </w:r>
+      <w:r>
+        <w:rPr>
+          <w:bCs/>
+          <w:b/>
+        </w:rPr>
+        <w:t xml:space="preserve"> </w:t>
+      </w:r>
+      <w:r>
+        <w:rPr>
+          <w:bCs/>
+          <w:b/>
+        </w:rPr>
+        <w:t xml:space="preserve">extracted independently mostly do not.</w:t>
+      </w:r>
+      <w:r>
+        <w:t xml:space="preserve"> </w:t>
+      </w:r>
+      <w:r>
+        <w:t xml:space="preserve">In DocETL’s per-query tables, 18% of player rows find their team and 19% of</w:t>
+      </w:r>
+      <w:r>
+        <w:t xml:space="preserve"> </w:t>
+      </w:r>
+      <w:r>
+        <w:t xml:space="preserve">team rows find their city. In our build the figures are 75% and 97%, and in the gold data 63% and 93% (the gold data</w:t>
+      </w:r>
+      <w:r>
+        <w:t xml:space="preserve"> </w:t>
+      </w:r>
+      <w:r>
+        <w:t xml:space="preserve">contains players whose team has no row of its own). Our build extracts each table’s keys once with the same field</w:t>
+      </w:r>
+      <w:r>
+        <w:t xml:space="preserve"> </w:t>
+      </w:r>
+      <w:r>
+        <w:t xml:space="preserve">definitions, and later queries reuse them.</w:t>
+      </w:r>
+    </w:p>
+    <w:p>
+      <w:pPr>
+        <w:pStyle w:val="CaptionedFigure"/>
+      </w:pPr>
+      <w:r>
+        <w:drawing>
+          <wp:inline>
+            <wp:extent cx="5334000" cy="2311400"/>
+            <wp:effectExtent b="0" l="0" r="0" t="0"/>
+            <wp:docPr descr="Figure 14. Share of rows whose join key finds a partner in the joined table." title="" id="68" name="Picture"/>
+            <a:graphic>
+              <a:graphicData uri="http://schemas.openxmlformats.org/drawingml/2006/picture">
+                <pic:pic>
+                  <pic:nvPicPr>
+                    <pic:cNvPr descr="figures/w5_join_keys.png" id="69" name="Picture"/>
+                    <pic:cNvPicPr>
+                      <a:picLocks noChangeArrowheads="1" noChangeAspect="1"/>
+                    </pic:cNvPicPr>
+                  </pic:nvPicPr>
+                  <pic:blipFill>
+                    <a:blip r:embed="rId67"/>
                     <a:stretch>
                       <a:fillRect/>
                     </a:stretch>
@@ -3962,7 +4277,7 @@
         <w:pStyle w:val="ImageCaption"/>
       </w:pPr>
       <w:r>
-        <w:t xml:space="preserve">Figure 13. Share of rows whose join key finds a partner in the joined table.</w:t>
+        <w:t xml:space="preserve">Figure 14. Share of rows whose join key finds a partner in the joined table.</w:t>
       </w:r>
     </w:p>
     <w:p>
@@ -4163,18 +4478,18 @@
           <wp:inline>
             <wp:extent cx="5334000" cy="1981200"/>
             <wp:effectExtent b="0" l="0" r="0" t="0"/>
-            <wp:docPr descr="Figure 14. DocETL’s mean query score and number of model calls on the same queries: per-query extraction, every column frozen on its first context, frozen on the better of its first two contexts (two runs), and frozen on a determined context." title="" id="68" name="Picture"/>
+            <wp:docPr descr="Figure 15. DocETL’s mean query score and number of model calls on the same queries: per-query extraction, every column frozen on its first context, frozen on the better of its first two contexts (two runs), and frozen on a determined context." title="" id="71" name="Picture"/>
             <a:graphic>
               <a:graphicData uri="http://schemas.openxmlformats.org/drawingml/2006/picture">
                 <pic:pic>
                   <pic:nvPicPr>
-                    <pic:cNvPr descr="figures/w11_frozen_docetl.png" id="69" name="Picture"/>
+                    <pic:cNvPr descr="figures/w11_frozen_docetl.png" id="72" name="Picture"/>
                     <pic:cNvPicPr>
                       <a:picLocks noChangeArrowheads="1" noChangeAspect="1"/>
                     </pic:cNvPicPr>
                   </pic:nvPicPr>
                   <pic:blipFill>
-                    <a:blip r:embed="rId67"/>
+                    <a:blip r:embed="rId70"/>
                     <a:stretch>
                       <a:fillRect/>
                     </a:stretch>
@@ -4206,7 +4521,7 @@
         <w:pStyle w:val="ImageCaption"/>
       </w:pPr>
       <w:r>
-        <w:t xml:space="preserve">Figure 14. DocETL’s mean query score and number of model calls on the same queries: per-query extraction, every</w:t>
+        <w:t xml:space="preserve">Figure 15. DocETL’s mean query score and number of model calls on the same queries: per-query extraction, every</w:t>
       </w:r>
       <w:r>
         <w:t xml:space="preserve"> </w:t>
@@ -4271,8 +4586,8 @@
         <w:t xml:space="preserve">extraction of it.</w:t>
       </w:r>
     </w:p>
-    <w:bookmarkEnd w:id="70"/>
-    <w:bookmarkStart w:id="74" w:name="Xbd704315bbce43bad443e692e96e2196f2e3232"/>
+    <w:bookmarkEnd w:id="73"/>
+    <w:bookmarkStart w:id="77" w:name="Xbd704315bbce43bad443e692e96e2196f2e3232"/>
     <w:p>
       <w:pPr>
         <w:pStyle w:val="Heading1"/>
@@ -4334,18 +4649,18 @@
           <wp:inline>
             <wp:extent cx="5334000" cy="2189747"/>
             <wp:effectExtent b="0" l="0" r="0" t="0"/>
-            <wp:docPr descr="Figure 15. Share of cells correct with and without field descriptions." title="" id="72" name="Picture"/>
+            <wp:docPr descr="Figure 16. Share of cells correct with and without field descriptions." title="" id="75" name="Picture"/>
             <a:graphic>
               <a:graphicData uri="http://schemas.openxmlformats.org/drawingml/2006/picture">
                 <pic:pic>
                   <pic:nvPicPr>
-                    <pic:cNvPr descr="figures/w6_specification.png" id="73" name="Picture"/>
+                    <pic:cNvPr descr="figures/w6_specification.png" id="76" name="Picture"/>
                     <pic:cNvPicPr>
                       <a:picLocks noChangeArrowheads="1" noChangeAspect="1"/>
                     </pic:cNvPicPr>
                   </pic:nvPicPr>
                   <pic:blipFill>
-                    <a:blip r:embed="rId71"/>
+                    <a:blip r:embed="rId74"/>
                     <a:stretch>
                       <a:fillRect/>
                     </a:stretch>
@@ -4377,7 +4692,7 @@
         <w:pStyle w:val="ImageCaption"/>
       </w:pPr>
       <w:r>
-        <w:t xml:space="preserve">Figure 15. Share of cells correct with and without field descriptions.</w:t>
+        <w:t xml:space="preserve">Figure 16. Share of cells correct with and without field descriptions.</w:t>
       </w:r>
     </w:p>
     <w:p>
@@ -4410,8 +4725,8 @@
         <w:t xml:space="preserve">between prompts, and categories whose labels the model draws differently from the data.</w:t>
       </w:r>
     </w:p>
-    <w:bookmarkEnd w:id="74"/>
-    <w:bookmarkStart w:id="75" w:name="X34eaed4bbf940b4d6e6bee49bb90fe986f37356"/>
+    <w:bookmarkEnd w:id="77"/>
+    <w:bookmarkStart w:id="78" w:name="X34eaed4bbf940b4d6e6bee49bb90fe986f37356"/>
     <w:p>
       <w:pPr>
         <w:pStyle w:val="Heading1"/>
@@ -4777,8 +5092,8 @@
         <w:t xml:space="preserve">fix only columns that lack one. Read each column only as far as its values sit.</w:t>
       </w:r>
     </w:p>
-    <w:bookmarkEnd w:id="75"/>
-    <w:bookmarkStart w:id="76" w:name="what-carries-over-to-other-problems"/>
+    <w:bookmarkEnd w:id="78"/>
+    <w:bookmarkStart w:id="79" w:name="what-carries-over-to-other-problems"/>
     <w:p>
       <w:pPr>
         <w:pStyle w:val="Heading1"/>
@@ -5065,8 +5380,8 @@
         <w:t xml:space="preserve">DocETL. For an LLM reader, schema documentation is not optional metadata but an input that decides accuracy.</w:t>
       </w:r>
     </w:p>
-    <w:bookmarkEnd w:id="76"/>
-    <w:bookmarkStart w:id="77" w:name="open-questions"/>
+    <w:bookmarkEnd w:id="79"/>
+    <w:bookmarkStart w:id="80" w:name="open-questions"/>
     <w:p>
       <w:pPr>
         <w:pStyle w:val="Heading1"/>
@@ -5116,13 +5431,13 @@
         <w:t xml:space="preserve"> </w:t>
       </w:r>
       <w:r>
-        <w:t xml:space="preserve">determined one). Running or queued, each with its prediction written first (RESEARCH_DEPTH.md): the budget policy</w:t>
-      </w:r>
-      <w:r>
-        <w:t xml:space="preserve"> </w:t>
-      </w:r>
-      <w:r>
-        <w:t xml:space="preserve">that forecasts reuse with frozen contexts (I4, to be added to the budget section), the build’s prompt groups chosen</w:t>
+        <w:t xml:space="preserve">determined one), and the budget policy that forecasts reuse with frozen contexts has been tested and fails for a</w:t>
+      </w:r>
+      <w:r>
+        <w:t xml:space="preserve"> </w:t>
+      </w:r>
+      <w:r>
+        <w:t xml:space="preserve">stated reason (Section 6). Running or queued, each with its prediction written first (RESEARCH_DEPTH.md): the build’s prompt groups chosen</w:t>
       </w:r>
       <w:r>
         <w:t xml:space="preserve"> </w:t>
@@ -5137,8 +5452,8 @@
         <w:t xml:space="preserve">contract on the five columns that lack a vocabulary (I6), and per-column read windows (I7).</w:t>
       </w:r>
     </w:p>
-    <w:bookmarkEnd w:id="77"/>
-    <w:bookmarkStart w:id="78" w:name="methods"/>
+    <w:bookmarkEnd w:id="80"/>
+    <w:bookmarkStart w:id="81" w:name="methods"/>
     <w:p>
       <w:pPr>
         <w:pStyle w:val="Heading1"/>
@@ -5383,8 +5698,8 @@
         <w:t xml:space="preserve">reference queries, and checks each query constant for a verbatim occurrence in the documents whose gold value equals it.</w:t>
       </w:r>
     </w:p>
-    <w:bookmarkEnd w:id="78"/>
-    <w:bookmarkStart w:id="84" w:name="appendix-example-test-queries"/>
+    <w:bookmarkEnd w:id="81"/>
+    <w:bookmarkStart w:id="87" w:name="appendix-example-test-queries"/>
     <w:p>
       <w:pPr>
         <w:pStyle w:val="Heading1"/>
@@ -5401,7 +5716,7 @@
         <w:t xml:space="preserve">Each test query is a benchmark query with one column replaced by a column the build did not read. A few per corpus, chosen to cover the aggregates and, where the corpus has them, joins and several filter conditions.</w:t>
       </w:r>
     </w:p>
-    <w:bookmarkStart w:id="79" w:name="research-papers-59-test-queries"/>
+    <w:bookmarkStart w:id="82" w:name="research-papers-59-test-queries"/>
     <w:p>
       <w:pPr>
         <w:pStyle w:val="Heading2"/>
@@ -6450,8 +6765,8 @@
         <w:t xml:space="preserve"> retrieval_family, agent_framework</w:t>
       </w:r>
     </w:p>
-    <w:bookmarkEnd w:id="79"/>
-    <w:bookmarkStart w:id="80" w:name="basketball-players-118-test-queries"/>
+    <w:bookmarkEnd w:id="82"/>
+    <w:bookmarkStart w:id="83" w:name="basketball-players-118-test-queries"/>
     <w:p>
       <w:pPr>
         <w:pStyle w:val="Heading2"/>
@@ -7398,8 +7713,8 @@
         <w:t xml:space="preserve"> player.team</w:t>
       </w:r>
     </w:p>
-    <w:bookmarkEnd w:id="80"/>
-    <w:bookmarkStart w:id="81" w:name="artists-43-test-queries"/>
+    <w:bookmarkEnd w:id="83"/>
+    <w:bookmarkStart w:id="84" w:name="artists-43-test-queries"/>
     <w:p>
       <w:pPr>
         <w:pStyle w:val="Heading2"/>
@@ -7974,8 +8289,8 @@
         <w:t xml:space="preserve">5</w:t>
       </w:r>
     </w:p>
-    <w:bookmarkEnd w:id="81"/>
-    <w:bookmarkStart w:id="82" w:name="medical-43-test-queries"/>
+    <w:bookmarkEnd w:id="84"/>
+    <w:bookmarkStart w:id="85" w:name="medical-43-test-queries"/>
     <w:p>
       <w:pPr>
         <w:pStyle w:val="Heading2"/>
@@ -8359,8 +8674,8 @@
         <w:t xml:space="preserve"> prescription_status</w:t>
       </w:r>
     </w:p>
-    <w:bookmarkEnd w:id="82"/>
-    <w:bookmarkStart w:id="83" w:name="court-judgments-27-test-queries"/>
+    <w:bookmarkEnd w:id="85"/>
+    <w:bookmarkStart w:id="86" w:name="court-judgments-27-test-queries"/>
     <w:p>
       <w:pPr>
         <w:pStyle w:val="Heading2"/>
@@ -9193,8 +9508,8 @@
         <w:t xml:space="preserve"> verdict</w:t>
       </w:r>
     </w:p>
-    <w:bookmarkEnd w:id="83"/>
-    <w:bookmarkEnd w:id="84"/>
+    <w:bookmarkEnd w:id="86"/>
+    <w:bookmarkEnd w:id="87"/>
     <w:sectPr/>
   </w:body>
 </w:document>

</xml_diff>

<commit_message>
I5 complete: the per-column context prediction transfers to the build (+0.14 on flagged columns), query scores do not move; form, emptiness and aggregate mechanisms; docx rebuilt
Co-Authored-By: Claude Fable 5.1 <noreply@anthropic.com>
</commit_message>
<xml_diff>
--- a/results/experiments/why/Key_findings_and_why.docx
+++ b/results/experiments/why/Key_findings_and_why.docx
@@ -725,6 +725,151 @@
         <w:pStyle w:val="BodyText"/>
       </w:pPr>
       <w:r>
+        <w:t xml:space="preserve">We then used the per-column effect as a rule for the build itself: every new column read alone, or only the columns</w:t>
+      </w:r>
+      <w:r>
+        <w:t xml:space="preserve"> </w:t>
+      </w:r>
+      <w:r>
+        <w:t xml:space="preserve">the thirty-document test had found more accurate alone, the rest grouped as before (ten builds, scored on the</w:t>
+      </w:r>
+      <w:r>
+        <w:t xml:space="preserve"> </w:t>
+      </w:r>
+      <w:r>
+        <w:t xml:space="preserve">undrifted stream).</w:t>
+      </w:r>
+      <w:r>
+        <w:t xml:space="preserve"> </w:t>
+      </w:r>
+      <w:r>
+        <w:rPr>
+          <w:bCs/>
+          <w:b/>
+        </w:rPr>
+        <w:t xml:space="preserve">The per-column prediction transfers: the columns flagged as better alone gain 0.14 in cell</w:t>
+      </w:r>
+      <w:r>
+        <w:rPr>
+          <w:bCs/>
+          <w:b/>
+        </w:rPr>
+        <w:t xml:space="preserve"> </w:t>
+      </w:r>
+      <w:r>
+        <w:rPr>
+          <w:bCs/>
+          <w:b/>
+        </w:rPr>
+        <w:t xml:space="preserve">accuracy in the full build, four of five up and none down, while columns flagged as better in the group gain nothing</w:t>
+      </w:r>
+      <w:r>
+        <w:rPr>
+          <w:bCs/>
+          <w:b/>
+        </w:rPr>
+        <w:t xml:space="preserve"> </w:t>
+      </w:r>
+      <w:r>
+        <w:rPr>
+          <w:bCs/>
+          <w:b/>
+        </w:rPr>
+        <w:t xml:space="preserve">when read alone.</w:t>
+      </w:r>
+      <w:r>
+        <w:t xml:space="preserve"> </w:t>
+      </w:r>
+      <w:r>
+        <w:t xml:space="preserve">The query score does not follow (−0.01 to +0.01 on every corpus but one, against a run-to-run</w:t>
+      </w:r>
+      <w:r>
+        <w:t xml:space="preserve"> </w:t>
+      </w:r>
+      <w:r>
+        <w:t xml:space="preserve">floor of 0.006; medical loses 0.028 when everything is read alone). Query by query the reasons are visible. The gains</w:t>
+      </w:r>
+      <w:r>
+        <w:t xml:space="preserve"> </w:t>
+      </w:r>
+      <w:r>
+        <w:t xml:space="preserve">are largely changes of form: a court judge’s name goes from 3% to 45% correct because the lone prompt writes</w:t>
+      </w:r>
+      <w:r>
+        <w:t xml:space="preserve"> </w:t>
+      </w:r>
+      <w:r>
+        <w:t xml:space="preserve">‘</w:t>
+      </w:r>
+      <w:r>
+        <w:t xml:space="preserve">Flick</w:t>
+      </w:r>
+      <w:r>
+        <w:t xml:space="preserve">’</w:t>
+      </w:r>
+      <w:r>
+        <w:t xml:space="preserve"> </w:t>
+      </w:r>
+      <w:r>
+        <w:t xml:space="preserve">where the group prompt wrote</w:t>
+      </w:r>
+      <w:r>
+        <w:t xml:space="preserve"> </w:t>
+      </w:r>
+      <w:r>
+        <w:t xml:space="preserve">‘</w:t>
+      </w:r>
+      <w:r>
+        <w:t xml:space="preserve">Justice Flick</w:t>
+      </w:r>
+      <w:r>
+        <w:t xml:space="preserve">’</w:t>
+      </w:r>
+      <w:r>
+        <w:t xml:space="preserve">, and the query that groups by judge moves 0.03. The losses are changes of</w:t>
+      </w:r>
+      <w:r>
+        <w:t xml:space="preserve"> </w:t>
+      </w:r>
+      <w:r>
+        <w:t xml:space="preserve">emptiness and of a few numeric cells: the lone prompt leaves a party’s status empty in 214 documents against 85, so</w:t>
+      </w:r>
+      <w:r>
+        <w:t xml:space="preserve"> </w:t>
+      </w:r>
+      <w:r>
+        <w:t xml:space="preserve">filters select other rows, and an artist’s award count read alone loses 0.07 in accuracy while the average of awards</w:t>
+      </w:r>
+      <w:r>
+        <w:t xml:space="preserve"> </w:t>
+      </w:r>
+      <w:r>
+        <w:t xml:space="preserve">by continent loses 0.45. And reading a column alone costs a document, so the all-alone build spends 2.8 to 6.4 times</w:t>
+      </w:r>
+      <w:r>
+        <w:t xml:space="preserve"> </w:t>
+      </w:r>
+      <w:r>
+        <w:t xml:space="preserve">the supplement tokens and the selective one 1.5 to 4.7. The context effect is real, per column and predictable from</w:t>
+      </w:r>
+      <w:r>
+        <w:t xml:space="preserve"> </w:t>
+      </w:r>
+      <w:r>
+        <w:t xml:space="preserve">thirty documents; at the cell level it is mostly form and emptiness, which a view rule can often fix for nothing and</w:t>
+      </w:r>
+      <w:r>
+        <w:t xml:space="preserve"> </w:t>
+      </w:r>
+      <w:r>
+        <w:t xml:space="preserve">which aggregates and filters do not reward consistently.</w:t>
+      </w:r>
+    </w:p>
+    <w:p>
+      <w:pPr>
+        <w:pStyle w:val="BodyText"/>
+      </w:pPr>
+      <w:r>
         <w:rPr>
           <w:iCs/>
           <w:i/>
@@ -753,19 +898,31 @@
         <w:t xml:space="preserve"> </w:t>
       </w:r>
       <w:r>
-        <w:t xml:space="preserve">prompt each value came from, and re-extracting a column is a new measurement, not a refresh. The budget section below</w:t>
-      </w:r>
-      <w:r>
-        <w:t xml:space="preserve"> </w:t>
-      </w:r>
-      <w:r>
-        <w:t xml:space="preserve">shows what happens when this is ignored: delaying an extraction moves it into a different prompt and changes the</w:t>
-      </w:r>
-      <w:r>
-        <w:t xml:space="preserve"> </w:t>
-      </w:r>
-      <w:r>
-        <w:t xml:space="preserve">answers.</w:t>
+        <w:t xml:space="preserve">prompt each value came from, and re-extracting a column is a new measurement, not a refresh. Choose the grouping for</w:t>
+      </w:r>
+      <w:r>
+        <w:t xml:space="preserve"> </w:t>
+      </w:r>
+      <w:r>
+        <w:t xml:space="preserve">cost and consistency; harvest a column’s form gain through normalization rather than a separate read; read a column</w:t>
+      </w:r>
+      <w:r>
+        <w:t xml:space="preserve"> </w:t>
+      </w:r>
+      <w:r>
+        <w:t xml:space="preserve">alone only when its emptiness or selection matters to a query and the document is short. The budget section below</w:t>
+      </w:r>
+      <w:r>
+        <w:t xml:space="preserve"> </w:t>
+      </w:r>
+      <w:r>
+        <w:t xml:space="preserve">shows what happens when the prompt is not controlled: delaying an extraction moves it into a different prompt and</w:t>
+      </w:r>
+      <w:r>
+        <w:t xml:space="preserve"> </w:t>
+      </w:r>
+      <w:r>
+        <w:t xml:space="preserve">changes the answers.</w:t>
       </w:r>
     </w:p>
     <w:bookmarkEnd w:id="26"/>
@@ -5395,19 +5552,19 @@
         <w:pStyle w:val="FirstParagraph"/>
       </w:pPr>
       <w:r>
-        <w:t xml:space="preserve">Several things remain unexplained. With the 7B model, asking for fewer columns helps on papers and players and hurts</w:t>
-      </w:r>
-      <w:r>
-        <w:t xml:space="preserve"> </w:t>
-      </w:r>
-      <w:r>
-        <w:t xml:space="preserve">on artists, and we do not know why the direction depends on the corpus. Grouping columns matters for the 32B model</w:t>
-      </w:r>
-      <w:r>
-        <w:t xml:space="preserve"> </w:t>
-      </w:r>
-      <w:r>
-        <w:t xml:space="preserve">but barely for the 7B model. We cannot yet say how much of the medical corpus’s prompt sensitivity comes from each of</w:t>
+        <w:t xml:space="preserve">Several things remain unexplained. With the 7B model the direction of asking for fewer columns is a per-column mix</w:t>
+      </w:r>
+      <w:r>
+        <w:t xml:space="preserve"> </w:t>
+      </w:r>
+      <w:r>
+        <w:t xml:space="preserve">of form and emptiness effects (Section 1), and we cannot yet predict a query’s score change from its columns’ cell</w:t>
+      </w:r>
+      <w:r>
+        <w:t xml:space="preserve"> </w:t>
+      </w:r>
+      <w:r>
+        <w:t xml:space="preserve">changes. Grouping columns matters for the 32B model but barely for the 7B model. We cannot yet say how much of the medical corpus’s prompt sensitivity comes from each of</w:t>
       </w:r>
       <w:r>
         <w:t xml:space="preserve"> </w:t>
@@ -5437,13 +5594,19 @@
         <w:t xml:space="preserve"> </w:t>
       </w:r>
       <w:r>
-        <w:t xml:space="preserve">stated reason (Section 6). Running or queued, each with its prediction written first (RESEARCH_DEPTH.md): the build’s prompt groups chosen</w:t>
-      </w:r>
-      <w:r>
-        <w:t xml:space="preserve"> </w:t>
-      </w:r>
-      <w:r>
-        <w:t xml:space="preserve">by each column’s measured context effect (I5), the verifier as the router of second looks on the 32B (I2b), the label</w:t>
+        <w:t xml:space="preserve">stated reason (Section 6), and the build’s prompt groups chosen by each column’s measured context effect have been</w:t>
+      </w:r>
+      <w:r>
+        <w:t xml:space="preserve"> </w:t>
+      </w:r>
+      <w:r>
+        <w:t xml:space="preserve">tested (Section 1: the cell gains transfer, the query scores do not move). Running or queued, each with its</w:t>
+      </w:r>
+      <w:r>
+        <w:t xml:space="preserve"> </w:t>
+      </w:r>
+      <w:r>
+        <w:t xml:space="preserve">prediction written first (RESEARCH_DEPTH.md): the verifier as the router of second looks on the 32B (I2b), the label</w:t>
       </w:r>
       <w:r>
         <w:t xml:space="preserve"> </w:t>

</xml_diff>

<commit_message>
I3c on artists: determined-context freezing matches per-query DocETL (0.191 vs 0.188) at 45% of the tokens; figure 15 with the artists panel; docx rebuilt
Co-Authored-By: Claude Fable 5.1 <noreply@anthropic.com>
</commit_message>
<xml_diff>
--- a/results/experiments/why/Key_findings_and_why.docx
+++ b/results/experiments/why/Key_findings_and_why.docx
@@ -4553,7 +4553,25 @@
         <w:t xml:space="preserve"> </w:t>
       </w:r>
       <w:r>
-        <w:t xml:space="preserve">gives 0.113 on papers at a fifth of the calls and 0.119 on players. The two runs differ because DocETL sets no</w:t>
+        <w:t xml:space="preserve">gives 0.113 on papers at a fifth of the calls, 0.119 on players, and on artists 0.191 against 0.188 at 47% of the</w:t>
+      </w:r>
+      <w:r>
+        <w:t xml:space="preserve"> </w:t>
+      </w:r>
+      <w:r>
+        <w:t xml:space="preserve">calls (45% of the tokens), where 18 of 24 columns are determined by their first context and three are not after</w:t>
+      </w:r>
+      <w:r>
+        <w:t xml:space="preserve"> </w:t>
+      </w:r>
+      <w:r>
+        <w:t xml:space="preserve">four draws; so the determined-context rule holds per-query accuracy within 0.01 on three corpora at 13% to 45% of the</w:t>
+      </w:r>
+      <w:r>
+        <w:t xml:space="preserve"> </w:t>
+      </w:r>
+      <w:r>
+        <w:t xml:space="preserve">tokens. The two runs differ because DocETL sets no</w:t>
       </w:r>
       <w:r>
         <w:t xml:space="preserve"> </w:t>
@@ -4633,9 +4651,9 @@
       <w:r>
         <w:drawing>
           <wp:inline>
-            <wp:extent cx="5334000" cy="1981200"/>
+            <wp:extent cx="5334000" cy="1485900"/>
             <wp:effectExtent b="0" l="0" r="0" t="0"/>
-            <wp:docPr descr="Figure 15. DocETL’s mean query score and number of model calls on the same queries: per-query extraction, every column frozen on its first context, frozen on the better of its first two contexts (two runs), and frozen on a determined context." title="" id="71" name="Picture"/>
+            <wp:docPr descr="Figure 15. DocETL’s mean query score and number of model calls on the same queries: per-query extraction, every column frozen on its first context, frozen on the better of its first two contexts (two runs), and frozen on a determined context; artists with the determined-context rule only." title="" id="71" name="Picture"/>
             <a:graphic>
               <a:graphicData uri="http://schemas.openxmlformats.org/drawingml/2006/picture">
                 <pic:pic>
@@ -4654,7 +4672,7 @@
                   <pic:spPr bwMode="auto">
                     <a:xfrm>
                       <a:off x="0" y="0"/>
-                      <a:ext cx="5334000" cy="1981200"/>
+                      <a:ext cx="5334000" cy="1485900"/>
                     </a:xfrm>
                     <a:prstGeom prst="rect">
                       <a:avLst/>
@@ -4690,7 +4708,7 @@
         <w:t xml:space="preserve"> </w:t>
       </w:r>
       <w:r>
-        <w:t xml:space="preserve">determined context.</w:t>
+        <w:t xml:space="preserve">determined context; artists with the determined-context rule only.</w:t>
       </w:r>
     </w:p>
     <w:p>

</xml_diff>

<commit_message>
I2b, I6, I7 folded into the key findings and the workload document: verifier finds wrong not repairable cells; a vocabulary fixes form not selection (legal 0.170->0.269); windows cannot establish an absence; docx rebuilt
Co-Authored-By: Claude Fable 5.1 <noreply@anthropic.com>
</commit_message>
<xml_diff>
--- a/results/experiments/why/Key_findings_and_why.docx
+++ b/results/experiments/why/Key_findings_and_why.docx
@@ -1647,6 +1647,136 @@
         <w:pStyle w:val="BodyText"/>
       </w:pPr>
       <w:r>
+        <w:t xml:space="preserve">We then let the verifier choose: 600 second looks by the 32B routed by its score, against 600 at random and 600</w:t>
+      </w:r>
+      <w:r>
+        <w:t xml:space="preserve"> </w:t>
+      </w:r>
+      <w:r>
+        <w:t xml:space="preserve">most-sensitive-first (1,280 new reads). The verifier’s 600 are wrong 99% of the time, random’s 60%; but the 32B</w:t>
+      </w:r>
+      <w:r>
+        <w:t xml:space="preserve"> </w:t>
+      </w:r>
+      <w:r>
+        <w:t xml:space="preserve">repairs 13% of the verifier’s and 32% of random’s, so the verifier nets 72 fixes for $0.52 against random’s 89 for</w:t>
+      </w:r>
+      <w:r>
+        <w:t xml:space="preserve"> </w:t>
+      </w:r>
+      <w:r>
+        <w:t xml:space="preserve">$0.55. On all 2,999 cells that now have a second look, the same label-free features predict</w:t>
+      </w:r>
+      <w:r>
+        <w:t xml:space="preserve"> </w:t>
+      </w:r>
+      <w:r>
+        <w:t xml:space="preserve">“</w:t>
+      </w:r>
+      <w:r>
+        <w:t xml:space="preserve">wrong</w:t>
+      </w:r>
+      <w:r>
+        <w:t xml:space="preserve">”</w:t>
+      </w:r>
+      <w:r>
+        <w:t xml:space="preserve"> </w:t>
+      </w:r>
+      <w:r>
+        <w:t xml:space="preserve">with AUROC 0.84</w:t>
+      </w:r>
+      <w:r>
+        <w:t xml:space="preserve"> </w:t>
+      </w:r>
+      <w:r>
+        <w:t xml:space="preserve">and</w:t>
+      </w:r>
+      <w:r>
+        <w:t xml:space="preserve"> </w:t>
+      </w:r>
+      <w:r>
+        <w:t xml:space="preserve">“</w:t>
+      </w:r>
+      <w:r>
+        <w:t xml:space="preserve">wrong and repaired by the stronger reader</w:t>
+      </w:r>
+      <w:r>
+        <w:t xml:space="preserve">”</w:t>
+      </w:r>
+      <w:r>
+        <w:t xml:space="preserve"> </w:t>
+      </w:r>
+      <w:r>
+        <w:t xml:space="preserve">with 0.53, which is chance.</w:t>
+      </w:r>
+      <w:r>
+        <w:t xml:space="preserve"> </w:t>
+      </w:r>
+      <w:r>
+        <w:rPr>
+          <w:bCs/>
+          <w:b/>
+        </w:rPr>
+        <w:t xml:space="preserve">The verifier detects</w:t>
+      </w:r>
+      <w:r>
+        <w:rPr>
+          <w:bCs/>
+          <w:b/>
+        </w:rPr>
+        <w:t xml:space="preserve"> </w:t>
+      </w:r>
+      <w:r>
+        <w:rPr>
+          <w:bCs/>
+          <w:b/>
+        </w:rPr>
+        <w:t xml:space="preserve">under-determination, which no reader repairs; it cannot see repairability, and nothing label-free in these features</w:t>
+      </w:r>
+      <w:r>
+        <w:rPr>
+          <w:bCs/>
+          <w:b/>
+        </w:rPr>
+        <w:t xml:space="preserve"> </w:t>
+      </w:r>
+      <w:r>
+        <w:rPr>
+          <w:bCs/>
+          <w:b/>
+        </w:rPr>
+        <w:t xml:space="preserve">can.</w:t>
+      </w:r>
+      <w:r>
+        <w:t xml:space="preserve"> </w:t>
+      </w:r>
+      <w:r>
+        <w:t xml:space="preserve">Repair rates are flat across kinds (14% to 23% of wrong cells), so a second look repairs about a fifth of</w:t>
+      </w:r>
+      <w:r>
+        <w:t xml:space="preserve"> </w:t>
+      </w:r>
+      <w:r>
+        <w:t xml:space="preserve">wrong cells whoever chooses them, and the only lever left to a router is price, which is why most-sensitive-first</w:t>
+      </w:r>
+      <w:r>
+        <w:t xml:space="preserve"> </w:t>
+      </w:r>
+      <w:r>
+        <w:t xml:space="preserve">(short documents) stays close to random per dollar. The verifier’s use is the one it is good at: saying which cells</w:t>
+      </w:r>
+      <w:r>
+        <w:t xml:space="preserve"> </w:t>
+      </w:r>
+      <w:r>
+        <w:t xml:space="preserve">not to trust.</w:t>
+      </w:r>
+    </w:p>
+    <w:p>
+      <w:pPr>
+        <w:pStyle w:val="BodyText"/>
+      </w:pPr>
+      <w:r>
         <w:rPr>
           <w:iCs/>
           <w:i/>
@@ -1687,13 +1817,13 @@
         <w:t xml:space="preserve"> </w:t>
       </w:r>
       <w:r>
-        <w:t xml:space="preserve">neither labels nor a model, tells which cells to trust and which to send to a stronger reader, and that routing should</w:t>
-      </w:r>
-      <w:r>
-        <w:t xml:space="preserve"> </w:t>
-      </w:r>
-      <w:r>
-        <w:t xml:space="preserve">be priced per token, not per cell.</w:t>
+        <w:t xml:space="preserve">neither labels nor a model, tells which cells not to trust; it does not tell which a stronger reader will repair, so</w:t>
+      </w:r>
+      <w:r>
+        <w:t xml:space="preserve"> </w:t>
+      </w:r>
+      <w:r>
+        <w:t xml:space="preserve">route second looks by price and expect about a fifth of them to pay.</w:t>
       </w:r>
     </w:p>
     <w:bookmarkEnd w:id="36"/>
@@ -5178,7 +5308,122 @@
         <w:t xml:space="preserve"> </w:t>
       </w:r>
       <w:r>
-        <w:t xml:space="preserve">where none exists (a run on those five is queued).</w:t>
+        <w:t xml:space="preserve">where none exists. We ran it on those five. Where the column is single-valued and its labels are forms of a stated</w:t>
+      </w:r>
+      <w:r>
+        <w:t xml:space="preserve"> </w:t>
+      </w:r>
+      <w:r>
+        <w:t xml:space="preserve">fact, declaring them works: artists’ century goes from 0.20 to 0.38 correct and the six queries grouping by it from</w:t>
+      </w:r>
+      <w:r>
+        <w:t xml:space="preserve"> </w:t>
+      </w:r>
+      <w:r>
+        <w:t xml:space="preserve">0.22 to 0.35; legal’s party status and year lift the corpus from 0.170 to 0.269 and the seven grouping queries from</w:t>
+      </w:r>
+      <w:r>
+        <w:t xml:space="preserve"> </w:t>
+      </w:r>
+      <w:r>
+        <w:t xml:space="preserve">0.17 to 0.32, none down, because filters now match the form the queries compare with. The fate of the rows says what</w:t>
+      </w:r>
+      <w:r>
+        <w:t xml:space="preserve"> </w:t>
+      </w:r>
+      <w:r>
+        <w:t xml:space="preserve">a vocabulary does: artists’</w:t>
+      </w:r>
+      <w:r>
+        <w:t xml:space="preserve"> </w:t>
+      </w:r>
+      <w:r>
+        <w:t xml:space="preserve">“</w:t>
+      </w:r>
+      <w:r>
+        <w:t xml:space="preserve">own label in another form</w:t>
+      </w:r>
+      <w:r>
+        <w:t xml:space="preserve">”</w:t>
+      </w:r>
+      <w:r>
+        <w:t xml:space="preserve"> </w:t>
+      </w:r>
+      <w:r>
+        <w:t xml:space="preserve">falls from 50% to 6%, exact rises from 27% to 52%, and merged</w:t>
+      </w:r>
+      <w:r>
+        <w:t xml:space="preserve"> </w:t>
+      </w:r>
+      <w:r>
+        <w:t xml:space="preserve">rises from 23% to 43%, since once the forms agree the model’s choice between</w:t>
+      </w:r>
+      <w:r>
+        <w:t xml:space="preserve"> </w:t>
+      </w:r>
+      <w:r>
+        <w:t xml:space="preserve">‘</w:t>
+      </w:r>
+      <w:r>
+        <w:t xml:space="preserve">20th</w:t>
+      </w:r>
+      <w:r>
+        <w:t xml:space="preserve">’</w:t>
+      </w:r>
+      <w:r>
+        <w:t xml:space="preserve"> </w:t>
+      </w:r>
+      <w:r>
+        <w:t xml:space="preserve">and</w:t>
+      </w:r>
+      <w:r>
+        <w:t xml:space="preserve"> </w:t>
+      </w:r>
+      <w:r>
+        <w:t xml:space="preserve">‘</w:t>
+      </w:r>
+      <w:r>
+        <w:t xml:space="preserve">19th-20th</w:t>
+      </w:r>
+      <w:r>
+        <w:t xml:space="preserve">’</w:t>
+      </w:r>
+      <w:r>
+        <w:t xml:space="preserve"> </w:t>
+      </w:r>
+      <w:r>
+        <w:t xml:space="preserve">is exposed as a</w:t>
+      </w:r>
+      <w:r>
+        <w:t xml:space="preserve"> </w:t>
+      </w:r>
+      <w:r>
+        <w:t xml:space="preserve">judgment. Where the column is a list, listing allowed values invites selection: medical’s two contracted list columns</w:t>
+      </w:r>
+      <w:r>
+        <w:t xml:space="preserve"> </w:t>
+      </w:r>
+      <w:r>
+        <w:t xml:space="preserve">lose accuracy (0.20 to 0.05 on one) and the corpus loses 0.013.</w:t>
+      </w:r>
+      <w:r>
+        <w:t xml:space="preserve"> </w:t>
+      </w:r>
+      <w:r>
+        <w:rPr>
+          <w:bCs/>
+          <w:b/>
+        </w:rPr>
+        <w:t xml:space="preserve">A vocabulary fixes form, not selection</w:t>
+      </w:r>
+      <w:r>
+        <w:t xml:space="preserve">, and</w:t>
+      </w:r>
+      <w:r>
+        <w:t xml:space="preserve"> </w:t>
+      </w:r>
+      <w:r>
+        <w:t xml:space="preserve">should be declared for single-valued columns only.</w:t>
       </w:r>
     </w:p>
     <w:p>
@@ -5216,7 +5461,82 @@
         <w:t xml:space="preserve"> </w:t>
       </w:r>
       <w:r>
-        <w:t xml:space="preserve">the fixed first-window cut of the ablation (21% to 42% of tokens for −0.012 to +0.015); a run with it is queued.</w:t>
+        <w:t xml:space="preserve">the fixed first-window cut of the ablation (21% to 42% of tokens for −0.012 to +0.015). Run on four corpora, the</w:t>
+      </w:r>
+      <w:r>
+        <w:t xml:space="preserve"> </w:t>
+      </w:r>
+      <w:r>
+        <w:t xml:space="preserve">per-column windows cut tokens to 41% on players, 75% on artists, 88% on papers and 89% on medical, with scores</w:t>
+      </w:r>
+      <w:r>
+        <w:t xml:space="preserve"> </w:t>
+      </w:r>
+      <w:r>
+        <w:t xml:space="preserve">unchanged on papers and artists, up 0.007 on medical and down 0.021 on players. Per column the window is a change of</w:t>
+      </w:r>
+      <w:r>
+        <w:t xml:space="preserve"> </w:t>
+      </w:r>
+      <w:r>
+        <w:t xml:space="preserve">context like any other: artists’ birth and death dates improve by 0.41 and 0.25 when the read stops at a tenth of</w:t>
+      </w:r>
+      <w:r>
+        <w:t xml:space="preserve"> </w:t>
+      </w:r>
+      <w:r>
+        <w:t xml:space="preserve">the article, because the first paragraph states the full date and the chained read of the whole article had</w:t>
+      </w:r>
+      <w:r>
+        <w:t xml:space="preserve"> </w:t>
+      </w:r>
+      <w:r>
+        <w:t xml:space="preserve">returned the year alone; lists lose where their items sit past the window; and players’ championship counts</w:t>
+      </w:r>
+      <w:r>
+        <w:t xml:space="preserve"> </w:t>
+      </w:r>
+      <w:r>
+        <w:t xml:space="preserve">collapse from 0.95 to 0.40, because the window was learned from the few players for whom a count is stated, while</w:t>
+      </w:r>
+      <w:r>
+        <w:t xml:space="preserve"> </w:t>
+      </w:r>
+      <w:r>
+        <w:t xml:space="preserve">most players’ gold is 0 and the model needs the whole entry to answer 0, otherwise leaving the cell empty.</w:t>
+      </w:r>
+      <w:r>
+        <w:t xml:space="preserve"> </w:t>
+      </w:r>
+      <w:r>
+        <w:rPr>
+          <w:bCs/>
+          <w:b/>
+        </w:rPr>
+        <w:t xml:space="preserve">A window</w:t>
+      </w:r>
+      <w:r>
+        <w:rPr>
+          <w:bCs/>
+          <w:b/>
+        </w:rPr>
+        <w:t xml:space="preserve"> </w:t>
+      </w:r>
+      <w:r>
+        <w:rPr>
+          <w:bCs/>
+          <w:b/>
+        </w:rPr>
+        <w:t xml:space="preserve">can locate a stated value but cannot establish an absence</w:t>
+      </w:r>
+      <w:r>
+        <w:t xml:space="preserve">, so the rule must exempt columns whose values are mostly</w:t>
+      </w:r>
+      <w:r>
+        <w:t xml:space="preserve"> </w:t>
+      </w:r>
+      <w:r>
+        <w:t xml:space="preserve">a coded absence and lists whose items scatter.</w:t>
       </w:r>
       <w:r>
         <w:t xml:space="preserve"> </w:t>
@@ -5618,19 +5938,31 @@
         <w:t xml:space="preserve"> </w:t>
       </w:r>
       <w:r>
-        <w:t xml:space="preserve">tested (Section 1: the cell gains transfer, the query scores do not move). Running or queued, each with its</w:t>
-      </w:r>
-      <w:r>
-        <w:t xml:space="preserve"> </w:t>
-      </w:r>
-      <w:r>
-        <w:t xml:space="preserve">prediction written first (RESEARCH_DEPTH.md): the verifier as the router of second looks on the 32B (I2b), the label</w:t>
-      </w:r>
-      <w:r>
-        <w:t xml:space="preserve"> </w:t>
-      </w:r>
-      <w:r>
-        <w:t xml:space="preserve">contract on the five columns that lack a vocabulary (I6), and per-column read windows (I7).</w:t>
+        <w:t xml:space="preserve">tested (Section 1: the cell gains transfer, the query scores do not move), as have the verifier as a router of</w:t>
+      </w:r>
+      <w:r>
+        <w:t xml:space="preserve"> </w:t>
+      </w:r>
+      <w:r>
+        <w:t xml:space="preserve">second looks (Section 2: it finds wrong cells, not repairable ones), the label contract and the per-column windows</w:t>
+      </w:r>
+      <w:r>
+        <w:t xml:space="preserve"> </w:t>
+      </w:r>
+      <w:r>
+        <w:t xml:space="preserve">(Section 11). Not yet run: a per-column estimate of repairability from a few labelled cells, the window rule with</w:t>
+      </w:r>
+      <w:r>
+        <w:t xml:space="preserve"> </w:t>
+      </w:r>
+      <w:r>
+        <w:t xml:space="preserve">its exemptions, and a field-order rule that places a mostly-empty column after the fields that make its absence</w:t>
+      </w:r>
+      <w:r>
+        <w:t xml:space="preserve"> </w:t>
+      </w:r>
+      <w:r>
+        <w:t xml:space="preserve">evident.</w:t>
       </w:r>
     </w:p>
     <w:bookmarkEnd w:id="80"/>
@@ -5877,6 +6209,54 @@
       </w:r>
       <w:r>
         <w:t xml:space="preserve">reference queries, and checks each query constant for a verbatim occurrence in the documents whose gold value equals it.</w:t>
+      </w:r>
+      <w:r>
+        <w:t xml:space="preserve"> </w:t>
+      </w:r>
+      <w:r>
+        <w:t xml:space="preserve">The label contract adds gold’s label set as the allowed values of a column’s on-demand prompt; the window runs cut</w:t>
+      </w:r>
+      <w:r>
+        <w:t xml:space="preserve"> </w:t>
+      </w:r>
+      <w:r>
+        <w:t xml:space="preserve">each document to the column’s learned share before the prompt is rendered (a prompt for several columns takes the</w:t>
+      </w:r>
+      <w:r>
+        <w:t xml:space="preserve"> </w:t>
+      </w:r>
+      <w:r>
+        <w:t xml:space="preserve">largest share); the routed second looks re-ask the 32B for the 600 cells each rule ranks first, reusing earlier</w:t>
+      </w:r>
+      <w:r>
+        <w:t xml:space="preserve"> </w:t>
+      </w:r>
+      <w:r>
+        <w:t xml:space="preserve">second looks of the same cells, and the repairability test fits the verifier’s features to</w:t>
+      </w:r>
+      <w:r>
+        <w:t xml:space="preserve"> </w:t>
+      </w:r>
+      <w:r>
+        <w:t xml:space="preserve">“</w:t>
+      </w:r>
+      <w:r>
+        <w:t xml:space="preserve">wrong and repaired</w:t>
+      </w:r>
+      <w:r>
+        <w:t xml:space="preserve">”</w:t>
+      </w:r>
+      <w:r>
+        <w:t xml:space="preserve"> </w:t>
+      </w:r>
+      <w:r>
+        <w:t xml:space="preserve">with</w:t>
+      </w:r>
+      <w:r>
+        <w:t xml:space="preserve"> </w:t>
+      </w:r>
+      <w:r>
+        <w:t xml:space="preserve">whole columns held out.</w:t>
       </w:r>
     </w:p>
     <w:bookmarkEnd w:id="81"/>

</xml_diff>

<commit_message>
Repairability is a column property: ten labelled second looks per column route 600 looks to 189 net fixes vs 59 random; docs and docx updated
Co-Authored-By: Claude Fable 5.1 <noreply@anthropic.com>
</commit_message>
<xml_diff>
--- a/results/experiments/why/Key_findings_and_why.docx
+++ b/results/experiments/why/Key_findings_and_why.docx
@@ -1757,19 +1757,59 @@
         <w:t xml:space="preserve"> </w:t>
       </w:r>
       <w:r>
-        <w:t xml:space="preserve">wrong cells whoever chooses them, and the only lever left to a router is price, which is why most-sensitive-first</w:t>
-      </w:r>
-      <w:r>
-        <w:t xml:space="preserve"> </w:t>
-      </w:r>
-      <w:r>
-        <w:t xml:space="preserve">(short documents) stays close to random per dollar. The verifier’s use is the one it is good at: saying which cells</w:t>
-      </w:r>
-      <w:r>
-        <w:t xml:space="preserve"> </w:t>
-      </w:r>
-      <w:r>
-        <w:t xml:space="preserve">not to trust.</w:t>
+        <w:t xml:space="preserve">wrong cells whoever chooses them. The verifier’s use is the one it is good at: saying which cells not to trust.</w:t>
+      </w:r>
+      <w:r>
+        <w:t xml:space="preserve"> </w:t>
+      </w:r>
+      <w:r>
+        <w:rPr>
+          <w:bCs/>
+          <w:b/>
+        </w:rPr>
+        <w:t xml:space="preserve">Repairability is a column property, and ten labelled cells find it.</w:t>
+      </w:r>
+      <w:r>
+        <w:t xml:space="preserve"> </w:t>
+      </w:r>
+      <w:r>
+        <w:t xml:space="preserve">Over the 25 columns with twenty or more</w:t>
+      </w:r>
+      <w:r>
+        <w:t xml:space="preserve"> </w:t>
+      </w:r>
+      <w:r>
+        <w:t xml:space="preserve">second looks, the net repair rate ranges from −0.67 to +0.56 per look (an artist’s death date +0.56, birth city</w:t>
+      </w:r>
+      <w:r>
+        <w:t xml:space="preserve"> </w:t>
+      </w:r>
+      <w:r>
+        <w:t xml:space="preserve">+0.54; columns where the stronger reader breaks more than it fixes at the other end). Estimating each column’s rate</w:t>
+      </w:r>
+      <w:r>
+        <w:t xml:space="preserve"> </w:t>
+      </w:r>
+      <w:r>
+        <w:t xml:space="preserve">from ten labelled second looks and routing 600 looks by it nets 189 fixes against 59 for random and 68 for</w:t>
+      </w:r>
+      <w:r>
+        <w:t xml:space="preserve"> </w:t>
+      </w:r>
+      <w:r>
+        <w:t xml:space="preserve">most-sensitive-first, 402 fixes per dollar with price in the denominator against 123, and close to the 206 of the</w:t>
+      </w:r>
+      <w:r>
+        <w:t xml:space="preserve"> </w:t>
+      </w:r>
+      <w:r>
+        <w:t xml:space="preserve">hindsight order. A stronger reader repairs misreadings of determined columns, and which columns those are is learnt</w:t>
+      </w:r>
+      <w:r>
+        <w:t xml:space="preserve"> </w:t>
+      </w:r>
+      <w:r>
+        <w:t xml:space="preserve">from a handful of labels, not from label-free features. The cascade router is a per-column table of repair rates.</w:t>
       </w:r>
     </w:p>
     <w:p>
@@ -1817,13 +1857,19 @@
         <w:t xml:space="preserve"> </w:t>
       </w:r>
       <w:r>
-        <w:t xml:space="preserve">neither labels nor a model, tells which cells not to trust; it does not tell which a stronger reader will repair, so</w:t>
-      </w:r>
-      <w:r>
-        <w:t xml:space="preserve"> </w:t>
-      </w:r>
-      <w:r>
-        <w:t xml:space="preserve">route second looks by price and expect about a fifth of them to pay.</w:t>
+        <w:t xml:space="preserve">neither labels nor a model, tells which cells not to trust; it does not tell which a stronger reader will repair.</w:t>
+      </w:r>
+      <w:r>
+        <w:t xml:space="preserve"> </w:t>
+      </w:r>
+      <w:r>
+        <w:t xml:space="preserve">Label ten second looks per column, route by the column’s repair rate over its price, and expect three times the</w:t>
+      </w:r>
+      <w:r>
+        <w:t xml:space="preserve"> </w:t>
+      </w:r>
+      <w:r>
+        <w:t xml:space="preserve">repairs of a random allocation.</w:t>
       </w:r>
     </w:p>
     <w:bookmarkEnd w:id="36"/>
@@ -5950,19 +5996,19 @@
         <w:t xml:space="preserve"> </w:t>
       </w:r>
       <w:r>
-        <w:t xml:space="preserve">(Section 11). Not yet run: a per-column estimate of repairability from a few labelled cells, the window rule with</w:t>
-      </w:r>
-      <w:r>
-        <w:t xml:space="preserve"> </w:t>
-      </w:r>
-      <w:r>
-        <w:t xml:space="preserve">its exemptions, and a field-order rule that places a mostly-empty column after the fields that make its absence</w:t>
-      </w:r>
-      <w:r>
-        <w:t xml:space="preserve"> </w:t>
-      </w:r>
-      <w:r>
-        <w:t xml:space="preserve">evident.</w:t>
+        <w:t xml:space="preserve">(Section 11). Not yet run: the window rule with its exemptions, replicates of the contract runs, the 32B context intervention</w:t>
+      </w:r>
+      <w:r>
+        <w:t xml:space="preserve"> </w:t>
+      </w:r>
+      <w:r>
+        <w:t xml:space="preserve">on medical and legal, and a field-order rule that places a mostly-empty column after the fields that make its</w:t>
+      </w:r>
+      <w:r>
+        <w:t xml:space="preserve"> </w:t>
+      </w:r>
+      <w:r>
+        <w:t xml:space="preserve">absence evident (all queued).</w:t>
       </w:r>
     </w:p>
     <w:bookmarkEnd w:id="80"/>

</xml_diff>

<commit_message>
Field position: last beats first by 0.046 with fewer empties, per column up to 0.6, no rule from gold emptiness; reads and analysis committed; docx rebuilt
Co-Authored-By: Claude Fable 5.1 <noreply@anthropic.com>
</commit_message>
<xml_diff>
--- a/results/experiments/why/Key_findings_and_why.docx
+++ b/results/experiments/why/Key_findings_and_why.docx
@@ -656,7 +656,73 @@
         <w:t xml:space="preserve"> </w:t>
       </w:r>
       <w:r>
-        <w:t xml:space="preserve">that reorders fields for cache hits changes the answers.</w:t>
+        <w:t xml:space="preserve">that reorders fields for cache hits changes the answers. Position itself is a free knob: the same column asked last</w:t>
+      </w:r>
+      <w:r>
+        <w:t xml:space="preserve"> </w:t>
+      </w:r>
+      <w:r>
+        <w:t xml:space="preserve">among the same fields is right 0.43 of the time against 0.39 when asked first, with fewer empties, and the effect is</w:t>
+      </w:r>
+      <w:r>
+        <w:t xml:space="preserve"> </w:t>
+      </w:r>
+      <w:r>
+        <w:t xml:space="preserve">per column and up to 0.6 (a</w:t>
+      </w:r>
+      <w:r>
+        <w:t xml:space="preserve"> </w:t>
+      </w:r>
+      <w:r>
+        <w:t xml:space="preserve">“</w:t>
+      </w:r>
+      <w:r>
+        <w:t xml:space="preserve">never null</w:t>
+      </w:r>
+      <w:r>
+        <w:t xml:space="preserve">”</w:t>
+      </w:r>
+      <w:r>
+        <w:t xml:space="preserve"> </w:t>
+      </w:r>
+      <w:r>
+        <w:t xml:space="preserve">count is left empty on 87% of documents when it heads the list and on 47%</w:t>
+      </w:r>
+      <w:r>
+        <w:t xml:space="preserve"> </w:t>
+      </w:r>
+      <w:r>
+        <w:t xml:space="preserve">when it closes it; a category whose gold is mostly empty is filled with</w:t>
+      </w:r>
+      <w:r>
+        <w:t xml:space="preserve"> </w:t>
+      </w:r>
+      <w:r>
+        <w:t xml:space="preserve">‘</w:t>
+      </w:r>
+      <w:r>
+        <w:t xml:space="preserve">Other</w:t>
+      </w:r>
+      <w:r>
+        <w:t xml:space="preserve">’</w:t>
+      </w:r>
+      <w:r>
+        <w:t xml:space="preserve"> </w:t>
+      </w:r>
+      <w:r>
+        <w:t xml:space="preserve">first and left empty last). The</w:t>
+      </w:r>
+      <w:r>
+        <w:t xml:space="preserve"> </w:t>
+      </w:r>
+      <w:r>
+        <w:t xml:space="preserve">share of empty gold does not predict the direction, so there is no layout rule to state, only a per-column choice</w:t>
+      </w:r>
+      <w:r>
+        <w:t xml:space="preserve"> </w:t>
+      </w:r>
+      <w:r>
+        <w:t xml:space="preserve">the thirty-document test can make.</w:t>
       </w:r>
     </w:p>
     <w:p>
@@ -6002,13 +6068,13 @@
         <w:t xml:space="preserve"> </w:t>
       </w:r>
       <w:r>
-        <w:t xml:space="preserve">on medical and legal, and a field-order rule that places a mostly-empty column after the fields that make its</w:t>
-      </w:r>
-      <w:r>
-        <w:t xml:space="preserve"> </w:t>
-      </w:r>
-      <w:r>
-        <w:t xml:space="preserve">absence evident (all queued).</w:t>
+        <w:t xml:space="preserve">on medical and legal (queued). The field-position test found no rule to state (Section 1), only a per-column</w:t>
+      </w:r>
+      <w:r>
+        <w:t xml:space="preserve"> </w:t>
+      </w:r>
+      <w:r>
+        <w:t xml:space="preserve">choice.</w:t>
       </w:r>
     </w:p>
     <w:bookmarkEnd w:id="80"/>

</xml_diff>

<commit_message>
I7b: exemptions restore the cells, filtered aggregates still flip on single cells, exemptions propagate through grouping; I6rep on artists replicates the contract gain
Co-Authored-By: Claude Fable 5.1 <noreply@anthropic.com>
</commit_message>
<xml_diff>
--- a/results/experiments/why/Key_findings_and_why.docx
+++ b/results/experiments/why/Key_findings_and_why.docx
@@ -5648,7 +5648,43 @@
         <w:t xml:space="preserve"> </w:t>
       </w:r>
       <w:r>
-        <w:t xml:space="preserve">a coded absence and lists whose items scatter.</w:t>
+        <w:t xml:space="preserve">a coded absence and lists whose items scatter. With those exemptions the counts return to their recorded accuracy</w:t>
+      </w:r>
+      <w:r>
+        <w:t xml:space="preserve"> </w:t>
+      </w:r>
+      <w:r>
+        <w:t xml:space="preserve">and every windowed column stays within 0.07, yet players still lose 0.03: three filtered aggregates over two or</w:t>
+      </w:r>
+      <w:r>
+        <w:t xml:space="preserve"> </w:t>
+      </w:r>
+      <w:r>
+        <w:t xml:space="preserve">three rows flip from 1 to 0 on single cells the draft columns’ windows changed, so a per-column accuracy within</w:t>
+      </w:r>
+      <w:r>
+        <w:t xml:space="preserve"> </w:t>
+      </w:r>
+      <w:r>
+        <w:t xml:space="preserve">0.02 is no safety margin for an aggregate over a narrow filter. And an exemption propagates through grouping: a</w:t>
+      </w:r>
+      <w:r>
+        <w:t xml:space="preserve"> </w:t>
+      </w:r>
+      <w:r>
+        <w:t xml:space="preserve">prompt takes the largest share of the columns it asks, so artists’ birth date lost its gain as soon as the lists in</w:t>
+      </w:r>
+      <w:r>
+        <w:t xml:space="preserve"> </w:t>
+      </w:r>
+      <w:r>
+        <w:t xml:space="preserve">its prompt were exempt. Windows and grouping have to be planned together, and the choice is about accuracy as much</w:t>
+      </w:r>
+      <w:r>
+        <w:t xml:space="preserve"> </w:t>
+      </w:r>
+      <w:r>
+        <w:t xml:space="preserve">as cost: a dates-only prompt at a tenth of the article costs 10% more than one prompt and gains 0.25 to 0.41.</w:t>
       </w:r>
       <w:r>
         <w:t xml:space="preserve"> </w:t>

</xml_diff>

<commit_message>
I6rep on legal: the contract's +0.10 replicates (0.270 vs 0.269); docx rebuilt
Co-Authored-By: Claude Fable 5.1 <noreply@anthropic.com>
</commit_message>
<xml_diff>
--- a/results/experiments/why/Key_findings_and_why.docx
+++ b/results/experiments/why/Key_findings_and_why.docx
@@ -5432,13 +5432,19 @@
         <w:t xml:space="preserve"> </w:t>
       </w:r>
       <w:r>
-        <w:t xml:space="preserve">0.22 to 0.35; legal’s party status and year lift the corpus from 0.170 to 0.269 and the seven grouping queries from</w:t>
-      </w:r>
-      <w:r>
-        <w:t xml:space="preserve"> </w:t>
-      </w:r>
-      <w:r>
-        <w:t xml:space="preserve">0.17 to 0.32, none down, because filters now match the form the queries compare with. The fate of the rows says what</w:t>
+        <w:t xml:space="preserve">0.22 to 0.35; legal’s party status and year lift the corpus from 0.170 to 0.269 (0.270 in a second run) and the seven grouping</w:t>
+      </w:r>
+      <w:r>
+        <w:t xml:space="preserve"> </w:t>
+      </w:r>
+      <w:r>
+        <w:t xml:space="preserve">queries from 0.17 to 0.32, none down, because filters now match the form the queries compare with; on artists the</w:t>
+      </w:r>
+      <w:r>
+        <w:t xml:space="preserve"> </w:t>
+      </w:r>
+      <w:r>
+        <w:t xml:space="preserve">gain replicates too (0.275 and 0.279). The fate of the rows says what</w:t>
       </w:r>
       <w:r>
         <w:t xml:space="preserve"> </w:t>

</xml_diff>

<commit_message>
I1 on the 32B across five corpora: cross-model sensitivity rank 0.77, 7B sensitivity predicts 32B accuracy at -0.71; every planned intervention has run; docx rebuilt
Co-Authored-By: Claude Fable 5.1 <noreply@anthropic.com>
</commit_message>
<xml_diff>
--- a/results/experiments/why/Key_findings_and_why.docx
+++ b/results/experiments/why/Key_findings_and_why.docx
@@ -416,7 +416,25 @@
         <w:t xml:space="preserve"> </w:t>
       </w:r>
       <w:r>
-        <w:t xml:space="preserve">measured it on other model families.</w:t>
+        <w:t xml:space="preserve">measured it on other model families. The intervention below was run on both models on all five corpora (39 shared</w:t>
+      </w:r>
+      <w:r>
+        <w:t xml:space="preserve"> </w:t>
+      </w:r>
+      <w:r>
+        <w:t xml:space="preserve">columns): the two rank the columns’ sensitivity the same way (Spearman 0.77), the 32B is barely less sensitive on</w:t>
+      </w:r>
+      <w:r>
+        <w:t xml:space="preserve"> </w:t>
+      </w:r>
+      <w:r>
+        <w:t xml:space="preserve">average (0.38 against 0.39) and more sensitive on 13 of 39 columns, and on the 32B the natural group is the best</w:t>
+      </w:r>
+      <w:r>
+        <w:t xml:space="preserve"> </w:t>
+      </w:r>
+      <w:r>
+        <w:t xml:space="preserve">context on average (0.48 against 0.46 alone) where on the 7B the contexts tie.</w:t>
       </w:r>
     </w:p>
     <w:p>
@@ -1430,13 +1448,13 @@
         <w:t xml:space="preserve"> </w:t>
       </w:r>
       <w:r>
-        <w:t xml:space="preserve">sensitive cells, chosen with hindsight, give 132). What it predicts is the 32B’s own accuracy on the column (−0.67,</w:t>
-      </w:r>
-      <w:r>
-        <w:t xml:space="preserve"> </w:t>
-      </w:r>
-      <w:r>
-        <w:t xml:space="preserve">as it predicts the 7B’s, Llama’s and DocETL’s): in the most sensitive band the 7B is right on 14% of cells and the 32B</w:t>
+        <w:t xml:space="preserve">sensitive cells, chosen with hindsight, give 132). What it predicts is the 32B’s own accuracy on the column (−0.67 on the second-look cells, −0.71 on the</w:t>
+      </w:r>
+      <w:r>
+        <w:t xml:space="preserve"> </w:t>
+      </w:r>
+      <w:r>
+        <w:t xml:space="preserve">intervention’s 39 columns across five corpora, as it predicts the 7B’s, Llama’s and DocETL’s): in the most sensitive band the 7B is right on 14% of cells and the 32B</w:t>
       </w:r>
       <w:r>
         <w:t xml:space="preserve"> </w:t>
@@ -6110,13 +6128,13 @@
         <w:t xml:space="preserve"> </w:t>
       </w:r>
       <w:r>
-        <w:t xml:space="preserve">on medical and legal (queued). The field-position test found no rule to state (Section 1), only a per-column</w:t>
-      </w:r>
-      <w:r>
-        <w:t xml:space="preserve"> </w:t>
-      </w:r>
-      <w:r>
-        <w:t xml:space="preserve">choice.</w:t>
+        <w:t xml:space="preserve">on medical and legal has run (Section 1: the models rank the columns the same). The field-position test found no</w:t>
+      </w:r>
+      <w:r>
+        <w:t xml:space="preserve"> </w:t>
+      </w:r>
+      <w:r>
+        <w:t xml:space="preserve">rule to state (Section 1), only a per-column choice. Every intervention planned in RESEARCH_DEPTH.md has now run.</w:t>
       </w:r>
     </w:p>
     <w:bookmarkEnd w:id="80"/>

</xml_diff>